<commit_message>
Integrate PPG-DaLiA replication into manuscript: Section 3.7, abstract, conclusions, paper.bib
</commit_message>
<xml_diff>
--- a/paper/manuscript.docx
+++ b/paper/manuscript.docx
@@ -2,7 +2,7 @@
 <file path=word/document.xml><?xml version="1.0" encoding="utf-8"?>
 <w:document xmlns:w="http://schemas.openxmlformats.org/wordprocessingml/2006/main" xmlns:m="http://schemas.openxmlformats.org/officeDocument/2006/math" xmlns:r="http://schemas.openxmlformats.org/officeDocument/2006/relationships" xmlns:o="urn:schemas-microsoft-com:office:office" xmlns:v="urn:schemas-microsoft-com:vml" xmlns:w10="urn:schemas-microsoft-com:office:word" xmlns:a="http://schemas.openxmlformats.org/drawingml/2006/main" xmlns:pic="http://schemas.openxmlformats.org/drawingml/2006/picture" xmlns:wp="http://schemas.openxmlformats.org/drawingml/2006/wordprocessingDrawing">
   <w:body>
-    <w:bookmarkStart w:id="99" w:name="X492e6e436080a4bb955983327137bd378b3e7de"/>
+    <w:bookmarkStart w:id="102" w:name="X492e6e436080a4bb955983327137bd378b3e7de"/>
     <w:p>
       <w:pPr>
         <w:pStyle w:val="Heading1"/>
@@ -1331,7 +1331,7 @@
     </w:p>
     <w:bookmarkEnd w:id="20"/>
     <w:bookmarkEnd w:id="21"/>
-    <w:bookmarkStart w:id="29" w:name="cross-method-audit-on-wesad"/>
+    <w:bookmarkStart w:id="30" w:name="cross-method-audit-on-wesad"/>
     <w:p>
       <w:pPr>
         <w:pStyle w:val="Heading2"/>
@@ -4143,8 +4143,426 @@
       </w:r>
     </w:p>
     <w:bookmarkEnd w:id="28"/>
+    <w:bookmarkStart w:id="29" w:name="external-validation-on-ppg-dalia"/>
+    <w:p>
+      <w:pPr>
+        <w:pStyle w:val="Heading3"/>
+      </w:pPr>
+      <w:r>
+        <w:t xml:space="preserve">3.7 External validation on PPG-DaLiA</w:t>
+      </w:r>
+    </w:p>
+    <w:p>
+      <w:pPr>
+        <w:pStyle w:val="FirstParagraph"/>
+      </w:pPr>
+      <w:r>
+        <w:t xml:space="preserve">The cross-method SQI disagreement finding from Section 3.2 replicates on a second public wearable benchmark with the same hardware but a different activity paradigm. We applied the identical audit pipeline (in-house threshold + Orphanidou + Sukor + Elgendi) to all 15 subjects of the public PPG-DaLiA release</w:t>
+      </w:r>
+      <w:r>
+        <w:t xml:space="preserve"> </w:t>
+      </w:r>
+      <w:r>
+        <w:t xml:space="preserve">(Reiss et al. 2019)</w:t>
+      </w:r>
+      <w:r>
+        <w:t xml:space="preserve">, which uses the same Empatica E4 wrist and RespiBAN chest devices as WESAD but covers 8 ambulatory activities (sitting, stairs, table soccer, cycling, car driving, lunch break, walking, working) rather than psychological stress and amusement.</w:t>
+      </w:r>
+    </w:p>
+    <w:p>
+      <w:pPr>
+        <w:pStyle w:val="BodyText"/>
+      </w:pPr>
+      <w:r>
+        <w:t xml:space="preserve">On 18,781 5-second windows from PPG-DaLiA, the three independently developed published methods collectively rejected 43.1% of windows accepted by the in-house threshold, compared with 44.6% on WESAD. Pairwise Cohen’s κ across the three published methods showed the same disagreement pattern: median pairwise κ = -0.204 on PPG-DaLiA versus -0.198 on WESAD, with the same sign and magnitude on each pair (Orphanidou vs Sukor +0.46 vs +0.41; Orphanidou vs Elgendi -0.20 vs -0.20; Sukor vs Elgendi -0.22 vs -0.23). Pass rates for each published method landed within 3 percentage points of their WESAD values. The in-house threshold passed 100.0% of windows on both datasets, with Cohen’s κ against each published method indistinguishable from zero on both.</w:t>
+      </w:r>
+    </w:p>
+    <w:p>
+      <w:pPr>
+        <w:pStyle w:val="TableCaption"/>
+      </w:pPr>
+      <w:r>
+        <w:t xml:space="preserve">Table 10. External validation on PPG-DaLiA, side-by-side with WESAD. The cross-method SQI disagreement finding replicates on a 3x larger benchmark with a different activity paradigm and the same hardware.</w:t>
+      </w:r>
+    </w:p>
+    <w:tbl>
+      <w:tblPr>
+        <w:tblStyle w:val="Table"/>
+        <w:tblW w:type="pct" w:w="5000"/>
+        <w:tblLayout w:type="fixed"/>
+        <w:tblLook w:firstRow="1" w:lastRow="0" w:firstColumn="0" w:lastColumn="0" w:noHBand="0" w:noVBand="0" w:val="0020"/>
+        <w:tblCaption w:val="Table 10. External validation on PPG-DaLiA, side-by-side with WESAD. The cross-method SQI disagreement finding replicates on a 3x larger benchmark with a different activity paradigm and the same hardware."/>
+      </w:tblPr>
+      <w:tblGrid>
+        <w:gridCol w:w="2640"/>
+        <w:gridCol w:w="2640"/>
+        <w:gridCol w:w="2640"/>
+      </w:tblGrid>
+      <w:tr>
+        <w:trPr>
+          <w:tblHeader w:val="on"/>
+        </w:trPr>
+        <w:tc>
+          <w:tcPr/>
+          <w:p>
+            <w:pPr>
+              <w:pStyle w:val="Compact"/>
+            </w:pPr>
+            <w:r>
+              <w:t xml:space="preserve">Metric</w:t>
+            </w:r>
+          </w:p>
+        </w:tc>
+        <w:tc>
+          <w:tcPr/>
+          <w:p>
+            <w:pPr>
+              <w:pStyle w:val="Compact"/>
+            </w:pPr>
+            <w:r>
+              <w:t xml:space="preserve">WESAD (n = 15, 6,585 windows)</w:t>
+            </w:r>
+          </w:p>
+        </w:tc>
+        <w:tc>
+          <w:tcPr/>
+          <w:p>
+            <w:pPr>
+              <w:pStyle w:val="Compact"/>
+            </w:pPr>
+            <w:r>
+              <w:t xml:space="preserve">PPG-DaLiA (n = 15, 18,781 windows)</w:t>
+            </w:r>
+          </w:p>
+        </w:tc>
+      </w:tr>
+      <w:tr>
+        <w:tc>
+          <w:tcPr/>
+          <w:p>
+            <w:pPr>
+              <w:pStyle w:val="Compact"/>
+            </w:pPr>
+            <w:r>
+              <w:t xml:space="preserve">In-house pass rate</w:t>
+            </w:r>
+          </w:p>
+        </w:tc>
+        <w:tc>
+          <w:tcPr/>
+          <w:p>
+            <w:pPr>
+              <w:pStyle w:val="Compact"/>
+            </w:pPr>
+            <w:r>
+              <w:t xml:space="preserve">1.000</w:t>
+            </w:r>
+          </w:p>
+        </w:tc>
+        <w:tc>
+          <w:tcPr/>
+          <w:p>
+            <w:pPr>
+              <w:pStyle w:val="Compact"/>
+            </w:pPr>
+            <w:r>
+              <w:t xml:space="preserve">1.000</w:t>
+            </w:r>
+          </w:p>
+        </w:tc>
+      </w:tr>
+      <w:tr>
+        <w:tc>
+          <w:tcPr/>
+          <w:p>
+            <w:pPr>
+              <w:pStyle w:val="Compact"/>
+            </w:pPr>
+            <w:r>
+              <w:t xml:space="preserve">Orphanidou pass rate</w:t>
+            </w:r>
+          </w:p>
+        </w:tc>
+        <w:tc>
+          <w:tcPr/>
+          <w:p>
+            <w:pPr>
+              <w:pStyle w:val="Compact"/>
+            </w:pPr>
+            <w:r>
+              <w:t xml:space="preserve">0.256</w:t>
+            </w:r>
+          </w:p>
+        </w:tc>
+        <w:tc>
+          <w:tcPr/>
+          <w:p>
+            <w:pPr>
+              <w:pStyle w:val="Compact"/>
+            </w:pPr>
+            <w:r>
+              <w:t xml:space="preserve">0.282</w:t>
+            </w:r>
+          </w:p>
+        </w:tc>
+      </w:tr>
+      <w:tr>
+        <w:tc>
+          <w:tcPr/>
+          <w:p>
+            <w:pPr>
+              <w:pStyle w:val="Compact"/>
+            </w:pPr>
+            <w:r>
+              <w:t xml:space="preserve">Sukor pass rate</w:t>
+            </w:r>
+          </w:p>
+        </w:tc>
+        <w:tc>
+          <w:tcPr/>
+          <w:p>
+            <w:pPr>
+              <w:pStyle w:val="Compact"/>
+            </w:pPr>
+            <w:r>
+              <w:t xml:space="preserve">0.255</w:t>
+            </w:r>
+          </w:p>
+        </w:tc>
+        <w:tc>
+          <w:tcPr/>
+          <w:p>
+            <w:pPr>
+              <w:pStyle w:val="Compact"/>
+            </w:pPr>
+            <w:r>
+              <w:t xml:space="preserve">0.271</w:t>
+            </w:r>
+          </w:p>
+        </w:tc>
+      </w:tr>
+      <w:tr>
+        <w:tc>
+          <w:tcPr/>
+          <w:p>
+            <w:pPr>
+              <w:pStyle w:val="Compact"/>
+            </w:pPr>
+            <w:r>
+              <w:t xml:space="preserve">Elgendi pass rate</w:t>
+            </w:r>
+          </w:p>
+        </w:tc>
+        <w:tc>
+          <w:tcPr/>
+          <w:p>
+            <w:pPr>
+              <w:pStyle w:val="Compact"/>
+            </w:pPr>
+            <w:r>
+              <w:t xml:space="preserve">0.215</w:t>
+            </w:r>
+          </w:p>
+        </w:tc>
+        <w:tc>
+          <w:tcPr/>
+          <w:p>
+            <w:pPr>
+              <w:pStyle w:val="Compact"/>
+            </w:pPr>
+            <w:r>
+              <w:t xml:space="preserve">0.220</w:t>
+            </w:r>
+          </w:p>
+        </w:tc>
+      </w:tr>
+      <w:tr>
+        <w:tc>
+          <w:tcPr/>
+          <w:p>
+            <w:pPr>
+              <w:pStyle w:val="Compact"/>
+            </w:pPr>
+            <w:r>
+              <w:t xml:space="preserve">In-house pass AND all 3 published fail</w:t>
+            </w:r>
+          </w:p>
+        </w:tc>
+        <w:tc>
+          <w:tcPr/>
+          <w:p>
+            <w:pPr>
+              <w:pStyle w:val="Compact"/>
+            </w:pPr>
+            <w:r>
+              <w:t xml:space="preserve">0.446</w:t>
+            </w:r>
+          </w:p>
+        </w:tc>
+        <w:tc>
+          <w:tcPr/>
+          <w:p>
+            <w:pPr>
+              <w:pStyle w:val="Compact"/>
+            </w:pPr>
+            <w:r>
+              <w:t xml:space="preserve">0.431</w:t>
+            </w:r>
+          </w:p>
+        </w:tc>
+      </w:tr>
+      <w:tr>
+        <w:tc>
+          <w:tcPr/>
+          <w:p>
+            <w:pPr>
+              <w:pStyle w:val="Compact"/>
+            </w:pPr>
+            <w:r>
+              <w:t xml:space="preserve">Median pairwise κ (published methods)</w:t>
+            </w:r>
+          </w:p>
+        </w:tc>
+        <w:tc>
+          <w:tcPr/>
+          <w:p>
+            <w:pPr>
+              <w:pStyle w:val="Compact"/>
+            </w:pPr>
+            <w:r>
+              <w:t xml:space="preserve">-0.198</w:t>
+            </w:r>
+          </w:p>
+        </w:tc>
+        <w:tc>
+          <w:tcPr/>
+          <w:p>
+            <w:pPr>
+              <w:pStyle w:val="Compact"/>
+            </w:pPr>
+            <w:r>
+              <w:t xml:space="preserve">-0.204</w:t>
+            </w:r>
+          </w:p>
+        </w:tc>
+      </w:tr>
+      <w:tr>
+        <w:tc>
+          <w:tcPr/>
+          <w:p>
+            <w:pPr>
+              <w:pStyle w:val="Compact"/>
+            </w:pPr>
+            <w:r>
+              <w:t xml:space="preserve">κ vs in-house (all three published)</w:t>
+            </w:r>
+          </w:p>
+        </w:tc>
+        <w:tc>
+          <w:tcPr/>
+          <w:p>
+            <w:pPr>
+              <w:pStyle w:val="Compact"/>
+            </w:pPr>
+            <w:r>
+              <w:t xml:space="preserve">0.000</w:t>
+            </w:r>
+          </w:p>
+        </w:tc>
+        <w:tc>
+          <w:tcPr/>
+          <w:p>
+            <w:pPr>
+              <w:pStyle w:val="Compact"/>
+            </w:pPr>
+            <w:r>
+              <w:t xml:space="preserve">0.000</w:t>
+            </w:r>
+          </w:p>
+        </w:tc>
+      </w:tr>
+      <w:tr>
+        <w:tc>
+          <w:tcPr/>
+          <w:p>
+            <w:pPr>
+              <w:pStyle w:val="Compact"/>
+            </w:pPr>
+            <w:r>
+              <w:t xml:space="preserve">Per-subject absolute HR-difference range (bpm)</w:t>
+            </w:r>
+          </w:p>
+        </w:tc>
+        <w:tc>
+          <w:tcPr/>
+          <w:p>
+            <w:pPr>
+              <w:pStyle w:val="Compact"/>
+            </w:pPr>
+            <w:r>
+              <w:t xml:space="preserve">6.75-26.02</w:t>
+            </w:r>
+          </w:p>
+        </w:tc>
+        <w:tc>
+          <w:tcPr/>
+          <w:p>
+            <w:pPr>
+              <w:pStyle w:val="Compact"/>
+            </w:pPr>
+            <w:r>
+              <w:t xml:space="preserve">6.66-16.27</w:t>
+            </w:r>
+          </w:p>
+        </w:tc>
+      </w:tr>
+      <w:tr>
+        <w:tc>
+          <w:tcPr/>
+          <w:p>
+            <w:pPr>
+              <w:pStyle w:val="Compact"/>
+            </w:pPr>
+            <w:r>
+              <w:t xml:space="preserve">Per-subject fold range</w:t>
+            </w:r>
+          </w:p>
+        </w:tc>
+        <w:tc>
+          <w:tcPr/>
+          <w:p>
+            <w:pPr>
+              <w:pStyle w:val="Compact"/>
+            </w:pPr>
+            <w:r>
+              <w:t xml:space="preserve">4.0x</w:t>
+            </w:r>
+          </w:p>
+        </w:tc>
+        <w:tc>
+          <w:tcPr/>
+          <w:p>
+            <w:pPr>
+              <w:pStyle w:val="Compact"/>
+            </w:pPr>
+            <w:r>
+              <w:t xml:space="preserve">2.4x</w:t>
+            </w:r>
+          </w:p>
+        </w:tc>
+      </w:tr>
+    </w:tbl>
+    <w:p>
+      <w:pPr>
+        <w:pStyle w:val="BodyText"/>
+      </w:pPr>
+      <w:r>
+        <w:t xml:space="preserve">The PPG-DaLiA per-subject absolute HR difference (wrist PPG vs chest ECG) range was less extreme than on WESAD (2.4x fold range vs 4.0x), but the absolute minimum was virtually identical (6.66 vs 6.75 bpm). The lower fold range is consistent with PPG-DaLiA’s wider activity mix smoothing the upper tail rather than with reduced per-subject heterogeneity. The replication confirms that the cross-method SQI disagreement finding is a property of wrist PPG itself rather than of the WESAD stress paradigm or of any single recording session.</w:t>
+      </w:r>
+    </w:p>
     <w:bookmarkEnd w:id="29"/>
-    <w:bookmarkStart w:id="37" w:name="Xf8d28994ab18c569b43451e1d59264a3df91dd7"/>
+    <w:bookmarkEnd w:id="30"/>
+    <w:bookmarkStart w:id="38" w:name="Xf8d28994ab18c569b43451e1d59264a3df91dd7"/>
     <w:p>
       <w:pPr>
         <w:pStyle w:val="Heading2"/>
@@ -4153,7 +4571,7 @@
         <w:t xml:space="preserve">4. Methodological validation on synthetic data</w:t>
       </w:r>
     </w:p>
-    <w:bookmarkStart w:id="30" w:name="Xa121e1727e5e5d44b54593882ea99d9ddb54092"/>
+    <w:bookmarkStart w:id="31" w:name="Xa121e1727e5e5d44b54593882ea99d9ddb54092"/>
     <w:p>
       <w:pPr>
         <w:pStyle w:val="Heading3"/>
@@ -4186,8 +4604,8 @@
         <w:t xml:space="preserve">(moderate category). Category distribution: 31 high (≥ 80), 266 moderate (≥ 60), 3 low (≥ 40), 0 unreliable. The distribution is in Figure 6A.</w:t>
       </w:r>
     </w:p>
-    <w:bookmarkEnd w:id="30"/>
-    <w:bookmarkStart w:id="31" w:name="X7eefbf0decf15c54e4d1e7780b435273777fbce"/>
+    <w:bookmarkEnd w:id="31"/>
+    <w:bookmarkStart w:id="32" w:name="X7eefbf0decf15c54e4d1e7780b435273777fbce"/>
     <w:p>
       <w:pPr>
         <w:pStyle w:val="Heading3"/>
@@ -4201,7 +4619,7 @@
         <w:pStyle w:val="TableCaption"/>
       </w:pPr>
       <w:r>
-        <w:t xml:space="preserve">Table 10. Bootstrap test-retest reliability on the synthetic cohort (n = 300 participants, 2,400 week-pairs).</w:t>
+        <w:t xml:space="preserve">Table 11. Bootstrap test-retest reliability on the synthetic cohort (n = 300 participants, 2,400 week-pairs).</w:t>
       </w:r>
     </w:p>
     <w:tbl>
@@ -4209,7 +4627,7 @@
         <w:tblStyle w:val="Table"/>
         <w:tblW w:type="auto" w:w="0"/>
         <w:tblLook w:firstRow="1" w:lastRow="0" w:firstColumn="0" w:lastColumn="0" w:noHBand="0" w:noVBand="0" w:val="0020"/>
-        <w:tblCaption w:val="Table 10. Bootstrap test-retest reliability on the synthetic cohort (n = 300 participants, 2,400 week-pairs)."/>
+        <w:tblCaption w:val="Table 11. Bootstrap test-retest reliability on the synthetic cohort (n = 300 participants, 2,400 week-pairs)."/>
       </w:tblPr>
       <w:tblGrid>
         <w:gridCol w:w="1584"/>
@@ -4535,8 +4953,8 @@
         <w:t xml:space="preserve">number.</w:t>
       </w:r>
     </w:p>
-    <w:bookmarkEnd w:id="31"/>
-    <w:bookmarkStart w:id="32" w:name="Xda95753af269ca0e3094d252b044c654d56e36b"/>
+    <w:bookmarkEnd w:id="32"/>
+    <w:bookmarkStart w:id="33" w:name="Xda95753af269ca0e3094d252b044c654d56e36b"/>
     <w:p>
       <w:pPr>
         <w:pStyle w:val="Heading3"/>
@@ -4553,8 +4971,8 @@
         <w:t xml:space="preserve">We also report an ICC(2,1) days-as-raters analysis as an internal noise-floor check (full numbers in supplement Table S1). The ICC and bootstrap week-pair r agree on metric ranking, with ICC uniformly more conservative because it treats within-week noise as rater disagreement. The bootstrap week-pair r is the recommended headline statistic for clinical claims; the ICC is included as a diagnostic.</w:t>
       </w:r>
     </w:p>
-    <w:bookmarkEnd w:id="32"/>
-    <w:bookmarkStart w:id="33" w:name="fairness-disparities-recovered"/>
+    <w:bookmarkEnd w:id="33"/>
+    <w:bookmarkStart w:id="34" w:name="fairness-disparities-recovered"/>
     <w:p>
       <w:pPr>
         <w:pStyle w:val="Heading3"/>
@@ -4568,7 +4986,7 @@
         <w:pStyle w:val="TableCaption"/>
       </w:pPr>
       <w:r>
-        <w:t xml:space="preserve">Table 11. Fairness disparities recovered on the synthetic cohort, signal_quality_score component.</w:t>
+        <w:t xml:space="preserve">Table 12. Fairness disparities recovered on the synthetic cohort, signal_quality_score component.</w:t>
       </w:r>
     </w:p>
     <w:tbl>
@@ -4577,7 +4995,7 @@
         <w:tblW w:type="pct" w:w="5000"/>
         <w:tblLayout w:type="fixed"/>
         <w:tblLook w:firstRow="1" w:lastRow="0" w:firstColumn="0" w:lastColumn="0" w:noHBand="0" w:noVBand="0" w:val="0020"/>
-        <w:tblCaption w:val="Table 11. Fairness disparities recovered on the synthetic cohort, signal_quality_score component."/>
+        <w:tblCaption w:val="Table 12. Fairness disparities recovered on the synthetic cohort, signal_quality_score component."/>
       </w:tblPr>
       <w:tblGrid>
         <w:gridCol w:w="1584"/>
@@ -4777,8 +5195,8 @@
         <w:t xml:space="preserve">The injected effects were 0.85 vs 1.00 SQI multiplier for device C vs A (recovers as a 13.02-point gap) and 0.12 × proxy for skin tone (recovers as a 9.53-point gap). Both gaps have bootstrap 95% CIs (Section 2.7).</w:t>
       </w:r>
     </w:p>
-    <w:bookmarkEnd w:id="33"/>
-    <w:bookmarkStart w:id="34" w:name="causal-adjusted-confounding"/>
+    <w:bookmarkEnd w:id="34"/>
+    <w:bookmarkStart w:id="35" w:name="causal-adjusted-confounding"/>
     <w:p>
       <w:pPr>
         <w:pStyle w:val="Heading3"/>
@@ -4792,7 +5210,7 @@
         <w:pStyle w:val="TableCaption"/>
       </w:pPr>
       <w:r>
-        <w:t xml:space="preserve">Table 12. Screening Pearson correlation vs AIPW adjusted estimate, synthetic cohort.</w:t>
+        <w:t xml:space="preserve">Table 13. Screening Pearson correlation vs AIPW adjusted estimate, synthetic cohort.</w:t>
       </w:r>
     </w:p>
     <w:tbl>
@@ -4801,7 +5219,7 @@
         <w:tblW w:type="pct" w:w="5000"/>
         <w:tblLayout w:type="fixed"/>
         <w:tblLook w:firstRow="1" w:lastRow="0" w:firstColumn="0" w:lastColumn="0" w:noHBand="0" w:noVBand="0" w:val="0020"/>
-        <w:tblCaption w:val="Table 12. Screening Pearson correlation vs AIPW adjusted estimate, synthetic cohort."/>
+        <w:tblCaption w:val="Table 13. Screening Pearson correlation vs AIPW adjusted estimate, synthetic cohort."/>
       </w:tblPr>
       <w:tblGrid>
         <w:gridCol w:w="1584"/>
@@ -5123,8 +5541,8 @@
         <w:t xml:space="preserve">Positivity and E-value sensitivity checks for both treatments are reported in supplement section S2. The heat_index treatments have a positivity violation (Kish ESS 63%), so those point estimates are illustrative; the active_minutes treatment has clean positivity (Kish ESS 98.5%) and the E-value of 2.52 indicates modest robustness.</w:t>
       </w:r>
     </w:p>
-    <w:bookmarkEnd w:id="34"/>
-    <w:bookmarkStart w:id="35" w:name="learned-trust-score-weights"/>
+    <w:bookmarkEnd w:id="35"/>
+    <w:bookmarkStart w:id="36" w:name="learned-trust-score-weights"/>
     <w:p>
       <w:pPr>
         <w:pStyle w:val="Heading3"/>
@@ -5141,8 +5559,8 @@
         <w:t xml:space="preserve">A 6-component weight-simplex search (Dirichlet sampling plus local grid refinement, 360 candidates) returned holdout Spearman ρ = +0.668 (n_holdout = 90) against a week-over-week HRV RMSSD reproducibility target, compared with +0.592 in training (n_train = 210). The learned weights emphasize signal_quality over confounding_risk but remain within the convex hull of plausible weightings; the default weights are within 0.08 Spearman of the optimum, supporting the policy of shipping the defaults and exposing the weights as user-configurable. Full training-vs-holdout breakdown in supplement section S6.</w:t>
       </w:r>
     </w:p>
-    <w:bookmarkEnd w:id="35"/>
-    <w:bookmarkStart w:id="36" w:name="cross-cohort-generalization"/>
+    <w:bookmarkEnd w:id="36"/>
+    <w:bookmarkStart w:id="37" w:name="cross-cohort-generalization"/>
     <w:p>
       <w:pPr>
         <w:pStyle w:val="Heading3"/>
@@ -5159,9 +5577,9 @@
         <w:t xml:space="preserve">Across five synthetic regimes (default, strong environment, inverted skin-tone, severe device bias, clean world) and eight qualitative predictions, seven of eight predictions pass (Figure 7, panel C). The one failure is consistent with random variation: in the clean-world regime, small-sample random imbalance produces a non-zero empirical device-B offset despite zero injected bias. The audit responds to cohort parameters in the predicted direction, including the sign-flip on the skin-tone gap when the injected penalty is inverted (Figure 7, panel B). Full per-regime table in supplement Table S2.</w:t>
       </w:r>
     </w:p>
-    <w:bookmarkEnd w:id="36"/>
     <w:bookmarkEnd w:id="37"/>
-    <w:bookmarkStart w:id="41" w:name="discussion"/>
+    <w:bookmarkEnd w:id="38"/>
+    <w:bookmarkStart w:id="42" w:name="discussion"/>
     <w:p>
       <w:pPr>
         <w:pStyle w:val="Heading2"/>
@@ -5170,7 +5588,7 @@
         <w:t xml:space="preserve">5. Discussion</w:t>
       </w:r>
     </w:p>
-    <w:bookmarkStart w:id="38" w:name="principal-findings"/>
+    <w:bookmarkStart w:id="39" w:name="principal-findings"/>
     <w:p>
       <w:pPr>
         <w:pStyle w:val="Heading3"/>
@@ -5250,8 +5668,8 @@
         <w:t xml:space="preserve">Mean |HR_PPG - HR_ECG| during stress ranges from 6.75 bpm (S15) to 26.02 bpm (S11), a four-fold spread across 15 subjects. The direction of the per-state quality change also varies (most subjects’ PPG SQI drops during stress; S15’s rises). Any conclusion from pooled WESAD wrist-PPG analysis is at risk of being driven by a small number of subjects. Restricting downstream models to multi-baseline-pass windows improves per-subject wrist-PPG-to-chest-ECG HR correlation by a median of +0.110 (13 of 15 subjects improved, paired Wilcoxon p = 1.5e-04), with the largest gains in subjects whose unfiltered correlation was modest (S10: 0.65 → 0.78, S9: 0.47 → 0.76).</w:t>
       </w:r>
     </w:p>
-    <w:bookmarkEnd w:id="38"/>
-    <w:bookmarkStart w:id="39" w:name="relation-to-prior-work"/>
+    <w:bookmarkEnd w:id="39"/>
+    <w:bookmarkStart w:id="40" w:name="relation-to-prior-work"/>
     <w:p>
       <w:pPr>
         <w:pStyle w:val="Heading3"/>
@@ -5306,8 +5724,8 @@
         <w:t xml:space="preserve">, which focuses on feature engineering and aggregation rather than auditing. Our framework can be combined with FLIRT rather than replacing it: FLIRT produces the features; our pipeline checks whether those features are reliable enough to model.</w:t>
       </w:r>
     </w:p>
-    <w:bookmarkEnd w:id="39"/>
-    <w:bookmarkStart w:id="40" w:name="limitations"/>
+    <w:bookmarkEnd w:id="40"/>
+    <w:bookmarkStart w:id="41" w:name="limitations"/>
     <w:p>
       <w:pPr>
         <w:pStyle w:val="Heading3"/>
@@ -5494,9 +5912,9 @@
         <w:t xml:space="preserve">We report time-domain HRV (RMSSD, SDNN) but not LF/HF. The synthetic windows are too short to support meaningful frequency-domain HRV. Adding frequency-domain HRV is a one-day change.</w:t>
       </w:r>
     </w:p>
-    <w:bookmarkEnd w:id="40"/>
     <w:bookmarkEnd w:id="41"/>
-    <w:bookmarkStart w:id="42" w:name="conclusions"/>
+    <w:bookmarkEnd w:id="42"/>
+    <w:bookmarkStart w:id="43" w:name="conclusions"/>
     <w:p>
       <w:pPr>
         <w:pStyle w:val="Heading2"/>
@@ -5510,7 +5928,7 @@
         <w:pStyle w:val="FirstParagraph"/>
       </w:pPr>
       <w:r>
-        <w:t xml:space="preserve">On a public wearable-PPG benchmark (WESAD, n = 15 subjects, 6,585 windows), three independently developed published signal-quality methods, Orphanidou (2015), Sukor (2011), and Elgendi (2016), collectively reject 44.6% of windows accepted by a representative in-house threshold. The three methods disagree with each other on the gray area (median pairwise Cohen’s κ = -0.20) but converge on the consensus rejection set. Single-threshold recalibration at n = 15 does not recover agreement, and per-subject heterogeneity in cross-modality HR disagreement spans a four-fold range across subjects. Restricting downstream models to multi-baseline-pass windows improves per-subject HR correlation by a median of +0.110 (paired Wilcoxon p = 1.5e-04). The implication for wearable-AI research practice is that single-method SQI reporting is insufficient: multi-baseline auditing should be standard supplementary material in wearable-AI publications.</w:t>
+        <w:t xml:space="preserve">On a public wearable-PPG benchmark (WESAD, n = 15 subjects, 6,585 windows), three independently developed published signal-quality methods, Orphanidou (2015), Sukor (2011), and Elgendi (2016), collectively reject 44.6% of windows accepted by a representative in-house threshold. The three methods disagree with each other on the gray area (median pairwise Cohen’s κ = -0.20) but converge on the consensus rejection set. Single-threshold recalibration at n = 15 does not recover agreement, and per-subject heterogeneity in cross-modality HR disagreement spans a four-fold range across subjects. Restricting downstream models to multi-baseline-pass windows improves per-subject HR correlation by a median of +0.110 (paired Wilcoxon p = 1.5e-04). The finding replicates on a second public benchmark (PPG-DaLiA, n = 15, 18,781 windows; same wrist-PPG hardware but ambulatory activity paradigm rather than stress paradigm): consensus rejection 43.1%, median pairwise κ across published methods -0.20, κ against the in-house threshold 0.000, with all three published-method pass rates within 3 percentage points of their WESAD values. The implication for wearable-AI research practice is that single-method SQI reporting is insufficient: multi-baseline auditing should be standard supplementary material in wearable-AI publications.</w:t>
       </w:r>
     </w:p>
     <w:p>
@@ -5536,8 +5954,8 @@
         <w:t xml:space="preserve">(MIT licensed) and runs end-to-end from a fixed seed in approximately three minutes on a modern laptop CPU.</w:t>
       </w:r>
     </w:p>
-    <w:bookmarkEnd w:id="42"/>
-    <w:bookmarkStart w:id="43" w:name="code-and-data-availability"/>
+    <w:bookmarkEnd w:id="43"/>
+    <w:bookmarkStart w:id="44" w:name="code-and-data-availability"/>
     <w:p>
       <w:pPr>
         <w:pStyle w:val="Heading2"/>
@@ -5566,8 +5984,8 @@
         <w:t xml:space="preserve">without restrictions.</w:t>
       </w:r>
     </w:p>
-    <w:bookmarkEnd w:id="43"/>
-    <w:bookmarkStart w:id="44" w:name="author-contributions"/>
+    <w:bookmarkEnd w:id="44"/>
+    <w:bookmarkStart w:id="45" w:name="author-contributions"/>
     <w:p>
       <w:pPr>
         <w:pStyle w:val="Heading2"/>
@@ -5584,8 +6002,8 @@
         <w:t xml:space="preserve">Ceyhun Olcan: Conceptualization, Data curation, Formal analysis, Investigation, Methodology, Software, Validation, Visualization, Writing - original draft, Writing - review and editing.</w:t>
       </w:r>
     </w:p>
-    <w:bookmarkEnd w:id="44"/>
-    <w:bookmarkStart w:id="45" w:name="funding"/>
+    <w:bookmarkEnd w:id="45"/>
+    <w:bookmarkStart w:id="46" w:name="funding"/>
     <w:p>
       <w:pPr>
         <w:pStyle w:val="Heading2"/>
@@ -5602,8 +6020,8 @@
         <w:t xml:space="preserve">No external funding supported this work.</w:t>
       </w:r>
     </w:p>
-    <w:bookmarkEnd w:id="45"/>
-    <w:bookmarkStart w:id="46" w:name="ethics-statement"/>
+    <w:bookmarkEnd w:id="46"/>
+    <w:bookmarkStart w:id="47" w:name="ethics-statement"/>
     <w:p>
       <w:pPr>
         <w:pStyle w:val="Heading2"/>
@@ -5629,8 +6047,8 @@
         <w:t xml:space="preserve">, released under terms permitting research use. No new human-subjects data were collected; institutional review board approval was therefore not required for this work.</w:t>
       </w:r>
     </w:p>
-    <w:bookmarkEnd w:id="46"/>
-    <w:bookmarkStart w:id="47" w:name="competing-interests"/>
+    <w:bookmarkEnd w:id="47"/>
+    <w:bookmarkStart w:id="48" w:name="competing-interests"/>
     <w:p>
       <w:pPr>
         <w:pStyle w:val="Heading2"/>
@@ -5647,8 +6065,8 @@
         <w:t xml:space="preserve">The author declares no competing interests.</w:t>
       </w:r>
     </w:p>
-    <w:bookmarkEnd w:id="47"/>
-    <w:bookmarkStart w:id="48" w:name="references"/>
+    <w:bookmarkEnd w:id="48"/>
+    <w:bookmarkStart w:id="49" w:name="references"/>
     <w:p>
       <w:pPr>
         <w:pStyle w:val="Heading2"/>
@@ -5680,8 +6098,8 @@
         <w:t xml:space="preserve">for full citations (Orphanidou et al. 2015, Sukor et al. 2011, Clifford et al. 2012, Robins et al. 1994, Shrout &amp; Fleiss 1979, Bland &amp; Altman 1986, Schmidt et al. 2018, Perraudin et al. 2021, Föll et al. 2021, Mertes et al. 2022, Efron &amp; Tibshirani 1993, Malik 1996).</w:t>
       </w:r>
     </w:p>
-    <w:bookmarkEnd w:id="48"/>
-    <w:bookmarkStart w:id="98" w:name="supplementary-materials"/>
+    <w:bookmarkEnd w:id="49"/>
+    <w:bookmarkStart w:id="101" w:name="supplementary-materials"/>
     <w:p>
       <w:pPr>
         <w:pStyle w:val="Heading2"/>
@@ -5930,8 +6348,8 @@
         <w:t xml:space="preserve">: full release history.</w:t>
       </w:r>
     </w:p>
-    <w:bookmarkStart w:id="97" w:name="refs"/>
-    <w:bookmarkStart w:id="50" w:name="ref-allen2007"/>
+    <w:bookmarkStart w:id="100" w:name="refs"/>
+    <w:bookmarkStart w:id="51" w:name="ref-allen2007"/>
     <w:p>
       <w:pPr>
         <w:pStyle w:val="Bibliography"/>
@@ -5964,7 +6382,7 @@
       <w:r>
         <w:t xml:space="preserve"> </w:t>
       </w:r>
-      <w:hyperlink r:id="rId49">
+      <w:hyperlink r:id="rId50">
         <w:r>
           <w:rPr>
             <w:rStyle w:val="Hyperlink"/>
@@ -5976,8 +6394,8 @@
         <w:t xml:space="preserve">.</w:t>
       </w:r>
     </w:p>
-    <w:bookmarkEnd w:id="50"/>
-    <w:bookmarkStart w:id="52" w:name="ref-bent2020"/>
+    <w:bookmarkEnd w:id="51"/>
+    <w:bookmarkStart w:id="53" w:name="ref-bent2020"/>
     <w:p>
       <w:pPr>
         <w:pStyle w:val="Bibliography"/>
@@ -6010,7 +6428,7 @@
       <w:r>
         <w:t xml:space="preserve"> </w:t>
       </w:r>
-      <w:hyperlink r:id="rId51">
+      <w:hyperlink r:id="rId52">
         <w:r>
           <w:rPr>
             <w:rStyle w:val="Hyperlink"/>
@@ -6022,8 +6440,8 @@
         <w:t xml:space="preserve">.</w:t>
       </w:r>
     </w:p>
-    <w:bookmarkEnd w:id="52"/>
-    <w:bookmarkStart w:id="54" w:name="ref-bland1986"/>
+    <w:bookmarkEnd w:id="53"/>
+    <w:bookmarkStart w:id="55" w:name="ref-bland1986"/>
     <w:p>
       <w:pPr>
         <w:pStyle w:val="Bibliography"/>
@@ -6056,7 +6474,7 @@
       <w:r>
         <w:t xml:space="preserve"> </w:t>
       </w:r>
-      <w:hyperlink r:id="rId53">
+      <w:hyperlink r:id="rId54">
         <w:r>
           <w:rPr>
             <w:rStyle w:val="Hyperlink"/>
@@ -6068,8 +6486,8 @@
         <w:t xml:space="preserve">.</w:t>
       </w:r>
     </w:p>
-    <w:bookmarkEnd w:id="54"/>
-    <w:bookmarkStart w:id="56" w:name="ref-bossuyt2015stard"/>
+    <w:bookmarkEnd w:id="55"/>
+    <w:bookmarkStart w:id="57" w:name="ref-bossuyt2015stard"/>
     <w:p>
       <w:pPr>
         <w:pStyle w:val="Bibliography"/>
@@ -6114,7 +6532,7 @@
       <w:r>
         <w:t xml:space="preserve"> </w:t>
       </w:r>
-      <w:hyperlink r:id="rId55">
+      <w:hyperlink r:id="rId56">
         <w:r>
           <w:rPr>
             <w:rStyle w:val="Hyperlink"/>
@@ -6126,8 +6544,8 @@
         <w:t xml:space="preserve">.</w:t>
       </w:r>
     </w:p>
-    <w:bookmarkEnd w:id="56"/>
-    <w:bookmarkStart w:id="58" w:name="ref-cliff1993"/>
+    <w:bookmarkEnd w:id="57"/>
+    <w:bookmarkStart w:id="59" w:name="ref-cliff1993"/>
     <w:p>
       <w:pPr>
         <w:pStyle w:val="Bibliography"/>
@@ -6160,7 +6578,7 @@
       <w:r>
         <w:t xml:space="preserve"> </w:t>
       </w:r>
-      <w:hyperlink r:id="rId57">
+      <w:hyperlink r:id="rId58">
         <w:r>
           <w:rPr>
             <w:rStyle w:val="Hyperlink"/>
@@ -6172,8 +6590,8 @@
         <w:t xml:space="preserve">.</w:t>
       </w:r>
     </w:p>
-    <w:bookmarkEnd w:id="58"/>
-    <w:bookmarkStart w:id="60" w:name="ref-clifford2012"/>
+    <w:bookmarkEnd w:id="59"/>
+    <w:bookmarkStart w:id="61" w:name="ref-clifford2012"/>
     <w:p>
       <w:pPr>
         <w:pStyle w:val="Bibliography"/>
@@ -6206,7 +6624,7 @@
       <w:r>
         <w:t xml:space="preserve"> </w:t>
       </w:r>
-      <w:hyperlink r:id="rId59">
+      <w:hyperlink r:id="rId60">
         <w:r>
           <w:rPr>
             <w:rStyle w:val="Hyperlink"/>
@@ -6218,8 +6636,8 @@
         <w:t xml:space="preserve">.</w:t>
       </w:r>
     </w:p>
-    <w:bookmarkEnd w:id="60"/>
-    <w:bookmarkStart w:id="61" w:name="ref-cohen1988"/>
+    <w:bookmarkEnd w:id="61"/>
+    <w:bookmarkStart w:id="62" w:name="ref-cohen1988"/>
     <w:p>
       <w:pPr>
         <w:pStyle w:val="Bibliography"/>
@@ -6241,8 +6659,8 @@
         <w:t xml:space="preserve">. 2nd ed. Lawrence Erlbaum Associates.</w:t>
       </w:r>
     </w:p>
-    <w:bookmarkEnd w:id="61"/>
-    <w:bookmarkStart w:id="63" w:name="ref-collins2024tripodai"/>
+    <w:bookmarkEnd w:id="62"/>
+    <w:bookmarkStart w:id="64" w:name="ref-collins2024tripodai"/>
     <w:p>
       <w:pPr>
         <w:pStyle w:val="Bibliography"/>
@@ -6293,7 +6711,7 @@
       <w:r>
         <w:t xml:space="preserve"> </w:t>
       </w:r>
-      <w:hyperlink r:id="rId62">
+      <w:hyperlink r:id="rId63">
         <w:r>
           <w:rPr>
             <w:rStyle w:val="Hyperlink"/>
@@ -6305,8 +6723,8 @@
         <w:t xml:space="preserve">.</w:t>
       </w:r>
     </w:p>
-    <w:bookmarkEnd w:id="63"/>
-    <w:bookmarkStart w:id="64" w:name="ref-efron1993"/>
+    <w:bookmarkEnd w:id="64"/>
+    <w:bookmarkStart w:id="65" w:name="ref-efron1993"/>
     <w:p>
       <w:pPr>
         <w:pStyle w:val="Bibliography"/>
@@ -6328,8 +6746,8 @@
         <w:t xml:space="preserve">. Chapman &amp; Hall/CRC.</w:t>
       </w:r>
     </w:p>
-    <w:bookmarkEnd w:id="64"/>
-    <w:bookmarkStart w:id="66" w:name="ref-elgendi2016"/>
+    <w:bookmarkEnd w:id="65"/>
+    <w:bookmarkStart w:id="67" w:name="ref-elgendi2016"/>
     <w:p>
       <w:pPr>
         <w:pStyle w:val="Bibliography"/>
@@ -6362,7 +6780,7 @@
       <w:r>
         <w:t xml:space="preserve"> </w:t>
       </w:r>
-      <w:hyperlink r:id="rId65">
+      <w:hyperlink r:id="rId66">
         <w:r>
           <w:rPr>
             <w:rStyle w:val="Hyperlink"/>
@@ -6374,8 +6792,8 @@
         <w:t xml:space="preserve">.</w:t>
       </w:r>
     </w:p>
-    <w:bookmarkEnd w:id="66"/>
-    <w:bookmarkStart w:id="68" w:name="ref-foll2021"/>
+    <w:bookmarkEnd w:id="67"/>
+    <w:bookmarkStart w:id="69" w:name="ref-foll2021"/>
     <w:p>
       <w:pPr>
         <w:pStyle w:val="Bibliography"/>
@@ -6414,7 +6832,7 @@
       <w:r>
         <w:t xml:space="preserve"> </w:t>
       </w:r>
-      <w:hyperlink r:id="rId67">
+      <w:hyperlink r:id="rId68">
         <w:r>
           <w:rPr>
             <w:rStyle w:val="Hyperlink"/>
@@ -6426,8 +6844,8 @@
         <w:t xml:space="preserve">.</w:t>
       </w:r>
     </w:p>
-    <w:bookmarkEnd w:id="68"/>
-    <w:bookmarkStart w:id="70" w:name="ref-liu2020consortai"/>
+    <w:bookmarkEnd w:id="69"/>
+    <w:bookmarkStart w:id="71" w:name="ref-liu2020consortai"/>
     <w:p>
       <w:pPr>
         <w:pStyle w:val="Bibliography"/>
@@ -6472,7 +6890,7 @@
       <w:r>
         <w:t xml:space="preserve"> </w:t>
       </w:r>
-      <w:hyperlink r:id="rId69">
+      <w:hyperlink r:id="rId70">
         <w:r>
           <w:rPr>
             <w:rStyle w:val="Hyperlink"/>
@@ -6484,8 +6902,8 @@
         <w:t xml:space="preserve">.</w:t>
       </w:r>
     </w:p>
-    <w:bookmarkEnd w:id="70"/>
-    <w:bookmarkStart w:id="72" w:name="ref-malik1996"/>
+    <w:bookmarkEnd w:id="71"/>
+    <w:bookmarkStart w:id="73" w:name="ref-malik1996"/>
     <w:p>
       <w:pPr>
         <w:pStyle w:val="Bibliography"/>
@@ -6551,7 +6969,7 @@
       <w:r>
         <w:t xml:space="preserve"> </w:t>
       </w:r>
-      <w:hyperlink r:id="rId71">
+      <w:hyperlink r:id="rId72">
         <w:r>
           <w:rPr>
             <w:rStyle w:val="Hyperlink"/>
@@ -6563,8 +6981,8 @@
         <w:t xml:space="preserve">.</w:t>
       </w:r>
     </w:p>
-    <w:bookmarkEnd w:id="72"/>
-    <w:bookmarkStart w:id="74" w:name="ref-charlton2021ppgproc"/>
+    <w:bookmarkEnd w:id="73"/>
+    <w:bookmarkStart w:id="75" w:name="ref-charlton2021ppgproc"/>
     <w:p>
       <w:pPr>
         <w:pStyle w:val="Bibliography"/>
@@ -6600,7 +7018,7 @@
       <w:r>
         <w:t xml:space="preserve"> </w:t>
       </w:r>
-      <w:hyperlink r:id="rId73">
+      <w:hyperlink r:id="rId74">
         <w:r>
           <w:rPr>
             <w:rStyle w:val="Hyperlink"/>
@@ -6612,8 +7030,8 @@
         <w:t xml:space="preserve">.</w:t>
       </w:r>
     </w:p>
-    <w:bookmarkEnd w:id="74"/>
-    <w:bookmarkStart w:id="76" w:name="ref-mertes2022"/>
+    <w:bookmarkEnd w:id="75"/>
+    <w:bookmarkStart w:id="77" w:name="ref-mertes2022"/>
     <w:p>
       <w:pPr>
         <w:pStyle w:val="Bibliography"/>
@@ -6658,7 +7076,7 @@
       <w:r>
         <w:t xml:space="preserve"> </w:t>
       </w:r>
-      <w:hyperlink r:id="rId75">
+      <w:hyperlink r:id="rId76">
         <w:r>
           <w:rPr>
             <w:rStyle w:val="Hyperlink"/>
@@ -6670,8 +7088,8 @@
         <w:t xml:space="preserve">.</w:t>
       </w:r>
     </w:p>
-    <w:bookmarkEnd w:id="76"/>
-    <w:bookmarkStart w:id="78" w:name="ref-orphanidou2015"/>
+    <w:bookmarkEnd w:id="77"/>
+    <w:bookmarkStart w:id="79" w:name="ref-orphanidou2015"/>
     <w:p>
       <w:pPr>
         <w:pStyle w:val="Bibliography"/>
@@ -6704,7 +7122,7 @@
       <w:r>
         <w:t xml:space="preserve"> </w:t>
       </w:r>
-      <w:hyperlink r:id="rId77">
+      <w:hyperlink r:id="rId78">
         <w:r>
           <w:rPr>
             <w:rStyle w:val="Hyperlink"/>
@@ -6716,8 +7134,8 @@
         <w:t xml:space="preserve">.</w:t>
       </w:r>
     </w:p>
-    <w:bookmarkEnd w:id="78"/>
-    <w:bookmarkStart w:id="80" w:name="ref-perraudin2021"/>
+    <w:bookmarkEnd w:id="79"/>
+    <w:bookmarkStart w:id="81" w:name="ref-perraudin2021"/>
     <w:p>
       <w:pPr>
         <w:pStyle w:val="Bibliography"/>
@@ -6750,7 +7168,7 @@
       <w:r>
         <w:t xml:space="preserve"> </w:t>
       </w:r>
-      <w:hyperlink r:id="rId79">
+      <w:hyperlink r:id="rId80">
         <w:r>
           <w:rPr>
             <w:rStyle w:val="Hyperlink"/>
@@ -6762,20 +7180,26 @@
         <w:t xml:space="preserve">.</w:t>
       </w:r>
     </w:p>
-    <w:bookmarkEnd w:id="80"/>
-    <w:bookmarkStart w:id="82" w:name="ref-robins1994"/>
+    <w:bookmarkEnd w:id="81"/>
+    <w:bookmarkStart w:id="83" w:name="ref-reiss2019"/>
     <w:p>
       <w:pPr>
         <w:pStyle w:val="Bibliography"/>
       </w:pPr>
       <w:r>
-        <w:t xml:space="preserve">Robins, James M., Andrea Rotnitzky, and Lue Ping Zhao. 1994.</w:t>
-      </w:r>
-      <w:r>
-        <w:t xml:space="preserve"> </w:t>
-      </w:r>
-      <w:r>
-        <w:t xml:space="preserve">“Estimation of Regression Coefficients When Some Regressors Are Not Always Observed.”</w:t>
+        <w:t xml:space="preserve">Reiss, Attila, Ina Indlekofer, Philip Schmidt, and Kristof Van Laerhoven. 2019.</w:t>
+      </w:r>
+      <w:r>
+        <w:t xml:space="preserve"> </w:t>
+      </w:r>
+      <w:r>
+        <w:t xml:space="preserve">“</w:t>
+      </w:r>
+      <w:r>
+        <w:t xml:space="preserve">Deep PPG</w:t>
+      </w:r>
+      <w:r>
+        <w:t xml:space="preserve">: Large-Scale Heart Rate Estimation with Convolutional Neural Networks.”</w:t>
       </w:r>
       <w:r>
         <w:t xml:space="preserve"> </w:t>
@@ -6785,6 +7209,52 @@
           <w:i/>
           <w:iCs/>
         </w:rPr>
+        <w:t xml:space="preserve">Sensors</w:t>
+      </w:r>
+      <w:r>
+        <w:t xml:space="preserve"> </w:t>
+      </w:r>
+      <w:r>
+        <w:t xml:space="preserve">19 (14): 3079.</w:t>
+      </w:r>
+      <w:r>
+        <w:t xml:space="preserve"> </w:t>
+      </w:r>
+      <w:hyperlink r:id="rId82">
+        <w:r>
+          <w:rPr>
+            <w:rStyle w:val="Hyperlink"/>
+          </w:rPr>
+          <w:t xml:space="preserve">https://doi.org/10.3390/s19143079</w:t>
+        </w:r>
+      </w:hyperlink>
+      <w:r>
+        <w:t xml:space="preserve">.</w:t>
+      </w:r>
+    </w:p>
+    <w:bookmarkEnd w:id="83"/>
+    <w:bookmarkStart w:id="85" w:name="ref-robins1994"/>
+    <w:p>
+      <w:pPr>
+        <w:pStyle w:val="Bibliography"/>
+      </w:pPr>
+      <w:r>
+        <w:t xml:space="preserve">Robins, James M., Andrea Rotnitzky, and Lue Ping Zhao. 1994.</w:t>
+      </w:r>
+      <w:r>
+        <w:t xml:space="preserve"> </w:t>
+      </w:r>
+      <w:r>
+        <w:t xml:space="preserve">“Estimation of Regression Coefficients When Some Regressors Are Not Always Observed.”</w:t>
+      </w:r>
+      <w:r>
+        <w:t xml:space="preserve"> </w:t>
+      </w:r>
+      <w:r>
+        <w:rPr>
+          <w:i/>
+          <w:iCs/>
+        </w:rPr>
         <w:t xml:space="preserve">Journal of the American Statistical Association</w:t>
       </w:r>
       <w:r>
@@ -6796,7 +7266,7 @@
       <w:r>
         <w:t xml:space="preserve"> </w:t>
       </w:r>
-      <w:hyperlink r:id="rId81">
+      <w:hyperlink r:id="rId84">
         <w:r>
           <w:rPr>
             <w:rStyle w:val="Hyperlink"/>
@@ -6808,8 +7278,8 @@
         <w:t xml:space="preserve">.</w:t>
       </w:r>
     </w:p>
-    <w:bookmarkEnd w:id="82"/>
-    <w:bookmarkStart w:id="84" w:name="ref-schafer2013"/>
+    <w:bookmarkEnd w:id="85"/>
+    <w:bookmarkStart w:id="87" w:name="ref-schafer2013"/>
     <w:p>
       <w:pPr>
         <w:pStyle w:val="Bibliography"/>
@@ -6842,7 +7312,7 @@
       <w:r>
         <w:t xml:space="preserve"> </w:t>
       </w:r>
-      <w:hyperlink r:id="rId83">
+      <w:hyperlink r:id="rId86">
         <w:r>
           <w:rPr>
             <w:rStyle w:val="Hyperlink"/>
@@ -6854,8 +7324,8 @@
         <w:t xml:space="preserve">.</w:t>
       </w:r>
     </w:p>
-    <w:bookmarkEnd w:id="84"/>
-    <w:bookmarkStart w:id="86" w:name="ref-schmidt2018"/>
+    <w:bookmarkEnd w:id="87"/>
+    <w:bookmarkStart w:id="89" w:name="ref-schmidt2018"/>
     <w:p>
       <w:pPr>
         <w:pStyle w:val="Bibliography"/>
@@ -6894,7 +7364,7 @@
       <w:r>
         <w:t xml:space="preserve"> </w:t>
       </w:r>
-      <w:hyperlink r:id="rId85">
+      <w:hyperlink r:id="rId88">
         <w:r>
           <w:rPr>
             <w:rStyle w:val="Hyperlink"/>
@@ -6906,8 +7376,8 @@
         <w:t xml:space="preserve">.</w:t>
       </w:r>
     </w:p>
-    <w:bookmarkEnd w:id="86"/>
-    <w:bookmarkStart w:id="88" w:name="ref-shcherbina2017"/>
+    <w:bookmarkEnd w:id="89"/>
+    <w:bookmarkStart w:id="91" w:name="ref-shcherbina2017"/>
     <w:p>
       <w:pPr>
         <w:pStyle w:val="Bibliography"/>
@@ -6940,7 +7410,7 @@
       <w:r>
         <w:t xml:space="preserve"> </w:t>
       </w:r>
-      <w:hyperlink r:id="rId87">
+      <w:hyperlink r:id="rId90">
         <w:r>
           <w:rPr>
             <w:rStyle w:val="Hyperlink"/>
@@ -6952,8 +7422,8 @@
         <w:t xml:space="preserve">.</w:t>
       </w:r>
     </w:p>
-    <w:bookmarkEnd w:id="88"/>
-    <w:bookmarkStart w:id="90" w:name="ref-shrout1979"/>
+    <w:bookmarkEnd w:id="91"/>
+    <w:bookmarkStart w:id="93" w:name="ref-shrout1979"/>
     <w:p>
       <w:pPr>
         <w:pStyle w:val="Bibliography"/>
@@ -6986,7 +7456,7 @@
       <w:r>
         <w:t xml:space="preserve"> </w:t>
       </w:r>
-      <w:hyperlink r:id="rId89">
+      <w:hyperlink r:id="rId92">
         <w:r>
           <w:rPr>
             <w:rStyle w:val="Hyperlink"/>
@@ -6998,8 +7468,8 @@
         <w:t xml:space="preserve">.</w:t>
       </w:r>
     </w:p>
-    <w:bookmarkEnd w:id="90"/>
-    <w:bookmarkStart w:id="92" w:name="ref-sukor2011"/>
+    <w:bookmarkEnd w:id="93"/>
+    <w:bookmarkStart w:id="95" w:name="ref-sukor2011"/>
     <w:p>
       <w:pPr>
         <w:pStyle w:val="Bibliography"/>
@@ -7032,7 +7502,7 @@
       <w:r>
         <w:t xml:space="preserve"> </w:t>
       </w:r>
-      <w:hyperlink r:id="rId91">
+      <w:hyperlink r:id="rId94">
         <w:r>
           <w:rPr>
             <w:rStyle w:val="Hyperlink"/>
@@ -7044,8 +7514,8 @@
         <w:t xml:space="preserve">.</w:t>
       </w:r>
     </w:p>
-    <w:bookmarkEnd w:id="92"/>
-    <w:bookmarkStart w:id="94" w:name="ref-vasey2022decideai"/>
+    <w:bookmarkEnd w:id="95"/>
+    <w:bookmarkStart w:id="97" w:name="ref-vasey2022decideai"/>
     <w:p>
       <w:pPr>
         <w:pStyle w:val="Bibliography"/>
@@ -7090,7 +7560,7 @@
       <w:r>
         <w:t xml:space="preserve"> </w:t>
       </w:r>
-      <w:hyperlink r:id="rId93">
+      <w:hyperlink r:id="rId96">
         <w:r>
           <w:rPr>
             <w:rStyle w:val="Hyperlink"/>
@@ -7102,8 +7572,8 @@
         <w:t xml:space="preserve">.</w:t>
       </w:r>
     </w:p>
-    <w:bookmarkEnd w:id="94"/>
-    <w:bookmarkStart w:id="96" w:name="ref-wilcoxon1945"/>
+    <w:bookmarkEnd w:id="97"/>
+    <w:bookmarkStart w:id="99" w:name="ref-wilcoxon1945"/>
     <w:p>
       <w:pPr>
         <w:pStyle w:val="Bibliography"/>
@@ -7136,7 +7606,7 @@
       <w:r>
         <w:t xml:space="preserve"> </w:t>
       </w:r>
-      <w:hyperlink r:id="rId95">
+      <w:hyperlink r:id="rId98">
         <w:r>
           <w:rPr>
             <w:rStyle w:val="Hyperlink"/>
@@ -7148,10 +7618,10 @@
         <w:t xml:space="preserve">.</w:t>
       </w:r>
     </w:p>
-    <w:bookmarkEnd w:id="96"/>
-    <w:bookmarkEnd w:id="97"/>
-    <w:bookmarkEnd w:id="98"/>
     <w:bookmarkEnd w:id="99"/>
+    <w:bookmarkEnd w:id="100"/>
+    <w:bookmarkEnd w:id="101"/>
+    <w:bookmarkEnd w:id="102"/>
     <w:sectPr>
       <w:footnotePr>
         <w:numRestart w:val="eachSect"/>

</xml_diff>

<commit_message>
Add PPG-DaLiA replication sentence to abstract Results paragraph
</commit_message>
<xml_diff>
--- a/paper/manuscript.docx
+++ b/paper/manuscript.docx
@@ -232,7 +232,19 @@
         <w:t xml:space="preserve"> </w:t>
       </w:r>
       <w:r>
-        <w:t xml:space="preserve">The three published methods disagreed with each other on the gray area (median pairwise Cohen’s κ = -0.20, range -0.23 to +0.41) but converged on rejecting 44.6% of windows that the in-house threshold accepted, three methods testing three different physical properties of pulse waveforms, three concordant rejections. The in-house SQI was uncorrelated with any published baseline (κ = 0.000 against each). Single-threshold recalibration at n = 15 did not recover agreement (Δκ = 0.000; AUROC for in-house SQI predicting Orphanidou pass/fail = 0.484). Per-subject heterogeneity in wrist-PPG-to-chest-ECG HR disagreement spanned 6.75 to 26.02 bpm during the stress condition, a four-fold range across subjects. Restricting downstream models to Orphanidou-passing windows improved per-subject HR correlation by a median of +0.110 (13 of 15 subjects improved, paired Wilcoxon p = 1.5e-04). On the synthetic cohort, the audit recovered injected fairness disparities (-13.02 points for device family, -9.53 points for skin-tone quartiles) and AIPW-adjusted confounding estimates with cluster bootstrap CIs.</w:t>
+        <w:t xml:space="preserve">The three published methods disagreed with each other on the gray area (median pairwise Cohen’s κ = -0.20, range -0.23 to +0.41) but converged on rejecting 44.6% of windows that the in-house threshold accepted, three methods testing three different physical properties of pulse waveforms, three concordant rejections. The in-house SQI was uncorrelated with any published baseline (κ = 0.000 against each). Single-threshold recalibration at n = 15 did not recover agreement (Δκ = 0.000; AUROC for in-house SQI predicting Orphanidou pass/fail = 0.484). Per-subject heterogeneity in wrist-PPG-to-chest-ECG HR disagreement spanned 6.75 to 26.02 bpm during the stress condition, a four-fold range across subjects. Restricting downstream models to Orphanidou-passing windows improved per-subject HR correlation by a median of +0.110 (13 of 15 subjects improved, paired Wilcoxon p = 1.5e-04). The finding replicated on PPG-DaLiA</w:t>
+      </w:r>
+      <w:r>
+        <w:t xml:space="preserve"> </w:t>
+      </w:r>
+      <w:r>
+        <w:t xml:space="preserve">(Reiss et al. 2019)</w:t>
+      </w:r>
+      <w:r>
+        <w:t xml:space="preserve"> </w:t>
+      </w:r>
+      <w:r>
+        <w:t xml:space="preserve">(n = 15 subjects, 18,781 windows, same wrist-PPG hardware but ambulatory rather than stress paradigm): consensus rejection 43.1% (vs 44.6% on WESAD), median pairwise κ across published methods -0.20 (vs -0.20), κ against the in-house threshold 0.000 (vs 0.000). On the synthetic cohort, the audit recovered injected fairness disparities (-13.02 points for device family, -9.53 points for skin-tone quartiles) and AIPW-adjusted confounding estimates with cluster bootstrap CIs.</w:t>
       </w:r>
     </w:p>
     <w:p>

</xml_diff>

<commit_message>
Update Section 5.1 with PPG-DaLiA replication; cap extreme p-values; sync medRxiv submission prep with reframed manuscript
</commit_message>
<xml_diff>
--- a/paper/manuscript.docx
+++ b/paper/manuscript.docx
@@ -1816,7 +1816,7 @@
               <w:pStyle w:val="Compact"/>
             </w:pPr>
             <w:r>
-              <w:t xml:space="preserve">+0.697 (p &lt; 1e-300)</w:t>
+              <w:t xml:space="preserve">+0.697 (p &lt;&lt; 0.001)</w:t>
             </w:r>
           </w:p>
         </w:tc>
@@ -2970,7 +2970,7 @@
         <w:pStyle w:val="BodyText"/>
       </w:pPr>
       <w:r>
-        <w:t xml:space="preserve">Stress vs baseline: most subjects show a PPG SQI drop during stress (largest effects at Cliff’s δ = +0.75 for S17, +0.73 for S5, +0.70 for S14; corresponding Cohen’s d 1.16-1.41, all p &lt; 1e-29). One subject (S15) shows the opposite (δ = -0.49), consistent with state-dependent posture in which less movement during the stressor than during baseline improves PPG quality. Heterogeneity in the direction of the PPG SQI effect across subjects is itself the finding. The framework’s per-subject outputs catch this; pooled-by-state numbers obscure it.</w:t>
+        <w:t xml:space="preserve">Stress vs baseline: most subjects show a PPG SQI drop during stress (largest effects at Cliff’s δ = +0.75 for S17, +0.73 for S5, +0.70 for S14; corresponding Cohen’s d 1.16-1.41, all p &lt;&lt; 0.001). One subject (S15) shows the opposite (δ = -0.49), consistent with state-dependent posture in which less movement during the stressor than during baseline improves PPG quality. Heterogeneity in the direction of the PPG SQI effect across subjects is itself the finding. The framework’s per-subject outputs catch this; pooled-by-state numbers obscure it.</w:t>
       </w:r>
     </w:p>
     <w:p>
@@ -2978,7 +2978,7 @@
         <w:pStyle w:val="BodyText"/>
       </w:pPr>
       <w:r>
-        <w:t xml:space="preserve">Baseline vs amusement: the funny-video paradigm produces upper-body laughter motion that degrades wrist PPG in most subjects. The largest single effect is S9 PPG SQI (Cliff’s δ = +0.80, Cohen’s d = +1.89, p = 3.7e-25). S14 also shows a large ECG SQI drop (δ = +0.70, d = +1.59), consistent with the chest device responding to laughter motion in addition to wrist PPG.</w:t>
+        <w:t xml:space="preserve">Baseline vs amusement: the funny-video paradigm produces upper-body laughter motion that degrades wrist PPG in most subjects. The largest single effect is S9 PPG SQI (Cliff’s δ = +0.80, Cohen’s d = +1.89, p =&lt; 0.001). S14 also shows a large ECG SQI drop (δ = +0.70, d = +1.59), consistent with the chest device responding to laughter motion in addition to wrist PPG.</w:t>
       </w:r>
     </w:p>
     <w:bookmarkEnd w:id="27"/>
@@ -5635,7 +5635,7 @@
         <w:t xml:space="preserve"> </w:t>
       </w:r>
       <w:r>
-        <w:t xml:space="preserve">The published methods individually pass 21.5% to 25.6% of windows but collectively reject 44.6% of windows accepted by a representative in-house threshold. Pairwise Cohen’s κ across the three published methods spans -0.23 to +0.41 (median -0.20), indicating that the methods agree on neither the pass nor the reject set in the gray area but converge on rejecting a substantial population of windows. Each method tests a different physical property (Orphanidou: pulse-shape correlation; Sukor: pulse-to-pulse interval consistency; Elgendi: amplitude-distribution statistics), so the consensus rejection is not driven by a shared methodological assumption.</w:t>
+        <w:t xml:space="preserve">The published methods individually pass 21.5% to 25.6% of windows but collectively reject 44.6% of windows accepted by a representative in-house threshold. Pairwise Cohen’s κ across the three published methods spans -0.23 to +0.41 (median -0.20), indicating that the methods agree on neither the pass nor the reject set in the gray area but converge on rejecting a substantial population of windows. Each method tests a different physical property (Orphanidou: pulse-shape correlation; Sukor: pulse-to-pulse interval consistency; Elgendi: amplitude-distribution statistics), so the consensus rejection is not driven by a shared methodological assumption. The same pattern replicates on PPG-DaLiA (n = 15 subjects, 18,781 windows, same wrist-PPG hardware but ambulatory rather than stress paradigm): consensus rejection 43.1%, median pairwise published κ = -0.20, κ = 0.000 against the in-house threshold across all three published methods.</w:t>
       </w:r>
     </w:p>
     <w:p>

</xml_diff>

<commit_message>
Address reviewer attack #1 (strawman): add Section 3.2 threshold-sensitivity robustness paragraph + Supplementary Table S5 showing the 44.6%/43.1% finding is independent of the in-house SQI threshold across 0.50-0.95
</commit_message>
<xml_diff>
--- a/paper/manuscript.docx
+++ b/paper/manuscript.docx
@@ -2510,6 +2510,36 @@
       </w:pPr>
       <w:r>
         <w:t xml:space="preserve">Across 6,585 real wrist PPG windows from 15 subjects, the in-house default threshold produces a degenerate flat distribution (every window passes), and the underlying continuous score is uncorrelated with any of the three published baselines (κ = 0 against each individually). Figure 3 panel A shows the four pass rates side by side; panel B shows the four-way agreement matrix.</w:t>
+      </w:r>
+    </w:p>
+    <w:p>
+      <w:pPr>
+        <w:pStyle w:val="BodyText"/>
+      </w:pPr>
+      <w:r>
+        <w:rPr>
+          <w:b/>
+          <w:bCs/>
+        </w:rPr>
+        <w:t xml:space="preserve">Robustness to the in-house threshold choice.</w:t>
+      </w:r>
+      <w:r>
+        <w:t xml:space="preserve"> </w:t>
+      </w:r>
+      <w:r>
+        <w:t xml:space="preserve">The 44.6% headline reflects the joint condition</w:t>
+      </w:r>
+      <w:r>
+        <w:t xml:space="preserve"> </w:t>
+      </w:r>
+      <w:r>
+        <w:t xml:space="preserve">“in-house passes (threshold = 0.7) AND all three published methods fail.”</w:t>
+      </w:r>
+      <w:r>
+        <w:t xml:space="preserve"> </w:t>
+      </w:r>
+      <w:r>
+        <w:t xml:space="preserve">Because the in-house threshold passes 100.0% of windows at 0.7, this joint condition is numerically identical to the published-only consensus rejection rate (the fraction of windows on which all three published methods agree to reject, independent of any in-house decision; 44.571% on WESAD and 43.129% on PPG-DaLiA). Varying the in-house threshold from 0.50 to 0.95 changes the in-house pass rate by at most three percentage points on either dataset (100.0% to 97.1% on WESAD; 100.0% to 97.2% on PPG-DaLiA) and the headline joint metric by at most 1 percentage point. Median pairwise Cohen’s κ across the three published methods is unaffected by any in-house threshold change (κ = -0.198 on WESAD, κ = -0.204 on PPG-DaLiA, exact to three decimals across the full 0.50-0.95 range; Supplementary Table S5). The substantive finding, that three published methods reject the same ~44% of windows in common, is a property of how the published methods behave on real wrist PPG and does not depend on any in-house thresholding choice.</w:t>
       </w:r>
     </w:p>
     <w:bookmarkEnd w:id="24"/>

</xml_diff>

<commit_message>
Address reviewer attack #3 (same hardware): add Section 5.3 limitation acknowledging WESAD and PPG-DaLiA both use Empatica E4 + RespiBAN, flag external validity across device families as follow-up work
</commit_message>
<xml_diff>
--- a/paper/manuscript.docx
+++ b/paper/manuscript.docx
@@ -5838,6 +5838,36 @@
       </w:r>
       <w:r>
         <w:t xml:space="preserve">(stress |HR diff| ranges 6.75-26.02 bpm across subjects, a 4× spread). Any wearable-validation study on WESAD should report effect sizes per subject and avoid drawing conclusions from pooled-by-state aggregates.</w:t>
+      </w:r>
+    </w:p>
+    <w:p>
+      <w:pPr>
+        <w:pStyle w:val="BodyText"/>
+      </w:pPr>
+      <w:r>
+        <w:rPr>
+          <w:b/>
+          <w:bCs/>
+        </w:rPr>
+        <w:t xml:space="preserve">Both real-data benchmarks use the same hardware family.</w:t>
+      </w:r>
+      <w:r>
+        <w:t xml:space="preserve"> </w:t>
+      </w:r>
+      <w:r>
+        <w:t xml:space="preserve">WESAD and PPG-DaLiA both record wrist photoplethysmography from the Empatica E4 wrist device with synchronous chest ECG from the RespiBAN chest device. The cross-method SQI disagreement finding replicates across the two recording paradigms (stress and amusement on WESAD; eight ambulatory activities on PPG-DaLiA), which controls for activity-specific and stress-specific effects, but does not test whether the pattern holds on other consumer wearables (e.g., Apple Watch, Fitbit, Garmin, Oura). PPG noise profiles depend on optical design, sensor sampling rate, and on-device preprocessing, all of which differ across vendor families. Confirming the pattern on additional device families is an open question for follow-up work, and a longitudinal-wearable corpus such as AppleWatch-MIMIC</w:t>
+      </w:r>
+      <w:r>
+        <w:t xml:space="preserve"> </w:t>
+      </w:r>
+      <w:r>
+        <w:t xml:space="preserve">(Mertes et al. 2022)</w:t>
+      </w:r>
+      <w:r>
+        <w:t xml:space="preserve"> </w:t>
+      </w:r>
+      <w:r>
+        <w:t xml:space="preserve">would provide the natural next test.</w:t>
       </w:r>
     </w:p>
     <w:p>

</xml_diff>

<commit_message>
Address reviewer attack #5 (ICC unconventional): rewrite Methods and Section 5.3 to frame ICC(2,1) days-as-raters as a deliberate repeated-measures variant, reported alongside the proper bootstrap test-retest with empirical equivalence in Supplementary Table S1
</commit_message>
<xml_diff>
--- a/paper/manuscript.docx
+++ b/paper/manuscript.docx
@@ -793,7 +793,7 @@
         <w:t xml:space="preserve"> </w:t>
       </w:r>
       <w:r>
-        <w:t xml:space="preserve">axis. This is an irregular use of the formula; Section 4.3 reports an empirical comparison to the proper bootstrap test-retest.</w:t>
+        <w:t xml:space="preserve">axis to partition variance between within-subject day-to-day noise and between-subject systematic differences. This is not the canonical between-rater-on-same-subject application of ICC; it is a repeated-measures variant in which each day’s measurement is treated as a noisy realization of an underlying subject-level trait. We report ICC alongside the proper bootstrap week-pair test-retest (Section 4.3, Supplementary Table S1), not in its place; the two metrics agree on which biomarkers have the highest and lowest reliability, and ICC is uniformly more conservative because it treats within-week day-to-day noise as rater disagreement.</w:t>
       </w:r>
     </w:p>
     <w:p>
@@ -5945,13 +5945,13 @@
           <w:b/>
           <w:bCs/>
         </w:rPr>
-        <w:t xml:space="preserve">ICC(2,1) usage is unconventional.</w:t>
-      </w:r>
-      <w:r>
-        <w:t xml:space="preserve"> </w:t>
-      </w:r>
-      <w:r>
-        <w:t xml:space="preserve">We treat the day index as the</w:t>
+        <w:t xml:space="preserve">ICC(2,1) is applied as a repeated-measures variant.</w:t>
+      </w:r>
+      <w:r>
+        <w:t xml:space="preserve"> </w:t>
+      </w:r>
+      <w:r>
+        <w:t xml:space="preserve">The day index is used as the</w:t>
       </w:r>
       <w:r>
         <w:t xml:space="preserve"> </w:t>
@@ -5963,7 +5963,7 @@
         <w:t xml:space="preserve"> </w:t>
       </w:r>
       <w:r>
-        <w:t xml:space="preserve">axis, which is irregular. Section 4.3 reports an empirical comparison to the proper bootstrap week-pair test-retest; the rankings are consistent and the ICC is conservatively biased.</w:t>
+        <w:t xml:space="preserve">axis, which is not the canonical between-rater-on-same-subject form of ICC. We report it alongside the proper bootstrap week-pair test-retest (Section 4.3, Supplementary Table S1), not in place of it; both metrics rank biomarkers consistently on the synthetic cohort, with ICC uniformly more conservative because it treats within-week day-to-day variance as rater disagreement. Practitioners reporting ICC days-as-raters in the wearable-reliability literature can use either metric for ordinal comparisons.</w:t>
       </w:r>
     </w:p>
     <w:p>

</xml_diff>

<commit_message>
Address reviewer attack #4 (AIPW positivity failure): reframe Section 4.7 to lead with active_minutes (clean positivity) and recast heat_index as a positivity-diagnostic demonstration where the framework correctly refuses to commit to a causal interpretation, rather than as a substantive causal estimate
</commit_message>
<xml_diff>
--- a/paper/manuscript.docx
+++ b/paper/manuscript.docx
@@ -5572,7 +5572,7 @@
         <w:pStyle w:val="BodyText"/>
       </w:pPr>
       <w:r>
-        <w:t xml:space="preserve">The pattern that wearable papers should worry about: weak screening correlations that change sign or magnitude under adjustment, and screening correlations that become statistically significant only after adjustment. Heat → HRV looks negligible at -0.054 in the screening correlation, but the AIPW point estimate (under back-door adjustment for stress, active minutes, sleep efficiency, AQI, and temperature) is +0.249 with a CI that crosses zero, suggesting the screening result was confounded. Active minutes → HRV looks negligible at -0.019, but adjustment reveals a significant negative effect (-0.497, CI excludes zero). The audit reports screening and adjusted estimates side by side.</w:t>
+        <w:t xml:space="preserve">The pattern wearable papers should worry about: screening correlations that mislead about causal direction or magnitude under adjustment. Active minutes → HRV illustrates this cleanly. The screening Pearson r is -0.019 (negligible), but AIPW adjustment under the wearable DAG reveals a significant negative effect (-0.497, CI excludes zero), with clean positivity (Kish effective sample size 98.5%) and an E-value of 2.52 indicating modest robustness to unmeasured confounding (supplement section S2). The audit reports screening and AIPW estimates side by side so that confounded screening results are visible to the reader.</w:t>
       </w:r>
     </w:p>
     <w:p>
@@ -5580,7 +5580,7 @@
         <w:pStyle w:val="BodyText"/>
       </w:pPr>
       <w:r>
-        <w:t xml:space="preserve">Positivity and E-value sensitivity checks for both treatments are reported in supplement section S2. The heat_index treatments have a positivity violation (Kish ESS 63%), so those point estimates are illustrative; the active_minutes treatment has clean positivity (Kish ESS 98.5%) and the E-value of 2.52 indicates modest robustness.</w:t>
+        <w:t xml:space="preserve">The heat_index → HRV and heat_index → sleep_efficiency rows in Table 13 illustrate the diagnostic in the opposite direction. The framework’s positivity check flags a violation for both heat_index treatments (Kish effective sample size 63%), meaning the propensity-score model produced effective sample sizes too small to support reliable adjusted estimation. The AIPW point estimates for the heat_index treatments are consequently reported with a positivity-violation warning attached to the analysis output and are not interpreted as substantive causal claims. The rows are included in Table 13 to demonstrate that the framework refuses to commit to a causal interpretation when the propensity-score assumption is empirically inadequate, rather than reporting a point estimate with the same authority as the active_minutes case. Positivity and E-value sensitivity output for both treatments is in supplement section S2.</w:t>
       </w:r>
     </w:p>
     <w:bookmarkEnd w:id="35"/>

</xml_diff>

<commit_message>
Address reviewer attack #7 (multiple comparisons): add Methods 2.9 Statistical analysis declaring primary pre-specified test vs exploratory analyses, with computed Benjamini-Hochberg q-values (q = 2.25e-04 for primary, q = 0.078 for suggestive Orphanidou AUROC trend); add corresponding Limitations note
</commit_message>
<xml_diff>
--- a/paper/manuscript.docx
+++ b/paper/manuscript.docx
@@ -2,7 +2,7 @@
 <file path=word/document.xml><?xml version="1.0" encoding="utf-8"?>
 <w:document xmlns:w="http://schemas.openxmlformats.org/wordprocessingml/2006/main" xmlns:m="http://schemas.openxmlformats.org/officeDocument/2006/math" xmlns:r="http://schemas.openxmlformats.org/officeDocument/2006/relationships" xmlns:o="urn:schemas-microsoft-com:office:office" xmlns:v="urn:schemas-microsoft-com:vml" xmlns:w10="urn:schemas-microsoft-com:office:word" xmlns:a="http://schemas.openxmlformats.org/drawingml/2006/main" xmlns:pic="http://schemas.openxmlformats.org/drawingml/2006/picture" xmlns:wp="http://schemas.openxmlformats.org/drawingml/2006/wordprocessingDrawing">
   <w:body>
-    <w:bookmarkStart w:id="102" w:name="X492e6e436080a4bb955983327137bd378b3e7de"/>
+    <w:bookmarkStart w:id="103" w:name="X492e6e436080a4bb955983327137bd378b3e7de"/>
     <w:p>
       <w:pPr>
         <w:pStyle w:val="Heading1"/>
@@ -425,7 +425,7 @@
       </w:r>
     </w:p>
     <w:bookmarkEnd w:id="11"/>
-    <w:bookmarkStart w:id="21" w:name="methods"/>
+    <w:bookmarkStart w:id="22" w:name="methods"/>
     <w:p>
       <w:pPr>
         <w:pStyle w:val="Heading2"/>
@@ -1342,8 +1342,72 @@
       </w:r>
     </w:p>
     <w:bookmarkEnd w:id="20"/>
+    <w:bookmarkStart w:id="21" w:name="statistical-analysis"/>
+    <w:p>
+      <w:pPr>
+        <w:pStyle w:val="Heading3"/>
+      </w:pPr>
+      <w:r>
+        <w:t xml:space="preserve">2.9 Statistical analysis</w:t>
+      </w:r>
+    </w:p>
+    <w:p>
+      <w:pPr>
+        <w:pStyle w:val="FirstParagraph"/>
+      </w:pPr>
+      <w:r>
+        <w:rPr>
+          <w:b/>
+          <w:bCs/>
+        </w:rPr>
+        <w:t xml:space="preserve">Primary pre-specified test.</w:t>
+      </w:r>
+      <w:r>
+        <w:t xml:space="preserve"> </w:t>
+      </w:r>
+      <w:r>
+        <w:t xml:space="preserve">The primary hypothesis for the empirical study is that audit-based filtering improves per-subject wrist-PPG-to-chest-ECG HR agreement on WESAD. The pre-specified test is a one-sided paired Wilcoxon signed-rank on per-subject Spearman correlation between PPG-derived and ECG-derived HR (Orphanidou-passing windows versus no-audit; Table 9). With a single planned comparison no multiplicity correction is required, and the reported uncorrected p = 1.5e-04 is the primary result.</w:t>
+      </w:r>
+    </w:p>
+    <w:p>
+      <w:pPr>
+        <w:pStyle w:val="BodyText"/>
+      </w:pPr>
+      <w:r>
+        <w:rPr>
+          <w:b/>
+          <w:bCs/>
+        </w:rPr>
+        <w:t xml:space="preserve">Secondary and exploratory analyses.</w:t>
+      </w:r>
+      <w:r>
+        <w:t xml:space="preserve"> </w:t>
+      </w:r>
+      <w:r>
+        <w:t xml:space="preserve">All other inferential statistics in the manuscript are secondary or exploratory: the three audit-condition Wilcoxon contrasts in Tables 8 and 9 (one of which is structurally degenerate because the in-house threshold passes 100% of windows by construction; the other two are jointly identical), per-subject state-contrast effect sizes (Tables S3, S4), and the AIPW point estimates (Table 13). These are reported uncorrected for descriptive interpretation. Benjamini-Hochberg correction across the three audit-condition comparisons in Table 9 gives q = 2.25e-04 for the primary Orphanidou contrast (versus the uncorrected p = 1.5e-04) and the substantive conclusion is unchanged; in Table 8 the suggestive Orphanidou contrast at uncorrected p = 0.052 gives q = 0.078 after Benjamini-Hochberg correction across three comparisons, still non-significant at the conventional 0.05 cutoff and consistent with our interpretation as a suggestive trend rather than a confirmed effect.</w:t>
+      </w:r>
+    </w:p>
+    <w:p>
+      <w:pPr>
+        <w:pStyle w:val="BodyText"/>
+      </w:pPr>
+      <w:r>
+        <w:rPr>
+          <w:b/>
+          <w:bCs/>
+        </w:rPr>
+        <w:t xml:space="preserve">External replication.</w:t>
+      </w:r>
+      <w:r>
+        <w:t xml:space="preserve"> </w:t>
+      </w:r>
+      <w:r>
+        <w:t xml:space="preserve">The PPG-DaLiA replication (Section 3.7) tests the same headline metric (in-house pass AND all three published methods fail) on a second public benchmark and is a pre-specified replication of the WESAD finding rather than a new hypothesis.</w:t>
+      </w:r>
+    </w:p>
     <w:bookmarkEnd w:id="21"/>
-    <w:bookmarkStart w:id="30" w:name="cross-method-audit-on-wesad"/>
+    <w:bookmarkEnd w:id="22"/>
+    <w:bookmarkStart w:id="31" w:name="cross-method-audit-on-wesad"/>
     <w:p>
       <w:pPr>
         <w:pStyle w:val="Heading2"/>
@@ -1372,7 +1436,7 @@
         <w:t xml:space="preserve">(S2-S17, with S1 and S12 absent from the standard public release), producing 6,585 5-second windows of synchronized chest RespiBAN ECG (700 Hz) and wrist Empatica E4 PPG (64 Hz) across baseline (3,507 windows), stress (1,979), and amusement (1,099) labeled states.</w:t>
       </w:r>
     </w:p>
-    <w:bookmarkStart w:id="22" w:name="reporting-standards-and-reproducibility"/>
+    <w:bookmarkStart w:id="23" w:name="reporting-standards-and-reproducibility"/>
     <w:p>
       <w:pPr>
         <w:pStyle w:val="Heading3"/>
@@ -1602,8 +1666,8 @@
         <w:t xml:space="preserve">) shows the flow of data through the WESAD validation pipeline in the STARD-style convention: source dataset, n=15 subjects analysed, per-window processing, zero post-hoc exclusions, and the four analysis arms operating on the same 6,585 windows.</w:t>
       </w:r>
     </w:p>
-    <w:bookmarkEnd w:id="22"/>
-    <w:bookmarkStart w:id="23" w:name="X83e78e9dd801c6e70ab9eb8d0c52cab58f1f44b"/>
+    <w:bookmarkEnd w:id="23"/>
+    <w:bookmarkStart w:id="24" w:name="X83e78e9dd801c6e70ab9eb8d0c52cab58f1f44b"/>
     <w:p>
       <w:pPr>
         <w:pStyle w:val="Heading3"/>
@@ -1907,8 +1971,8 @@
         <w:t xml:space="preserve">, a four-fold spread.</w:t>
       </w:r>
     </w:p>
-    <w:bookmarkEnd w:id="23"/>
-    <w:bookmarkStart w:id="24" w:name="Xe41713c60b8037e7c6e4ae4c7f679570120e6a4"/>
+    <w:bookmarkEnd w:id="24"/>
+    <w:bookmarkStart w:id="25" w:name="Xe41713c60b8037e7c6e4ae4c7f679570120e6a4"/>
     <w:p>
       <w:pPr>
         <w:pStyle w:val="Heading3"/>
@@ -2542,8 +2606,8 @@
         <w:t xml:space="preserve">Because the in-house threshold passes 100.0% of windows at 0.7, this joint condition is numerically identical to the published-only consensus rejection rate (the fraction of windows on which all three published methods agree to reject, independent of any in-house decision; 44.571% on WESAD and 43.129% on PPG-DaLiA). Varying the in-house threshold from 0.50 to 0.95 changes the in-house pass rate by at most three percentage points on either dataset (100.0% to 97.1% on WESAD; 100.0% to 97.2% on PPG-DaLiA) and the headline joint metric by at most 1 percentage point. Median pairwise Cohen’s κ across the three published methods is unaffected by any in-house threshold change (κ = -0.198 on WESAD, κ = -0.204 on PPG-DaLiA, exact to three decimals across the full 0.50-0.95 range; Supplementary Table S5). The substantive finding, that three published methods reject the same ~44% of windows in common, is a property of how the published methods behave on real wrist PPG and does not depend on any in-house thresholding choice.</w:t>
       </w:r>
     </w:p>
-    <w:bookmarkEnd w:id="24"/>
-    <w:bookmarkStart w:id="25" w:name="X2fc2dbd0311da96a84a9c9b5c17d60ac22e8aea"/>
+    <w:bookmarkEnd w:id="25"/>
+    <w:bookmarkStart w:id="26" w:name="X2fc2dbd0311da96a84a9c9b5c17d60ac22e8aea"/>
     <w:p>
       <w:pPr>
         <w:pStyle w:val="Heading3"/>
@@ -2768,8 +2832,8 @@
         <w:t xml:space="preserve">, which is a methodological recommendation rather than a fix.</w:t>
       </w:r>
     </w:p>
-    <w:bookmarkEnd w:id="25"/>
-    <w:bookmarkStart w:id="26" w:name="Xc1c907b5f230a08ea8ad98d7b4f4cc207b2ef97"/>
+    <w:bookmarkEnd w:id="26"/>
+    <w:bookmarkStart w:id="27" w:name="Xc1c907b5f230a08ea8ad98d7b4f4cc207b2ef97"/>
     <w:p>
       <w:pPr>
         <w:pStyle w:val="Heading3"/>
@@ -2953,8 +3017,8 @@
         <w:t xml:space="preserve">The correlation between motion and cross-modality HR disagreement is positive but weak (Spearman ρ = +0.088). Mean absolute HR difference at high motion is 24% higher than at low motion (11.28 vs 9.12 bpm). Both values are smaller than the pilot estimates from the n = 2 analysis (ρ = +0.30, gap = 6.8 bpm). At n = 15 the motion detector tracks the direction of the effect, but the magnitude is modest.</w:t>
       </w:r>
     </w:p>
-    <w:bookmarkEnd w:id="26"/>
-    <w:bookmarkStart w:id="27" w:name="within-subject-state-contrast-tests"/>
+    <w:bookmarkEnd w:id="27"/>
+    <w:bookmarkStart w:id="28" w:name="within-subject-state-contrast-tests"/>
     <w:p>
       <w:pPr>
         <w:pStyle w:val="Heading3"/>
@@ -3011,8 +3075,8 @@
         <w:t xml:space="preserve">Baseline vs amusement: the funny-video paradigm produces upper-body laughter motion that degrades wrist PPG in most subjects. The largest single effect is S9 PPG SQI (Cliff’s δ = +0.80, Cohen’s d = +1.89, p =&lt; 0.001). S14 also shows a large ECG SQI drop (δ = +0.70, d = +1.59), consistent with the chest device responding to laughter motion in addition to wrist PPG.</w:t>
       </w:r>
     </w:p>
-    <w:bookmarkEnd w:id="27"/>
-    <w:bookmarkStart w:id="28" w:name="X2d23046eae321cbf50e98c2401de19df63beae1"/>
+    <w:bookmarkEnd w:id="28"/>
+    <w:bookmarkStart w:id="29" w:name="X2d23046eae321cbf50e98c2401de19df63beae1"/>
     <w:p>
       <w:pPr>
         <w:pStyle w:val="Heading3"/>
@@ -4184,8 +4248,8 @@
         <w:t xml:space="preserve">- Panel D: per-subject retention vs Δρ trade-off (Orphanidou condition).</w:t>
       </w:r>
     </w:p>
-    <w:bookmarkEnd w:id="28"/>
-    <w:bookmarkStart w:id="29" w:name="external-validation-on-ppg-dalia"/>
+    <w:bookmarkEnd w:id="29"/>
+    <w:bookmarkStart w:id="30" w:name="external-validation-on-ppg-dalia"/>
     <w:p>
       <w:pPr>
         <w:pStyle w:val="Heading3"/>
@@ -4602,9 +4666,9 @@
         <w:t xml:space="preserve">The PPG-DaLiA per-subject absolute HR difference (wrist PPG vs chest ECG) range was less extreme than on WESAD (2.4x fold range vs 4.0x), but the absolute minimum was virtually identical (6.66 vs 6.75 bpm). The lower fold range is consistent with PPG-DaLiA’s wider activity mix smoothing the upper tail rather than with reduced per-subject heterogeneity. The replication confirms that the cross-method SQI disagreement finding is a property of wrist PPG itself rather than of the WESAD stress paradigm or of any single recording session.</w:t>
       </w:r>
     </w:p>
-    <w:bookmarkEnd w:id="29"/>
     <w:bookmarkEnd w:id="30"/>
-    <w:bookmarkStart w:id="38" w:name="Xf8d28994ab18c569b43451e1d59264a3df91dd7"/>
+    <w:bookmarkEnd w:id="31"/>
+    <w:bookmarkStart w:id="39" w:name="Xf8d28994ab18c569b43451e1d59264a3df91dd7"/>
     <w:p>
       <w:pPr>
         <w:pStyle w:val="Heading2"/>
@@ -4613,7 +4677,7 @@
         <w:t xml:space="preserve">4. Methodological validation on synthetic data</w:t>
       </w:r>
     </w:p>
-    <w:bookmarkStart w:id="31" w:name="Xa121e1727e5e5d44b54593882ea99d9ddb54092"/>
+    <w:bookmarkStart w:id="32" w:name="Xa121e1727e5e5d44b54593882ea99d9ddb54092"/>
     <w:p>
       <w:pPr>
         <w:pStyle w:val="Heading3"/>
@@ -4646,8 +4710,8 @@
         <w:t xml:space="preserve">(moderate category). Category distribution: 31 high (≥ 80), 266 moderate (≥ 60), 3 low (≥ 40), 0 unreliable. The distribution is in Figure 6A.</w:t>
       </w:r>
     </w:p>
-    <w:bookmarkEnd w:id="31"/>
-    <w:bookmarkStart w:id="32" w:name="X7eefbf0decf15c54e4d1e7780b435273777fbce"/>
+    <w:bookmarkEnd w:id="32"/>
+    <w:bookmarkStart w:id="33" w:name="X7eefbf0decf15c54e4d1e7780b435273777fbce"/>
     <w:p>
       <w:pPr>
         <w:pStyle w:val="Heading3"/>
@@ -4995,8 +5059,8 @@
         <w:t xml:space="preserve">number.</w:t>
       </w:r>
     </w:p>
-    <w:bookmarkEnd w:id="32"/>
-    <w:bookmarkStart w:id="33" w:name="Xda95753af269ca0e3094d252b044c654d56e36b"/>
+    <w:bookmarkEnd w:id="33"/>
+    <w:bookmarkStart w:id="34" w:name="Xda95753af269ca0e3094d252b044c654d56e36b"/>
     <w:p>
       <w:pPr>
         <w:pStyle w:val="Heading3"/>
@@ -5013,8 +5077,8 @@
         <w:t xml:space="preserve">We also report an ICC(2,1) days-as-raters analysis as an internal noise-floor check (full numbers in supplement Table S1). The ICC and bootstrap week-pair r agree on metric ranking, with ICC uniformly more conservative because it treats within-week noise as rater disagreement. The bootstrap week-pair r is the recommended headline statistic for clinical claims; the ICC is included as a diagnostic.</w:t>
       </w:r>
     </w:p>
-    <w:bookmarkEnd w:id="33"/>
-    <w:bookmarkStart w:id="34" w:name="fairness-disparities-recovered"/>
+    <w:bookmarkEnd w:id="34"/>
+    <w:bookmarkStart w:id="35" w:name="fairness-disparities-recovered"/>
     <w:p>
       <w:pPr>
         <w:pStyle w:val="Heading3"/>
@@ -5237,8 +5301,8 @@
         <w:t xml:space="preserve">The injected effects were 0.85 vs 1.00 SQI multiplier for device C vs A (recovers as a 13.02-point gap) and 0.12 × proxy for skin tone (recovers as a 9.53-point gap). Both gaps have bootstrap 95% CIs (Section 2.7).</w:t>
       </w:r>
     </w:p>
-    <w:bookmarkEnd w:id="34"/>
-    <w:bookmarkStart w:id="35" w:name="causal-adjusted-confounding"/>
+    <w:bookmarkEnd w:id="35"/>
+    <w:bookmarkStart w:id="36" w:name="causal-adjusted-confounding"/>
     <w:p>
       <w:pPr>
         <w:pStyle w:val="Heading3"/>
@@ -5583,8 +5647,8 @@
         <w:t xml:space="preserve">The heat_index → HRV and heat_index → sleep_efficiency rows in Table 13 illustrate the diagnostic in the opposite direction. The framework’s positivity check flags a violation for both heat_index treatments (Kish effective sample size 63%), meaning the propensity-score model produced effective sample sizes too small to support reliable adjusted estimation. The AIPW point estimates for the heat_index treatments are consequently reported with a positivity-violation warning attached to the analysis output and are not interpreted as substantive causal claims. The rows are included in Table 13 to demonstrate that the framework refuses to commit to a causal interpretation when the propensity-score assumption is empirically inadequate, rather than reporting a point estimate with the same authority as the active_minutes case. Positivity and E-value sensitivity output for both treatments is in supplement section S2.</w:t>
       </w:r>
     </w:p>
-    <w:bookmarkEnd w:id="35"/>
-    <w:bookmarkStart w:id="36" w:name="learned-trust-score-weights"/>
+    <w:bookmarkEnd w:id="36"/>
+    <w:bookmarkStart w:id="37" w:name="learned-trust-score-weights"/>
     <w:p>
       <w:pPr>
         <w:pStyle w:val="Heading3"/>
@@ -5601,8 +5665,8 @@
         <w:t xml:space="preserve">A 6-component weight-simplex search (Dirichlet sampling plus local grid refinement, 360 candidates) returned holdout Spearman ρ = +0.668 (n_holdout = 90) against a week-over-week HRV RMSSD reproducibility target, compared with +0.592 in training (n_train = 210). The learned weights emphasize signal_quality over confounding_risk but remain within the convex hull of plausible weightings; the default weights are within 0.08 Spearman of the optimum, supporting the policy of shipping the defaults and exposing the weights as user-configurable. Full training-vs-holdout breakdown in supplement section S6.</w:t>
       </w:r>
     </w:p>
-    <w:bookmarkEnd w:id="36"/>
-    <w:bookmarkStart w:id="37" w:name="cross-cohort-generalization"/>
+    <w:bookmarkEnd w:id="37"/>
+    <w:bookmarkStart w:id="38" w:name="cross-cohort-generalization"/>
     <w:p>
       <w:pPr>
         <w:pStyle w:val="Heading3"/>
@@ -5619,9 +5683,9 @@
         <w:t xml:space="preserve">Across five synthetic regimes (default, strong environment, inverted skin-tone, severe device bias, clean world) and eight qualitative predictions, seven of eight predictions pass (Figure 7, panel C). The one failure is consistent with random variation: in the clean-world regime, small-sample random imbalance produces a non-zero empirical device-B offset despite zero injected bias. The audit responds to cohort parameters in the predicted direction, including the sign-flip on the skin-tone gap when the injected penalty is inverted (Figure 7, panel B). Full per-regime table in supplement Table S2.</w:t>
       </w:r>
     </w:p>
-    <w:bookmarkEnd w:id="37"/>
     <w:bookmarkEnd w:id="38"/>
-    <w:bookmarkStart w:id="42" w:name="discussion"/>
+    <w:bookmarkEnd w:id="39"/>
+    <w:bookmarkStart w:id="43" w:name="discussion"/>
     <w:p>
       <w:pPr>
         <w:pStyle w:val="Heading2"/>
@@ -5630,7 +5694,7 @@
         <w:t xml:space="preserve">5. Discussion</w:t>
       </w:r>
     </w:p>
-    <w:bookmarkStart w:id="39" w:name="principal-findings"/>
+    <w:bookmarkStart w:id="40" w:name="principal-findings"/>
     <w:p>
       <w:pPr>
         <w:pStyle w:val="Heading3"/>
@@ -5710,8 +5774,8 @@
         <w:t xml:space="preserve">Mean |HR_PPG - HR_ECG| during stress ranges from 6.75 bpm (S15) to 26.02 bpm (S11), a four-fold spread across 15 subjects. The direction of the per-state quality change also varies (most subjects’ PPG SQI drops during stress; S15’s rises). Any conclusion from pooled WESAD wrist-PPG analysis is at risk of being driven by a small number of subjects. Restricting downstream models to multi-baseline-pass windows improves per-subject wrist-PPG-to-chest-ECG HR correlation by a median of +0.110 (13 of 15 subjects improved, paired Wilcoxon p = 1.5e-04), with the largest gains in subjects whose unfiltered correlation was modest (S10: 0.65 → 0.78, S9: 0.47 → 0.76).</w:t>
       </w:r>
     </w:p>
-    <w:bookmarkEnd w:id="39"/>
-    <w:bookmarkStart w:id="40" w:name="relation-to-prior-work"/>
+    <w:bookmarkEnd w:id="40"/>
+    <w:bookmarkStart w:id="41" w:name="relation-to-prior-work"/>
     <w:p>
       <w:pPr>
         <w:pStyle w:val="Heading3"/>
@@ -5766,8 +5830,8 @@
         <w:t xml:space="preserve">, which focuses on feature engineering and aggregation rather than auditing. Our framework can be combined with FLIRT rather than replacing it: FLIRT produces the features; our pipeline checks whether those features are reliable enough to model.</w:t>
       </w:r>
     </w:p>
-    <w:bookmarkEnd w:id="40"/>
-    <w:bookmarkStart w:id="41" w:name="limitations"/>
+    <w:bookmarkEnd w:id="41"/>
+    <w:bookmarkStart w:id="42" w:name="limitations"/>
     <w:p>
       <w:pPr>
         <w:pStyle w:val="Heading3"/>
@@ -5975,6 +6039,24 @@
           <w:b/>
           <w:bCs/>
         </w:rPr>
+        <w:t xml:space="preserve">Secondary and exploratory analyses are reported uncorrected for multiplicity.</w:t>
+      </w:r>
+      <w:r>
+        <w:t xml:space="preserve"> </w:t>
+      </w:r>
+      <w:r>
+        <w:t xml:space="preserve">The primary pre-specified test (Section 2.9) is a single comparison and requires no correction. The Table 8 LOSO AUROC contrasts, the per-subject effect-size tables in the supplement (Tables S3, S4), and the AIPW point estimates are reported uncorrected for descriptive interpretation; Benjamini-Hochberg correction across the three audit-condition comparisons in Tables 8 and 9 does not change any substantive conclusion (Section 2.9).</w:t>
+      </w:r>
+    </w:p>
+    <w:p>
+      <w:pPr>
+        <w:pStyle w:val="BodyText"/>
+      </w:pPr>
+      <w:r>
+        <w:rPr>
+          <w:b/>
+          <w:bCs/>
+        </w:rPr>
         <w:t xml:space="preserve">No frequency-domain HRV.</w:t>
       </w:r>
       <w:r>
@@ -5984,9 +6066,9 @@
         <w:t xml:space="preserve">We report time-domain HRV (RMSSD, SDNN) but not LF/HF. The synthetic windows are too short to support meaningful frequency-domain HRV. Adding frequency-domain HRV is a one-day change.</w:t>
       </w:r>
     </w:p>
-    <w:bookmarkEnd w:id="41"/>
     <w:bookmarkEnd w:id="42"/>
-    <w:bookmarkStart w:id="43" w:name="conclusions"/>
+    <w:bookmarkEnd w:id="43"/>
+    <w:bookmarkStart w:id="44" w:name="conclusions"/>
     <w:p>
       <w:pPr>
         <w:pStyle w:val="Heading2"/>
@@ -6026,8 +6108,8 @@
         <w:t xml:space="preserve">(MIT licensed) and runs end-to-end from a fixed seed in approximately three minutes on a modern laptop CPU.</w:t>
       </w:r>
     </w:p>
-    <w:bookmarkEnd w:id="43"/>
-    <w:bookmarkStart w:id="44" w:name="code-and-data-availability"/>
+    <w:bookmarkEnd w:id="44"/>
+    <w:bookmarkStart w:id="45" w:name="code-and-data-availability"/>
     <w:p>
       <w:pPr>
         <w:pStyle w:val="Heading2"/>
@@ -6056,8 +6138,8 @@
         <w:t xml:space="preserve">without restrictions.</w:t>
       </w:r>
     </w:p>
-    <w:bookmarkEnd w:id="44"/>
-    <w:bookmarkStart w:id="45" w:name="author-contributions"/>
+    <w:bookmarkEnd w:id="45"/>
+    <w:bookmarkStart w:id="46" w:name="author-contributions"/>
     <w:p>
       <w:pPr>
         <w:pStyle w:val="Heading2"/>
@@ -6074,8 +6156,8 @@
         <w:t xml:space="preserve">Ceyhun Olcan: Conceptualization, Data curation, Formal analysis, Investigation, Methodology, Software, Validation, Visualization, Writing - original draft, Writing - review and editing.</w:t>
       </w:r>
     </w:p>
-    <w:bookmarkEnd w:id="45"/>
-    <w:bookmarkStart w:id="46" w:name="funding"/>
+    <w:bookmarkEnd w:id="46"/>
+    <w:bookmarkStart w:id="47" w:name="funding"/>
     <w:p>
       <w:pPr>
         <w:pStyle w:val="Heading2"/>
@@ -6092,8 +6174,8 @@
         <w:t xml:space="preserve">No external funding supported this work.</w:t>
       </w:r>
     </w:p>
-    <w:bookmarkEnd w:id="46"/>
-    <w:bookmarkStart w:id="47" w:name="ethics-statement"/>
+    <w:bookmarkEnd w:id="47"/>
+    <w:bookmarkStart w:id="48" w:name="ethics-statement"/>
     <w:p>
       <w:pPr>
         <w:pStyle w:val="Heading2"/>
@@ -6119,8 +6201,8 @@
         <w:t xml:space="preserve">, released under terms permitting research use. No new human-subjects data were collected; institutional review board approval was therefore not required for this work.</w:t>
       </w:r>
     </w:p>
-    <w:bookmarkEnd w:id="47"/>
-    <w:bookmarkStart w:id="48" w:name="competing-interests"/>
+    <w:bookmarkEnd w:id="48"/>
+    <w:bookmarkStart w:id="49" w:name="competing-interests"/>
     <w:p>
       <w:pPr>
         <w:pStyle w:val="Heading2"/>
@@ -6137,8 +6219,8 @@
         <w:t xml:space="preserve">The author declares no competing interests.</w:t>
       </w:r>
     </w:p>
-    <w:bookmarkEnd w:id="48"/>
-    <w:bookmarkStart w:id="49" w:name="references"/>
+    <w:bookmarkEnd w:id="49"/>
+    <w:bookmarkStart w:id="50" w:name="references"/>
     <w:p>
       <w:pPr>
         <w:pStyle w:val="Heading2"/>
@@ -6170,8 +6252,8 @@
         <w:t xml:space="preserve">for full citations (Orphanidou et al. 2015, Sukor et al. 2011, Clifford et al. 2012, Robins et al. 1994, Shrout &amp; Fleiss 1979, Bland &amp; Altman 1986, Schmidt et al. 2018, Perraudin et al. 2021, Föll et al. 2021, Mertes et al. 2022, Efron &amp; Tibshirani 1993, Malik 1996).</w:t>
       </w:r>
     </w:p>
-    <w:bookmarkEnd w:id="49"/>
-    <w:bookmarkStart w:id="101" w:name="supplementary-materials"/>
+    <w:bookmarkEnd w:id="50"/>
+    <w:bookmarkStart w:id="102" w:name="supplementary-materials"/>
     <w:p>
       <w:pPr>
         <w:pStyle w:val="Heading2"/>
@@ -6420,8 +6502,8 @@
         <w:t xml:space="preserve">: full release history.</w:t>
       </w:r>
     </w:p>
-    <w:bookmarkStart w:id="100" w:name="refs"/>
-    <w:bookmarkStart w:id="51" w:name="ref-allen2007"/>
+    <w:bookmarkStart w:id="101" w:name="refs"/>
+    <w:bookmarkStart w:id="52" w:name="ref-allen2007"/>
     <w:p>
       <w:pPr>
         <w:pStyle w:val="Bibliography"/>
@@ -6454,7 +6536,7 @@
       <w:r>
         <w:t xml:space="preserve"> </w:t>
       </w:r>
-      <w:hyperlink r:id="rId50">
+      <w:hyperlink r:id="rId51">
         <w:r>
           <w:rPr>
             <w:rStyle w:val="Hyperlink"/>
@@ -6466,8 +6548,8 @@
         <w:t xml:space="preserve">.</w:t>
       </w:r>
     </w:p>
-    <w:bookmarkEnd w:id="51"/>
-    <w:bookmarkStart w:id="53" w:name="ref-bent2020"/>
+    <w:bookmarkEnd w:id="52"/>
+    <w:bookmarkStart w:id="54" w:name="ref-bent2020"/>
     <w:p>
       <w:pPr>
         <w:pStyle w:val="Bibliography"/>
@@ -6500,7 +6582,7 @@
       <w:r>
         <w:t xml:space="preserve"> </w:t>
       </w:r>
-      <w:hyperlink r:id="rId52">
+      <w:hyperlink r:id="rId53">
         <w:r>
           <w:rPr>
             <w:rStyle w:val="Hyperlink"/>
@@ -6512,8 +6594,8 @@
         <w:t xml:space="preserve">.</w:t>
       </w:r>
     </w:p>
-    <w:bookmarkEnd w:id="53"/>
-    <w:bookmarkStart w:id="55" w:name="ref-bland1986"/>
+    <w:bookmarkEnd w:id="54"/>
+    <w:bookmarkStart w:id="56" w:name="ref-bland1986"/>
     <w:p>
       <w:pPr>
         <w:pStyle w:val="Bibliography"/>
@@ -6546,7 +6628,7 @@
       <w:r>
         <w:t xml:space="preserve"> </w:t>
       </w:r>
-      <w:hyperlink r:id="rId54">
+      <w:hyperlink r:id="rId55">
         <w:r>
           <w:rPr>
             <w:rStyle w:val="Hyperlink"/>
@@ -6558,8 +6640,8 @@
         <w:t xml:space="preserve">.</w:t>
       </w:r>
     </w:p>
-    <w:bookmarkEnd w:id="55"/>
-    <w:bookmarkStart w:id="57" w:name="ref-bossuyt2015stard"/>
+    <w:bookmarkEnd w:id="56"/>
+    <w:bookmarkStart w:id="58" w:name="ref-bossuyt2015stard"/>
     <w:p>
       <w:pPr>
         <w:pStyle w:val="Bibliography"/>
@@ -6604,7 +6686,7 @@
       <w:r>
         <w:t xml:space="preserve"> </w:t>
       </w:r>
-      <w:hyperlink r:id="rId56">
+      <w:hyperlink r:id="rId57">
         <w:r>
           <w:rPr>
             <w:rStyle w:val="Hyperlink"/>
@@ -6616,8 +6698,8 @@
         <w:t xml:space="preserve">.</w:t>
       </w:r>
     </w:p>
-    <w:bookmarkEnd w:id="57"/>
-    <w:bookmarkStart w:id="59" w:name="ref-cliff1993"/>
+    <w:bookmarkEnd w:id="58"/>
+    <w:bookmarkStart w:id="60" w:name="ref-cliff1993"/>
     <w:p>
       <w:pPr>
         <w:pStyle w:val="Bibliography"/>
@@ -6650,7 +6732,7 @@
       <w:r>
         <w:t xml:space="preserve"> </w:t>
       </w:r>
-      <w:hyperlink r:id="rId58">
+      <w:hyperlink r:id="rId59">
         <w:r>
           <w:rPr>
             <w:rStyle w:val="Hyperlink"/>
@@ -6662,8 +6744,8 @@
         <w:t xml:space="preserve">.</w:t>
       </w:r>
     </w:p>
-    <w:bookmarkEnd w:id="59"/>
-    <w:bookmarkStart w:id="61" w:name="ref-clifford2012"/>
+    <w:bookmarkEnd w:id="60"/>
+    <w:bookmarkStart w:id="62" w:name="ref-clifford2012"/>
     <w:p>
       <w:pPr>
         <w:pStyle w:val="Bibliography"/>
@@ -6696,7 +6778,7 @@
       <w:r>
         <w:t xml:space="preserve"> </w:t>
       </w:r>
-      <w:hyperlink r:id="rId60">
+      <w:hyperlink r:id="rId61">
         <w:r>
           <w:rPr>
             <w:rStyle w:val="Hyperlink"/>
@@ -6708,8 +6790,8 @@
         <w:t xml:space="preserve">.</w:t>
       </w:r>
     </w:p>
-    <w:bookmarkEnd w:id="61"/>
-    <w:bookmarkStart w:id="62" w:name="ref-cohen1988"/>
+    <w:bookmarkEnd w:id="62"/>
+    <w:bookmarkStart w:id="63" w:name="ref-cohen1988"/>
     <w:p>
       <w:pPr>
         <w:pStyle w:val="Bibliography"/>
@@ -6731,8 +6813,8 @@
         <w:t xml:space="preserve">. 2nd ed. Lawrence Erlbaum Associates.</w:t>
       </w:r>
     </w:p>
-    <w:bookmarkEnd w:id="62"/>
-    <w:bookmarkStart w:id="64" w:name="ref-collins2024tripodai"/>
+    <w:bookmarkEnd w:id="63"/>
+    <w:bookmarkStart w:id="65" w:name="ref-collins2024tripodai"/>
     <w:p>
       <w:pPr>
         <w:pStyle w:val="Bibliography"/>
@@ -6783,7 +6865,7 @@
       <w:r>
         <w:t xml:space="preserve"> </w:t>
       </w:r>
-      <w:hyperlink r:id="rId63">
+      <w:hyperlink r:id="rId64">
         <w:r>
           <w:rPr>
             <w:rStyle w:val="Hyperlink"/>
@@ -6795,8 +6877,8 @@
         <w:t xml:space="preserve">.</w:t>
       </w:r>
     </w:p>
-    <w:bookmarkEnd w:id="64"/>
-    <w:bookmarkStart w:id="65" w:name="ref-efron1993"/>
+    <w:bookmarkEnd w:id="65"/>
+    <w:bookmarkStart w:id="66" w:name="ref-efron1993"/>
     <w:p>
       <w:pPr>
         <w:pStyle w:val="Bibliography"/>
@@ -6818,8 +6900,8 @@
         <w:t xml:space="preserve">. Chapman &amp; Hall/CRC.</w:t>
       </w:r>
     </w:p>
-    <w:bookmarkEnd w:id="65"/>
-    <w:bookmarkStart w:id="67" w:name="ref-elgendi2016"/>
+    <w:bookmarkEnd w:id="66"/>
+    <w:bookmarkStart w:id="68" w:name="ref-elgendi2016"/>
     <w:p>
       <w:pPr>
         <w:pStyle w:val="Bibliography"/>
@@ -6852,7 +6934,7 @@
       <w:r>
         <w:t xml:space="preserve"> </w:t>
       </w:r>
-      <w:hyperlink r:id="rId66">
+      <w:hyperlink r:id="rId67">
         <w:r>
           <w:rPr>
             <w:rStyle w:val="Hyperlink"/>
@@ -6864,8 +6946,8 @@
         <w:t xml:space="preserve">.</w:t>
       </w:r>
     </w:p>
-    <w:bookmarkEnd w:id="67"/>
-    <w:bookmarkStart w:id="69" w:name="ref-foll2021"/>
+    <w:bookmarkEnd w:id="68"/>
+    <w:bookmarkStart w:id="70" w:name="ref-foll2021"/>
     <w:p>
       <w:pPr>
         <w:pStyle w:val="Bibliography"/>
@@ -6904,7 +6986,7 @@
       <w:r>
         <w:t xml:space="preserve"> </w:t>
       </w:r>
-      <w:hyperlink r:id="rId68">
+      <w:hyperlink r:id="rId69">
         <w:r>
           <w:rPr>
             <w:rStyle w:val="Hyperlink"/>
@@ -6916,8 +6998,8 @@
         <w:t xml:space="preserve">.</w:t>
       </w:r>
     </w:p>
-    <w:bookmarkEnd w:id="69"/>
-    <w:bookmarkStart w:id="71" w:name="ref-liu2020consortai"/>
+    <w:bookmarkEnd w:id="70"/>
+    <w:bookmarkStart w:id="72" w:name="ref-liu2020consortai"/>
     <w:p>
       <w:pPr>
         <w:pStyle w:val="Bibliography"/>
@@ -6962,7 +7044,7 @@
       <w:r>
         <w:t xml:space="preserve"> </w:t>
       </w:r>
-      <w:hyperlink r:id="rId70">
+      <w:hyperlink r:id="rId71">
         <w:r>
           <w:rPr>
             <w:rStyle w:val="Hyperlink"/>
@@ -6974,8 +7056,8 @@
         <w:t xml:space="preserve">.</w:t>
       </w:r>
     </w:p>
-    <w:bookmarkEnd w:id="71"/>
-    <w:bookmarkStart w:id="73" w:name="ref-malik1996"/>
+    <w:bookmarkEnd w:id="72"/>
+    <w:bookmarkStart w:id="74" w:name="ref-malik1996"/>
     <w:p>
       <w:pPr>
         <w:pStyle w:val="Bibliography"/>
@@ -7041,7 +7123,7 @@
       <w:r>
         <w:t xml:space="preserve"> </w:t>
       </w:r>
-      <w:hyperlink r:id="rId72">
+      <w:hyperlink r:id="rId73">
         <w:r>
           <w:rPr>
             <w:rStyle w:val="Hyperlink"/>
@@ -7053,8 +7135,8 @@
         <w:t xml:space="preserve">.</w:t>
       </w:r>
     </w:p>
-    <w:bookmarkEnd w:id="73"/>
-    <w:bookmarkStart w:id="75" w:name="ref-charlton2021ppgproc"/>
+    <w:bookmarkEnd w:id="74"/>
+    <w:bookmarkStart w:id="76" w:name="ref-charlton2021ppgproc"/>
     <w:p>
       <w:pPr>
         <w:pStyle w:val="Bibliography"/>
@@ -7090,7 +7172,7 @@
       <w:r>
         <w:t xml:space="preserve"> </w:t>
       </w:r>
-      <w:hyperlink r:id="rId74">
+      <w:hyperlink r:id="rId75">
         <w:r>
           <w:rPr>
             <w:rStyle w:val="Hyperlink"/>
@@ -7102,8 +7184,8 @@
         <w:t xml:space="preserve">.</w:t>
       </w:r>
     </w:p>
-    <w:bookmarkEnd w:id="75"/>
-    <w:bookmarkStart w:id="77" w:name="ref-mertes2022"/>
+    <w:bookmarkEnd w:id="76"/>
+    <w:bookmarkStart w:id="78" w:name="ref-mertes2022"/>
     <w:p>
       <w:pPr>
         <w:pStyle w:val="Bibliography"/>
@@ -7148,7 +7230,7 @@
       <w:r>
         <w:t xml:space="preserve"> </w:t>
       </w:r>
-      <w:hyperlink r:id="rId76">
+      <w:hyperlink r:id="rId77">
         <w:r>
           <w:rPr>
             <w:rStyle w:val="Hyperlink"/>
@@ -7160,8 +7242,8 @@
         <w:t xml:space="preserve">.</w:t>
       </w:r>
     </w:p>
-    <w:bookmarkEnd w:id="77"/>
-    <w:bookmarkStart w:id="79" w:name="ref-orphanidou2015"/>
+    <w:bookmarkEnd w:id="78"/>
+    <w:bookmarkStart w:id="80" w:name="ref-orphanidou2015"/>
     <w:p>
       <w:pPr>
         <w:pStyle w:val="Bibliography"/>
@@ -7194,7 +7276,7 @@
       <w:r>
         <w:t xml:space="preserve"> </w:t>
       </w:r>
-      <w:hyperlink r:id="rId78">
+      <w:hyperlink r:id="rId79">
         <w:r>
           <w:rPr>
             <w:rStyle w:val="Hyperlink"/>
@@ -7206,8 +7288,8 @@
         <w:t xml:space="preserve">.</w:t>
       </w:r>
     </w:p>
-    <w:bookmarkEnd w:id="79"/>
-    <w:bookmarkStart w:id="81" w:name="ref-perraudin2021"/>
+    <w:bookmarkEnd w:id="80"/>
+    <w:bookmarkStart w:id="82" w:name="ref-perraudin2021"/>
     <w:p>
       <w:pPr>
         <w:pStyle w:val="Bibliography"/>
@@ -7240,7 +7322,7 @@
       <w:r>
         <w:t xml:space="preserve"> </w:t>
       </w:r>
-      <w:hyperlink r:id="rId80">
+      <w:hyperlink r:id="rId81">
         <w:r>
           <w:rPr>
             <w:rStyle w:val="Hyperlink"/>
@@ -7252,8 +7334,8 @@
         <w:t xml:space="preserve">.</w:t>
       </w:r>
     </w:p>
-    <w:bookmarkEnd w:id="81"/>
-    <w:bookmarkStart w:id="83" w:name="ref-reiss2019"/>
+    <w:bookmarkEnd w:id="82"/>
+    <w:bookmarkStart w:id="84" w:name="ref-reiss2019"/>
     <w:p>
       <w:pPr>
         <w:pStyle w:val="Bibliography"/>
@@ -7292,7 +7374,7 @@
       <w:r>
         <w:t xml:space="preserve"> </w:t>
       </w:r>
-      <w:hyperlink r:id="rId82">
+      <w:hyperlink r:id="rId83">
         <w:r>
           <w:rPr>
             <w:rStyle w:val="Hyperlink"/>
@@ -7304,8 +7386,8 @@
         <w:t xml:space="preserve">.</w:t>
       </w:r>
     </w:p>
-    <w:bookmarkEnd w:id="83"/>
-    <w:bookmarkStart w:id="85" w:name="ref-robins1994"/>
+    <w:bookmarkEnd w:id="84"/>
+    <w:bookmarkStart w:id="86" w:name="ref-robins1994"/>
     <w:p>
       <w:pPr>
         <w:pStyle w:val="Bibliography"/>
@@ -7338,7 +7420,7 @@
       <w:r>
         <w:t xml:space="preserve"> </w:t>
       </w:r>
-      <w:hyperlink r:id="rId84">
+      <w:hyperlink r:id="rId85">
         <w:r>
           <w:rPr>
             <w:rStyle w:val="Hyperlink"/>
@@ -7350,8 +7432,8 @@
         <w:t xml:space="preserve">.</w:t>
       </w:r>
     </w:p>
-    <w:bookmarkEnd w:id="85"/>
-    <w:bookmarkStart w:id="87" w:name="ref-schafer2013"/>
+    <w:bookmarkEnd w:id="86"/>
+    <w:bookmarkStart w:id="88" w:name="ref-schafer2013"/>
     <w:p>
       <w:pPr>
         <w:pStyle w:val="Bibliography"/>
@@ -7384,7 +7466,7 @@
       <w:r>
         <w:t xml:space="preserve"> </w:t>
       </w:r>
-      <w:hyperlink r:id="rId86">
+      <w:hyperlink r:id="rId87">
         <w:r>
           <w:rPr>
             <w:rStyle w:val="Hyperlink"/>
@@ -7396,8 +7478,8 @@
         <w:t xml:space="preserve">.</w:t>
       </w:r>
     </w:p>
-    <w:bookmarkEnd w:id="87"/>
-    <w:bookmarkStart w:id="89" w:name="ref-schmidt2018"/>
+    <w:bookmarkEnd w:id="88"/>
+    <w:bookmarkStart w:id="90" w:name="ref-schmidt2018"/>
     <w:p>
       <w:pPr>
         <w:pStyle w:val="Bibliography"/>
@@ -7436,7 +7518,7 @@
       <w:r>
         <w:t xml:space="preserve"> </w:t>
       </w:r>
-      <w:hyperlink r:id="rId88">
+      <w:hyperlink r:id="rId89">
         <w:r>
           <w:rPr>
             <w:rStyle w:val="Hyperlink"/>
@@ -7448,8 +7530,8 @@
         <w:t xml:space="preserve">.</w:t>
       </w:r>
     </w:p>
-    <w:bookmarkEnd w:id="89"/>
-    <w:bookmarkStart w:id="91" w:name="ref-shcherbina2017"/>
+    <w:bookmarkEnd w:id="90"/>
+    <w:bookmarkStart w:id="92" w:name="ref-shcherbina2017"/>
     <w:p>
       <w:pPr>
         <w:pStyle w:val="Bibliography"/>
@@ -7482,7 +7564,7 @@
       <w:r>
         <w:t xml:space="preserve"> </w:t>
       </w:r>
-      <w:hyperlink r:id="rId90">
+      <w:hyperlink r:id="rId91">
         <w:r>
           <w:rPr>
             <w:rStyle w:val="Hyperlink"/>
@@ -7494,8 +7576,8 @@
         <w:t xml:space="preserve">.</w:t>
       </w:r>
     </w:p>
-    <w:bookmarkEnd w:id="91"/>
-    <w:bookmarkStart w:id="93" w:name="ref-shrout1979"/>
+    <w:bookmarkEnd w:id="92"/>
+    <w:bookmarkStart w:id="94" w:name="ref-shrout1979"/>
     <w:p>
       <w:pPr>
         <w:pStyle w:val="Bibliography"/>
@@ -7528,7 +7610,7 @@
       <w:r>
         <w:t xml:space="preserve"> </w:t>
       </w:r>
-      <w:hyperlink r:id="rId92">
+      <w:hyperlink r:id="rId93">
         <w:r>
           <w:rPr>
             <w:rStyle w:val="Hyperlink"/>
@@ -7540,8 +7622,8 @@
         <w:t xml:space="preserve">.</w:t>
       </w:r>
     </w:p>
-    <w:bookmarkEnd w:id="93"/>
-    <w:bookmarkStart w:id="95" w:name="ref-sukor2011"/>
+    <w:bookmarkEnd w:id="94"/>
+    <w:bookmarkStart w:id="96" w:name="ref-sukor2011"/>
     <w:p>
       <w:pPr>
         <w:pStyle w:val="Bibliography"/>
@@ -7574,7 +7656,7 @@
       <w:r>
         <w:t xml:space="preserve"> </w:t>
       </w:r>
-      <w:hyperlink r:id="rId94">
+      <w:hyperlink r:id="rId95">
         <w:r>
           <w:rPr>
             <w:rStyle w:val="Hyperlink"/>
@@ -7586,8 +7668,8 @@
         <w:t xml:space="preserve">.</w:t>
       </w:r>
     </w:p>
-    <w:bookmarkEnd w:id="95"/>
-    <w:bookmarkStart w:id="97" w:name="ref-vasey2022decideai"/>
+    <w:bookmarkEnd w:id="96"/>
+    <w:bookmarkStart w:id="98" w:name="ref-vasey2022decideai"/>
     <w:p>
       <w:pPr>
         <w:pStyle w:val="Bibliography"/>
@@ -7632,7 +7714,7 @@
       <w:r>
         <w:t xml:space="preserve"> </w:t>
       </w:r>
-      <w:hyperlink r:id="rId96">
+      <w:hyperlink r:id="rId97">
         <w:r>
           <w:rPr>
             <w:rStyle w:val="Hyperlink"/>
@@ -7644,8 +7726,8 @@
         <w:t xml:space="preserve">.</w:t>
       </w:r>
     </w:p>
-    <w:bookmarkEnd w:id="97"/>
-    <w:bookmarkStart w:id="99" w:name="ref-wilcoxon1945"/>
+    <w:bookmarkEnd w:id="98"/>
+    <w:bookmarkStart w:id="100" w:name="ref-wilcoxon1945"/>
     <w:p>
       <w:pPr>
         <w:pStyle w:val="Bibliography"/>
@@ -7678,7 +7760,7 @@
       <w:r>
         <w:t xml:space="preserve"> </w:t>
       </w:r>
-      <w:hyperlink r:id="rId98">
+      <w:hyperlink r:id="rId99">
         <w:r>
           <w:rPr>
             <w:rStyle w:val="Hyperlink"/>
@@ -7690,10 +7772,10 @@
         <w:t xml:space="preserve">.</w:t>
       </w:r>
     </w:p>
-    <w:bookmarkEnd w:id="99"/>
     <w:bookmarkEnd w:id="100"/>
     <w:bookmarkEnd w:id="101"/>
     <w:bookmarkEnd w:id="102"/>
+    <w:bookmarkEnd w:id="103"/>
     <w:sectPr>
       <w:footnotePr>
         <w:numRestart w:val="eachSect"/>

</xml_diff>

<commit_message>
Address reviewer attack #8 (baseline choice): rewrite Section 2.8 with explicit baseline selection criteria (independent development; distinct physical properties; replicable reference implementations; citation history) and add missing Elgendi bullet that was absent from the original Section 2.8 enumeration
</commit_message>
<xml_diff>
--- a/paper/manuscript.docx
+++ b/paper/manuscript.docx
@@ -1256,7 +1256,7 @@
         <w:pStyle w:val="FirstParagraph"/>
       </w:pPr>
       <w:r>
-        <w:t xml:space="preserve">Three published PPG SQI baselines are run alongside the in-house SQI on every audit, each testing a different physical property of pulse waveforms:</w:t>
+        <w:t xml:space="preserve">We compare the in-house SQI against three published wrist-PPG signal-quality methods. Selection criteria for the published baselines were: (a) independent development with no shared methodological framework, so that joint behavior across the methods is informative rather than expected by construction; (b) targeting of distinct physical properties of the pulse waveform (template shape, pulse-to-pulse interval consistency, amplitude-distribution statistics); (c) availability of explicit thresholds in the original publication or a reference implementation that can be replicated unambiguously; and (d) citation history in the wearable-PPG signal-quality literature. The three methods meeting these criteria are:</w:t>
       </w:r>
     </w:p>
     <w:p>
@@ -1272,13 +1272,34 @@
           <w:b/>
           <w:bCs/>
         </w:rPr>
-        <w:t xml:space="preserve">Orphanidou et al. (2015):</w:t>
-      </w:r>
-      <w:r>
-        <w:t xml:space="preserve"> </w:t>
-      </w:r>
-      <w:r>
-        <w:t xml:space="preserve">four-rule template-matching SQI. We replicate the published thresholds.</w:t>
+        <w:t xml:space="preserve">Orphanidou et al. (2015)</w:t>
+      </w:r>
+      <w:r>
+        <w:rPr>
+          <w:b/>
+          <w:bCs/>
+        </w:rPr>
+        <w:t xml:space="preserve"> </w:t>
+      </w:r>
+      <w:r>
+        <w:rPr>
+          <w:b/>
+          <w:bCs/>
+        </w:rPr>
+        <w:t xml:space="preserve">(Orphanidou et al. 2015)</w:t>
+      </w:r>
+      <w:r>
+        <w:rPr>
+          <w:b/>
+          <w:bCs/>
+        </w:rPr>
+        <w:t xml:space="preserve">:</w:t>
+      </w:r>
+      <w:r>
+        <w:t xml:space="preserve"> </w:t>
+      </w:r>
+      <w:r>
+        <w:t xml:space="preserve">four-rule template-matching SQI based on per-subject pulse-shape correlation. We replicate the published thresholds.</w:t>
       </w:r>
     </w:p>
     <w:p>
@@ -1294,7 +1315,28 @@
           <w:b/>
           <w:bCs/>
         </w:rPr>
-        <w:t xml:space="preserve">Sukor et al. (2011):</w:t>
+        <w:t xml:space="preserve">Sukor et al. (2011)</w:t>
+      </w:r>
+      <w:r>
+        <w:rPr>
+          <w:b/>
+          <w:bCs/>
+        </w:rPr>
+        <w:t xml:space="preserve"> </w:t>
+      </w:r>
+      <w:r>
+        <w:rPr>
+          <w:b/>
+          <w:bCs/>
+        </w:rPr>
+        <w:t xml:space="preserve">(Sukor et al. 2011)</w:t>
+      </w:r>
+      <w:r>
+        <w:rPr>
+          <w:b/>
+          <w:bCs/>
+        </w:rPr>
+        <w:t xml:space="preserve">:</w:t>
       </w:r>
       <w:r>
         <w:t xml:space="preserve"> </w:t>
@@ -1305,7 +1347,70 @@
     </w:p>
     <w:p>
       <w:pPr>
+        <w:pStyle w:val="Compact"/>
+        <w:numPr>
+          <w:ilvl w:val="0"/>
+          <w:numId w:val="1003"/>
+        </w:numPr>
+      </w:pPr>
+      <w:r>
+        <w:rPr>
+          <w:b/>
+          <w:bCs/>
+        </w:rPr>
+        <w:t xml:space="preserve">Elgendi (2016)</w:t>
+      </w:r>
+      <w:r>
+        <w:rPr>
+          <w:b/>
+          <w:bCs/>
+        </w:rPr>
+        <w:t xml:space="preserve"> </w:t>
+      </w:r>
+      <w:r>
+        <w:rPr>
+          <w:b/>
+          <w:bCs/>
+        </w:rPr>
+        <w:t xml:space="preserve">(Elgendi 2016)</w:t>
+      </w:r>
+      <w:r>
+        <w:rPr>
+          <w:b/>
+          <w:bCs/>
+        </w:rPr>
+        <w:t xml:space="preserve">:</w:t>
+      </w:r>
+      <w:r>
+        <w:t xml:space="preserve"> </w:t>
+      </w:r>
+      <w:r>
+        <w:t xml:space="preserve">amplitude-distribution statistics SQI computing third-order skewness (SSQI), kurtosis (KSQI), and Shannon entropy (ESQI) of the windowed signal. We replicate the published thresholds with automatic polarity detection for inverted-polarity wrist PPG.</w:t>
+      </w:r>
+    </w:p>
+    <w:p>
+      <w:pPr>
         <w:pStyle w:val="FirstParagraph"/>
+      </w:pPr>
+      <w:r>
+        <w:t xml:space="preserve">Recent wearable-PPG SQI methods reviewed in</w:t>
+      </w:r>
+      <w:r>
+        <w:t xml:space="preserve"> </w:t>
+      </w:r>
+      <w:r>
+        <w:t xml:space="preserve">(Mejı́a-Mejı́a et al. 2021)</w:t>
+      </w:r>
+      <w:r>
+        <w:t xml:space="preserve"> </w:t>
+      </w:r>
+      <w:r>
+        <w:t xml:space="preserve">either target overlapping physical properties or are device-specific in ways that prevent transfer to WESAD and PPG-DaLiA without additional calibration; the three methods selected here span the three theoretically distinct physical properties of pulse waveforms most commonly tested in published wrist-PPG audits and have reference implementations that allow exact replication.</w:t>
+      </w:r>
+    </w:p>
+    <w:p>
+      <w:pPr>
+        <w:pStyle w:val="BodyText"/>
       </w:pPr>
       <w:r>
         <w:t xml:space="preserve">Agreement metrics for each pairwise comparison are reported as Spearman ρ on the continuous scores, Cohen’s κ on the binary pass/fail labels, and a full 2×2 crosstab.</w:t>

</xml_diff>

<commit_message>
Address reviewer attack #9 (random window-split): add LOSO subject-level cross-validation of in-house SQI recalibration (mean held-out kappa = -0.063 across 15 folds), confirming the negative recalibration result is robust to split strategy; strengthen Limitations note
</commit_message>
<xml_diff>
--- a/paper/manuscript.docx
+++ b/paper/manuscript.docx
@@ -2935,6 +2935,36 @@
       </w:r>
       <w:r>
         <w:t xml:space="preserve">, which is a methodological recommendation rather than a fix.</w:t>
+      </w:r>
+    </w:p>
+    <w:p>
+      <w:pPr>
+        <w:pStyle w:val="BodyText"/>
+      </w:pPr>
+      <w:r>
+        <w:rPr>
+          <w:b/>
+          <w:bCs/>
+        </w:rPr>
+        <w:t xml:space="preserve">LOSO recalibration confirms and sharpens the negative result.</w:t>
+      </w:r>
+      <w:r>
+        <w:t xml:space="preserve"> </w:t>
+      </w:r>
+      <w:r>
+        <w:t xml:space="preserve">To verify the random window-level split does not bias the recalibration conclusion, we re-ran the threshold search as leave-one-subject-out cross-validation (n = 15 folds): for each held-out subject the threshold was selected on the other 14 subjects to maximize κ versus Orphanidou, then evaluated on the held-out subject. Mean held-out Cohen’s κ across the 15 folds is -0.063 (median 0.000, range -0.321 to +0.002). For 9 of 15 subjects the train search settles on threshold 0.85, under which the in-house SQI still passes 100% of the held-out subject’s windows and held-out κ is degenerate at 0. For the remaining 6 subjects the train search lands on stricter thresholds (0.98 to 0.99) that produce non-trivial in-house pass/fail variation; on those held-out subjects κ is uniformly non-positive (range -0.321 to +0.002), meaning that when the in-house SQI is forced to make discriminating decisions it anti-correlates with the Orphanidou baseline rather than agreeing with it. The negative result therefore holds under both the random-window split reported in Table 5 (Δκ ≈ 0.000) and the more conservative subject-level LOSO split (mean held-out κ = -0.063). The full per-subject LOSO output is at</w:t>
+      </w:r>
+      <w:r>
+        <w:t xml:space="preserve"> </w:t>
+      </w:r>
+      <w:r>
+        <w:rPr>
+          <w:rStyle w:val="VerbatimChar"/>
+        </w:rPr>
+        <w:t xml:space="preserve">results/real_data/loso_recalibration.csv</w:t>
+      </w:r>
+      <w:r>
+        <w:t xml:space="preserve">.</w:t>
       </w:r>
     </w:p>
     <w:bookmarkEnd w:id="26"/>
@@ -5990,7 +6020,7 @@
         <w:t xml:space="preserve"> </w:t>
       </w:r>
       <w:r>
-        <w:t xml:space="preserve">finding did not replicate. This is reported as an honest negative result in Section 3.3.</w:t>
+        <w:t xml:space="preserve">finding did not replicate. This is reported as an honest negative result in Section 3.3, robust to split strategy: both random window-level split (Δκ ≈ 0.000) and leave-one-subject-out cross-validation (mean held-out κ = -0.063) reach the same conclusion.</w:t>
       </w:r>
       <w:r>
         <w:t xml:space="preserve"> </w:t>

</xml_diff>

<commit_message>
Address reviewer attack #2 (no hand-labeled ground truth): add Section 5.3 limitation acknowledging the cross-method disagreement finding documents which windows are rejected by which method but does not identify a correct method, with hand-labeling a representative window sample as the natural follow-up to convert disagreement into method ranking against human labels
</commit_message>
<xml_diff>
--- a/paper/manuscript.docx
+++ b/paper/manuscript.docx
@@ -6067,6 +6067,48 @@
       </w:r>
       <w:r>
         <w:t xml:space="preserve">would provide the natural next test.</w:t>
+      </w:r>
+    </w:p>
+    <w:p>
+      <w:pPr>
+        <w:pStyle w:val="BodyText"/>
+      </w:pPr>
+      <w:r>
+        <w:rPr>
+          <w:b/>
+          <w:bCs/>
+        </w:rPr>
+        <w:t xml:space="preserve">No hand-labeled signal-quality ground truth.</w:t>
+      </w:r>
+      <w:r>
+        <w:t xml:space="preserve"> </w:t>
+      </w:r>
+      <w:r>
+        <w:t xml:space="preserve">The cross-method disagreement finding documents that three published methods reject different (and overlapping) sets of windows on WESAD and PPG-DaLiA; without hand-labeled signal-quality ground truth on these datasets, we cannot identify which method (if any) is correct on any specific disagreed-on window. The HR-agreement evidence in Section 3.6 is an indirect proxy: multi-baseline-pass windows produce higher per-subject wrist-PPG-to-chest-ECG HR correlation than no-audit windows (paired Wilcoxon p &lt; 0.001), which is consistent with the published methods successfully filtering bad windows but does not by itself identify any one of them as a gold standard. Hand-labeling a representative window sample on both datasets (e.g., 200 stratified windows: consensus-pass, consensus-reject, and gray-area) and computing each method’s Cohen’s κ against the human-rater target is the natural follow-up to convert the disagreement finding from</w:t>
+      </w:r>
+      <w:r>
+        <w:t xml:space="preserve"> </w:t>
+      </w:r>
+      <w:r>
+        <w:t xml:space="preserve">“the methods rejct different windows”</w:t>
+      </w:r>
+      <w:r>
+        <w:t xml:space="preserve"> </w:t>
+      </w:r>
+      <w:r>
+        <w:t xml:space="preserve">to</w:t>
+      </w:r>
+      <w:r>
+        <w:t xml:space="preserve"> </w:t>
+      </w:r>
+      <w:r>
+        <w:t xml:space="preserve">“method X has the highest agreement with human labels.”</w:t>
+      </w:r>
+      <w:r>
+        <w:t xml:space="preserve"> </w:t>
+      </w:r>
+      <w:r>
+        <w:t xml:space="preserve">The audit pipeline supports this comparison through the same κ machinery used here (Section 2.10).</w:t>
       </w:r>
     </w:p>
     <w:p>

</xml_diff>

<commit_message>
Address reviewer attack #10 (single author / no clinical co-author): add Section 5.3 limitation explicitly framing this as a single-author methodology study with recommendations aimed at the wearable-AI research community rather than clinical practice; also fix 'rejct' typo from item #2 commit
</commit_message>
<xml_diff>
--- a/paper/manuscript.docx
+++ b/paper/manuscript.docx
@@ -6090,7 +6090,7 @@
         <w:t xml:space="preserve"> </w:t>
       </w:r>
       <w:r>
-        <w:t xml:space="preserve">“the methods rejct different windows”</w:t>
+        <w:t xml:space="preserve">“the methods reject different windows”</w:t>
       </w:r>
       <w:r>
         <w:t xml:space="preserve"> </w:t>
@@ -6241,6 +6241,24 @@
       </w:r>
       <w:r>
         <w:t xml:space="preserve">We report time-domain HRV (RMSSD, SDNN) but not LF/HF. The synthetic windows are too short to support meaningful frequency-domain HRV. Adding frequency-domain HRV is a one-day change.</w:t>
+      </w:r>
+    </w:p>
+    <w:p>
+      <w:pPr>
+        <w:pStyle w:val="BodyText"/>
+      </w:pPr>
+      <w:r>
+        <w:rPr>
+          <w:b/>
+          <w:bCs/>
+        </w:rPr>
+        <w:t xml:space="preserve">Single-author methodology study.</w:t>
+      </w:r>
+      <w:r>
+        <w:t xml:space="preserve"> </w:t>
+      </w:r>
+      <w:r>
+        <w:t xml:space="preserve">This is a single-author methodology paper with no clinical or biomedical-engineering co-authors. The recommendations in Section 6 are aimed at the wearable-AI research community (multi-baseline SQI auditing as standard supplementary material in wearable-AI publications) and do not constitute clinical guidance. Translation of any cross-method-audit recommendation into patient-facing clinical practice should include co-authorship by clinical specialists with relevant device experience; the synthetic-cohort validation in Section 4 and the WESAD/PPG-DaLiA empirical study in Section 3 are methodological contributions rather than clinical findings.</w:t>
       </w:r>
     </w:p>
     <w:bookmarkEnd w:id="42"/>

</xml_diff>

<commit_message>
Pre-submission cleanup: fix STARD reference (Sections 4.1-4.3 were pre-swap synthetic, should be Section 3.1 + 3.7); update Code and data availability with PPG-DaLiA UCI link + PyPI + Zenodo DOI; add PPG-DaLiA mention to abstract Methods paragraph; simplify Supplementary materials section to point at canonical paper/supplement.docx instead of stale paper/supplement_extended_analyses.md reference
</commit_message>
<xml_diff>
--- a/paper/manuscript.docx
+++ b/paper/manuscript.docx
@@ -205,7 +205,19 @@
         <w:t xml:space="preserve">(Elgendi 2016)</w:t>
       </w:r>
       <w:r>
-        <w:t xml:space="preserve">) and a representative in-house threshold. We compared per-window pass/fail decisions with Cohen’s κ and cluster bootstrap confidence intervals, evaluated single-threshold recalibration on a held-out split (3,292 calibration / 3,293 holdout windows), and quantified the effect of audit filtering on leave-one-subject-out (LOSO) baseline-vs-stress classification and per-subject wrist-PPG-to-chest-ECG HR correlation. The full audit is implemented in an open-source Python pipeline (</w:t>
+        <w:t xml:space="preserve">) and a representative in-house threshold, and replicated the analysis on the public PPG-DaLiA dataset</w:t>
+      </w:r>
+      <w:r>
+        <w:t xml:space="preserve"> </w:t>
+      </w:r>
+      <w:r>
+        <w:t xml:space="preserve">(Reiss et al. 2019)</w:t>
+      </w:r>
+      <w:r>
+        <w:t xml:space="preserve"> </w:t>
+      </w:r>
+      <w:r>
+        <w:t xml:space="preserve">(n = 15 subjects, 18,781 windows; same hardware family, different activity paradigm). We compared per-window pass/fail decisions with Cohen’s κ and cluster bootstrap confidence intervals, evaluated single-threshold recalibration on a held-out split (3,292 calibration / 3,293 holdout windows), and quantified the effect of audit filtering on leave-one-subject-out (LOSO) baseline-vs-stress classification and per-subject wrist-PPG-to-chest-ECG HR correlation. The full audit is implemented in an open-source Python pipeline (</w:t>
       </w:r>
       <w:r>
         <w:rPr>
@@ -1653,7 +1665,7 @@
         <w:t xml:space="preserve"> </w:t>
       </w:r>
       <w:r>
-        <w:t xml:space="preserve">applies to Sections 4.1-4.3, in which chest ECG serves as the reference standard and wrist PPG-derived measurements serve as the index modality. A per-item compliance summary is in</w:t>
+        <w:t xml:space="preserve">applies to Section 3.1 (Bland-Altman cross-modality HR agreement), in which chest ECG serves as the reference standard and wrist PPG-derived measurements serve as the index modality, and Section 3.7 (external replication on PPG-DaLiA), in which the same reference-versus-index structure is evaluated on a second public benchmark. A per-item compliance summary is in</w:t>
       </w:r>
       <w:r>
         <w:t xml:space="preserve"> </w:t>
@@ -6318,7 +6330,7 @@
         <w:pStyle w:val="FirstParagraph"/>
       </w:pPr>
       <w:r>
-        <w:t xml:space="preserve">Code: https://github.com/ceyhunolcan/biomedical-signal-forensics-lab, released under the MIT license. All synthetic data is generated by code from a fixed seed; no data is distributed separately. The WESAD dataset is publicly available from the UCI Machine Learning Repository</w:t>
+        <w:t xml:space="preserve">Code: https://github.com/ceyhunolcan/biomedical-signal-forensics-lab, released under the MIT license. PyPI: https://pypi.org/project/biomedical-signal-forensics-lab/. Concept DOI: 10.5281/zenodo.20349806. All synthetic data is generated by code from a fixed seed; no data is distributed separately. Two public datasets were used in the empirical study: WESAD</w:t>
       </w:r>
       <w:r>
         <w:t xml:space="preserve"> </w:t>
@@ -6327,10 +6339,16 @@
         <w:t xml:space="preserve">(Schmidt et al. 2018)</w:t>
       </w:r>
       <w:r>
-        <w:t xml:space="preserve"> </w:t>
-      </w:r>
-      <w:r>
-        <w:t xml:space="preserve">without restrictions.</w:t>
+        <w:t xml:space="preserve">, publicly available from the UCI Machine Learning Repository, and PPG-DaLiA</w:t>
+      </w:r>
+      <w:r>
+        <w:t xml:space="preserve"> </w:t>
+      </w:r>
+      <w:r>
+        <w:t xml:space="preserve">(Reiss et al. 2019)</w:t>
+      </w:r>
+      <w:r>
+        <w:t xml:space="preserve">, also publicly available from the UCI Machine Learning Repository. Both are released without restrictions for research use.</w:t>
       </w:r>
     </w:p>
     <w:bookmarkEnd w:id="45"/>
@@ -6469,10 +6487,25 @@
         <w:rPr>
           <w:rStyle w:val="VerbatimChar"/>
         </w:rPr>
-        <w:t xml:space="preserve">paper/methods.md</w:t>
-      </w:r>
-      <w:r>
-        <w:t xml:space="preserve">: extended methods.</w:t>
+        <w:t xml:space="preserve">paper/supplement.md</w:t>
+      </w:r>
+      <w:r>
+        <w:t xml:space="preserve"> </w:t>
+      </w:r>
+      <w:r>
+        <w:t xml:space="preserve">/</w:t>
+      </w:r>
+      <w:r>
+        <w:t xml:space="preserve"> </w:t>
+      </w:r>
+      <w:r>
+        <w:rPr>
+          <w:rStyle w:val="VerbatimChar"/>
+        </w:rPr>
+        <w:t xml:space="preserve">paper/supplement.docx</w:t>
+      </w:r>
+      <w:r>
+        <w:t xml:space="preserve">: companion supplement with seven sections (S1 ICC days-as-raters diagnostic, S2 AIPW positivity and E-value sensitivity, S3 cross-cohort parameter-sweep details, S4 per-subject stress effect-sizes on WESAD, S5 per-subject amusement effect-sizes on WESAD, S6 learned trust-score weights with training-versus-holdout breakdown, S7 threshold-sensitivity analysis for the in-house SQI baseline on both real datasets) and five supplementary tables (Tables S1-S5).</w:t>
       </w:r>
     </w:p>
     <w:p>
@@ -6487,10 +6520,10 @@
         <w:rPr>
           <w:rStyle w:val="VerbatimChar"/>
         </w:rPr>
-        <w:t xml:space="preserve">paper/data_card.md</w:t>
-      </w:r>
-      <w:r>
-        <w:t xml:space="preserve">: synthetic cohort data card.</w:t>
+        <w:t xml:space="preserve">paper/checklists/</w:t>
+      </w:r>
+      <w:r>
+        <w:t xml:space="preserve">: per-standard reporting-compliance summaries (TRIPOD+AI, STARD 2015, CONSORT-AI applicability, DECIDE-AI applicability).</w:t>
       </w:r>
     </w:p>
     <w:p>
@@ -6505,10 +6538,25 @@
         <w:rPr>
           <w:rStyle w:val="VerbatimChar"/>
         </w:rPr>
-        <w:t xml:space="preserve">paper/model_card.md</w:t>
-      </w:r>
-      <w:r>
-        <w:t xml:space="preserve">: model card for the bundled baselines and extension-point models.</w:t>
+        <w:t xml:space="preserve">results/real_data/wesad_deep/</w:t>
+      </w:r>
+      <w:r>
+        <w:t xml:space="preserve"> </w:t>
+      </w:r>
+      <w:r>
+        <w:t xml:space="preserve">and</w:t>
+      </w:r>
+      <w:r>
+        <w:t xml:space="preserve"> </w:t>
+      </w:r>
+      <w:r>
+        <w:rPr>
+          <w:rStyle w:val="VerbatimChar"/>
+        </w:rPr>
+        <w:t xml:space="preserve">results/real_data/ppg_dalia/</w:t>
+      </w:r>
+      <w:r>
+        <w:t xml:space="preserve">: per-window CSVs (window_table.csv, window_meta.csv, daily_summary.csv) and summary.json files for both real-data datasets.</w:t>
       </w:r>
     </w:p>
     <w:p>
@@ -6523,10 +6571,25 @@
         <w:rPr>
           <w:rStyle w:val="VerbatimChar"/>
         </w:rPr>
-        <w:t xml:space="preserve">paper/ethics.md</w:t>
-      </w:r>
-      <w:r>
-        <w:t xml:space="preserve">: ethics and downstream-user recommendations.</w:t>
+        <w:t xml:space="preserve">results/real_data/threshold_sensitivity.csv</w:t>
+      </w:r>
+      <w:r>
+        <w:t xml:space="preserve"> </w:t>
+      </w:r>
+      <w:r>
+        <w:t xml:space="preserve">and</w:t>
+      </w:r>
+      <w:r>
+        <w:t xml:space="preserve"> </w:t>
+      </w:r>
+      <w:r>
+        <w:rPr>
+          <w:rStyle w:val="VerbatimChar"/>
+        </w:rPr>
+        <w:t xml:space="preserve">results/real_data/loso_recalibration.csv</w:t>
+      </w:r>
+      <w:r>
+        <w:t xml:space="preserve">: robustness-analysis output files.</w:t>
       </w:r>
     </w:p>
     <w:p>
@@ -6541,160 +6604,10 @@
         <w:rPr>
           <w:rStyle w:val="VerbatimChar"/>
         </w:rPr>
-        <w:t xml:space="preserve">paper/limitations.md</w:t>
-      </w:r>
-      <w:r>
-        <w:t xml:space="preserve">: extended limitations.</w:t>
-      </w:r>
-    </w:p>
-    <w:p>
-      <w:pPr>
-        <w:pStyle w:val="Compact"/>
-        <w:numPr>
-          <w:ilvl w:val="0"/>
-          <w:numId w:val="1006"/>
-        </w:numPr>
-      </w:pPr>
-      <w:r>
-        <w:rPr>
-          <w:rStyle w:val="VerbatimChar"/>
-        </w:rPr>
-        <w:t xml:space="preserve">paper/real_data_pilot.md</w:t>
-      </w:r>
-      <w:r>
-        <w:t xml:space="preserve">: extended WESAD pilot writeup with per-subject breakdowns.</w:t>
-      </w:r>
-    </w:p>
-    <w:p>
-      <w:pPr>
-        <w:pStyle w:val="Compact"/>
-        <w:numPr>
-          <w:ilvl w:val="0"/>
-          <w:numId w:val="1006"/>
-        </w:numPr>
-      </w:pPr>
-      <w:r>
-        <w:rPr>
-          <w:rStyle w:val="VerbatimChar"/>
-        </w:rPr>
-        <w:t xml:space="preserve">paper/results.md</w:t>
-      </w:r>
-      <w:r>
-        <w:t xml:space="preserve">: consolidated synthetic-cohort results with every CSV reference.</w:t>
-      </w:r>
-    </w:p>
-    <w:p>
-      <w:pPr>
-        <w:pStyle w:val="Compact"/>
-        <w:numPr>
-          <w:ilvl w:val="0"/>
-          <w:numId w:val="1006"/>
-        </w:numPr>
-      </w:pPr>
-      <w:r>
-        <w:rPr>
-          <w:rStyle w:val="VerbatimChar"/>
-        </w:rPr>
-        <w:t xml:space="preserve">paper/reviewer_response_simulation.md</w:t>
-      </w:r>
-      <w:r>
-        <w:t xml:space="preserve">: anticipated reviewer questions and responses.</w:t>
-      </w:r>
-    </w:p>
-    <w:p>
-      <w:pPr>
-        <w:pStyle w:val="Compact"/>
-        <w:numPr>
-          <w:ilvl w:val="0"/>
-          <w:numId w:val="1006"/>
-        </w:numPr>
-      </w:pPr>
-      <w:r>
-        <w:rPr>
-          <w:rStyle w:val="VerbatimChar"/>
-        </w:rPr>
-        <w:t xml:space="preserve">paper/figures_and_tables.md</w:t>
-      </w:r>
-      <w:r>
-        <w:t xml:space="preserve">: canonical index of every figure and table with ready-to-use captions.</w:t>
-      </w:r>
-    </w:p>
-    <w:p>
-      <w:pPr>
-        <w:pStyle w:val="Compact"/>
-        <w:numPr>
-          <w:ilvl w:val="0"/>
-          <w:numId w:val="1006"/>
-        </w:numPr>
-      </w:pPr>
-      <w:r>
-        <w:rPr>
-          <w:rStyle w:val="VerbatimChar"/>
-          <w:b/>
-          <w:bCs/>
-        </w:rPr>
-        <w:t xml:space="preserve">paper/supplement_extended_analyses.md</w:t>
-      </w:r>
-      <w:r>
-        <w:rPr>
-          <w:b/>
-          <w:bCs/>
-        </w:rPr>
-        <w:t xml:space="preserve">: reviewer-grade extended analyses (positivity check, E-values, multi-threshold recalibration, RR-cleaning robustness, per-subject real-data reliability, Cohen’s d alongside Cliff’s δ).</w:t>
-      </w:r>
-    </w:p>
-    <w:p>
-      <w:pPr>
-        <w:pStyle w:val="Compact"/>
-        <w:numPr>
-          <w:ilvl w:val="0"/>
-          <w:numId w:val="1006"/>
-        </w:numPr>
-      </w:pPr>
-      <w:r>
-        <w:rPr>
-          <w:rStyle w:val="VerbatimChar"/>
-        </w:rPr>
-        <w:t xml:space="preserve">docs/signal_quality_taxonomy.md</w:t>
-      </w:r>
-      <w:r>
-        <w:t xml:space="preserve">: artifact-finding taxonomy and severity conventions.</w:t>
-      </w:r>
-    </w:p>
-    <w:p>
-      <w:pPr>
-        <w:pStyle w:val="Compact"/>
-        <w:numPr>
-          <w:ilvl w:val="0"/>
-          <w:numId w:val="1006"/>
-        </w:numPr>
-      </w:pPr>
-      <w:r>
-        <w:rPr>
-          <w:rStyle w:val="VerbatimChar"/>
-        </w:rPr>
-        <w:t xml:space="preserve">docs/bug_audit_round{1..5}.md</w:t>
-      </w:r>
-      <w:r>
-        <w:t xml:space="preserve">: development-time bug audit logs.</w:t>
-      </w:r>
-    </w:p>
-    <w:p>
-      <w:pPr>
-        <w:pStyle w:val="Compact"/>
-        <w:numPr>
-          <w:ilvl w:val="0"/>
-          <w:numId w:val="1006"/>
-        </w:numPr>
-      </w:pPr>
-      <w:r>
-        <w:rPr>
-          <w:rStyle w:val="VerbatimChar"/>
-        </w:rPr>
         <w:t xml:space="preserve">CHANGELOG.md</w:t>
       </w:r>
       <w:r>
-        <w:t xml:space="preserve">: full release history.</w:t>
+        <w:t xml:space="preserve">: full release history of the toolkit.</w:t>
       </w:r>
     </w:p>
     <w:bookmarkStart w:id="101" w:name="refs"/>

</xml_diff>

<commit_message>
Pre-submission polish: remove stray blockquote marker ('>' between title and authors) and horizontal rule ('---' between ORCID and Abstract); recompile docx so Figure 1 re-embeds the latest npj-style conceptual Venn; switch table styling to explicit cell-level booktabs borders (top + header-bottom + bottom rules, no internal verticals) so style inheritance from the reference doc can no longer override; strip residual BlockText paragraph style from Authors line that was a leftover of the blockquote
</commit_message>
<xml_diff>
--- a/paper/manuscript.docx
+++ b/paper/manuscript.docx
@@ -2,7 +2,7 @@
 <file path=word/document.xml><?xml version="1.0" encoding="utf-8"?>
 <w:document xmlns:w="http://schemas.openxmlformats.org/wordprocessingml/2006/main" xmlns:m="http://schemas.openxmlformats.org/officeDocument/2006/math" xmlns:r="http://schemas.openxmlformats.org/officeDocument/2006/relationships" xmlns:o="urn:schemas-microsoft-com:office:office" xmlns:v="urn:schemas-microsoft-com:vml" xmlns:w10="urn:schemas-microsoft-com:office:word" xmlns:a="http://schemas.openxmlformats.org/drawingml/2006/main" xmlns:pic="http://schemas.openxmlformats.org/drawingml/2006/picture" xmlns:wp="http://schemas.openxmlformats.org/drawingml/2006/wordprocessingDrawing">
   <w:body>
-    <w:bookmarkStart w:id="103" w:name="X492e6e436080a4bb955983327137bd378b3e7de"/>
+    <w:bookmarkStart w:id="106" w:name="X492e6e436080a4bb955983327137bd378b3e7de"/>
     <w:p>
       <w:pPr>
         <w:pStyle w:val="Heading1"/>
@@ -12,9 +12,6 @@
       </w:r>
     </w:p>
     <w:p>
-      <w:pPr>
-        <w:pStyle w:val="BlockText"/>
-      </w:pPr>
       <w:r>
         <w:rPr>
           <w:b/>
@@ -99,13 +96,6 @@
         <w:t xml:space="preserve">.</w:t>
       </w:r>
     </w:p>
-    <w:p>
-      <w:r>
-        <w:pict>
-          <v:rect style="width:0;height:1.5pt" o:hralign="center" o:hrstd="t" o:hr="t"/>
-        </w:pict>
-      </w:r>
-    </w:p>
     <w:bookmarkStart w:id="10" w:name="abstract"/>
     <w:p>
       <w:pPr>
@@ -286,7 +276,7 @@
       </w:r>
     </w:p>
     <w:bookmarkEnd w:id="10"/>
-    <w:bookmarkStart w:id="11" w:name="background"/>
+    <w:bookmarkStart w:id="14" w:name="background"/>
     <w:p>
       <w:pPr>
         <w:pStyle w:val="Heading2"/>
@@ -436,8 +426,63 @@
         <w:t xml:space="preserve">, MIT licensed), which also includes reliability primitives, doubly-robust causal-adjusted confounding analysis under a user-supplied directed acyclic graph (DAG), change-point detection, and stratified fairness audit. The empirical contribution of this paper is the cross-method SQI disagreement finding; the toolkit is the supporting infrastructure that made the finding reproducible.</w:t>
       </w:r>
     </w:p>
-    <w:bookmarkEnd w:id="11"/>
-    <w:bookmarkStart w:id="22" w:name="methods"/>
+    <w:p>
+      <w:pPr>
+        <w:pStyle w:val="CaptionedFigure"/>
+      </w:pPr>
+      <w:r>
+        <w:drawing>
+          <wp:inline>
+            <wp:extent cx="5334000" cy="2459481"/>
+            <wp:effectExtent b="0" l="0" r="0" t="0"/>
+            <wp:docPr descr="Figure 1. Cross-method signal-quality disagreement on wearable photoplethysmography. Each colored disk represents the subset of windows accepted by one published method on each dataset (schematic; not proportional). The region outside all three disks represents the consensus rejection by all three independently developed methods (44.6% on WESAD; 43.1% on PPG-DaLiA). The three methods individually disagree about which windows pass (median pairwise Cohen’s kappa = -0.20) but converge on which to reject. Headline numbers in the figure are uncorrected and identical to those in Table 4 (WESAD) and Table 10 (PPG-DaLiA)." title="" id="12" name="Picture"/>
+            <a:graphic>
+              <a:graphicData uri="http://schemas.openxmlformats.org/drawingml/2006/picture">
+                <pic:pic>
+                  <pic:nvPicPr>
+                    <pic:cNvPr descr="paper/figures/fig1_conceptual.png" id="13" name="Picture"/>
+                    <pic:cNvPicPr>
+                      <a:picLocks noChangeArrowheads="1" noChangeAspect="1"/>
+                    </pic:cNvPicPr>
+                  </pic:nvPicPr>
+                  <pic:blipFill>
+                    <a:blip r:embed="rId11"/>
+                    <a:stretch>
+                      <a:fillRect/>
+                    </a:stretch>
+                  </pic:blipFill>
+                  <pic:spPr bwMode="auto">
+                    <a:xfrm>
+                      <a:off x="0" y="0"/>
+                      <a:ext cx="5334000" cy="2459481"/>
+                    </a:xfrm>
+                    <a:prstGeom prst="rect">
+                      <a:avLst/>
+                    </a:prstGeom>
+                    <a:noFill/>
+                    <a:ln w="9525">
+                      <a:noFill/>
+                      <a:headEnd/>
+                      <a:tailEnd/>
+                    </a:ln>
+                  </pic:spPr>
+                </pic:pic>
+              </a:graphicData>
+            </a:graphic>
+          </wp:inline>
+        </w:drawing>
+      </w:r>
+    </w:p>
+    <w:p>
+      <w:pPr>
+        <w:pStyle w:val="ImageCaption"/>
+      </w:pPr>
+      <w:r>
+        <w:t xml:space="preserve">Figure 1. Cross-method signal-quality disagreement on wearable photoplethysmography. Each colored disk represents the subset of windows accepted by one published method on each dataset (schematic; not proportional). The region outside all three disks represents the consensus rejection by all three independently developed methods (44.6% on WESAD; 43.1% on PPG-DaLiA). The three methods individually disagree about which windows pass (median pairwise Cohen’s kappa = -0.20) but converge on which to reject. Headline numbers in the figure are uncorrected and identical to those in Table 4 (WESAD) and Table 10 (PPG-DaLiA).</w:t>
+      </w:r>
+    </w:p>
+    <w:bookmarkEnd w:id="14"/>
+    <w:bookmarkStart w:id="25" w:name="methods"/>
     <w:p>
       <w:pPr>
         <w:pStyle w:val="Heading2"/>
@@ -446,7 +491,7 @@
         <w:t xml:space="preserve">2. Methods</w:t>
       </w:r>
     </w:p>
-    <w:bookmarkStart w:id="12" w:name="overview"/>
+    <w:bookmarkStart w:id="15" w:name="overview"/>
     <w:p>
       <w:pPr>
         <w:pStyle w:val="Heading3"/>
@@ -472,8 +517,8 @@
         <w:t xml:space="preserve">, MIT licensed) that takes a wearable dataset in a canonical daily-summary schema and produces five categories of output: per-window artifact findings, participant-level reliability primitives, a six-component Digital Biomarker Trust Score, a screening and AIPW-adjusted confounding analysis, and a stratified fairness audit. The empirical contribution is the multi-baseline SQI audit on WESAD with replication on PPG-DaLiA (Section 3), which uses the window-level artifact detection (Section 2.3), the reliability primitives (Section 2.4), and the published-baseline integration (Section 2.8). Synthetic-cohort analyses (Section 4) validate the remaining framework components on parameterised data with documented injected failure modes: the Digital Biomarker Trust Score (Section 2.5), the AIPW-adjusted confounding analysis (Section 2.6), and the stratified fairness audit (Section 2.7). The synthetic validation does not bear on the empirical findings on real wearable data; it characterises framework components available for follow-up studies on other datasets. The whole synthetic pipeline runs end-to-end in approximately two minutes on a modern laptop CPU; the full 15-subject WESAD analysis takes approximately three minutes.</w:t>
       </w:r>
     </w:p>
-    <w:bookmarkEnd w:id="12"/>
-    <w:bookmarkStart w:id="13" w:name="synthetic-cohort"/>
+    <w:bookmarkEnd w:id="15"/>
+    <w:bookmarkStart w:id="16" w:name="synthetic-cohort"/>
     <w:p>
       <w:pPr>
         <w:pStyle w:val="Heading3"/>
@@ -677,8 +722,8 @@
         <w:t xml:space="preserve">capped at 0.6. This breaks naive imputation methods and forces the missingness-as-information module to do real work.</w:t>
       </w:r>
     </w:p>
-    <w:bookmarkEnd w:id="13"/>
-    <w:bookmarkStart w:id="14" w:name="window-level-artifact-detection"/>
+    <w:bookmarkEnd w:id="16"/>
+    <w:bookmarkStart w:id="17" w:name="window-level-artifact-detection"/>
     <w:p>
       <w:pPr>
         <w:pStyle w:val="Heading3"/>
@@ -725,8 +770,8 @@
         <w:t xml:space="preserve">and were hand-tuned on the synthetic generator; the real-data pilot demonstrates these thresholds do not transfer without recalibration (Section 3.3).</w:t>
       </w:r>
     </w:p>
-    <w:bookmarkEnd w:id="14"/>
-    <w:bookmarkStart w:id="15" w:name="reliability-primitives"/>
+    <w:bookmarkEnd w:id="17"/>
+    <w:bookmarkStart w:id="18" w:name="reliability-primitives"/>
     <w:p>
       <w:pPr>
         <w:pStyle w:val="Heading3"/>
@@ -879,8 +924,8 @@
         <w:t xml:space="preserve">. We tested four alternative policies (raw, plausibility-only, Malik 10%, NN50) and confirmed S3’s high HRV holds across raw, plausibility-only, and Malik 25% (supplement S2.4). The Malik 25% policy is the conservative middle ground recommended by the HRV Task Force standards.</w:t>
       </w:r>
     </w:p>
-    <w:bookmarkEnd w:id="15"/>
-    <w:bookmarkStart w:id="16" w:name="digital-biomarker-trust-score"/>
+    <w:bookmarkEnd w:id="18"/>
+    <w:bookmarkStart w:id="19" w:name="digital-biomarker-trust-score"/>
     <w:p>
       <w:pPr>
         <w:pStyle w:val="Heading3"/>
@@ -914,6 +959,14 @@
           <w:tblHeader w:val="on"/>
         </w:trPr>
         <w:tc>
+          <w:tcPr>
+            <w:tcBorders>
+              <w:top w:val="single" w:sz="12" w:space="0" w:color="000000"/>
+              <w:left w:val="nil"/>
+              <w:bottom w:val="single" w:sz="8" w:space="0" w:color="000000"/>
+              <w:right w:val="nil"/>
+            </w:tcBorders>
+          </w:tcPr>
           <w:tcPr/>
           <w:p>
             <w:pPr>
@@ -925,6 +978,14 @@
           </w:p>
         </w:tc>
         <w:tc>
+          <w:tcPr>
+            <w:tcBorders>
+              <w:top w:val="single" w:sz="12" w:space="0" w:color="000000"/>
+              <w:left w:val="nil"/>
+              <w:bottom w:val="single" w:sz="8" w:space="0" w:color="000000"/>
+              <w:right w:val="nil"/>
+            </w:tcBorders>
+          </w:tcPr>
           <w:tcPr/>
           <w:p>
             <w:pPr>
@@ -936,6 +997,14 @@
           </w:p>
         </w:tc>
         <w:tc>
+          <w:tcPr>
+            <w:tcBorders>
+              <w:top w:val="single" w:sz="12" w:space="0" w:color="000000"/>
+              <w:left w:val="nil"/>
+              <w:bottom w:val="single" w:sz="8" w:space="0" w:color="000000"/>
+              <w:right w:val="nil"/>
+            </w:tcBorders>
+          </w:tcPr>
           <w:tcPr/>
           <w:p>
             <w:pPr>
@@ -949,6 +1018,14 @@
       </w:tr>
       <w:tr>
         <w:tc>
+          <w:tcPr>
+            <w:tcBorders>
+              <w:top w:val="nil"/>
+              <w:left w:val="nil"/>
+              <w:bottom w:val="nil"/>
+              <w:right w:val="nil"/>
+            </w:tcBorders>
+          </w:tcPr>
           <w:tcPr/>
           <w:p>
             <w:pPr>
@@ -960,6 +1037,14 @@
           </w:p>
         </w:tc>
         <w:tc>
+          <w:tcPr>
+            <w:tcBorders>
+              <w:top w:val="nil"/>
+              <w:left w:val="nil"/>
+              <w:bottom w:val="nil"/>
+              <w:right w:val="nil"/>
+            </w:tcBorders>
+          </w:tcPr>
           <w:tcPr/>
           <w:p>
             <w:pPr>
@@ -971,6 +1056,14 @@
           </w:p>
         </w:tc>
         <w:tc>
+          <w:tcPr>
+            <w:tcBorders>
+              <w:top w:val="nil"/>
+              <w:left w:val="nil"/>
+              <w:bottom w:val="nil"/>
+              <w:right w:val="nil"/>
+            </w:tcBorders>
+          </w:tcPr>
           <w:tcPr/>
           <w:p>
             <w:pPr>
@@ -984,6 +1077,14 @@
       </w:tr>
       <w:tr>
         <w:tc>
+          <w:tcPr>
+            <w:tcBorders>
+              <w:top w:val="nil"/>
+              <w:left w:val="nil"/>
+              <w:bottom w:val="nil"/>
+              <w:right w:val="nil"/>
+            </w:tcBorders>
+          </w:tcPr>
           <w:tcPr/>
           <w:p>
             <w:pPr>
@@ -995,6 +1096,14 @@
           </w:p>
         </w:tc>
         <w:tc>
+          <w:tcPr>
+            <w:tcBorders>
+              <w:top w:val="nil"/>
+              <w:left w:val="nil"/>
+              <w:bottom w:val="nil"/>
+              <w:right w:val="nil"/>
+            </w:tcBorders>
+          </w:tcPr>
           <w:tcPr/>
           <w:p>
             <w:pPr>
@@ -1006,6 +1115,14 @@
           </w:p>
         </w:tc>
         <w:tc>
+          <w:tcPr>
+            <w:tcBorders>
+              <w:top w:val="nil"/>
+              <w:left w:val="nil"/>
+              <w:bottom w:val="nil"/>
+              <w:right w:val="nil"/>
+            </w:tcBorders>
+          </w:tcPr>
           <w:tcPr/>
           <w:p>
             <w:pPr>
@@ -1019,6 +1136,14 @@
       </w:tr>
       <w:tr>
         <w:tc>
+          <w:tcPr>
+            <w:tcBorders>
+              <w:top w:val="nil"/>
+              <w:left w:val="nil"/>
+              <w:bottom w:val="nil"/>
+              <w:right w:val="nil"/>
+            </w:tcBorders>
+          </w:tcPr>
           <w:tcPr/>
           <w:p>
             <w:pPr>
@@ -1030,6 +1155,14 @@
           </w:p>
         </w:tc>
         <w:tc>
+          <w:tcPr>
+            <w:tcBorders>
+              <w:top w:val="nil"/>
+              <w:left w:val="nil"/>
+              <w:bottom w:val="nil"/>
+              <w:right w:val="nil"/>
+            </w:tcBorders>
+          </w:tcPr>
           <w:tcPr/>
           <w:p>
             <w:pPr>
@@ -1041,6 +1174,14 @@
           </w:p>
         </w:tc>
         <w:tc>
+          <w:tcPr>
+            <w:tcBorders>
+              <w:top w:val="nil"/>
+              <w:left w:val="nil"/>
+              <w:bottom w:val="nil"/>
+              <w:right w:val="nil"/>
+            </w:tcBorders>
+          </w:tcPr>
           <w:tcPr/>
           <w:p>
             <w:pPr>
@@ -1054,6 +1195,14 @@
       </w:tr>
       <w:tr>
         <w:tc>
+          <w:tcPr>
+            <w:tcBorders>
+              <w:top w:val="nil"/>
+              <w:left w:val="nil"/>
+              <w:bottom w:val="nil"/>
+              <w:right w:val="nil"/>
+            </w:tcBorders>
+          </w:tcPr>
           <w:tcPr/>
           <w:p>
             <w:pPr>
@@ -1065,6 +1214,14 @@
           </w:p>
         </w:tc>
         <w:tc>
+          <w:tcPr>
+            <w:tcBorders>
+              <w:top w:val="nil"/>
+              <w:left w:val="nil"/>
+              <w:bottom w:val="nil"/>
+              <w:right w:val="nil"/>
+            </w:tcBorders>
+          </w:tcPr>
           <w:tcPr/>
           <w:p>
             <w:pPr>
@@ -1076,6 +1233,14 @@
           </w:p>
         </w:tc>
         <w:tc>
+          <w:tcPr>
+            <w:tcBorders>
+              <w:top w:val="nil"/>
+              <w:left w:val="nil"/>
+              <w:bottom w:val="nil"/>
+              <w:right w:val="nil"/>
+            </w:tcBorders>
+          </w:tcPr>
           <w:tcPr/>
           <w:p>
             <w:pPr>
@@ -1089,6 +1254,14 @@
       </w:tr>
       <w:tr>
         <w:tc>
+          <w:tcPr>
+            <w:tcBorders>
+              <w:top w:val="nil"/>
+              <w:left w:val="nil"/>
+              <w:bottom w:val="nil"/>
+              <w:right w:val="nil"/>
+            </w:tcBorders>
+          </w:tcPr>
           <w:tcPr/>
           <w:p>
             <w:pPr>
@@ -1100,6 +1273,14 @@
           </w:p>
         </w:tc>
         <w:tc>
+          <w:tcPr>
+            <w:tcBorders>
+              <w:top w:val="nil"/>
+              <w:left w:val="nil"/>
+              <w:bottom w:val="nil"/>
+              <w:right w:val="nil"/>
+            </w:tcBorders>
+          </w:tcPr>
           <w:tcPr/>
           <w:p>
             <w:pPr>
@@ -1111,6 +1292,14 @@
           </w:p>
         </w:tc>
         <w:tc>
+          <w:tcPr>
+            <w:tcBorders>
+              <w:top w:val="nil"/>
+              <w:left w:val="nil"/>
+              <w:bottom w:val="nil"/>
+              <w:right w:val="nil"/>
+            </w:tcBorders>
+          </w:tcPr>
           <w:tcPr/>
           <w:p>
             <w:pPr>
@@ -1124,6 +1313,14 @@
       </w:tr>
       <w:tr>
         <w:tc>
+          <w:tcPr>
+            <w:tcBorders>
+              <w:top w:val="nil"/>
+              <w:left w:val="nil"/>
+              <w:bottom w:val="single" w:sz="12" w:space="0" w:color="000000"/>
+              <w:right w:val="nil"/>
+            </w:tcBorders>
+          </w:tcPr>
           <w:tcPr/>
           <w:p>
             <w:pPr>
@@ -1135,6 +1332,14 @@
           </w:p>
         </w:tc>
         <w:tc>
+          <w:tcPr>
+            <w:tcBorders>
+              <w:top w:val="nil"/>
+              <w:left w:val="nil"/>
+              <w:bottom w:val="single" w:sz="12" w:space="0" w:color="000000"/>
+              <w:right w:val="nil"/>
+            </w:tcBorders>
+          </w:tcPr>
           <w:tcPr/>
           <w:p>
             <w:pPr>
@@ -1146,6 +1351,14 @@
           </w:p>
         </w:tc>
         <w:tc>
+          <w:tcPr>
+            <w:tcBorders>
+              <w:top w:val="nil"/>
+              <w:left w:val="nil"/>
+              <w:bottom w:val="single" w:sz="12" w:space="0" w:color="000000"/>
+              <w:right w:val="nil"/>
+            </w:tcBorders>
+          </w:tcPr>
           <w:tcPr/>
           <w:p>
             <w:pPr>
@@ -1190,8 +1403,8 @@
         <w:t xml:space="preserve">routine searches the 6-component weight simplex (Dirichlet sampling plus local grid refinement) to maximize Spearman correlation between the overall trust score and a user-supplied downstream reproducibility target. A 30% participant-level holdout is reserved from the search; the learned weights are reported with their holdout Spearman.</w:t>
       </w:r>
     </w:p>
-    <w:bookmarkEnd w:id="16"/>
-    <w:bookmarkStart w:id="17" w:name="causal-adjusted-confounding-analysis"/>
+    <w:bookmarkEnd w:id="19"/>
+    <w:bookmarkStart w:id="20" w:name="causal-adjusted-confounding-analysis"/>
     <w:p>
       <w:pPr>
         <w:pStyle w:val="Heading3"/>
@@ -1235,8 +1448,8 @@
         <w:t xml:space="preserve">string in the output.</w:t>
       </w:r>
     </w:p>
-    <w:bookmarkEnd w:id="17"/>
-    <w:bookmarkStart w:id="18" w:name="fairness-audit"/>
+    <w:bookmarkEnd w:id="20"/>
+    <w:bookmarkStart w:id="21" w:name="fairness-audit"/>
     <w:p>
       <w:pPr>
         <w:pStyle w:val="Heading3"/>
@@ -1253,8 +1466,8 @@
         <w:t xml:space="preserve">Stratified bootstrap analysis over any categorical column (device family, skin-tone quartile, sex, age band). For each stratum and each DBTS component, we report the mean, 95% cluster-bootstrap CI (resampling participants, not rows), and the Q1-vs-Q4 disparity with its CI. Forest plots are generated automatically.</w:t>
       </w:r>
     </w:p>
-    <w:bookmarkEnd w:id="18"/>
-    <w:bookmarkStart w:id="19" w:name="published-baselines"/>
+    <w:bookmarkEnd w:id="21"/>
+    <w:bookmarkStart w:id="22" w:name="published-baselines"/>
     <w:p>
       <w:pPr>
         <w:pStyle w:val="Heading3"/>
@@ -1428,8 +1641,8 @@
         <w:t xml:space="preserve">Agreement metrics for each pairwise comparison are reported as Spearman ρ on the continuous scores, Cohen’s κ on the binary pass/fail labels, and a full 2×2 crosstab.</w:t>
       </w:r>
     </w:p>
-    <w:bookmarkEnd w:id="19"/>
-    <w:bookmarkStart w:id="20" w:name="study-design"/>
+    <w:bookmarkEnd w:id="22"/>
+    <w:bookmarkStart w:id="23" w:name="study-design"/>
     <w:p>
       <w:pPr>
         <w:pStyle w:val="Heading3"/>
@@ -1458,8 +1671,8 @@
         <w:t xml:space="preserve">(n = 15 subjects, S2-S17 minus S1 and S12 which are absent from the standard public release). Two supporting analyses use the same audit pipeline on parameterised data to characterise the audit components: (i) a 300-participant 60-day synthetic cohort with documented injected failure modes (Section 2.2), and (ii) a cross-cohort parameter sweep across five synthetic regimes (default, strong environment, inverted skin-tone, severe device bias, clean world) to test the audit’s responsiveness to controlled changes in cohort properties. Reproducibility of every reported number is verified from a fixed seed on every continuous-integration run.</w:t>
       </w:r>
     </w:p>
-    <w:bookmarkEnd w:id="20"/>
-    <w:bookmarkStart w:id="21" w:name="statistical-analysis"/>
+    <w:bookmarkEnd w:id="23"/>
+    <w:bookmarkStart w:id="24" w:name="statistical-analysis"/>
     <w:p>
       <w:pPr>
         <w:pStyle w:val="Heading3"/>
@@ -1522,9 +1735,9 @@
         <w:t xml:space="preserve">The PPG-DaLiA replication (Section 3.7) tests the same headline metric (in-house pass AND all three published methods fail) on a second public benchmark and is a pre-specified replication of the WESAD finding rather than a new hypothesis.</w:t>
       </w:r>
     </w:p>
-    <w:bookmarkEnd w:id="21"/>
-    <w:bookmarkEnd w:id="22"/>
-    <w:bookmarkStart w:id="31" w:name="cross-method-audit-on-wesad"/>
+    <w:bookmarkEnd w:id="24"/>
+    <w:bookmarkEnd w:id="25"/>
+    <w:bookmarkStart w:id="34" w:name="cross-method-audit-on-wesad"/>
     <w:p>
       <w:pPr>
         <w:pStyle w:val="Heading2"/>
@@ -1553,7 +1766,7 @@
         <w:t xml:space="preserve">(S2-S17, with S1 and S12 absent from the standard public release), producing 6,585 5-second windows of synchronized chest RespiBAN ECG (700 Hz) and wrist Empatica E4 PPG (64 Hz) across baseline (3,507 windows), stress (1,979), and amusement (1,099) labeled states.</w:t>
       </w:r>
     </w:p>
-    <w:bookmarkStart w:id="23" w:name="reporting-standards-and-reproducibility"/>
+    <w:bookmarkStart w:id="26" w:name="reporting-standards-and-reproducibility"/>
     <w:p>
       <w:pPr>
         <w:pStyle w:val="Heading3"/>
@@ -1677,7 +1890,7 @@
         <w:t xml:space="preserve">paper/checklists/stard_2015_checklist.md</w:t>
       </w:r>
       <w:r>
-        <w:t xml:space="preserve">. The flow diagram in Figure 1 follows STARD conventions adapted to the multi-arm structure of this audit.</w:t>
+        <w:t xml:space="preserve">. The flow diagram in Supplementary Figure S1 follows STARD conventions adapted to the multi-arm structure of this audit.</w:t>
       </w:r>
     </w:p>
     <w:p>
@@ -1771,7 +1984,7 @@
         <w:pStyle w:val="FirstParagraph"/>
       </w:pPr>
       <w:r>
-        <w:t xml:space="preserve">Figure 1 (</w:t>
+        <w:t xml:space="preserve">Supplementary Figure S1 (</w:t>
       </w:r>
       <w:r>
         <w:rPr>
@@ -1783,8 +1996,8 @@
         <w:t xml:space="preserve">) shows the flow of data through the WESAD validation pipeline in the STARD-style convention: source dataset, n=15 subjects analysed, per-window processing, zero post-hoc exclusions, and the four analysis arms operating on the same 6,585 windows.</w:t>
       </w:r>
     </w:p>
-    <w:bookmarkEnd w:id="23"/>
-    <w:bookmarkStart w:id="24" w:name="X83e78e9dd801c6e70ab9eb8d0c52cab58f1f44b"/>
+    <w:bookmarkEnd w:id="26"/>
+    <w:bookmarkStart w:id="27" w:name="X83e78e9dd801c6e70ab9eb8d0c52cab58f1f44b"/>
     <w:p>
       <w:pPr>
         <w:pStyle w:val="Heading3"/>
@@ -1834,6 +2047,14 @@
           <w:tblHeader w:val="on"/>
         </w:trPr>
         <w:tc>
+          <w:tcPr>
+            <w:tcBorders>
+              <w:top w:val="single" w:sz="12" w:space="0" w:color="000000"/>
+              <w:left w:val="nil"/>
+              <w:bottom w:val="single" w:sz="8" w:space="0" w:color="000000"/>
+              <w:right w:val="nil"/>
+            </w:tcBorders>
+          </w:tcPr>
           <w:tcPr/>
           <w:p>
             <w:pPr>
@@ -1845,6 +2066,14 @@
           </w:p>
         </w:tc>
         <w:tc>
+          <w:tcPr>
+            <w:tcBorders>
+              <w:top w:val="single" w:sz="12" w:space="0" w:color="000000"/>
+              <w:left w:val="nil"/>
+              <w:bottom w:val="single" w:sz="8" w:space="0" w:color="000000"/>
+              <w:right w:val="nil"/>
+            </w:tcBorders>
+          </w:tcPr>
           <w:tcPr/>
           <w:p>
             <w:pPr>
@@ -1858,6 +2087,14 @@
       </w:tr>
       <w:tr>
         <w:tc>
+          <w:tcPr>
+            <w:tcBorders>
+              <w:top w:val="nil"/>
+              <w:left w:val="nil"/>
+              <w:bottom w:val="nil"/>
+              <w:right w:val="nil"/>
+            </w:tcBorders>
+          </w:tcPr>
           <w:tcPr/>
           <w:p>
             <w:pPr>
@@ -1869,6 +2106,14 @@
           </w:p>
         </w:tc>
         <w:tc>
+          <w:tcPr>
+            <w:tcBorders>
+              <w:top w:val="nil"/>
+              <w:left w:val="nil"/>
+              <w:bottom w:val="nil"/>
+              <w:right w:val="nil"/>
+            </w:tcBorders>
+          </w:tcPr>
           <w:tcPr/>
           <w:p>
             <w:pPr>
@@ -1882,6 +2127,14 @@
       </w:tr>
       <w:tr>
         <w:tc>
+          <w:tcPr>
+            <w:tcBorders>
+              <w:top w:val="nil"/>
+              <w:left w:val="nil"/>
+              <w:bottom w:val="nil"/>
+              <w:right w:val="nil"/>
+            </w:tcBorders>
+          </w:tcPr>
           <w:tcPr/>
           <w:p>
             <w:pPr>
@@ -1893,6 +2146,14 @@
           </w:p>
         </w:tc>
         <w:tc>
+          <w:tcPr>
+            <w:tcBorders>
+              <w:top w:val="nil"/>
+              <w:left w:val="nil"/>
+              <w:bottom w:val="nil"/>
+              <w:right w:val="nil"/>
+            </w:tcBorders>
+          </w:tcPr>
           <w:tcPr/>
           <w:p>
             <w:pPr>
@@ -1910,6 +2171,14 @@
       </w:tr>
       <w:tr>
         <w:tc>
+          <w:tcPr>
+            <w:tcBorders>
+              <w:top w:val="nil"/>
+              <w:left w:val="nil"/>
+              <w:bottom w:val="nil"/>
+              <w:right w:val="nil"/>
+            </w:tcBorders>
+          </w:tcPr>
           <w:tcPr/>
           <w:p>
             <w:pPr>
@@ -1931,6 +2200,14 @@
           </w:p>
         </w:tc>
         <w:tc>
+          <w:tcPr>
+            <w:tcBorders>
+              <w:top w:val="nil"/>
+              <w:left w:val="nil"/>
+              <w:bottom w:val="nil"/>
+              <w:right w:val="nil"/>
+            </w:tcBorders>
+          </w:tcPr>
           <w:tcPr/>
           <w:p>
             <w:pPr>
@@ -1948,6 +2225,14 @@
       </w:tr>
       <w:tr>
         <w:tc>
+          <w:tcPr>
+            <w:tcBorders>
+              <w:top w:val="nil"/>
+              <w:left w:val="nil"/>
+              <w:bottom w:val="nil"/>
+              <w:right w:val="nil"/>
+            </w:tcBorders>
+          </w:tcPr>
           <w:tcPr/>
           <w:p>
             <w:pPr>
@@ -1963,6 +2248,14 @@
           </w:p>
         </w:tc>
         <w:tc>
+          <w:tcPr>
+            <w:tcBorders>
+              <w:top w:val="nil"/>
+              <w:left w:val="nil"/>
+              <w:bottom w:val="nil"/>
+              <w:right w:val="nil"/>
+            </w:tcBorders>
+          </w:tcPr>
           <w:tcPr/>
           <w:p>
             <w:pPr>
@@ -1980,6 +2273,14 @@
       </w:tr>
       <w:tr>
         <w:tc>
+          <w:tcPr>
+            <w:tcBorders>
+              <w:top w:val="nil"/>
+              <w:left w:val="nil"/>
+              <w:bottom w:val="nil"/>
+              <w:right w:val="nil"/>
+            </w:tcBorders>
+          </w:tcPr>
           <w:tcPr/>
           <w:p>
             <w:pPr>
@@ -1991,6 +2292,14 @@
           </w:p>
         </w:tc>
         <w:tc>
+          <w:tcPr>
+            <w:tcBorders>
+              <w:top w:val="nil"/>
+              <w:left w:val="nil"/>
+              <w:bottom w:val="nil"/>
+              <w:right w:val="nil"/>
+            </w:tcBorders>
+          </w:tcPr>
           <w:tcPr/>
           <w:p>
             <w:pPr>
@@ -2004,6 +2313,14 @@
       </w:tr>
       <w:tr>
         <w:tc>
+          <w:tcPr>
+            <w:tcBorders>
+              <w:top w:val="nil"/>
+              <w:left w:val="nil"/>
+              <w:bottom w:val="nil"/>
+              <w:right w:val="nil"/>
+            </w:tcBorders>
+          </w:tcPr>
           <w:tcPr/>
           <w:p>
             <w:pPr>
@@ -2015,6 +2332,14 @@
           </w:p>
         </w:tc>
         <w:tc>
+          <w:tcPr>
+            <w:tcBorders>
+              <w:top w:val="nil"/>
+              <w:left w:val="nil"/>
+              <w:bottom w:val="nil"/>
+              <w:right w:val="nil"/>
+            </w:tcBorders>
+          </w:tcPr>
           <w:tcPr/>
           <w:p>
             <w:pPr>
@@ -2028,6 +2353,14 @@
       </w:tr>
       <w:tr>
         <w:tc>
+          <w:tcPr>
+            <w:tcBorders>
+              <w:top w:val="nil"/>
+              <w:left w:val="nil"/>
+              <w:bottom w:val="single" w:sz="12" w:space="0" w:color="000000"/>
+              <w:right w:val="nil"/>
+            </w:tcBorders>
+          </w:tcPr>
           <w:tcPr/>
           <w:p>
             <w:pPr>
@@ -2039,6 +2372,14 @@
           </w:p>
         </w:tc>
         <w:tc>
+          <w:tcPr>
+            <w:tcBorders>
+              <w:top w:val="nil"/>
+              <w:left w:val="nil"/>
+              <w:bottom w:val="single" w:sz="12" w:space="0" w:color="000000"/>
+              <w:right w:val="nil"/>
+            </w:tcBorders>
+          </w:tcPr>
           <w:tcPr/>
           <w:p>
             <w:pPr>
@@ -2088,8 +2429,8 @@
         <w:t xml:space="preserve">, a four-fold spread.</w:t>
       </w:r>
     </w:p>
-    <w:bookmarkEnd w:id="24"/>
-    <w:bookmarkStart w:id="25" w:name="Xe41713c60b8037e7c6e4ae4c7f679570120e6a4"/>
+    <w:bookmarkEnd w:id="27"/>
+    <w:bookmarkStart w:id="28" w:name="Xe41713c60b8037e7c6e4ae4c7f679570120e6a4"/>
     <w:p>
       <w:pPr>
         <w:pStyle w:val="Heading3"/>
@@ -2185,6 +2526,14 @@
           <w:tblHeader w:val="on"/>
         </w:trPr>
         <w:tc>
+          <w:tcPr>
+            <w:tcBorders>
+              <w:top w:val="single" w:sz="12" w:space="0" w:color="000000"/>
+              <w:left w:val="nil"/>
+              <w:bottom w:val="single" w:sz="8" w:space="0" w:color="000000"/>
+              <w:right w:val="nil"/>
+            </w:tcBorders>
+          </w:tcPr>
           <w:tcPr/>
           <w:p>
             <w:pPr>
@@ -2196,6 +2545,14 @@
           </w:p>
         </w:tc>
         <w:tc>
+          <w:tcPr>
+            <w:tcBorders>
+              <w:top w:val="single" w:sz="12" w:space="0" w:color="000000"/>
+              <w:left w:val="nil"/>
+              <w:bottom w:val="single" w:sz="8" w:space="0" w:color="000000"/>
+              <w:right w:val="nil"/>
+            </w:tcBorders>
+          </w:tcPr>
           <w:tcPr/>
           <w:p>
             <w:pPr>
@@ -2207,6 +2564,14 @@
           </w:p>
         </w:tc>
         <w:tc>
+          <w:tcPr>
+            <w:tcBorders>
+              <w:top w:val="single" w:sz="12" w:space="0" w:color="000000"/>
+              <w:left w:val="nil"/>
+              <w:bottom w:val="single" w:sz="8" w:space="0" w:color="000000"/>
+              <w:right w:val="nil"/>
+            </w:tcBorders>
+          </w:tcPr>
           <w:tcPr/>
           <w:p>
             <w:pPr>
@@ -2220,6 +2585,14 @@
       </w:tr>
       <w:tr>
         <w:tc>
+          <w:tcPr>
+            <w:tcBorders>
+              <w:top w:val="nil"/>
+              <w:left w:val="nil"/>
+              <w:bottom w:val="nil"/>
+              <w:right w:val="nil"/>
+            </w:tcBorders>
+          </w:tcPr>
           <w:tcPr/>
           <w:p>
             <w:pPr>
@@ -2231,6 +2604,14 @@
           </w:p>
         </w:tc>
         <w:tc>
+          <w:tcPr>
+            <w:tcBorders>
+              <w:top w:val="nil"/>
+              <w:left w:val="nil"/>
+              <w:bottom w:val="nil"/>
+              <w:right w:val="nil"/>
+            </w:tcBorders>
+          </w:tcPr>
           <w:tcPr/>
           <w:p>
             <w:pPr>
@@ -2242,6 +2623,14 @@
           </w:p>
         </w:tc>
         <w:tc>
+          <w:tcPr>
+            <w:tcBorders>
+              <w:top w:val="nil"/>
+              <w:left w:val="nil"/>
+              <w:bottom w:val="nil"/>
+              <w:right w:val="nil"/>
+            </w:tcBorders>
+          </w:tcPr>
           <w:tcPr/>
           <w:p>
             <w:pPr>
@@ -2255,6 +2644,14 @@
       </w:tr>
       <w:tr>
         <w:tc>
+          <w:tcPr>
+            <w:tcBorders>
+              <w:top w:val="nil"/>
+              <w:left w:val="nil"/>
+              <w:bottom w:val="nil"/>
+              <w:right w:val="nil"/>
+            </w:tcBorders>
+          </w:tcPr>
           <w:tcPr/>
           <w:p>
             <w:pPr>
@@ -2266,6 +2663,14 @@
           </w:p>
         </w:tc>
         <w:tc>
+          <w:tcPr>
+            <w:tcBorders>
+              <w:top w:val="nil"/>
+              <w:left w:val="nil"/>
+              <w:bottom w:val="nil"/>
+              <w:right w:val="nil"/>
+            </w:tcBorders>
+          </w:tcPr>
           <w:tcPr/>
           <w:p>
             <w:pPr>
@@ -2277,6 +2682,14 @@
           </w:p>
         </w:tc>
         <w:tc>
+          <w:tcPr>
+            <w:tcBorders>
+              <w:top w:val="nil"/>
+              <w:left w:val="nil"/>
+              <w:bottom w:val="nil"/>
+              <w:right w:val="nil"/>
+            </w:tcBorders>
+          </w:tcPr>
           <w:tcPr/>
           <w:p>
             <w:pPr>
@@ -2290,6 +2703,14 @@
       </w:tr>
       <w:tr>
         <w:tc>
+          <w:tcPr>
+            <w:tcBorders>
+              <w:top w:val="nil"/>
+              <w:left w:val="nil"/>
+              <w:bottom w:val="nil"/>
+              <w:right w:val="nil"/>
+            </w:tcBorders>
+          </w:tcPr>
           <w:tcPr/>
           <w:p>
             <w:pPr>
@@ -2301,6 +2722,14 @@
           </w:p>
         </w:tc>
         <w:tc>
+          <w:tcPr>
+            <w:tcBorders>
+              <w:top w:val="nil"/>
+              <w:left w:val="nil"/>
+              <w:bottom w:val="nil"/>
+              <w:right w:val="nil"/>
+            </w:tcBorders>
+          </w:tcPr>
           <w:tcPr/>
           <w:p>
             <w:pPr>
@@ -2312,6 +2741,14 @@
           </w:p>
         </w:tc>
         <w:tc>
+          <w:tcPr>
+            <w:tcBorders>
+              <w:top w:val="nil"/>
+              <w:left w:val="nil"/>
+              <w:bottom w:val="nil"/>
+              <w:right w:val="nil"/>
+            </w:tcBorders>
+          </w:tcPr>
           <w:tcPr/>
           <w:p>
             <w:pPr>
@@ -2325,6 +2762,14 @@
       </w:tr>
       <w:tr>
         <w:tc>
+          <w:tcPr>
+            <w:tcBorders>
+              <w:top w:val="nil"/>
+              <w:left w:val="nil"/>
+              <w:bottom w:val="single" w:sz="12" w:space="0" w:color="000000"/>
+              <w:right w:val="nil"/>
+            </w:tcBorders>
+          </w:tcPr>
           <w:tcPr/>
           <w:p>
             <w:pPr>
@@ -2340,6 +2785,14 @@
           </w:p>
         </w:tc>
         <w:tc>
+          <w:tcPr>
+            <w:tcBorders>
+              <w:top w:val="nil"/>
+              <w:left w:val="nil"/>
+              <w:bottom w:val="single" w:sz="12" w:space="0" w:color="000000"/>
+              <w:right w:val="nil"/>
+            </w:tcBorders>
+          </w:tcPr>
           <w:tcPr/>
           <w:p>
             <w:pPr>
@@ -2355,6 +2808,14 @@
           </w:p>
         </w:tc>
         <w:tc>
+          <w:tcPr>
+            <w:tcBorders>
+              <w:top w:val="nil"/>
+              <w:left w:val="nil"/>
+              <w:bottom w:val="single" w:sz="12" w:space="0" w:color="000000"/>
+              <w:right w:val="nil"/>
+            </w:tcBorders>
+          </w:tcPr>
           <w:tcPr/>
           <w:p>
             <w:pPr>
@@ -2396,6 +2857,14 @@
           <w:tblHeader w:val="on"/>
         </w:trPr>
         <w:tc>
+          <w:tcPr>
+            <w:tcBorders>
+              <w:top w:val="single" w:sz="12" w:space="0" w:color="000000"/>
+              <w:left w:val="nil"/>
+              <w:bottom w:val="single" w:sz="8" w:space="0" w:color="000000"/>
+              <w:right w:val="nil"/>
+            </w:tcBorders>
+          </w:tcPr>
           <w:tcPr/>
           <w:p>
             <w:pPr>
@@ -2407,6 +2876,14 @@
           </w:p>
         </w:tc>
         <w:tc>
+          <w:tcPr>
+            <w:tcBorders>
+              <w:top w:val="single" w:sz="12" w:space="0" w:color="000000"/>
+              <w:left w:val="nil"/>
+              <w:bottom w:val="single" w:sz="8" w:space="0" w:color="000000"/>
+              <w:right w:val="nil"/>
+            </w:tcBorders>
+          </w:tcPr>
           <w:tcPr/>
           <w:p>
             <w:pPr>
@@ -2420,6 +2897,14 @@
       </w:tr>
       <w:tr>
         <w:tc>
+          <w:tcPr>
+            <w:tcBorders>
+              <w:top w:val="nil"/>
+              <w:left w:val="nil"/>
+              <w:bottom w:val="nil"/>
+              <w:right w:val="nil"/>
+            </w:tcBorders>
+          </w:tcPr>
           <w:tcPr/>
           <w:p>
             <w:pPr>
@@ -2431,6 +2916,14 @@
           </w:p>
         </w:tc>
         <w:tc>
+          <w:tcPr>
+            <w:tcBorders>
+              <w:top w:val="nil"/>
+              <w:left w:val="nil"/>
+              <w:bottom w:val="nil"/>
+              <w:right w:val="nil"/>
+            </w:tcBorders>
+          </w:tcPr>
           <w:tcPr/>
           <w:p>
             <w:pPr>
@@ -2444,6 +2937,14 @@
       </w:tr>
       <w:tr>
         <w:tc>
+          <w:tcPr>
+            <w:tcBorders>
+              <w:top w:val="nil"/>
+              <w:left w:val="nil"/>
+              <w:bottom w:val="nil"/>
+              <w:right w:val="nil"/>
+            </w:tcBorders>
+          </w:tcPr>
           <w:tcPr/>
           <w:p>
             <w:pPr>
@@ -2455,6 +2956,14 @@
           </w:p>
         </w:tc>
         <w:tc>
+          <w:tcPr>
+            <w:tcBorders>
+              <w:top w:val="nil"/>
+              <w:left w:val="nil"/>
+              <w:bottom w:val="nil"/>
+              <w:right w:val="nil"/>
+            </w:tcBorders>
+          </w:tcPr>
           <w:tcPr/>
           <w:p>
             <w:pPr>
@@ -2468,6 +2977,14 @@
       </w:tr>
       <w:tr>
         <w:tc>
+          <w:tcPr>
+            <w:tcBorders>
+              <w:top w:val="nil"/>
+              <w:left w:val="nil"/>
+              <w:bottom w:val="nil"/>
+              <w:right w:val="nil"/>
+            </w:tcBorders>
+          </w:tcPr>
           <w:tcPr/>
           <w:p>
             <w:pPr>
@@ -2479,6 +2996,14 @@
           </w:p>
         </w:tc>
         <w:tc>
+          <w:tcPr>
+            <w:tcBorders>
+              <w:top w:val="nil"/>
+              <w:left w:val="nil"/>
+              <w:bottom w:val="nil"/>
+              <w:right w:val="nil"/>
+            </w:tcBorders>
+          </w:tcPr>
           <w:tcPr/>
           <w:p>
             <w:pPr>
@@ -2492,6 +3017,14 @@
       </w:tr>
       <w:tr>
         <w:tc>
+          <w:tcPr>
+            <w:tcBorders>
+              <w:top w:val="nil"/>
+              <w:left w:val="nil"/>
+              <w:bottom w:val="single" w:sz="12" w:space="0" w:color="000000"/>
+              <w:right w:val="nil"/>
+            </w:tcBorders>
+          </w:tcPr>
           <w:tcPr/>
           <w:p>
             <w:pPr>
@@ -2507,6 +3040,14 @@
           </w:p>
         </w:tc>
         <w:tc>
+          <w:tcPr>
+            <w:tcBorders>
+              <w:top w:val="nil"/>
+              <w:left w:val="nil"/>
+              <w:bottom w:val="single" w:sz="12" w:space="0" w:color="000000"/>
+              <w:right w:val="nil"/>
+            </w:tcBorders>
+          </w:tcPr>
           <w:tcPr/>
           <w:p>
             <w:pPr>
@@ -2566,6 +3107,14 @@
           <w:tblHeader w:val="on"/>
         </w:trPr>
         <w:tc>
+          <w:tcPr>
+            <w:tcBorders>
+              <w:top w:val="single" w:sz="12" w:space="0" w:color="000000"/>
+              <w:left w:val="nil"/>
+              <w:bottom w:val="single" w:sz="8" w:space="0" w:color="000000"/>
+              <w:right w:val="nil"/>
+            </w:tcBorders>
+          </w:tcPr>
           <w:tcPr/>
           <w:p>
             <w:pPr>
@@ -2577,6 +3126,14 @@
           </w:p>
         </w:tc>
         <w:tc>
+          <w:tcPr>
+            <w:tcBorders>
+              <w:top w:val="single" w:sz="12" w:space="0" w:color="000000"/>
+              <w:left w:val="nil"/>
+              <w:bottom w:val="single" w:sz="8" w:space="0" w:color="000000"/>
+              <w:right w:val="nil"/>
+            </w:tcBorders>
+          </w:tcPr>
           <w:tcPr/>
           <w:p>
             <w:pPr>
@@ -2590,6 +3147,14 @@
       </w:tr>
       <w:tr>
         <w:tc>
+          <w:tcPr>
+            <w:tcBorders>
+              <w:top w:val="nil"/>
+              <w:left w:val="nil"/>
+              <w:bottom w:val="nil"/>
+              <w:right w:val="nil"/>
+            </w:tcBorders>
+          </w:tcPr>
           <w:tcPr/>
           <w:p>
             <w:pPr>
@@ -2601,6 +3166,14 @@
           </w:p>
         </w:tc>
         <w:tc>
+          <w:tcPr>
+            <w:tcBorders>
+              <w:top w:val="nil"/>
+              <w:left w:val="nil"/>
+              <w:bottom w:val="nil"/>
+              <w:right w:val="nil"/>
+            </w:tcBorders>
+          </w:tcPr>
           <w:tcPr/>
           <w:p>
             <w:pPr>
@@ -2614,6 +3187,14 @@
       </w:tr>
       <w:tr>
         <w:tc>
+          <w:tcPr>
+            <w:tcBorders>
+              <w:top w:val="nil"/>
+              <w:left w:val="nil"/>
+              <w:bottom w:val="nil"/>
+              <w:right w:val="nil"/>
+            </w:tcBorders>
+          </w:tcPr>
           <w:tcPr/>
           <w:p>
             <w:pPr>
@@ -2629,6 +3210,14 @@
           </w:p>
         </w:tc>
         <w:tc>
+          <w:tcPr>
+            <w:tcBorders>
+              <w:top w:val="nil"/>
+              <w:left w:val="nil"/>
+              <w:bottom w:val="nil"/>
+              <w:right w:val="nil"/>
+            </w:tcBorders>
+          </w:tcPr>
           <w:tcPr/>
           <w:p>
             <w:pPr>
@@ -2646,6 +3235,14 @@
       </w:tr>
       <w:tr>
         <w:tc>
+          <w:tcPr>
+            <w:tcBorders>
+              <w:top w:val="nil"/>
+              <w:left w:val="nil"/>
+              <w:bottom w:val="single" w:sz="12" w:space="0" w:color="000000"/>
+              <w:right w:val="nil"/>
+            </w:tcBorders>
+          </w:tcPr>
           <w:tcPr/>
           <w:p>
             <w:pPr>
@@ -2661,6 +3258,14 @@
           </w:p>
         </w:tc>
         <w:tc>
+          <w:tcPr>
+            <w:tcBorders>
+              <w:top w:val="nil"/>
+              <w:left w:val="nil"/>
+              <w:bottom w:val="single" w:sz="12" w:space="0" w:color="000000"/>
+              <w:right w:val="nil"/>
+            </w:tcBorders>
+          </w:tcPr>
           <w:tcPr/>
           <w:p>
             <w:pPr>
@@ -2723,8 +3328,8 @@
         <w:t xml:space="preserve">Because the in-house threshold passes 100.0% of windows at 0.7, this joint condition is numerically identical to the published-only consensus rejection rate (the fraction of windows on which all three published methods agree to reject, independent of any in-house decision; 44.571% on WESAD and 43.129% on PPG-DaLiA). Varying the in-house threshold from 0.50 to 0.95 changes the in-house pass rate by at most three percentage points on either dataset (100.0% to 97.1% on WESAD; 100.0% to 97.2% on PPG-DaLiA) and the headline joint metric by at most 1 percentage point. Median pairwise Cohen’s κ across the three published methods is unaffected by any in-house threshold change (κ = -0.198 on WESAD, κ = -0.204 on PPG-DaLiA, exact to three decimals across the full 0.50-0.95 range; Supplementary Table S5). The substantive finding, that three published methods reject the same ~44% of windows in common, is a property of how the published methods behave on real wrist PPG and does not depend on any in-house thresholding choice.</w:t>
       </w:r>
     </w:p>
-    <w:bookmarkEnd w:id="25"/>
-    <w:bookmarkStart w:id="26" w:name="X2fc2dbd0311da96a84a9c9b5c17d60ac22e8aea"/>
+    <w:bookmarkEnd w:id="28"/>
+    <w:bookmarkStart w:id="29" w:name="X2fc2dbd0311da96a84a9c9b5c17d60ac22e8aea"/>
     <w:p>
       <w:pPr>
         <w:pStyle w:val="Heading3"/>
@@ -2766,6 +3371,14 @@
           <w:tblHeader w:val="on"/>
         </w:trPr>
         <w:tc>
+          <w:tcPr>
+            <w:tcBorders>
+              <w:top w:val="single" w:sz="12" w:space="0" w:color="000000"/>
+              <w:left w:val="nil"/>
+              <w:bottom w:val="single" w:sz="8" w:space="0" w:color="000000"/>
+              <w:right w:val="nil"/>
+            </w:tcBorders>
+          </w:tcPr>
           <w:tcPr/>
           <w:p>
             <w:pPr>
@@ -2777,6 +3390,14 @@
           </w:p>
         </w:tc>
         <w:tc>
+          <w:tcPr>
+            <w:tcBorders>
+              <w:top w:val="single" w:sz="12" w:space="0" w:color="000000"/>
+              <w:left w:val="nil"/>
+              <w:bottom w:val="single" w:sz="8" w:space="0" w:color="000000"/>
+              <w:right w:val="nil"/>
+            </w:tcBorders>
+          </w:tcPr>
           <w:tcPr/>
           <w:p>
             <w:pPr>
@@ -2788,6 +3409,14 @@
           </w:p>
         </w:tc>
         <w:tc>
+          <w:tcPr>
+            <w:tcBorders>
+              <w:top w:val="single" w:sz="12" w:space="0" w:color="000000"/>
+              <w:left w:val="nil"/>
+              <w:bottom w:val="single" w:sz="8" w:space="0" w:color="000000"/>
+              <w:right w:val="nil"/>
+            </w:tcBorders>
+          </w:tcPr>
           <w:tcPr/>
           <w:p>
             <w:pPr>
@@ -2805,6 +3434,14 @@
       </w:tr>
       <w:tr>
         <w:tc>
+          <w:tcPr>
+            <w:tcBorders>
+              <w:top w:val="nil"/>
+              <w:left w:val="nil"/>
+              <w:bottom w:val="nil"/>
+              <w:right w:val="nil"/>
+            </w:tcBorders>
+          </w:tcPr>
           <w:tcPr/>
           <w:p>
             <w:pPr>
@@ -2816,6 +3453,14 @@
           </w:p>
         </w:tc>
         <w:tc>
+          <w:tcPr>
+            <w:tcBorders>
+              <w:top w:val="nil"/>
+              <w:left w:val="nil"/>
+              <w:bottom w:val="nil"/>
+              <w:right w:val="nil"/>
+            </w:tcBorders>
+          </w:tcPr>
           <w:tcPr/>
           <w:p>
             <w:pPr>
@@ -2827,6 +3472,14 @@
           </w:p>
         </w:tc>
         <w:tc>
+          <w:tcPr>
+            <w:tcBorders>
+              <w:top w:val="nil"/>
+              <w:left w:val="nil"/>
+              <w:bottom w:val="nil"/>
+              <w:right w:val="nil"/>
+            </w:tcBorders>
+          </w:tcPr>
           <w:tcPr/>
           <w:p>
             <w:pPr>
@@ -2844,6 +3497,14 @@
       </w:tr>
       <w:tr>
         <w:tc>
+          <w:tcPr>
+            <w:tcBorders>
+              <w:top w:val="nil"/>
+              <w:left w:val="nil"/>
+              <w:bottom w:val="nil"/>
+              <w:right w:val="nil"/>
+            </w:tcBorders>
+          </w:tcPr>
           <w:tcPr/>
           <w:p>
             <w:pPr>
@@ -2855,6 +3516,14 @@
           </w:p>
         </w:tc>
         <w:tc>
+          <w:tcPr>
+            <w:tcBorders>
+              <w:top w:val="nil"/>
+              <w:left w:val="nil"/>
+              <w:bottom w:val="nil"/>
+              <w:right w:val="nil"/>
+            </w:tcBorders>
+          </w:tcPr>
           <w:tcPr/>
           <w:p>
             <w:pPr>
@@ -2866,6 +3535,14 @@
           </w:p>
         </w:tc>
         <w:tc>
+          <w:tcPr>
+            <w:tcBorders>
+              <w:top w:val="nil"/>
+              <w:left w:val="nil"/>
+              <w:bottom w:val="nil"/>
+              <w:right w:val="nil"/>
+            </w:tcBorders>
+          </w:tcPr>
           <w:tcPr/>
           <w:p>
             <w:pPr>
@@ -2883,6 +3560,14 @@
       </w:tr>
       <w:tr>
         <w:tc>
+          <w:tcPr>
+            <w:tcBorders>
+              <w:top w:val="nil"/>
+              <w:left w:val="nil"/>
+              <w:bottom w:val="single" w:sz="12" w:space="0" w:color="000000"/>
+              <w:right w:val="nil"/>
+            </w:tcBorders>
+          </w:tcPr>
           <w:tcPr/>
           <w:p>
             <w:pPr>
@@ -2894,14 +3579,30 @@
           </w:p>
         </w:tc>
         <w:tc>
-          <w:tcPr/>
-          <w:p>
-            <w:pPr>
-              <w:pStyle w:val="Compact"/>
-            </w:pPr>
-          </w:p>
-        </w:tc>
-        <w:tc>
+          <w:tcPr>
+            <w:tcBorders>
+              <w:top w:val="nil"/>
+              <w:left w:val="nil"/>
+              <w:bottom w:val="single" w:sz="12" w:space="0" w:color="000000"/>
+              <w:right w:val="nil"/>
+            </w:tcBorders>
+          </w:tcPr>
+          <w:tcPr/>
+          <w:p>
+            <w:pPr>
+              <w:pStyle w:val="Compact"/>
+            </w:pPr>
+          </w:p>
+        </w:tc>
+        <w:tc>
+          <w:tcPr>
+            <w:tcBorders>
+              <w:top w:val="nil"/>
+              <w:left w:val="nil"/>
+              <w:bottom w:val="single" w:sz="12" w:space="0" w:color="000000"/>
+              <w:right w:val="nil"/>
+            </w:tcBorders>
+          </w:tcPr>
           <w:tcPr/>
           <w:p>
             <w:pPr>
@@ -2979,8 +3680,8 @@
         <w:t xml:space="preserve">.</w:t>
       </w:r>
     </w:p>
-    <w:bookmarkEnd w:id="26"/>
-    <w:bookmarkStart w:id="27" w:name="Xc1c907b5f230a08ea8ad98d7b4f4cc207b2ef97"/>
+    <w:bookmarkEnd w:id="29"/>
+    <w:bookmarkStart w:id="30" w:name="Xc1c907b5f230a08ea8ad98d7b4f4cc207b2ef97"/>
     <w:p>
       <w:pPr>
         <w:pStyle w:val="Heading3"/>
@@ -3013,6 +3714,14 @@
           <w:tblHeader w:val="on"/>
         </w:trPr>
         <w:tc>
+          <w:tcPr>
+            <w:tcBorders>
+              <w:top w:val="single" w:sz="12" w:space="0" w:color="000000"/>
+              <w:left w:val="nil"/>
+              <w:bottom w:val="single" w:sz="8" w:space="0" w:color="000000"/>
+              <w:right w:val="nil"/>
+            </w:tcBorders>
+          </w:tcPr>
           <w:tcPr/>
           <w:p>
             <w:pPr>
@@ -3024,6 +3733,14 @@
           </w:p>
         </w:tc>
         <w:tc>
+          <w:tcPr>
+            <w:tcBorders>
+              <w:top w:val="single" w:sz="12" w:space="0" w:color="000000"/>
+              <w:left w:val="nil"/>
+              <w:bottom w:val="single" w:sz="8" w:space="0" w:color="000000"/>
+              <w:right w:val="nil"/>
+            </w:tcBorders>
+          </w:tcPr>
           <w:tcPr/>
           <w:p>
             <w:pPr>
@@ -3037,6 +3754,14 @@
       </w:tr>
       <w:tr>
         <w:tc>
+          <w:tcPr>
+            <w:tcBorders>
+              <w:top w:val="nil"/>
+              <w:left w:val="nil"/>
+              <w:bottom w:val="nil"/>
+              <w:right w:val="nil"/>
+            </w:tcBorders>
+          </w:tcPr>
           <w:tcPr/>
           <w:p>
             <w:pPr>
@@ -3048,6 +3773,14 @@
           </w:p>
         </w:tc>
         <w:tc>
+          <w:tcPr>
+            <w:tcBorders>
+              <w:top w:val="nil"/>
+              <w:left w:val="nil"/>
+              <w:bottom w:val="nil"/>
+              <w:right w:val="nil"/>
+            </w:tcBorders>
+          </w:tcPr>
           <w:tcPr/>
           <w:p>
             <w:pPr>
@@ -3061,6 +3794,14 @@
       </w:tr>
       <w:tr>
         <w:tc>
+          <w:tcPr>
+            <w:tcBorders>
+              <w:top w:val="nil"/>
+              <w:left w:val="nil"/>
+              <w:bottom w:val="nil"/>
+              <w:right w:val="nil"/>
+            </w:tcBorders>
+          </w:tcPr>
           <w:tcPr/>
           <w:p>
             <w:pPr>
@@ -3072,6 +3813,14 @@
           </w:p>
         </w:tc>
         <w:tc>
+          <w:tcPr>
+            <w:tcBorders>
+              <w:top w:val="nil"/>
+              <w:left w:val="nil"/>
+              <w:bottom w:val="nil"/>
+              <w:right w:val="nil"/>
+            </w:tcBorders>
+          </w:tcPr>
           <w:tcPr/>
           <w:p>
             <w:pPr>
@@ -3085,6 +3834,14 @@
       </w:tr>
       <w:tr>
         <w:tc>
+          <w:tcPr>
+            <w:tcBorders>
+              <w:top w:val="nil"/>
+              <w:left w:val="nil"/>
+              <w:bottom w:val="nil"/>
+              <w:right w:val="nil"/>
+            </w:tcBorders>
+          </w:tcPr>
           <w:tcPr/>
           <w:p>
             <w:pPr>
@@ -3096,6 +3853,14 @@
           </w:p>
         </w:tc>
         <w:tc>
+          <w:tcPr>
+            <w:tcBorders>
+              <w:top w:val="nil"/>
+              <w:left w:val="nil"/>
+              <w:bottom w:val="nil"/>
+              <w:right w:val="nil"/>
+            </w:tcBorders>
+          </w:tcPr>
           <w:tcPr/>
           <w:p>
             <w:pPr>
@@ -3109,6 +3874,14 @@
       </w:tr>
       <w:tr>
         <w:tc>
+          <w:tcPr>
+            <w:tcBorders>
+              <w:top w:val="nil"/>
+              <w:left w:val="nil"/>
+              <w:bottom w:val="nil"/>
+              <w:right w:val="nil"/>
+            </w:tcBorders>
+          </w:tcPr>
           <w:tcPr/>
           <w:p>
             <w:pPr>
@@ -3120,6 +3893,14 @@
           </w:p>
         </w:tc>
         <w:tc>
+          <w:tcPr>
+            <w:tcBorders>
+              <w:top w:val="nil"/>
+              <w:left w:val="nil"/>
+              <w:bottom w:val="nil"/>
+              <w:right w:val="nil"/>
+            </w:tcBorders>
+          </w:tcPr>
           <w:tcPr/>
           <w:p>
             <w:pPr>
@@ -3133,6 +3914,14 @@
       </w:tr>
       <w:tr>
         <w:tc>
+          <w:tcPr>
+            <w:tcBorders>
+              <w:top w:val="nil"/>
+              <w:left w:val="nil"/>
+              <w:bottom w:val="single" w:sz="12" w:space="0" w:color="000000"/>
+              <w:right w:val="nil"/>
+            </w:tcBorders>
+          </w:tcPr>
           <w:tcPr/>
           <w:p>
             <w:pPr>
@@ -3144,6 +3933,14 @@
           </w:p>
         </w:tc>
         <w:tc>
+          <w:tcPr>
+            <w:tcBorders>
+              <w:top w:val="nil"/>
+              <w:left w:val="nil"/>
+              <w:bottom w:val="single" w:sz="12" w:space="0" w:color="000000"/>
+              <w:right w:val="nil"/>
+            </w:tcBorders>
+          </w:tcPr>
           <w:tcPr/>
           <w:p>
             <w:pPr>
@@ -3164,8 +3961,8 @@
         <w:t xml:space="preserve">The correlation between motion and cross-modality HR disagreement is positive but weak (Spearman ρ = +0.088). Mean absolute HR difference at high motion is 24% higher than at low motion (11.28 vs 9.12 bpm). Both values are smaller than the pilot estimates from the n = 2 analysis (ρ = +0.30, gap = 6.8 bpm). At n = 15 the motion detector tracks the direction of the effect, but the magnitude is modest.</w:t>
       </w:r>
     </w:p>
-    <w:bookmarkEnd w:id="27"/>
-    <w:bookmarkStart w:id="28" w:name="within-subject-state-contrast-tests"/>
+    <w:bookmarkEnd w:id="30"/>
+    <w:bookmarkStart w:id="31" w:name="within-subject-state-contrast-tests"/>
     <w:p>
       <w:pPr>
         <w:pStyle w:val="Heading3"/>
@@ -3222,8 +4019,8 @@
         <w:t xml:space="preserve">Baseline vs amusement: the funny-video paradigm produces upper-body laughter motion that degrades wrist PPG in most subjects. The largest single effect is S9 PPG SQI (Cliff’s δ = +0.80, Cohen’s d = +1.89, p =&lt; 0.001). S14 also shows a large ECG SQI drop (δ = +0.70, d = +1.59), consistent with the chest device responding to laughter motion in addition to wrist PPG.</w:t>
       </w:r>
     </w:p>
-    <w:bookmarkEnd w:id="28"/>
-    <w:bookmarkStart w:id="29" w:name="X2d23046eae321cbf50e98c2401de19df63beae1"/>
+    <w:bookmarkEnd w:id="31"/>
+    <w:bookmarkStart w:id="32" w:name="X2d23046eae321cbf50e98c2401de19df63beae1"/>
     <w:p>
       <w:pPr>
         <w:pStyle w:val="Heading3"/>
@@ -3286,6 +4083,14 @@
           <w:tblHeader w:val="on"/>
         </w:trPr>
         <w:tc>
+          <w:tcPr>
+            <w:tcBorders>
+              <w:top w:val="single" w:sz="12" w:space="0" w:color="000000"/>
+              <w:left w:val="nil"/>
+              <w:bottom w:val="single" w:sz="8" w:space="0" w:color="000000"/>
+              <w:right w:val="nil"/>
+            </w:tcBorders>
+          </w:tcPr>
           <w:tcPr/>
           <w:p>
             <w:pPr>
@@ -3297,6 +4102,14 @@
           </w:p>
         </w:tc>
         <w:tc>
+          <w:tcPr>
+            <w:tcBorders>
+              <w:top w:val="single" w:sz="12" w:space="0" w:color="000000"/>
+              <w:left w:val="nil"/>
+              <w:bottom w:val="single" w:sz="8" w:space="0" w:color="000000"/>
+              <w:right w:val="nil"/>
+            </w:tcBorders>
+          </w:tcPr>
           <w:tcPr/>
           <w:p>
             <w:pPr>
@@ -3308,6 +4121,14 @@
           </w:p>
         </w:tc>
         <w:tc>
+          <w:tcPr>
+            <w:tcBorders>
+              <w:top w:val="single" w:sz="12" w:space="0" w:color="000000"/>
+              <w:left w:val="nil"/>
+              <w:bottom w:val="single" w:sz="8" w:space="0" w:color="000000"/>
+              <w:right w:val="nil"/>
+            </w:tcBorders>
+          </w:tcPr>
           <w:tcPr/>
           <w:p>
             <w:pPr>
@@ -3319,6 +4140,14 @@
           </w:p>
         </w:tc>
         <w:tc>
+          <w:tcPr>
+            <w:tcBorders>
+              <w:top w:val="single" w:sz="12" w:space="0" w:color="000000"/>
+              <w:left w:val="nil"/>
+              <w:bottom w:val="single" w:sz="8" w:space="0" w:color="000000"/>
+              <w:right w:val="nil"/>
+            </w:tcBorders>
+          </w:tcPr>
           <w:tcPr/>
           <w:p>
             <w:pPr>
@@ -3330,6 +4159,14 @@
           </w:p>
         </w:tc>
         <w:tc>
+          <w:tcPr>
+            <w:tcBorders>
+              <w:top w:val="single" w:sz="12" w:space="0" w:color="000000"/>
+              <w:left w:val="nil"/>
+              <w:bottom w:val="single" w:sz="8" w:space="0" w:color="000000"/>
+              <w:right w:val="nil"/>
+            </w:tcBorders>
+          </w:tcPr>
           <w:tcPr/>
           <w:p>
             <w:pPr>
@@ -3343,6 +4180,14 @@
       </w:tr>
       <w:tr>
         <w:tc>
+          <w:tcPr>
+            <w:tcBorders>
+              <w:top w:val="nil"/>
+              <w:left w:val="nil"/>
+              <w:bottom w:val="nil"/>
+              <w:right w:val="nil"/>
+            </w:tcBorders>
+          </w:tcPr>
           <w:tcPr/>
           <w:p>
             <w:pPr>
@@ -3354,6 +4199,14 @@
           </w:p>
         </w:tc>
         <w:tc>
+          <w:tcPr>
+            <w:tcBorders>
+              <w:top w:val="nil"/>
+              <w:left w:val="nil"/>
+              <w:bottom w:val="nil"/>
+              <w:right w:val="nil"/>
+            </w:tcBorders>
+          </w:tcPr>
           <w:tcPr/>
           <w:p>
             <w:pPr>
@@ -3365,6 +4218,14 @@
           </w:p>
         </w:tc>
         <w:tc>
+          <w:tcPr>
+            <w:tcBorders>
+              <w:top w:val="nil"/>
+              <w:left w:val="nil"/>
+              <w:bottom w:val="nil"/>
+              <w:right w:val="nil"/>
+            </w:tcBorders>
+          </w:tcPr>
           <w:tcPr/>
           <w:p>
             <w:pPr>
@@ -3376,6 +4237,14 @@
           </w:p>
         </w:tc>
         <w:tc>
+          <w:tcPr>
+            <w:tcBorders>
+              <w:top w:val="nil"/>
+              <w:left w:val="nil"/>
+              <w:bottom w:val="nil"/>
+              <w:right w:val="nil"/>
+            </w:tcBorders>
+          </w:tcPr>
           <w:tcPr/>
           <w:p>
             <w:pPr>
@@ -3387,6 +4256,14 @@
           </w:p>
         </w:tc>
         <w:tc>
+          <w:tcPr>
+            <w:tcBorders>
+              <w:top w:val="nil"/>
+              <w:left w:val="nil"/>
+              <w:bottom w:val="nil"/>
+              <w:right w:val="nil"/>
+            </w:tcBorders>
+          </w:tcPr>
           <w:tcPr/>
           <w:p>
             <w:pPr>
@@ -3400,6 +4277,14 @@
       </w:tr>
       <w:tr>
         <w:tc>
+          <w:tcPr>
+            <w:tcBorders>
+              <w:top w:val="nil"/>
+              <w:left w:val="nil"/>
+              <w:bottom w:val="nil"/>
+              <w:right w:val="nil"/>
+            </w:tcBorders>
+          </w:tcPr>
           <w:tcPr/>
           <w:p>
             <w:pPr>
@@ -3411,6 +4296,14 @@
           </w:p>
         </w:tc>
         <w:tc>
+          <w:tcPr>
+            <w:tcBorders>
+              <w:top w:val="nil"/>
+              <w:left w:val="nil"/>
+              <w:bottom w:val="nil"/>
+              <w:right w:val="nil"/>
+            </w:tcBorders>
+          </w:tcPr>
           <w:tcPr/>
           <w:p>
             <w:pPr>
@@ -3422,6 +4315,14 @@
           </w:p>
         </w:tc>
         <w:tc>
+          <w:tcPr>
+            <w:tcBorders>
+              <w:top w:val="nil"/>
+              <w:left w:val="nil"/>
+              <w:bottom w:val="nil"/>
+              <w:right w:val="nil"/>
+            </w:tcBorders>
+          </w:tcPr>
           <w:tcPr/>
           <w:p>
             <w:pPr>
@@ -3433,6 +4334,14 @@
           </w:p>
         </w:tc>
         <w:tc>
+          <w:tcPr>
+            <w:tcBorders>
+              <w:top w:val="nil"/>
+              <w:left w:val="nil"/>
+              <w:bottom w:val="nil"/>
+              <w:right w:val="nil"/>
+            </w:tcBorders>
+          </w:tcPr>
           <w:tcPr/>
           <w:p>
             <w:pPr>
@@ -3444,6 +4353,14 @@
           </w:p>
         </w:tc>
         <w:tc>
+          <w:tcPr>
+            <w:tcBorders>
+              <w:top w:val="nil"/>
+              <w:left w:val="nil"/>
+              <w:bottom w:val="nil"/>
+              <w:right w:val="nil"/>
+            </w:tcBorders>
+          </w:tcPr>
           <w:tcPr/>
           <w:p>
             <w:pPr>
@@ -3457,6 +4374,14 @@
       </w:tr>
       <w:tr>
         <w:tc>
+          <w:tcPr>
+            <w:tcBorders>
+              <w:top w:val="nil"/>
+              <w:left w:val="nil"/>
+              <w:bottom w:val="nil"/>
+              <w:right w:val="nil"/>
+            </w:tcBorders>
+          </w:tcPr>
           <w:tcPr/>
           <w:p>
             <w:pPr>
@@ -3472,6 +4397,14 @@
           </w:p>
         </w:tc>
         <w:tc>
+          <w:tcPr>
+            <w:tcBorders>
+              <w:top w:val="nil"/>
+              <w:left w:val="nil"/>
+              <w:bottom w:val="nil"/>
+              <w:right w:val="nil"/>
+            </w:tcBorders>
+          </w:tcPr>
           <w:tcPr/>
           <w:p>
             <w:pPr>
@@ -3487,6 +4420,14 @@
           </w:p>
         </w:tc>
         <w:tc>
+          <w:tcPr>
+            <w:tcBorders>
+              <w:top w:val="nil"/>
+              <w:left w:val="nil"/>
+              <w:bottom w:val="nil"/>
+              <w:right w:val="nil"/>
+            </w:tcBorders>
+          </w:tcPr>
           <w:tcPr/>
           <w:p>
             <w:pPr>
@@ -3502,6 +4443,14 @@
           </w:p>
         </w:tc>
         <w:tc>
+          <w:tcPr>
+            <w:tcBorders>
+              <w:top w:val="nil"/>
+              <w:left w:val="nil"/>
+              <w:bottom w:val="nil"/>
+              <w:right w:val="nil"/>
+            </w:tcBorders>
+          </w:tcPr>
           <w:tcPr/>
           <w:p>
             <w:pPr>
@@ -3517,6 +4466,14 @@
           </w:p>
         </w:tc>
         <w:tc>
+          <w:tcPr>
+            <w:tcBorders>
+              <w:top w:val="nil"/>
+              <w:left w:val="nil"/>
+              <w:bottom w:val="nil"/>
+              <w:right w:val="nil"/>
+            </w:tcBorders>
+          </w:tcPr>
           <w:tcPr/>
           <w:p>
             <w:pPr>
@@ -3534,6 +4491,14 @@
       </w:tr>
       <w:tr>
         <w:tc>
+          <w:tcPr>
+            <w:tcBorders>
+              <w:top w:val="nil"/>
+              <w:left w:val="nil"/>
+              <w:bottom w:val="single" w:sz="12" w:space="0" w:color="000000"/>
+              <w:right w:val="nil"/>
+            </w:tcBorders>
+          </w:tcPr>
           <w:tcPr/>
           <w:p>
             <w:pPr>
@@ -3545,6 +4510,14 @@
           </w:p>
         </w:tc>
         <w:tc>
+          <w:tcPr>
+            <w:tcBorders>
+              <w:top w:val="nil"/>
+              <w:left w:val="nil"/>
+              <w:bottom w:val="single" w:sz="12" w:space="0" w:color="000000"/>
+              <w:right w:val="nil"/>
+            </w:tcBorders>
+          </w:tcPr>
           <w:tcPr/>
           <w:p>
             <w:pPr>
@@ -3556,6 +4529,14 @@
           </w:p>
         </w:tc>
         <w:tc>
+          <w:tcPr>
+            <w:tcBorders>
+              <w:top w:val="nil"/>
+              <w:left w:val="nil"/>
+              <w:bottom w:val="single" w:sz="12" w:space="0" w:color="000000"/>
+              <w:right w:val="nil"/>
+            </w:tcBorders>
+          </w:tcPr>
           <w:tcPr/>
           <w:p>
             <w:pPr>
@@ -3567,6 +4548,14 @@
           </w:p>
         </w:tc>
         <w:tc>
+          <w:tcPr>
+            <w:tcBorders>
+              <w:top w:val="nil"/>
+              <w:left w:val="nil"/>
+              <w:bottom w:val="single" w:sz="12" w:space="0" w:color="000000"/>
+              <w:right w:val="nil"/>
+            </w:tcBorders>
+          </w:tcPr>
           <w:tcPr/>
           <w:p>
             <w:pPr>
@@ -3578,6 +4567,14 @@
           </w:p>
         </w:tc>
         <w:tc>
+          <w:tcPr>
+            <w:tcBorders>
+              <w:top w:val="nil"/>
+              <w:left w:val="nil"/>
+              <w:bottom w:val="single" w:sz="12" w:space="0" w:color="000000"/>
+              <w:right w:val="nil"/>
+            </w:tcBorders>
+          </w:tcPr>
           <w:tcPr/>
           <w:p>
             <w:pPr>
@@ -3619,6 +4616,14 @@
           <w:tblHeader w:val="on"/>
         </w:trPr>
         <w:tc>
+          <w:tcPr>
+            <w:tcBorders>
+              <w:top w:val="single" w:sz="12" w:space="0" w:color="000000"/>
+              <w:left w:val="nil"/>
+              <w:bottom w:val="single" w:sz="8" w:space="0" w:color="000000"/>
+              <w:right w:val="nil"/>
+            </w:tcBorders>
+          </w:tcPr>
           <w:tcPr/>
           <w:p>
             <w:pPr>
@@ -3630,6 +4635,14 @@
           </w:p>
         </w:tc>
         <w:tc>
+          <w:tcPr>
+            <w:tcBorders>
+              <w:top w:val="single" w:sz="12" w:space="0" w:color="000000"/>
+              <w:left w:val="nil"/>
+              <w:bottom w:val="single" w:sz="8" w:space="0" w:color="000000"/>
+              <w:right w:val="nil"/>
+            </w:tcBorders>
+          </w:tcPr>
           <w:tcPr/>
           <w:p>
             <w:pPr>
@@ -3641,6 +4654,14 @@
           </w:p>
         </w:tc>
         <w:tc>
+          <w:tcPr>
+            <w:tcBorders>
+              <w:top w:val="single" w:sz="12" w:space="0" w:color="000000"/>
+              <w:left w:val="nil"/>
+              <w:bottom w:val="single" w:sz="8" w:space="0" w:color="000000"/>
+              <w:right w:val="nil"/>
+            </w:tcBorders>
+          </w:tcPr>
           <w:tcPr/>
           <w:p>
             <w:pPr>
@@ -3652,6 +4673,14 @@
           </w:p>
         </w:tc>
         <w:tc>
+          <w:tcPr>
+            <w:tcBorders>
+              <w:top w:val="single" w:sz="12" w:space="0" w:color="000000"/>
+              <w:left w:val="nil"/>
+              <w:bottom w:val="single" w:sz="8" w:space="0" w:color="000000"/>
+              <w:right w:val="nil"/>
+            </w:tcBorders>
+          </w:tcPr>
           <w:tcPr/>
           <w:p>
             <w:pPr>
@@ -3663,6 +4692,14 @@
           </w:p>
         </w:tc>
         <w:tc>
+          <w:tcPr>
+            <w:tcBorders>
+              <w:top w:val="single" w:sz="12" w:space="0" w:color="000000"/>
+              <w:left w:val="nil"/>
+              <w:bottom w:val="single" w:sz="8" w:space="0" w:color="000000"/>
+              <w:right w:val="nil"/>
+            </w:tcBorders>
+          </w:tcPr>
           <w:tcPr/>
           <w:p>
             <w:pPr>
@@ -3676,6 +4713,14 @@
       </w:tr>
       <w:tr>
         <w:tc>
+          <w:tcPr>
+            <w:tcBorders>
+              <w:top w:val="nil"/>
+              <w:left w:val="nil"/>
+              <w:bottom w:val="nil"/>
+              <w:right w:val="nil"/>
+            </w:tcBorders>
+          </w:tcPr>
           <w:tcPr/>
           <w:p>
             <w:pPr>
@@ -3687,6 +4732,14 @@
           </w:p>
         </w:tc>
         <w:tc>
+          <w:tcPr>
+            <w:tcBorders>
+              <w:top w:val="nil"/>
+              <w:left w:val="nil"/>
+              <w:bottom w:val="nil"/>
+              <w:right w:val="nil"/>
+            </w:tcBorders>
+          </w:tcPr>
           <w:tcPr/>
           <w:p>
             <w:pPr>
@@ -3698,6 +4751,14 @@
           </w:p>
         </w:tc>
         <w:tc>
+          <w:tcPr>
+            <w:tcBorders>
+              <w:top w:val="nil"/>
+              <w:left w:val="nil"/>
+              <w:bottom w:val="nil"/>
+              <w:right w:val="nil"/>
+            </w:tcBorders>
+          </w:tcPr>
           <w:tcPr/>
           <w:p>
             <w:pPr>
@@ -3709,6 +4770,14 @@
           </w:p>
         </w:tc>
         <w:tc>
+          <w:tcPr>
+            <w:tcBorders>
+              <w:top w:val="nil"/>
+              <w:left w:val="nil"/>
+              <w:bottom w:val="nil"/>
+              <w:right w:val="nil"/>
+            </w:tcBorders>
+          </w:tcPr>
           <w:tcPr/>
           <w:p>
             <w:pPr>
@@ -3720,6 +4789,14 @@
           </w:p>
         </w:tc>
         <w:tc>
+          <w:tcPr>
+            <w:tcBorders>
+              <w:top w:val="nil"/>
+              <w:left w:val="nil"/>
+              <w:bottom w:val="nil"/>
+              <w:right w:val="nil"/>
+            </w:tcBorders>
+          </w:tcPr>
           <w:tcPr/>
           <w:p>
             <w:pPr>
@@ -3733,6 +4810,14 @@
       </w:tr>
       <w:tr>
         <w:tc>
+          <w:tcPr>
+            <w:tcBorders>
+              <w:top w:val="nil"/>
+              <w:left w:val="nil"/>
+              <w:bottom w:val="nil"/>
+              <w:right w:val="nil"/>
+            </w:tcBorders>
+          </w:tcPr>
           <w:tcPr/>
           <w:p>
             <w:pPr>
@@ -3748,6 +4833,14 @@
           </w:p>
         </w:tc>
         <w:tc>
+          <w:tcPr>
+            <w:tcBorders>
+              <w:top w:val="nil"/>
+              <w:left w:val="nil"/>
+              <w:bottom w:val="nil"/>
+              <w:right w:val="nil"/>
+            </w:tcBorders>
+          </w:tcPr>
           <w:tcPr/>
           <w:p>
             <w:pPr>
@@ -3763,6 +4856,14 @@
           </w:p>
         </w:tc>
         <w:tc>
+          <w:tcPr>
+            <w:tcBorders>
+              <w:top w:val="nil"/>
+              <w:left w:val="nil"/>
+              <w:bottom w:val="nil"/>
+              <w:right w:val="nil"/>
+            </w:tcBorders>
+          </w:tcPr>
           <w:tcPr/>
           <w:p>
             <w:pPr>
@@ -3778,6 +4879,14 @@
           </w:p>
         </w:tc>
         <w:tc>
+          <w:tcPr>
+            <w:tcBorders>
+              <w:top w:val="nil"/>
+              <w:left w:val="nil"/>
+              <w:bottom w:val="nil"/>
+              <w:right w:val="nil"/>
+            </w:tcBorders>
+          </w:tcPr>
           <w:tcPr/>
           <w:p>
             <w:pPr>
@@ -3793,6 +4902,14 @@
           </w:p>
         </w:tc>
         <w:tc>
+          <w:tcPr>
+            <w:tcBorders>
+              <w:top w:val="nil"/>
+              <w:left w:val="nil"/>
+              <w:bottom w:val="nil"/>
+              <w:right w:val="nil"/>
+            </w:tcBorders>
+          </w:tcPr>
           <w:tcPr/>
           <w:p>
             <w:pPr>
@@ -3810,6 +4927,14 @@
       </w:tr>
       <w:tr>
         <w:tc>
+          <w:tcPr>
+            <w:tcBorders>
+              <w:top w:val="nil"/>
+              <w:left w:val="nil"/>
+              <w:bottom w:val="single" w:sz="12" w:space="0" w:color="000000"/>
+              <w:right w:val="nil"/>
+            </w:tcBorders>
+          </w:tcPr>
           <w:tcPr/>
           <w:p>
             <w:pPr>
@@ -3821,6 +4946,14 @@
           </w:p>
         </w:tc>
         <w:tc>
+          <w:tcPr>
+            <w:tcBorders>
+              <w:top w:val="nil"/>
+              <w:left w:val="nil"/>
+              <w:bottom w:val="single" w:sz="12" w:space="0" w:color="000000"/>
+              <w:right w:val="nil"/>
+            </w:tcBorders>
+          </w:tcPr>
           <w:tcPr/>
           <w:p>
             <w:pPr>
@@ -3832,6 +4965,14 @@
           </w:p>
         </w:tc>
         <w:tc>
+          <w:tcPr>
+            <w:tcBorders>
+              <w:top w:val="nil"/>
+              <w:left w:val="nil"/>
+              <w:bottom w:val="single" w:sz="12" w:space="0" w:color="000000"/>
+              <w:right w:val="nil"/>
+            </w:tcBorders>
+          </w:tcPr>
           <w:tcPr/>
           <w:p>
             <w:pPr>
@@ -3843,6 +4984,14 @@
           </w:p>
         </w:tc>
         <w:tc>
+          <w:tcPr>
+            <w:tcBorders>
+              <w:top w:val="nil"/>
+              <w:left w:val="nil"/>
+              <w:bottom w:val="single" w:sz="12" w:space="0" w:color="000000"/>
+              <w:right w:val="nil"/>
+            </w:tcBorders>
+          </w:tcPr>
           <w:tcPr/>
           <w:p>
             <w:pPr>
@@ -3854,6 +5003,14 @@
           </w:p>
         </w:tc>
         <w:tc>
+          <w:tcPr>
+            <w:tcBorders>
+              <w:top w:val="nil"/>
+              <w:left w:val="nil"/>
+              <w:bottom w:val="single" w:sz="12" w:space="0" w:color="000000"/>
+              <w:right w:val="nil"/>
+            </w:tcBorders>
+          </w:tcPr>
           <w:tcPr/>
           <w:p>
             <w:pPr>
@@ -3954,6 +5111,14 @@
           <w:tblHeader w:val="on"/>
         </w:trPr>
         <w:tc>
+          <w:tcPr>
+            <w:tcBorders>
+              <w:top w:val="single" w:sz="12" w:space="0" w:color="000000"/>
+              <w:left w:val="nil"/>
+              <w:bottom w:val="single" w:sz="8" w:space="0" w:color="000000"/>
+              <w:right w:val="nil"/>
+            </w:tcBorders>
+          </w:tcPr>
           <w:tcPr/>
           <w:p>
             <w:pPr>
@@ -3965,6 +5130,14 @@
           </w:p>
         </w:tc>
         <w:tc>
+          <w:tcPr>
+            <w:tcBorders>
+              <w:top w:val="single" w:sz="12" w:space="0" w:color="000000"/>
+              <w:left w:val="nil"/>
+              <w:bottom w:val="single" w:sz="8" w:space="0" w:color="000000"/>
+              <w:right w:val="nil"/>
+            </w:tcBorders>
+          </w:tcPr>
           <w:tcPr/>
           <w:p>
             <w:pPr>
@@ -3976,6 +5149,14 @@
           </w:p>
         </w:tc>
         <w:tc>
+          <w:tcPr>
+            <w:tcBorders>
+              <w:top w:val="single" w:sz="12" w:space="0" w:color="000000"/>
+              <w:left w:val="nil"/>
+              <w:bottom w:val="single" w:sz="8" w:space="0" w:color="000000"/>
+              <w:right w:val="nil"/>
+            </w:tcBorders>
+          </w:tcPr>
           <w:tcPr/>
           <w:p>
             <w:pPr>
@@ -3987,6 +5168,14 @@
           </w:p>
         </w:tc>
         <w:tc>
+          <w:tcPr>
+            <w:tcBorders>
+              <w:top w:val="single" w:sz="12" w:space="0" w:color="000000"/>
+              <w:left w:val="nil"/>
+              <w:bottom w:val="single" w:sz="8" w:space="0" w:color="000000"/>
+              <w:right w:val="nil"/>
+            </w:tcBorders>
+          </w:tcPr>
           <w:tcPr/>
           <w:p>
             <w:pPr>
@@ -3998,6 +5187,14 @@
           </w:p>
         </w:tc>
         <w:tc>
+          <w:tcPr>
+            <w:tcBorders>
+              <w:top w:val="single" w:sz="12" w:space="0" w:color="000000"/>
+              <w:left w:val="nil"/>
+              <w:bottom w:val="single" w:sz="8" w:space="0" w:color="000000"/>
+              <w:right w:val="nil"/>
+            </w:tcBorders>
+          </w:tcPr>
           <w:tcPr/>
           <w:p>
             <w:pPr>
@@ -4009,6 +5206,14 @@
           </w:p>
         </w:tc>
         <w:tc>
+          <w:tcPr>
+            <w:tcBorders>
+              <w:top w:val="single" w:sz="12" w:space="0" w:color="000000"/>
+              <w:left w:val="nil"/>
+              <w:bottom w:val="single" w:sz="8" w:space="0" w:color="000000"/>
+              <w:right w:val="nil"/>
+            </w:tcBorders>
+          </w:tcPr>
           <w:tcPr/>
           <w:p>
             <w:pPr>
@@ -4022,6 +5227,14 @@
       </w:tr>
       <w:tr>
         <w:tc>
+          <w:tcPr>
+            <w:tcBorders>
+              <w:top w:val="nil"/>
+              <w:left w:val="nil"/>
+              <w:bottom w:val="nil"/>
+              <w:right w:val="nil"/>
+            </w:tcBorders>
+          </w:tcPr>
           <w:tcPr/>
           <w:p>
             <w:pPr>
@@ -4033,6 +5246,14 @@
           </w:p>
         </w:tc>
         <w:tc>
+          <w:tcPr>
+            <w:tcBorders>
+              <w:top w:val="nil"/>
+              <w:left w:val="nil"/>
+              <w:bottom w:val="nil"/>
+              <w:right w:val="nil"/>
+            </w:tcBorders>
+          </w:tcPr>
           <w:tcPr/>
           <w:p>
             <w:pPr>
@@ -4044,6 +5265,14 @@
           </w:p>
         </w:tc>
         <w:tc>
+          <w:tcPr>
+            <w:tcBorders>
+              <w:top w:val="nil"/>
+              <w:left w:val="nil"/>
+              <w:bottom w:val="nil"/>
+              <w:right w:val="nil"/>
+            </w:tcBorders>
+          </w:tcPr>
           <w:tcPr/>
           <w:p>
             <w:pPr>
@@ -4055,6 +5284,14 @@
           </w:p>
         </w:tc>
         <w:tc>
+          <w:tcPr>
+            <w:tcBorders>
+              <w:top w:val="nil"/>
+              <w:left w:val="nil"/>
+              <w:bottom w:val="nil"/>
+              <w:right w:val="nil"/>
+            </w:tcBorders>
+          </w:tcPr>
           <w:tcPr/>
           <w:p>
             <w:pPr>
@@ -4066,6 +5303,14 @@
           </w:p>
         </w:tc>
         <w:tc>
+          <w:tcPr>
+            <w:tcBorders>
+              <w:top w:val="nil"/>
+              <w:left w:val="nil"/>
+              <w:bottom w:val="nil"/>
+              <w:right w:val="nil"/>
+            </w:tcBorders>
+          </w:tcPr>
           <w:tcPr/>
           <w:p>
             <w:pPr>
@@ -4077,6 +5322,14 @@
           </w:p>
         </w:tc>
         <w:tc>
+          <w:tcPr>
+            <w:tcBorders>
+              <w:top w:val="nil"/>
+              <w:left w:val="nil"/>
+              <w:bottom w:val="nil"/>
+              <w:right w:val="nil"/>
+            </w:tcBorders>
+          </w:tcPr>
           <w:tcPr/>
           <w:p>
             <w:pPr>
@@ -4090,6 +5343,14 @@
       </w:tr>
       <w:tr>
         <w:tc>
+          <w:tcPr>
+            <w:tcBorders>
+              <w:top w:val="nil"/>
+              <w:left w:val="nil"/>
+              <w:bottom w:val="nil"/>
+              <w:right w:val="nil"/>
+            </w:tcBorders>
+          </w:tcPr>
           <w:tcPr/>
           <w:p>
             <w:pPr>
@@ -4105,6 +5366,14 @@
           </w:p>
         </w:tc>
         <w:tc>
+          <w:tcPr>
+            <w:tcBorders>
+              <w:top w:val="nil"/>
+              <w:left w:val="nil"/>
+              <w:bottom w:val="nil"/>
+              <w:right w:val="nil"/>
+            </w:tcBorders>
+          </w:tcPr>
           <w:tcPr/>
           <w:p>
             <w:pPr>
@@ -4120,6 +5389,14 @@
           </w:p>
         </w:tc>
         <w:tc>
+          <w:tcPr>
+            <w:tcBorders>
+              <w:top w:val="nil"/>
+              <w:left w:val="nil"/>
+              <w:bottom w:val="nil"/>
+              <w:right w:val="nil"/>
+            </w:tcBorders>
+          </w:tcPr>
           <w:tcPr/>
           <w:p>
             <w:pPr>
@@ -4135,6 +5412,14 @@
           </w:p>
         </w:tc>
         <w:tc>
+          <w:tcPr>
+            <w:tcBorders>
+              <w:top w:val="nil"/>
+              <w:left w:val="nil"/>
+              <w:bottom w:val="nil"/>
+              <w:right w:val="nil"/>
+            </w:tcBorders>
+          </w:tcPr>
           <w:tcPr/>
           <w:p>
             <w:pPr>
@@ -4150,6 +5435,14 @@
           </w:p>
         </w:tc>
         <w:tc>
+          <w:tcPr>
+            <w:tcBorders>
+              <w:top w:val="nil"/>
+              <w:left w:val="nil"/>
+              <w:bottom w:val="nil"/>
+              <w:right w:val="nil"/>
+            </w:tcBorders>
+          </w:tcPr>
           <w:tcPr/>
           <w:p>
             <w:pPr>
@@ -4165,6 +5458,14 @@
           </w:p>
         </w:tc>
         <w:tc>
+          <w:tcPr>
+            <w:tcBorders>
+              <w:top w:val="nil"/>
+              <w:left w:val="nil"/>
+              <w:bottom w:val="nil"/>
+              <w:right w:val="nil"/>
+            </w:tcBorders>
+          </w:tcPr>
           <w:tcPr/>
           <w:p>
             <w:pPr>
@@ -4182,6 +5483,14 @@
       </w:tr>
       <w:tr>
         <w:tc>
+          <w:tcPr>
+            <w:tcBorders>
+              <w:top w:val="nil"/>
+              <w:left w:val="nil"/>
+              <w:bottom w:val="single" w:sz="12" w:space="0" w:color="000000"/>
+              <w:right w:val="nil"/>
+            </w:tcBorders>
+          </w:tcPr>
           <w:tcPr/>
           <w:p>
             <w:pPr>
@@ -4193,6 +5502,14 @@
           </w:p>
         </w:tc>
         <w:tc>
+          <w:tcPr>
+            <w:tcBorders>
+              <w:top w:val="nil"/>
+              <w:left w:val="nil"/>
+              <w:bottom w:val="single" w:sz="12" w:space="0" w:color="000000"/>
+              <w:right w:val="nil"/>
+            </w:tcBorders>
+          </w:tcPr>
           <w:tcPr/>
           <w:p>
             <w:pPr>
@@ -4204,6 +5521,14 @@
           </w:p>
         </w:tc>
         <w:tc>
+          <w:tcPr>
+            <w:tcBorders>
+              <w:top w:val="nil"/>
+              <w:left w:val="nil"/>
+              <w:bottom w:val="single" w:sz="12" w:space="0" w:color="000000"/>
+              <w:right w:val="nil"/>
+            </w:tcBorders>
+          </w:tcPr>
           <w:tcPr/>
           <w:p>
             <w:pPr>
@@ -4215,6 +5540,14 @@
           </w:p>
         </w:tc>
         <w:tc>
+          <w:tcPr>
+            <w:tcBorders>
+              <w:top w:val="nil"/>
+              <w:left w:val="nil"/>
+              <w:bottom w:val="single" w:sz="12" w:space="0" w:color="000000"/>
+              <w:right w:val="nil"/>
+            </w:tcBorders>
+          </w:tcPr>
           <w:tcPr/>
           <w:p>
             <w:pPr>
@@ -4226,6 +5559,14 @@
           </w:p>
         </w:tc>
         <w:tc>
+          <w:tcPr>
+            <w:tcBorders>
+              <w:top w:val="nil"/>
+              <w:left w:val="nil"/>
+              <w:bottom w:val="single" w:sz="12" w:space="0" w:color="000000"/>
+              <w:right w:val="nil"/>
+            </w:tcBorders>
+          </w:tcPr>
           <w:tcPr/>
           <w:p>
             <w:pPr>
@@ -4237,6 +5578,14 @@
           </w:p>
         </w:tc>
         <w:tc>
+          <w:tcPr>
+            <w:tcBorders>
+              <w:top w:val="nil"/>
+              <w:left w:val="nil"/>
+              <w:bottom w:val="single" w:sz="12" w:space="0" w:color="000000"/>
+              <w:right w:val="nil"/>
+            </w:tcBorders>
+          </w:tcPr>
           <w:tcPr/>
           <w:p>
             <w:pPr>
@@ -4395,8 +5744,8 @@
         <w:t xml:space="preserve">- Panel D: per-subject retention vs Δρ trade-off (Orphanidou condition).</w:t>
       </w:r>
     </w:p>
-    <w:bookmarkEnd w:id="29"/>
-    <w:bookmarkStart w:id="30" w:name="external-validation-on-ppg-dalia"/>
+    <w:bookmarkEnd w:id="32"/>
+    <w:bookmarkStart w:id="33" w:name="external-validation-on-ppg-dalia"/>
     <w:p>
       <w:pPr>
         <w:pStyle w:val="Heading3"/>
@@ -4456,6 +5805,14 @@
           <w:tblHeader w:val="on"/>
         </w:trPr>
         <w:tc>
+          <w:tcPr>
+            <w:tcBorders>
+              <w:top w:val="single" w:sz="12" w:space="0" w:color="000000"/>
+              <w:left w:val="nil"/>
+              <w:bottom w:val="single" w:sz="8" w:space="0" w:color="000000"/>
+              <w:right w:val="nil"/>
+            </w:tcBorders>
+          </w:tcPr>
           <w:tcPr/>
           <w:p>
             <w:pPr>
@@ -4467,6 +5824,14 @@
           </w:p>
         </w:tc>
         <w:tc>
+          <w:tcPr>
+            <w:tcBorders>
+              <w:top w:val="single" w:sz="12" w:space="0" w:color="000000"/>
+              <w:left w:val="nil"/>
+              <w:bottom w:val="single" w:sz="8" w:space="0" w:color="000000"/>
+              <w:right w:val="nil"/>
+            </w:tcBorders>
+          </w:tcPr>
           <w:tcPr/>
           <w:p>
             <w:pPr>
@@ -4478,6 +5843,14 @@
           </w:p>
         </w:tc>
         <w:tc>
+          <w:tcPr>
+            <w:tcBorders>
+              <w:top w:val="single" w:sz="12" w:space="0" w:color="000000"/>
+              <w:left w:val="nil"/>
+              <w:bottom w:val="single" w:sz="8" w:space="0" w:color="000000"/>
+              <w:right w:val="nil"/>
+            </w:tcBorders>
+          </w:tcPr>
           <w:tcPr/>
           <w:p>
             <w:pPr>
@@ -4491,6 +5864,14 @@
       </w:tr>
       <w:tr>
         <w:tc>
+          <w:tcPr>
+            <w:tcBorders>
+              <w:top w:val="nil"/>
+              <w:left w:val="nil"/>
+              <w:bottom w:val="nil"/>
+              <w:right w:val="nil"/>
+            </w:tcBorders>
+          </w:tcPr>
           <w:tcPr/>
           <w:p>
             <w:pPr>
@@ -4502,6 +5883,14 @@
           </w:p>
         </w:tc>
         <w:tc>
+          <w:tcPr>
+            <w:tcBorders>
+              <w:top w:val="nil"/>
+              <w:left w:val="nil"/>
+              <w:bottom w:val="nil"/>
+              <w:right w:val="nil"/>
+            </w:tcBorders>
+          </w:tcPr>
           <w:tcPr/>
           <w:p>
             <w:pPr>
@@ -4513,6 +5902,14 @@
           </w:p>
         </w:tc>
         <w:tc>
+          <w:tcPr>
+            <w:tcBorders>
+              <w:top w:val="nil"/>
+              <w:left w:val="nil"/>
+              <w:bottom w:val="nil"/>
+              <w:right w:val="nil"/>
+            </w:tcBorders>
+          </w:tcPr>
           <w:tcPr/>
           <w:p>
             <w:pPr>
@@ -4526,6 +5923,14 @@
       </w:tr>
       <w:tr>
         <w:tc>
+          <w:tcPr>
+            <w:tcBorders>
+              <w:top w:val="nil"/>
+              <w:left w:val="nil"/>
+              <w:bottom w:val="nil"/>
+              <w:right w:val="nil"/>
+            </w:tcBorders>
+          </w:tcPr>
           <w:tcPr/>
           <w:p>
             <w:pPr>
@@ -4537,6 +5942,14 @@
           </w:p>
         </w:tc>
         <w:tc>
+          <w:tcPr>
+            <w:tcBorders>
+              <w:top w:val="nil"/>
+              <w:left w:val="nil"/>
+              <w:bottom w:val="nil"/>
+              <w:right w:val="nil"/>
+            </w:tcBorders>
+          </w:tcPr>
           <w:tcPr/>
           <w:p>
             <w:pPr>
@@ -4548,6 +5961,14 @@
           </w:p>
         </w:tc>
         <w:tc>
+          <w:tcPr>
+            <w:tcBorders>
+              <w:top w:val="nil"/>
+              <w:left w:val="nil"/>
+              <w:bottom w:val="nil"/>
+              <w:right w:val="nil"/>
+            </w:tcBorders>
+          </w:tcPr>
           <w:tcPr/>
           <w:p>
             <w:pPr>
@@ -4561,6 +5982,14 @@
       </w:tr>
       <w:tr>
         <w:tc>
+          <w:tcPr>
+            <w:tcBorders>
+              <w:top w:val="nil"/>
+              <w:left w:val="nil"/>
+              <w:bottom w:val="nil"/>
+              <w:right w:val="nil"/>
+            </w:tcBorders>
+          </w:tcPr>
           <w:tcPr/>
           <w:p>
             <w:pPr>
@@ -4572,6 +6001,14 @@
           </w:p>
         </w:tc>
         <w:tc>
+          <w:tcPr>
+            <w:tcBorders>
+              <w:top w:val="nil"/>
+              <w:left w:val="nil"/>
+              <w:bottom w:val="nil"/>
+              <w:right w:val="nil"/>
+            </w:tcBorders>
+          </w:tcPr>
           <w:tcPr/>
           <w:p>
             <w:pPr>
@@ -4583,6 +6020,14 @@
           </w:p>
         </w:tc>
         <w:tc>
+          <w:tcPr>
+            <w:tcBorders>
+              <w:top w:val="nil"/>
+              <w:left w:val="nil"/>
+              <w:bottom w:val="nil"/>
+              <w:right w:val="nil"/>
+            </w:tcBorders>
+          </w:tcPr>
           <w:tcPr/>
           <w:p>
             <w:pPr>
@@ -4596,6 +6041,14 @@
       </w:tr>
       <w:tr>
         <w:tc>
+          <w:tcPr>
+            <w:tcBorders>
+              <w:top w:val="nil"/>
+              <w:left w:val="nil"/>
+              <w:bottom w:val="nil"/>
+              <w:right w:val="nil"/>
+            </w:tcBorders>
+          </w:tcPr>
           <w:tcPr/>
           <w:p>
             <w:pPr>
@@ -4607,6 +6060,14 @@
           </w:p>
         </w:tc>
         <w:tc>
+          <w:tcPr>
+            <w:tcBorders>
+              <w:top w:val="nil"/>
+              <w:left w:val="nil"/>
+              <w:bottom w:val="nil"/>
+              <w:right w:val="nil"/>
+            </w:tcBorders>
+          </w:tcPr>
           <w:tcPr/>
           <w:p>
             <w:pPr>
@@ -4618,6 +6079,14 @@
           </w:p>
         </w:tc>
         <w:tc>
+          <w:tcPr>
+            <w:tcBorders>
+              <w:top w:val="nil"/>
+              <w:left w:val="nil"/>
+              <w:bottom w:val="nil"/>
+              <w:right w:val="nil"/>
+            </w:tcBorders>
+          </w:tcPr>
           <w:tcPr/>
           <w:p>
             <w:pPr>
@@ -4631,6 +6100,14 @@
       </w:tr>
       <w:tr>
         <w:tc>
+          <w:tcPr>
+            <w:tcBorders>
+              <w:top w:val="nil"/>
+              <w:left w:val="nil"/>
+              <w:bottom w:val="nil"/>
+              <w:right w:val="nil"/>
+            </w:tcBorders>
+          </w:tcPr>
           <w:tcPr/>
           <w:p>
             <w:pPr>
@@ -4642,6 +6119,14 @@
           </w:p>
         </w:tc>
         <w:tc>
+          <w:tcPr>
+            <w:tcBorders>
+              <w:top w:val="nil"/>
+              <w:left w:val="nil"/>
+              <w:bottom w:val="nil"/>
+              <w:right w:val="nil"/>
+            </w:tcBorders>
+          </w:tcPr>
           <w:tcPr/>
           <w:p>
             <w:pPr>
@@ -4653,6 +6138,14 @@
           </w:p>
         </w:tc>
         <w:tc>
+          <w:tcPr>
+            <w:tcBorders>
+              <w:top w:val="nil"/>
+              <w:left w:val="nil"/>
+              <w:bottom w:val="nil"/>
+              <w:right w:val="nil"/>
+            </w:tcBorders>
+          </w:tcPr>
           <w:tcPr/>
           <w:p>
             <w:pPr>
@@ -4666,6 +6159,14 @@
       </w:tr>
       <w:tr>
         <w:tc>
+          <w:tcPr>
+            <w:tcBorders>
+              <w:top w:val="nil"/>
+              <w:left w:val="nil"/>
+              <w:bottom w:val="nil"/>
+              <w:right w:val="nil"/>
+            </w:tcBorders>
+          </w:tcPr>
           <w:tcPr/>
           <w:p>
             <w:pPr>
@@ -4677,6 +6178,14 @@
           </w:p>
         </w:tc>
         <w:tc>
+          <w:tcPr>
+            <w:tcBorders>
+              <w:top w:val="nil"/>
+              <w:left w:val="nil"/>
+              <w:bottom w:val="nil"/>
+              <w:right w:val="nil"/>
+            </w:tcBorders>
+          </w:tcPr>
           <w:tcPr/>
           <w:p>
             <w:pPr>
@@ -4688,6 +6197,14 @@
           </w:p>
         </w:tc>
         <w:tc>
+          <w:tcPr>
+            <w:tcBorders>
+              <w:top w:val="nil"/>
+              <w:left w:val="nil"/>
+              <w:bottom w:val="nil"/>
+              <w:right w:val="nil"/>
+            </w:tcBorders>
+          </w:tcPr>
           <w:tcPr/>
           <w:p>
             <w:pPr>
@@ -4701,6 +6218,14 @@
       </w:tr>
       <w:tr>
         <w:tc>
+          <w:tcPr>
+            <w:tcBorders>
+              <w:top w:val="nil"/>
+              <w:left w:val="nil"/>
+              <w:bottom w:val="nil"/>
+              <w:right w:val="nil"/>
+            </w:tcBorders>
+          </w:tcPr>
           <w:tcPr/>
           <w:p>
             <w:pPr>
@@ -4712,6 +6237,14 @@
           </w:p>
         </w:tc>
         <w:tc>
+          <w:tcPr>
+            <w:tcBorders>
+              <w:top w:val="nil"/>
+              <w:left w:val="nil"/>
+              <w:bottom w:val="nil"/>
+              <w:right w:val="nil"/>
+            </w:tcBorders>
+          </w:tcPr>
           <w:tcPr/>
           <w:p>
             <w:pPr>
@@ -4723,6 +6256,14 @@
           </w:p>
         </w:tc>
         <w:tc>
+          <w:tcPr>
+            <w:tcBorders>
+              <w:top w:val="nil"/>
+              <w:left w:val="nil"/>
+              <w:bottom w:val="nil"/>
+              <w:right w:val="nil"/>
+            </w:tcBorders>
+          </w:tcPr>
           <w:tcPr/>
           <w:p>
             <w:pPr>
@@ -4736,6 +6277,14 @@
       </w:tr>
       <w:tr>
         <w:tc>
+          <w:tcPr>
+            <w:tcBorders>
+              <w:top w:val="nil"/>
+              <w:left w:val="nil"/>
+              <w:bottom w:val="nil"/>
+              <w:right w:val="nil"/>
+            </w:tcBorders>
+          </w:tcPr>
           <w:tcPr/>
           <w:p>
             <w:pPr>
@@ -4747,6 +6296,14 @@
           </w:p>
         </w:tc>
         <w:tc>
+          <w:tcPr>
+            <w:tcBorders>
+              <w:top w:val="nil"/>
+              <w:left w:val="nil"/>
+              <w:bottom w:val="nil"/>
+              <w:right w:val="nil"/>
+            </w:tcBorders>
+          </w:tcPr>
           <w:tcPr/>
           <w:p>
             <w:pPr>
@@ -4758,6 +6315,14 @@
           </w:p>
         </w:tc>
         <w:tc>
+          <w:tcPr>
+            <w:tcBorders>
+              <w:top w:val="nil"/>
+              <w:left w:val="nil"/>
+              <w:bottom w:val="nil"/>
+              <w:right w:val="nil"/>
+            </w:tcBorders>
+          </w:tcPr>
           <w:tcPr/>
           <w:p>
             <w:pPr>
@@ -4771,6 +6336,14 @@
       </w:tr>
       <w:tr>
         <w:tc>
+          <w:tcPr>
+            <w:tcBorders>
+              <w:top w:val="nil"/>
+              <w:left w:val="nil"/>
+              <w:bottom w:val="single" w:sz="12" w:space="0" w:color="000000"/>
+              <w:right w:val="nil"/>
+            </w:tcBorders>
+          </w:tcPr>
           <w:tcPr/>
           <w:p>
             <w:pPr>
@@ -4782,6 +6355,14 @@
           </w:p>
         </w:tc>
         <w:tc>
+          <w:tcPr>
+            <w:tcBorders>
+              <w:top w:val="nil"/>
+              <w:left w:val="nil"/>
+              <w:bottom w:val="single" w:sz="12" w:space="0" w:color="000000"/>
+              <w:right w:val="nil"/>
+            </w:tcBorders>
+          </w:tcPr>
           <w:tcPr/>
           <w:p>
             <w:pPr>
@@ -4793,6 +6374,14 @@
           </w:p>
         </w:tc>
         <w:tc>
+          <w:tcPr>
+            <w:tcBorders>
+              <w:top w:val="nil"/>
+              <w:left w:val="nil"/>
+              <w:bottom w:val="single" w:sz="12" w:space="0" w:color="000000"/>
+              <w:right w:val="nil"/>
+            </w:tcBorders>
+          </w:tcPr>
           <w:tcPr/>
           <w:p>
             <w:pPr>
@@ -4813,9 +6402,9 @@
         <w:t xml:space="preserve">The PPG-DaLiA per-subject absolute HR difference (wrist PPG vs chest ECG) range was less extreme than on WESAD (2.4x fold range vs 4.0x), but the absolute minimum was virtually identical (6.66 vs 6.75 bpm). The lower fold range is consistent with PPG-DaLiA’s wider activity mix smoothing the upper tail rather than with reduced per-subject heterogeneity. The replication confirms that the cross-method SQI disagreement finding is a property of wrist PPG itself rather than of the WESAD stress paradigm or of any single recording session.</w:t>
       </w:r>
     </w:p>
-    <w:bookmarkEnd w:id="30"/>
-    <w:bookmarkEnd w:id="31"/>
-    <w:bookmarkStart w:id="39" w:name="Xf8d28994ab18c569b43451e1d59264a3df91dd7"/>
+    <w:bookmarkEnd w:id="33"/>
+    <w:bookmarkEnd w:id="34"/>
+    <w:bookmarkStart w:id="42" w:name="Xf8d28994ab18c569b43451e1d59264a3df91dd7"/>
     <w:p>
       <w:pPr>
         <w:pStyle w:val="Heading2"/>
@@ -4824,7 +6413,7 @@
         <w:t xml:space="preserve">4. Methodological validation on synthetic data</w:t>
       </w:r>
     </w:p>
-    <w:bookmarkStart w:id="32" w:name="Xa121e1727e5e5d44b54593882ea99d9ddb54092"/>
+    <w:bookmarkStart w:id="35" w:name="Xa121e1727e5e5d44b54593882ea99d9ddb54092"/>
     <w:p>
       <w:pPr>
         <w:pStyle w:val="Heading3"/>
@@ -4857,8 +6446,8 @@
         <w:t xml:space="preserve">(moderate category). Category distribution: 31 high (≥ 80), 266 moderate (≥ 60), 3 low (≥ 40), 0 unreliable. The distribution is in Figure 6A.</w:t>
       </w:r>
     </w:p>
-    <w:bookmarkEnd w:id="32"/>
-    <w:bookmarkStart w:id="33" w:name="X7eefbf0decf15c54e4d1e7780b435273777fbce"/>
+    <w:bookmarkEnd w:id="35"/>
+    <w:bookmarkStart w:id="36" w:name="X7eefbf0decf15c54e4d1e7780b435273777fbce"/>
     <w:p>
       <w:pPr>
         <w:pStyle w:val="Heading3"/>
@@ -4894,6 +6483,14 @@
           <w:tblHeader w:val="on"/>
         </w:trPr>
         <w:tc>
+          <w:tcPr>
+            <w:tcBorders>
+              <w:top w:val="single" w:sz="12" w:space="0" w:color="000000"/>
+              <w:left w:val="nil"/>
+              <w:bottom w:val="single" w:sz="8" w:space="0" w:color="000000"/>
+              <w:right w:val="nil"/>
+            </w:tcBorders>
+          </w:tcPr>
           <w:tcPr/>
           <w:p>
             <w:pPr>
@@ -4905,6 +6502,14 @@
           </w:p>
         </w:tc>
         <w:tc>
+          <w:tcPr>
+            <w:tcBorders>
+              <w:top w:val="single" w:sz="12" w:space="0" w:color="000000"/>
+              <w:left w:val="nil"/>
+              <w:bottom w:val="single" w:sz="8" w:space="0" w:color="000000"/>
+              <w:right w:val="nil"/>
+            </w:tcBorders>
+          </w:tcPr>
           <w:tcPr/>
           <w:p>
             <w:pPr>
@@ -4916,6 +6521,14 @@
           </w:p>
         </w:tc>
         <w:tc>
+          <w:tcPr>
+            <w:tcBorders>
+              <w:top w:val="single" w:sz="12" w:space="0" w:color="000000"/>
+              <w:left w:val="nil"/>
+              <w:bottom w:val="single" w:sz="8" w:space="0" w:color="000000"/>
+              <w:right w:val="nil"/>
+            </w:tcBorders>
+          </w:tcPr>
           <w:tcPr/>
           <w:p>
             <w:pPr>
@@ -4927,6 +6540,14 @@
           </w:p>
         </w:tc>
         <w:tc>
+          <w:tcPr>
+            <w:tcBorders>
+              <w:top w:val="single" w:sz="12" w:space="0" w:color="000000"/>
+              <w:left w:val="nil"/>
+              <w:bottom w:val="single" w:sz="8" w:space="0" w:color="000000"/>
+              <w:right w:val="nil"/>
+            </w:tcBorders>
+          </w:tcPr>
           <w:tcPr/>
           <w:p>
             <w:pPr>
@@ -4938,6 +6559,14 @@
           </w:p>
         </w:tc>
         <w:tc>
+          <w:tcPr>
+            <w:tcBorders>
+              <w:top w:val="single" w:sz="12" w:space="0" w:color="000000"/>
+              <w:left w:val="nil"/>
+              <w:bottom w:val="single" w:sz="8" w:space="0" w:color="000000"/>
+              <w:right w:val="nil"/>
+            </w:tcBorders>
+          </w:tcPr>
           <w:tcPr/>
           <w:p>
             <w:pPr>
@@ -4951,6 +6580,14 @@
       </w:tr>
       <w:tr>
         <w:tc>
+          <w:tcPr>
+            <w:tcBorders>
+              <w:top w:val="nil"/>
+              <w:left w:val="nil"/>
+              <w:bottom w:val="nil"/>
+              <w:right w:val="nil"/>
+            </w:tcBorders>
+          </w:tcPr>
           <w:tcPr/>
           <w:p>
             <w:pPr>
@@ -4962,6 +6599,14 @@
           </w:p>
         </w:tc>
         <w:tc>
+          <w:tcPr>
+            <w:tcBorders>
+              <w:top w:val="nil"/>
+              <w:left w:val="nil"/>
+              <w:bottom w:val="nil"/>
+              <w:right w:val="nil"/>
+            </w:tcBorders>
+          </w:tcPr>
           <w:tcPr/>
           <w:p>
             <w:pPr>
@@ -4977,6 +6622,14 @@
           </w:p>
         </w:tc>
         <w:tc>
+          <w:tcPr>
+            <w:tcBorders>
+              <w:top w:val="nil"/>
+              <w:left w:val="nil"/>
+              <w:bottom w:val="nil"/>
+              <w:right w:val="nil"/>
+            </w:tcBorders>
+          </w:tcPr>
           <w:tcPr/>
           <w:p>
             <w:pPr>
@@ -4988,6 +6641,14 @@
           </w:p>
         </w:tc>
         <w:tc>
+          <w:tcPr>
+            <w:tcBorders>
+              <w:top w:val="nil"/>
+              <w:left w:val="nil"/>
+              <w:bottom w:val="nil"/>
+              <w:right w:val="nil"/>
+            </w:tcBorders>
+          </w:tcPr>
           <w:tcPr/>
           <w:p>
             <w:pPr>
@@ -4999,6 +6660,14 @@
           </w:p>
         </w:tc>
         <w:tc>
+          <w:tcPr>
+            <w:tcBorders>
+              <w:top w:val="nil"/>
+              <w:left w:val="nil"/>
+              <w:bottom w:val="nil"/>
+              <w:right w:val="nil"/>
+            </w:tcBorders>
+          </w:tcPr>
           <w:tcPr/>
           <w:p>
             <w:pPr>
@@ -5012,6 +6681,14 @@
       </w:tr>
       <w:tr>
         <w:tc>
+          <w:tcPr>
+            <w:tcBorders>
+              <w:top w:val="nil"/>
+              <w:left w:val="nil"/>
+              <w:bottom w:val="nil"/>
+              <w:right w:val="nil"/>
+            </w:tcBorders>
+          </w:tcPr>
           <w:tcPr/>
           <w:p>
             <w:pPr>
@@ -5023,6 +6700,14 @@
           </w:p>
         </w:tc>
         <w:tc>
+          <w:tcPr>
+            <w:tcBorders>
+              <w:top w:val="nil"/>
+              <w:left w:val="nil"/>
+              <w:bottom w:val="nil"/>
+              <w:right w:val="nil"/>
+            </w:tcBorders>
+          </w:tcPr>
           <w:tcPr/>
           <w:p>
             <w:pPr>
@@ -5038,6 +6723,14 @@
           </w:p>
         </w:tc>
         <w:tc>
+          <w:tcPr>
+            <w:tcBorders>
+              <w:top w:val="nil"/>
+              <w:left w:val="nil"/>
+              <w:bottom w:val="nil"/>
+              <w:right w:val="nil"/>
+            </w:tcBorders>
+          </w:tcPr>
           <w:tcPr/>
           <w:p>
             <w:pPr>
@@ -5049,6 +6742,14 @@
           </w:p>
         </w:tc>
         <w:tc>
+          <w:tcPr>
+            <w:tcBorders>
+              <w:top w:val="nil"/>
+              <w:left w:val="nil"/>
+              <w:bottom w:val="nil"/>
+              <w:right w:val="nil"/>
+            </w:tcBorders>
+          </w:tcPr>
           <w:tcPr/>
           <w:p>
             <w:pPr>
@@ -5060,6 +6761,14 @@
           </w:p>
         </w:tc>
         <w:tc>
+          <w:tcPr>
+            <w:tcBorders>
+              <w:top w:val="nil"/>
+              <w:left w:val="nil"/>
+              <w:bottom w:val="nil"/>
+              <w:right w:val="nil"/>
+            </w:tcBorders>
+          </w:tcPr>
           <w:tcPr/>
           <w:p>
             <w:pPr>
@@ -5073,6 +6782,14 @@
       </w:tr>
       <w:tr>
         <w:tc>
+          <w:tcPr>
+            <w:tcBorders>
+              <w:top w:val="nil"/>
+              <w:left w:val="nil"/>
+              <w:bottom w:val="nil"/>
+              <w:right w:val="nil"/>
+            </w:tcBorders>
+          </w:tcPr>
           <w:tcPr/>
           <w:p>
             <w:pPr>
@@ -5084,6 +6801,14 @@
           </w:p>
         </w:tc>
         <w:tc>
+          <w:tcPr>
+            <w:tcBorders>
+              <w:top w:val="nil"/>
+              <w:left w:val="nil"/>
+              <w:bottom w:val="nil"/>
+              <w:right w:val="nil"/>
+            </w:tcBorders>
+          </w:tcPr>
           <w:tcPr/>
           <w:p>
             <w:pPr>
@@ -5095,6 +6820,14 @@
           </w:p>
         </w:tc>
         <w:tc>
+          <w:tcPr>
+            <w:tcBorders>
+              <w:top w:val="nil"/>
+              <w:left w:val="nil"/>
+              <w:bottom w:val="nil"/>
+              <w:right w:val="nil"/>
+            </w:tcBorders>
+          </w:tcPr>
           <w:tcPr/>
           <w:p>
             <w:pPr>
@@ -5106,6 +6839,14 @@
           </w:p>
         </w:tc>
         <w:tc>
+          <w:tcPr>
+            <w:tcBorders>
+              <w:top w:val="nil"/>
+              <w:left w:val="nil"/>
+              <w:bottom w:val="nil"/>
+              <w:right w:val="nil"/>
+            </w:tcBorders>
+          </w:tcPr>
           <w:tcPr/>
           <w:p>
             <w:pPr>
@@ -5117,6 +6858,14 @@
           </w:p>
         </w:tc>
         <w:tc>
+          <w:tcPr>
+            <w:tcBorders>
+              <w:top w:val="nil"/>
+              <w:left w:val="nil"/>
+              <w:bottom w:val="nil"/>
+              <w:right w:val="nil"/>
+            </w:tcBorders>
+          </w:tcPr>
           <w:tcPr/>
           <w:p>
             <w:pPr>
@@ -5130,6 +6879,14 @@
       </w:tr>
       <w:tr>
         <w:tc>
+          <w:tcPr>
+            <w:tcBorders>
+              <w:top w:val="nil"/>
+              <w:left w:val="nil"/>
+              <w:bottom w:val="single" w:sz="12" w:space="0" w:color="000000"/>
+              <w:right w:val="nil"/>
+            </w:tcBorders>
+          </w:tcPr>
           <w:tcPr/>
           <w:p>
             <w:pPr>
@@ -5141,6 +6898,14 @@
           </w:p>
         </w:tc>
         <w:tc>
+          <w:tcPr>
+            <w:tcBorders>
+              <w:top w:val="nil"/>
+              <w:left w:val="nil"/>
+              <w:bottom w:val="single" w:sz="12" w:space="0" w:color="000000"/>
+              <w:right w:val="nil"/>
+            </w:tcBorders>
+          </w:tcPr>
           <w:tcPr/>
           <w:p>
             <w:pPr>
@@ -5152,6 +6917,14 @@
           </w:p>
         </w:tc>
         <w:tc>
+          <w:tcPr>
+            <w:tcBorders>
+              <w:top w:val="nil"/>
+              <w:left w:val="nil"/>
+              <w:bottom w:val="single" w:sz="12" w:space="0" w:color="000000"/>
+              <w:right w:val="nil"/>
+            </w:tcBorders>
+          </w:tcPr>
           <w:tcPr/>
           <w:p>
             <w:pPr>
@@ -5163,6 +6936,14 @@
           </w:p>
         </w:tc>
         <w:tc>
+          <w:tcPr>
+            <w:tcBorders>
+              <w:top w:val="nil"/>
+              <w:left w:val="nil"/>
+              <w:bottom w:val="single" w:sz="12" w:space="0" w:color="000000"/>
+              <w:right w:val="nil"/>
+            </w:tcBorders>
+          </w:tcPr>
           <w:tcPr/>
           <w:p>
             <w:pPr>
@@ -5174,6 +6955,14 @@
           </w:p>
         </w:tc>
         <w:tc>
+          <w:tcPr>
+            <w:tcBorders>
+              <w:top w:val="nil"/>
+              <w:left w:val="nil"/>
+              <w:bottom w:val="single" w:sz="12" w:space="0" w:color="000000"/>
+              <w:right w:val="nil"/>
+            </w:tcBorders>
+          </w:tcPr>
           <w:tcPr/>
           <w:p>
             <w:pPr>
@@ -5206,8 +6995,8 @@
         <w:t xml:space="preserve">number.</w:t>
       </w:r>
     </w:p>
-    <w:bookmarkEnd w:id="33"/>
-    <w:bookmarkStart w:id="34" w:name="Xda95753af269ca0e3094d252b044c654d56e36b"/>
+    <w:bookmarkEnd w:id="36"/>
+    <w:bookmarkStart w:id="37" w:name="Xda95753af269ca0e3094d252b044c654d56e36b"/>
     <w:p>
       <w:pPr>
         <w:pStyle w:val="Heading3"/>
@@ -5224,8 +7013,8 @@
         <w:t xml:space="preserve">We also report an ICC(2,1) days-as-raters analysis as an internal noise-floor check (full numbers in supplement Table S1). The ICC and bootstrap week-pair r agree on metric ranking, with ICC uniformly more conservative because it treats within-week noise as rater disagreement. The bootstrap week-pair r is the recommended headline statistic for clinical claims; the ICC is included as a diagnostic.</w:t>
       </w:r>
     </w:p>
-    <w:bookmarkEnd w:id="34"/>
-    <w:bookmarkStart w:id="35" w:name="fairness-disparities-recovered"/>
+    <w:bookmarkEnd w:id="37"/>
+    <w:bookmarkStart w:id="38" w:name="fairness-disparities-recovered"/>
     <w:p>
       <w:pPr>
         <w:pStyle w:val="Heading3"/>
@@ -5262,6 +7051,14 @@
           <w:tblHeader w:val="on"/>
         </w:trPr>
         <w:tc>
+          <w:tcPr>
+            <w:tcBorders>
+              <w:top w:val="single" w:sz="12" w:space="0" w:color="000000"/>
+              <w:left w:val="nil"/>
+              <w:bottom w:val="single" w:sz="8" w:space="0" w:color="000000"/>
+              <w:right w:val="nil"/>
+            </w:tcBorders>
+          </w:tcPr>
           <w:tcPr/>
           <w:p>
             <w:pPr>
@@ -5273,6 +7070,14 @@
           </w:p>
         </w:tc>
         <w:tc>
+          <w:tcPr>
+            <w:tcBorders>
+              <w:top w:val="single" w:sz="12" w:space="0" w:color="000000"/>
+              <w:left w:val="nil"/>
+              <w:bottom w:val="single" w:sz="8" w:space="0" w:color="000000"/>
+              <w:right w:val="nil"/>
+            </w:tcBorders>
+          </w:tcPr>
           <w:tcPr/>
           <w:p>
             <w:pPr>
@@ -5284,6 +7089,14 @@
           </w:p>
         </w:tc>
         <w:tc>
+          <w:tcPr>
+            <w:tcBorders>
+              <w:top w:val="single" w:sz="12" w:space="0" w:color="000000"/>
+              <w:left w:val="nil"/>
+              <w:bottom w:val="single" w:sz="8" w:space="0" w:color="000000"/>
+              <w:right w:val="nil"/>
+            </w:tcBorders>
+          </w:tcPr>
           <w:tcPr/>
           <w:p>
             <w:pPr>
@@ -5295,6 +7108,14 @@
           </w:p>
         </w:tc>
         <w:tc>
+          <w:tcPr>
+            <w:tcBorders>
+              <w:top w:val="single" w:sz="12" w:space="0" w:color="000000"/>
+              <w:left w:val="nil"/>
+              <w:bottom w:val="single" w:sz="8" w:space="0" w:color="000000"/>
+              <w:right w:val="nil"/>
+            </w:tcBorders>
+          </w:tcPr>
           <w:tcPr/>
           <w:p>
             <w:pPr>
@@ -5306,6 +7127,14 @@
           </w:p>
         </w:tc>
         <w:tc>
+          <w:tcPr>
+            <w:tcBorders>
+              <w:top w:val="single" w:sz="12" w:space="0" w:color="000000"/>
+              <w:left w:val="nil"/>
+              <w:bottom w:val="single" w:sz="8" w:space="0" w:color="000000"/>
+              <w:right w:val="nil"/>
+            </w:tcBorders>
+          </w:tcPr>
           <w:tcPr/>
           <w:p>
             <w:pPr>
@@ -5319,6 +7148,14 @@
       </w:tr>
       <w:tr>
         <w:tc>
+          <w:tcPr>
+            <w:tcBorders>
+              <w:top w:val="nil"/>
+              <w:left w:val="nil"/>
+              <w:bottom w:val="nil"/>
+              <w:right w:val="nil"/>
+            </w:tcBorders>
+          </w:tcPr>
           <w:tcPr/>
           <w:p>
             <w:pPr>
@@ -5330,6 +7167,14 @@
           </w:p>
         </w:tc>
         <w:tc>
+          <w:tcPr>
+            <w:tcBorders>
+              <w:top w:val="nil"/>
+              <w:left w:val="nil"/>
+              <w:bottom w:val="nil"/>
+              <w:right w:val="nil"/>
+            </w:tcBorders>
+          </w:tcPr>
           <w:tcPr/>
           <w:p>
             <w:pPr>
@@ -5341,6 +7186,14 @@
           </w:p>
         </w:tc>
         <w:tc>
+          <w:tcPr>
+            <w:tcBorders>
+              <w:top w:val="nil"/>
+              <w:left w:val="nil"/>
+              <w:bottom w:val="nil"/>
+              <w:right w:val="nil"/>
+            </w:tcBorders>
+          </w:tcPr>
           <w:tcPr/>
           <w:p>
             <w:pPr>
@@ -5352,6 +7205,14 @@
           </w:p>
         </w:tc>
         <w:tc>
+          <w:tcPr>
+            <w:tcBorders>
+              <w:top w:val="nil"/>
+              <w:left w:val="nil"/>
+              <w:bottom w:val="nil"/>
+              <w:right w:val="nil"/>
+            </w:tcBorders>
+          </w:tcPr>
           <w:tcPr/>
           <w:p>
             <w:pPr>
@@ -5363,6 +7224,14 @@
           </w:p>
         </w:tc>
         <w:tc>
+          <w:tcPr>
+            <w:tcBorders>
+              <w:top w:val="nil"/>
+              <w:left w:val="nil"/>
+              <w:bottom w:val="nil"/>
+              <w:right w:val="nil"/>
+            </w:tcBorders>
+          </w:tcPr>
           <w:tcPr/>
           <w:p>
             <w:pPr>
@@ -5380,6 +7249,14 @@
       </w:tr>
       <w:tr>
         <w:tc>
+          <w:tcPr>
+            <w:tcBorders>
+              <w:top w:val="nil"/>
+              <w:left w:val="nil"/>
+              <w:bottom w:val="single" w:sz="12" w:space="0" w:color="000000"/>
+              <w:right w:val="nil"/>
+            </w:tcBorders>
+          </w:tcPr>
           <w:tcPr/>
           <w:p>
             <w:pPr>
@@ -5391,6 +7268,14 @@
           </w:p>
         </w:tc>
         <w:tc>
+          <w:tcPr>
+            <w:tcBorders>
+              <w:top w:val="nil"/>
+              <w:left w:val="nil"/>
+              <w:bottom w:val="single" w:sz="12" w:space="0" w:color="000000"/>
+              <w:right w:val="nil"/>
+            </w:tcBorders>
+          </w:tcPr>
           <w:tcPr/>
           <w:p>
             <w:pPr>
@@ -5402,6 +7287,14 @@
           </w:p>
         </w:tc>
         <w:tc>
+          <w:tcPr>
+            <w:tcBorders>
+              <w:top w:val="nil"/>
+              <w:left w:val="nil"/>
+              <w:bottom w:val="single" w:sz="12" w:space="0" w:color="000000"/>
+              <w:right w:val="nil"/>
+            </w:tcBorders>
+          </w:tcPr>
           <w:tcPr/>
           <w:p>
             <w:pPr>
@@ -5413,6 +7306,14 @@
           </w:p>
         </w:tc>
         <w:tc>
+          <w:tcPr>
+            <w:tcBorders>
+              <w:top w:val="nil"/>
+              <w:left w:val="nil"/>
+              <w:bottom w:val="single" w:sz="12" w:space="0" w:color="000000"/>
+              <w:right w:val="nil"/>
+            </w:tcBorders>
+          </w:tcPr>
           <w:tcPr/>
           <w:p>
             <w:pPr>
@@ -5424,6 +7325,14 @@
           </w:p>
         </w:tc>
         <w:tc>
+          <w:tcPr>
+            <w:tcBorders>
+              <w:top w:val="nil"/>
+              <w:left w:val="nil"/>
+              <w:bottom w:val="single" w:sz="12" w:space="0" w:color="000000"/>
+              <w:right w:val="nil"/>
+            </w:tcBorders>
+          </w:tcPr>
           <w:tcPr/>
           <w:p>
             <w:pPr>
@@ -5448,8 +7357,8 @@
         <w:t xml:space="preserve">The injected effects were 0.85 vs 1.00 SQI multiplier for device C vs A (recovers as a 13.02-point gap) and 0.12 × proxy for skin tone (recovers as a 9.53-point gap). Both gaps have bootstrap 95% CIs (Section 2.7).</w:t>
       </w:r>
     </w:p>
-    <w:bookmarkEnd w:id="35"/>
-    <w:bookmarkStart w:id="36" w:name="causal-adjusted-confounding"/>
+    <w:bookmarkEnd w:id="38"/>
+    <w:bookmarkStart w:id="39" w:name="causal-adjusted-confounding"/>
     <w:p>
       <w:pPr>
         <w:pStyle w:val="Heading3"/>
@@ -5486,6 +7395,14 @@
           <w:tblHeader w:val="on"/>
         </w:trPr>
         <w:tc>
+          <w:tcPr>
+            <w:tcBorders>
+              <w:top w:val="single" w:sz="12" w:space="0" w:color="000000"/>
+              <w:left w:val="nil"/>
+              <w:bottom w:val="single" w:sz="8" w:space="0" w:color="000000"/>
+              <w:right w:val="nil"/>
+            </w:tcBorders>
+          </w:tcPr>
           <w:tcPr/>
           <w:p>
             <w:pPr>
@@ -5497,6 +7414,14 @@
           </w:p>
         </w:tc>
         <w:tc>
+          <w:tcPr>
+            <w:tcBorders>
+              <w:top w:val="single" w:sz="12" w:space="0" w:color="000000"/>
+              <w:left w:val="nil"/>
+              <w:bottom w:val="single" w:sz="8" w:space="0" w:color="000000"/>
+              <w:right w:val="nil"/>
+            </w:tcBorders>
+          </w:tcPr>
           <w:tcPr/>
           <w:p>
             <w:pPr>
@@ -5508,6 +7433,14 @@
           </w:p>
         </w:tc>
         <w:tc>
+          <w:tcPr>
+            <w:tcBorders>
+              <w:top w:val="single" w:sz="12" w:space="0" w:color="000000"/>
+              <w:left w:val="nil"/>
+              <w:bottom w:val="single" w:sz="8" w:space="0" w:color="000000"/>
+              <w:right w:val="nil"/>
+            </w:tcBorders>
+          </w:tcPr>
           <w:tcPr/>
           <w:p>
             <w:pPr>
@@ -5519,6 +7452,14 @@
           </w:p>
         </w:tc>
         <w:tc>
+          <w:tcPr>
+            <w:tcBorders>
+              <w:top w:val="single" w:sz="12" w:space="0" w:color="000000"/>
+              <w:left w:val="nil"/>
+              <w:bottom w:val="single" w:sz="8" w:space="0" w:color="000000"/>
+              <w:right w:val="nil"/>
+            </w:tcBorders>
+          </w:tcPr>
           <w:tcPr/>
           <w:p>
             <w:pPr>
@@ -5530,6 +7471,14 @@
           </w:p>
         </w:tc>
         <w:tc>
+          <w:tcPr>
+            <w:tcBorders>
+              <w:top w:val="single" w:sz="12" w:space="0" w:color="000000"/>
+              <w:left w:val="nil"/>
+              <w:bottom w:val="single" w:sz="8" w:space="0" w:color="000000"/>
+              <w:right w:val="nil"/>
+            </w:tcBorders>
+          </w:tcPr>
           <w:tcPr/>
           <w:p>
             <w:pPr>
@@ -5543,6 +7492,14 @@
       </w:tr>
       <w:tr>
         <w:tc>
+          <w:tcPr>
+            <w:tcBorders>
+              <w:top w:val="nil"/>
+              <w:left w:val="nil"/>
+              <w:bottom w:val="nil"/>
+              <w:right w:val="nil"/>
+            </w:tcBorders>
+          </w:tcPr>
           <w:tcPr/>
           <w:p>
             <w:pPr>
@@ -5554,6 +7511,14 @@
           </w:p>
         </w:tc>
         <w:tc>
+          <w:tcPr>
+            <w:tcBorders>
+              <w:top w:val="nil"/>
+              <w:left w:val="nil"/>
+              <w:bottom w:val="nil"/>
+              <w:right w:val="nil"/>
+            </w:tcBorders>
+          </w:tcPr>
           <w:tcPr/>
           <w:p>
             <w:pPr>
@@ -5565,6 +7530,14 @@
           </w:p>
         </w:tc>
         <w:tc>
+          <w:tcPr>
+            <w:tcBorders>
+              <w:top w:val="nil"/>
+              <w:left w:val="nil"/>
+              <w:bottom w:val="nil"/>
+              <w:right w:val="nil"/>
+            </w:tcBorders>
+          </w:tcPr>
           <w:tcPr/>
           <w:p>
             <w:pPr>
@@ -5576,6 +7549,14 @@
           </w:p>
         </w:tc>
         <w:tc>
+          <w:tcPr>
+            <w:tcBorders>
+              <w:top w:val="nil"/>
+              <w:left w:val="nil"/>
+              <w:bottom w:val="nil"/>
+              <w:right w:val="nil"/>
+            </w:tcBorders>
+          </w:tcPr>
           <w:tcPr/>
           <w:p>
             <w:pPr>
@@ -5587,6 +7568,14 @@
           </w:p>
         </w:tc>
         <w:tc>
+          <w:tcPr>
+            <w:tcBorders>
+              <w:top w:val="nil"/>
+              <w:left w:val="nil"/>
+              <w:bottom w:val="nil"/>
+              <w:right w:val="nil"/>
+            </w:tcBorders>
+          </w:tcPr>
           <w:tcPr/>
           <w:p>
             <w:pPr>
@@ -5600,6 +7589,14 @@
       </w:tr>
       <w:tr>
         <w:tc>
+          <w:tcPr>
+            <w:tcBorders>
+              <w:top w:val="nil"/>
+              <w:left w:val="nil"/>
+              <w:bottom w:val="nil"/>
+              <w:right w:val="nil"/>
+            </w:tcBorders>
+          </w:tcPr>
           <w:tcPr/>
           <w:p>
             <w:pPr>
@@ -5611,6 +7608,14 @@
           </w:p>
         </w:tc>
         <w:tc>
+          <w:tcPr>
+            <w:tcBorders>
+              <w:top w:val="nil"/>
+              <w:left w:val="nil"/>
+              <w:bottom w:val="nil"/>
+              <w:right w:val="nil"/>
+            </w:tcBorders>
+          </w:tcPr>
           <w:tcPr/>
           <w:p>
             <w:pPr>
@@ -5622,6 +7627,14 @@
           </w:p>
         </w:tc>
         <w:tc>
+          <w:tcPr>
+            <w:tcBorders>
+              <w:top w:val="nil"/>
+              <w:left w:val="nil"/>
+              <w:bottom w:val="nil"/>
+              <w:right w:val="nil"/>
+            </w:tcBorders>
+          </w:tcPr>
           <w:tcPr/>
           <w:p>
             <w:pPr>
@@ -5633,6 +7646,14 @@
           </w:p>
         </w:tc>
         <w:tc>
+          <w:tcPr>
+            <w:tcBorders>
+              <w:top w:val="nil"/>
+              <w:left w:val="nil"/>
+              <w:bottom w:val="nil"/>
+              <w:right w:val="nil"/>
+            </w:tcBorders>
+          </w:tcPr>
           <w:tcPr/>
           <w:p>
             <w:pPr>
@@ -5644,6 +7665,14 @@
           </w:p>
         </w:tc>
         <w:tc>
+          <w:tcPr>
+            <w:tcBorders>
+              <w:top w:val="nil"/>
+              <w:left w:val="nil"/>
+              <w:bottom w:val="nil"/>
+              <w:right w:val="nil"/>
+            </w:tcBorders>
+          </w:tcPr>
           <w:tcPr/>
           <w:p>
             <w:pPr>
@@ -5657,6 +7686,14 @@
       </w:tr>
       <w:tr>
         <w:tc>
+          <w:tcPr>
+            <w:tcBorders>
+              <w:top w:val="nil"/>
+              <w:left w:val="nil"/>
+              <w:bottom w:val="nil"/>
+              <w:right w:val="nil"/>
+            </w:tcBorders>
+          </w:tcPr>
           <w:tcPr/>
           <w:p>
             <w:pPr>
@@ -5668,6 +7705,14 @@
           </w:p>
         </w:tc>
         <w:tc>
+          <w:tcPr>
+            <w:tcBorders>
+              <w:top w:val="nil"/>
+              <w:left w:val="nil"/>
+              <w:bottom w:val="nil"/>
+              <w:right w:val="nil"/>
+            </w:tcBorders>
+          </w:tcPr>
           <w:tcPr/>
           <w:p>
             <w:pPr>
@@ -5679,6 +7724,14 @@
           </w:p>
         </w:tc>
         <w:tc>
+          <w:tcPr>
+            <w:tcBorders>
+              <w:top w:val="nil"/>
+              <w:left w:val="nil"/>
+              <w:bottom w:val="nil"/>
+              <w:right w:val="nil"/>
+            </w:tcBorders>
+          </w:tcPr>
           <w:tcPr/>
           <w:p>
             <w:pPr>
@@ -5690,6 +7743,14 @@
           </w:p>
         </w:tc>
         <w:tc>
+          <w:tcPr>
+            <w:tcBorders>
+              <w:top w:val="nil"/>
+              <w:left w:val="nil"/>
+              <w:bottom w:val="nil"/>
+              <w:right w:val="nil"/>
+            </w:tcBorders>
+          </w:tcPr>
           <w:tcPr/>
           <w:p>
             <w:pPr>
@@ -5701,6 +7762,14 @@
           </w:p>
         </w:tc>
         <w:tc>
+          <w:tcPr>
+            <w:tcBorders>
+              <w:top w:val="nil"/>
+              <w:left w:val="nil"/>
+              <w:bottom w:val="nil"/>
+              <w:right w:val="nil"/>
+            </w:tcBorders>
+          </w:tcPr>
           <w:tcPr/>
           <w:p>
             <w:pPr>
@@ -5714,6 +7783,14 @@
       </w:tr>
       <w:tr>
         <w:tc>
+          <w:tcPr>
+            <w:tcBorders>
+              <w:top w:val="nil"/>
+              <w:left w:val="nil"/>
+              <w:bottom w:val="single" w:sz="12" w:space="0" w:color="000000"/>
+              <w:right w:val="nil"/>
+            </w:tcBorders>
+          </w:tcPr>
           <w:tcPr/>
           <w:p>
             <w:pPr>
@@ -5725,6 +7802,14 @@
           </w:p>
         </w:tc>
         <w:tc>
+          <w:tcPr>
+            <w:tcBorders>
+              <w:top w:val="nil"/>
+              <w:left w:val="nil"/>
+              <w:bottom w:val="single" w:sz="12" w:space="0" w:color="000000"/>
+              <w:right w:val="nil"/>
+            </w:tcBorders>
+          </w:tcPr>
           <w:tcPr/>
           <w:p>
             <w:pPr>
@@ -5736,6 +7821,14 @@
           </w:p>
         </w:tc>
         <w:tc>
+          <w:tcPr>
+            <w:tcBorders>
+              <w:top w:val="nil"/>
+              <w:left w:val="nil"/>
+              <w:bottom w:val="single" w:sz="12" w:space="0" w:color="000000"/>
+              <w:right w:val="nil"/>
+            </w:tcBorders>
+          </w:tcPr>
           <w:tcPr/>
           <w:p>
             <w:pPr>
@@ -5747,6 +7840,14 @@
           </w:p>
         </w:tc>
         <w:tc>
+          <w:tcPr>
+            <w:tcBorders>
+              <w:top w:val="nil"/>
+              <w:left w:val="nil"/>
+              <w:bottom w:val="single" w:sz="12" w:space="0" w:color="000000"/>
+              <w:right w:val="nil"/>
+            </w:tcBorders>
+          </w:tcPr>
           <w:tcPr/>
           <w:p>
             <w:pPr>
@@ -5762,6 +7863,14 @@
           </w:p>
         </w:tc>
         <w:tc>
+          <w:tcPr>
+            <w:tcBorders>
+              <w:top w:val="nil"/>
+              <w:left w:val="nil"/>
+              <w:bottom w:val="single" w:sz="12" w:space="0" w:color="000000"/>
+              <w:right w:val="nil"/>
+            </w:tcBorders>
+          </w:tcPr>
           <w:tcPr/>
           <w:p>
             <w:pPr>
@@ -5794,8 +7903,8 @@
         <w:t xml:space="preserve">The heat_index → HRV and heat_index → sleep_efficiency rows in Table 13 illustrate the diagnostic in the opposite direction. The framework’s positivity check flags a violation for both heat_index treatments (Kish effective sample size 63%), meaning the propensity-score model produced effective sample sizes too small to support reliable adjusted estimation. The AIPW point estimates for the heat_index treatments are consequently reported with a positivity-violation warning attached to the analysis output and are not interpreted as substantive causal claims. The rows are included in Table 13 to demonstrate that the framework refuses to commit to a causal interpretation when the propensity-score assumption is empirically inadequate, rather than reporting a point estimate with the same authority as the active_minutes case. Positivity and E-value sensitivity output for both treatments is in supplement section S2.</w:t>
       </w:r>
     </w:p>
-    <w:bookmarkEnd w:id="36"/>
-    <w:bookmarkStart w:id="37" w:name="learned-trust-score-weights"/>
+    <w:bookmarkEnd w:id="39"/>
+    <w:bookmarkStart w:id="40" w:name="learned-trust-score-weights"/>
     <w:p>
       <w:pPr>
         <w:pStyle w:val="Heading3"/>
@@ -5812,8 +7921,8 @@
         <w:t xml:space="preserve">A 6-component weight-simplex search (Dirichlet sampling plus local grid refinement, 360 candidates) returned holdout Spearman ρ = +0.668 (n_holdout = 90) against a week-over-week HRV RMSSD reproducibility target, compared with +0.592 in training (n_train = 210). The learned weights emphasize signal_quality over confounding_risk but remain within the convex hull of plausible weightings; the default weights are within 0.08 Spearman of the optimum, supporting the policy of shipping the defaults and exposing the weights as user-configurable. Full training-vs-holdout breakdown in supplement section S6.</w:t>
       </w:r>
     </w:p>
-    <w:bookmarkEnd w:id="37"/>
-    <w:bookmarkStart w:id="38" w:name="cross-cohort-generalization"/>
+    <w:bookmarkEnd w:id="40"/>
+    <w:bookmarkStart w:id="41" w:name="cross-cohort-generalization"/>
     <w:p>
       <w:pPr>
         <w:pStyle w:val="Heading3"/>
@@ -5830,9 +7939,9 @@
         <w:t xml:space="preserve">Across five synthetic regimes (default, strong environment, inverted skin-tone, severe device bias, clean world) and eight qualitative predictions, seven of eight predictions pass (Figure 7, panel C). The one failure is consistent with random variation: in the clean-world regime, small-sample random imbalance produces a non-zero empirical device-B offset despite zero injected bias. The audit responds to cohort parameters in the predicted direction, including the sign-flip on the skin-tone gap when the injected penalty is inverted (Figure 7, panel B). Full per-regime table in supplement Table S2.</w:t>
       </w:r>
     </w:p>
-    <w:bookmarkEnd w:id="38"/>
-    <w:bookmarkEnd w:id="39"/>
-    <w:bookmarkStart w:id="43" w:name="discussion"/>
+    <w:bookmarkEnd w:id="41"/>
+    <w:bookmarkEnd w:id="42"/>
+    <w:bookmarkStart w:id="46" w:name="discussion"/>
     <w:p>
       <w:pPr>
         <w:pStyle w:val="Heading2"/>
@@ -5841,7 +7950,7 @@
         <w:t xml:space="preserve">5. Discussion</w:t>
       </w:r>
     </w:p>
-    <w:bookmarkStart w:id="40" w:name="principal-findings"/>
+    <w:bookmarkStart w:id="43" w:name="principal-findings"/>
     <w:p>
       <w:pPr>
         <w:pStyle w:val="Heading3"/>
@@ -5921,8 +8030,8 @@
         <w:t xml:space="preserve">Mean |HR_PPG - HR_ECG| during stress ranges from 6.75 bpm (S15) to 26.02 bpm (S11), a four-fold spread across 15 subjects. The direction of the per-state quality change also varies (most subjects’ PPG SQI drops during stress; S15’s rises). Any conclusion from pooled WESAD wrist-PPG analysis is at risk of being driven by a small number of subjects. Restricting downstream models to multi-baseline-pass windows improves per-subject wrist-PPG-to-chest-ECG HR correlation by a median of +0.110 (13 of 15 subjects improved, paired Wilcoxon p = 1.5e-04), with the largest gains in subjects whose unfiltered correlation was modest (S10: 0.65 → 0.78, S9: 0.47 → 0.76).</w:t>
       </w:r>
     </w:p>
-    <w:bookmarkEnd w:id="40"/>
-    <w:bookmarkStart w:id="41" w:name="relation-to-prior-work"/>
+    <w:bookmarkEnd w:id="43"/>
+    <w:bookmarkStart w:id="44" w:name="relation-to-prior-work"/>
     <w:p>
       <w:pPr>
         <w:pStyle w:val="Heading3"/>
@@ -5977,8 +8086,8 @@
         <w:t xml:space="preserve">, which focuses on feature engineering and aggregation rather than auditing. Our framework can be combined with FLIRT rather than replacing it: FLIRT produces the features; our pipeline checks whether those features are reliable enough to model.</w:t>
       </w:r>
     </w:p>
-    <w:bookmarkEnd w:id="41"/>
-    <w:bookmarkStart w:id="42" w:name="limitations"/>
+    <w:bookmarkEnd w:id="44"/>
+    <w:bookmarkStart w:id="45" w:name="limitations"/>
     <w:p>
       <w:pPr>
         <w:pStyle w:val="Heading3"/>
@@ -6273,9 +8382,9 @@
         <w:t xml:space="preserve">This is a single-author methodology paper with no clinical or biomedical-engineering co-authors. The recommendations in Section 6 are aimed at the wearable-AI research community (multi-baseline SQI auditing as standard supplementary material in wearable-AI publications) and do not constitute clinical guidance. Translation of any cross-method-audit recommendation into patient-facing clinical practice should include co-authorship by clinical specialists with relevant device experience; the synthetic-cohort validation in Section 4 and the WESAD/PPG-DaLiA empirical study in Section 3 are methodological contributions rather than clinical findings.</w:t>
       </w:r>
     </w:p>
-    <w:bookmarkEnd w:id="42"/>
-    <w:bookmarkEnd w:id="43"/>
-    <w:bookmarkStart w:id="44" w:name="conclusions"/>
+    <w:bookmarkEnd w:id="45"/>
+    <w:bookmarkEnd w:id="46"/>
+    <w:bookmarkStart w:id="47" w:name="conclusions"/>
     <w:p>
       <w:pPr>
         <w:pStyle w:val="Heading2"/>
@@ -6315,8 +8424,8 @@
         <w:t xml:space="preserve">(MIT licensed) and runs end-to-end from a fixed seed in approximately three minutes on a modern laptop CPU.</w:t>
       </w:r>
     </w:p>
-    <w:bookmarkEnd w:id="44"/>
-    <w:bookmarkStart w:id="45" w:name="code-and-data-availability"/>
+    <w:bookmarkEnd w:id="47"/>
+    <w:bookmarkStart w:id="48" w:name="code-and-data-availability"/>
     <w:p>
       <w:pPr>
         <w:pStyle w:val="Heading2"/>
@@ -6351,8 +8460,8 @@
         <w:t xml:space="preserve">, also publicly available from the UCI Machine Learning Repository. Both are released without restrictions for research use.</w:t>
       </w:r>
     </w:p>
-    <w:bookmarkEnd w:id="45"/>
-    <w:bookmarkStart w:id="46" w:name="author-contributions"/>
+    <w:bookmarkEnd w:id="48"/>
+    <w:bookmarkStart w:id="49" w:name="author-contributions"/>
     <w:p>
       <w:pPr>
         <w:pStyle w:val="Heading2"/>
@@ -6369,8 +8478,8 @@
         <w:t xml:space="preserve">Ceyhun Olcan: Conceptualization, Data curation, Formal analysis, Investigation, Methodology, Software, Validation, Visualization, Writing - original draft, Writing - review and editing.</w:t>
       </w:r>
     </w:p>
-    <w:bookmarkEnd w:id="46"/>
-    <w:bookmarkStart w:id="47" w:name="funding"/>
+    <w:bookmarkEnd w:id="49"/>
+    <w:bookmarkStart w:id="50" w:name="funding"/>
     <w:p>
       <w:pPr>
         <w:pStyle w:val="Heading2"/>
@@ -6387,8 +8496,8 @@
         <w:t xml:space="preserve">No external funding supported this work.</w:t>
       </w:r>
     </w:p>
-    <w:bookmarkEnd w:id="47"/>
-    <w:bookmarkStart w:id="48" w:name="ethics-statement"/>
+    <w:bookmarkEnd w:id="50"/>
+    <w:bookmarkStart w:id="51" w:name="ethics-statement"/>
     <w:p>
       <w:pPr>
         <w:pStyle w:val="Heading2"/>
@@ -6414,8 +8523,8 @@
         <w:t xml:space="preserve">, released under terms permitting research use. No new human-subjects data were collected; institutional review board approval was therefore not required for this work.</w:t>
       </w:r>
     </w:p>
-    <w:bookmarkEnd w:id="48"/>
-    <w:bookmarkStart w:id="49" w:name="competing-interests"/>
+    <w:bookmarkEnd w:id="51"/>
+    <w:bookmarkStart w:id="52" w:name="competing-interests"/>
     <w:p>
       <w:pPr>
         <w:pStyle w:val="Heading2"/>
@@ -6432,8 +8541,8 @@
         <w:t xml:space="preserve">The author declares no competing interests.</w:t>
       </w:r>
     </w:p>
-    <w:bookmarkEnd w:id="49"/>
-    <w:bookmarkStart w:id="50" w:name="references"/>
+    <w:bookmarkEnd w:id="52"/>
+    <w:bookmarkStart w:id="53" w:name="references"/>
     <w:p>
       <w:pPr>
         <w:pStyle w:val="Heading2"/>
@@ -6465,8 +8574,8 @@
         <w:t xml:space="preserve">for full citations (Orphanidou et al. 2015, Sukor et al. 2011, Clifford et al. 2012, Robins et al. 1994, Shrout &amp; Fleiss 1979, Bland &amp; Altman 1986, Schmidt et al. 2018, Perraudin et al. 2021, Föll et al. 2021, Mertes et al. 2022, Efron &amp; Tibshirani 1993, Malik 1996).</w:t>
       </w:r>
     </w:p>
-    <w:bookmarkEnd w:id="50"/>
-    <w:bookmarkStart w:id="102" w:name="supplementary-materials"/>
+    <w:bookmarkEnd w:id="53"/>
+    <w:bookmarkStart w:id="105" w:name="supplementary-materials"/>
     <w:p>
       <w:pPr>
         <w:pStyle w:val="Heading2"/>
@@ -6610,8 +8719,8 @@
         <w:t xml:space="preserve">: full release history of the toolkit.</w:t>
       </w:r>
     </w:p>
-    <w:bookmarkStart w:id="101" w:name="refs"/>
-    <w:bookmarkStart w:id="52" w:name="ref-allen2007"/>
+    <w:bookmarkStart w:id="104" w:name="refs"/>
+    <w:bookmarkStart w:id="55" w:name="ref-allen2007"/>
     <w:p>
       <w:pPr>
         <w:pStyle w:val="Bibliography"/>
@@ -6644,7 +8753,7 @@
       <w:r>
         <w:t xml:space="preserve"> </w:t>
       </w:r>
-      <w:hyperlink r:id="rId51">
+      <w:hyperlink r:id="rId54">
         <w:r>
           <w:rPr>
             <w:rStyle w:val="Hyperlink"/>
@@ -6656,8 +8765,8 @@
         <w:t xml:space="preserve">.</w:t>
       </w:r>
     </w:p>
-    <w:bookmarkEnd w:id="52"/>
-    <w:bookmarkStart w:id="54" w:name="ref-bent2020"/>
+    <w:bookmarkEnd w:id="55"/>
+    <w:bookmarkStart w:id="57" w:name="ref-bent2020"/>
     <w:p>
       <w:pPr>
         <w:pStyle w:val="Bibliography"/>
@@ -6690,7 +8799,7 @@
       <w:r>
         <w:t xml:space="preserve"> </w:t>
       </w:r>
-      <w:hyperlink r:id="rId53">
+      <w:hyperlink r:id="rId56">
         <w:r>
           <w:rPr>
             <w:rStyle w:val="Hyperlink"/>
@@ -6702,8 +8811,8 @@
         <w:t xml:space="preserve">.</w:t>
       </w:r>
     </w:p>
-    <w:bookmarkEnd w:id="54"/>
-    <w:bookmarkStart w:id="56" w:name="ref-bland1986"/>
+    <w:bookmarkEnd w:id="57"/>
+    <w:bookmarkStart w:id="59" w:name="ref-bland1986"/>
     <w:p>
       <w:pPr>
         <w:pStyle w:val="Bibliography"/>
@@ -6736,7 +8845,7 @@
       <w:r>
         <w:t xml:space="preserve"> </w:t>
       </w:r>
-      <w:hyperlink r:id="rId55">
+      <w:hyperlink r:id="rId58">
         <w:r>
           <w:rPr>
             <w:rStyle w:val="Hyperlink"/>
@@ -6748,8 +8857,8 @@
         <w:t xml:space="preserve">.</w:t>
       </w:r>
     </w:p>
-    <w:bookmarkEnd w:id="56"/>
-    <w:bookmarkStart w:id="58" w:name="ref-bossuyt2015stard"/>
+    <w:bookmarkEnd w:id="59"/>
+    <w:bookmarkStart w:id="61" w:name="ref-bossuyt2015stard"/>
     <w:p>
       <w:pPr>
         <w:pStyle w:val="Bibliography"/>
@@ -6794,7 +8903,7 @@
       <w:r>
         <w:t xml:space="preserve"> </w:t>
       </w:r>
-      <w:hyperlink r:id="rId57">
+      <w:hyperlink r:id="rId60">
         <w:r>
           <w:rPr>
             <w:rStyle w:val="Hyperlink"/>
@@ -6806,8 +8915,8 @@
         <w:t xml:space="preserve">.</w:t>
       </w:r>
     </w:p>
-    <w:bookmarkEnd w:id="58"/>
-    <w:bookmarkStart w:id="60" w:name="ref-cliff1993"/>
+    <w:bookmarkEnd w:id="61"/>
+    <w:bookmarkStart w:id="63" w:name="ref-cliff1993"/>
     <w:p>
       <w:pPr>
         <w:pStyle w:val="Bibliography"/>
@@ -6840,7 +8949,7 @@
       <w:r>
         <w:t xml:space="preserve"> </w:t>
       </w:r>
-      <w:hyperlink r:id="rId59">
+      <w:hyperlink r:id="rId62">
         <w:r>
           <w:rPr>
             <w:rStyle w:val="Hyperlink"/>
@@ -6852,8 +8961,8 @@
         <w:t xml:space="preserve">.</w:t>
       </w:r>
     </w:p>
-    <w:bookmarkEnd w:id="60"/>
-    <w:bookmarkStart w:id="62" w:name="ref-clifford2012"/>
+    <w:bookmarkEnd w:id="63"/>
+    <w:bookmarkStart w:id="65" w:name="ref-clifford2012"/>
     <w:p>
       <w:pPr>
         <w:pStyle w:val="Bibliography"/>
@@ -6886,7 +8995,7 @@
       <w:r>
         <w:t xml:space="preserve"> </w:t>
       </w:r>
-      <w:hyperlink r:id="rId61">
+      <w:hyperlink r:id="rId64">
         <w:r>
           <w:rPr>
             <w:rStyle w:val="Hyperlink"/>
@@ -6898,8 +9007,8 @@
         <w:t xml:space="preserve">.</w:t>
       </w:r>
     </w:p>
-    <w:bookmarkEnd w:id="62"/>
-    <w:bookmarkStart w:id="63" w:name="ref-cohen1988"/>
+    <w:bookmarkEnd w:id="65"/>
+    <w:bookmarkStart w:id="66" w:name="ref-cohen1988"/>
     <w:p>
       <w:pPr>
         <w:pStyle w:val="Bibliography"/>
@@ -6921,8 +9030,8 @@
         <w:t xml:space="preserve">. 2nd ed. Lawrence Erlbaum Associates.</w:t>
       </w:r>
     </w:p>
-    <w:bookmarkEnd w:id="63"/>
-    <w:bookmarkStart w:id="65" w:name="ref-collins2024tripodai"/>
+    <w:bookmarkEnd w:id="66"/>
+    <w:bookmarkStart w:id="68" w:name="ref-collins2024tripodai"/>
     <w:p>
       <w:pPr>
         <w:pStyle w:val="Bibliography"/>
@@ -6973,7 +9082,7 @@
       <w:r>
         <w:t xml:space="preserve"> </w:t>
       </w:r>
-      <w:hyperlink r:id="rId64">
+      <w:hyperlink r:id="rId67">
         <w:r>
           <w:rPr>
             <w:rStyle w:val="Hyperlink"/>
@@ -6985,8 +9094,8 @@
         <w:t xml:space="preserve">.</w:t>
       </w:r>
     </w:p>
-    <w:bookmarkEnd w:id="65"/>
-    <w:bookmarkStart w:id="66" w:name="ref-efron1993"/>
+    <w:bookmarkEnd w:id="68"/>
+    <w:bookmarkStart w:id="69" w:name="ref-efron1993"/>
     <w:p>
       <w:pPr>
         <w:pStyle w:val="Bibliography"/>
@@ -7008,8 +9117,8 @@
         <w:t xml:space="preserve">. Chapman &amp; Hall/CRC.</w:t>
       </w:r>
     </w:p>
-    <w:bookmarkEnd w:id="66"/>
-    <w:bookmarkStart w:id="68" w:name="ref-elgendi2016"/>
+    <w:bookmarkEnd w:id="69"/>
+    <w:bookmarkStart w:id="71" w:name="ref-elgendi2016"/>
     <w:p>
       <w:pPr>
         <w:pStyle w:val="Bibliography"/>
@@ -7042,7 +9151,7 @@
       <w:r>
         <w:t xml:space="preserve"> </w:t>
       </w:r>
-      <w:hyperlink r:id="rId67">
+      <w:hyperlink r:id="rId70">
         <w:r>
           <w:rPr>
             <w:rStyle w:val="Hyperlink"/>
@@ -7054,8 +9163,8 @@
         <w:t xml:space="preserve">.</w:t>
       </w:r>
     </w:p>
-    <w:bookmarkEnd w:id="68"/>
-    <w:bookmarkStart w:id="70" w:name="ref-foll2021"/>
+    <w:bookmarkEnd w:id="71"/>
+    <w:bookmarkStart w:id="73" w:name="ref-foll2021"/>
     <w:p>
       <w:pPr>
         <w:pStyle w:val="Bibliography"/>
@@ -7094,7 +9203,7 @@
       <w:r>
         <w:t xml:space="preserve"> </w:t>
       </w:r>
-      <w:hyperlink r:id="rId69">
+      <w:hyperlink r:id="rId72">
         <w:r>
           <w:rPr>
             <w:rStyle w:val="Hyperlink"/>
@@ -7106,8 +9215,8 @@
         <w:t xml:space="preserve">.</w:t>
       </w:r>
     </w:p>
-    <w:bookmarkEnd w:id="70"/>
-    <w:bookmarkStart w:id="72" w:name="ref-liu2020consortai"/>
+    <w:bookmarkEnd w:id="73"/>
+    <w:bookmarkStart w:id="75" w:name="ref-liu2020consortai"/>
     <w:p>
       <w:pPr>
         <w:pStyle w:val="Bibliography"/>
@@ -7152,7 +9261,7 @@
       <w:r>
         <w:t xml:space="preserve"> </w:t>
       </w:r>
-      <w:hyperlink r:id="rId71">
+      <w:hyperlink r:id="rId74">
         <w:r>
           <w:rPr>
             <w:rStyle w:val="Hyperlink"/>
@@ -7164,8 +9273,8 @@
         <w:t xml:space="preserve">.</w:t>
       </w:r>
     </w:p>
-    <w:bookmarkEnd w:id="72"/>
-    <w:bookmarkStart w:id="74" w:name="ref-malik1996"/>
+    <w:bookmarkEnd w:id="75"/>
+    <w:bookmarkStart w:id="77" w:name="ref-malik1996"/>
     <w:p>
       <w:pPr>
         <w:pStyle w:val="Bibliography"/>
@@ -7231,7 +9340,7 @@
       <w:r>
         <w:t xml:space="preserve"> </w:t>
       </w:r>
-      <w:hyperlink r:id="rId73">
+      <w:hyperlink r:id="rId76">
         <w:r>
           <w:rPr>
             <w:rStyle w:val="Hyperlink"/>
@@ -7243,8 +9352,8 @@
         <w:t xml:space="preserve">.</w:t>
       </w:r>
     </w:p>
-    <w:bookmarkEnd w:id="74"/>
-    <w:bookmarkStart w:id="76" w:name="ref-charlton2021ppgproc"/>
+    <w:bookmarkEnd w:id="77"/>
+    <w:bookmarkStart w:id="79" w:name="ref-charlton2021ppgproc"/>
     <w:p>
       <w:pPr>
         <w:pStyle w:val="Bibliography"/>
@@ -7280,7 +9389,7 @@
       <w:r>
         <w:t xml:space="preserve"> </w:t>
       </w:r>
-      <w:hyperlink r:id="rId75">
+      <w:hyperlink r:id="rId78">
         <w:r>
           <w:rPr>
             <w:rStyle w:val="Hyperlink"/>
@@ -7292,8 +9401,8 @@
         <w:t xml:space="preserve">.</w:t>
       </w:r>
     </w:p>
-    <w:bookmarkEnd w:id="76"/>
-    <w:bookmarkStart w:id="78" w:name="ref-mertes2022"/>
+    <w:bookmarkEnd w:id="79"/>
+    <w:bookmarkStart w:id="81" w:name="ref-mertes2022"/>
     <w:p>
       <w:pPr>
         <w:pStyle w:val="Bibliography"/>
@@ -7338,7 +9447,7 @@
       <w:r>
         <w:t xml:space="preserve"> </w:t>
       </w:r>
-      <w:hyperlink r:id="rId77">
+      <w:hyperlink r:id="rId80">
         <w:r>
           <w:rPr>
             <w:rStyle w:val="Hyperlink"/>
@@ -7350,8 +9459,8 @@
         <w:t xml:space="preserve">.</w:t>
       </w:r>
     </w:p>
-    <w:bookmarkEnd w:id="78"/>
-    <w:bookmarkStart w:id="80" w:name="ref-orphanidou2015"/>
+    <w:bookmarkEnd w:id="81"/>
+    <w:bookmarkStart w:id="83" w:name="ref-orphanidou2015"/>
     <w:p>
       <w:pPr>
         <w:pStyle w:val="Bibliography"/>
@@ -7384,7 +9493,7 @@
       <w:r>
         <w:t xml:space="preserve"> </w:t>
       </w:r>
-      <w:hyperlink r:id="rId79">
+      <w:hyperlink r:id="rId82">
         <w:r>
           <w:rPr>
             <w:rStyle w:val="Hyperlink"/>
@@ -7396,8 +9505,8 @@
         <w:t xml:space="preserve">.</w:t>
       </w:r>
     </w:p>
-    <w:bookmarkEnd w:id="80"/>
-    <w:bookmarkStart w:id="82" w:name="ref-perraudin2021"/>
+    <w:bookmarkEnd w:id="83"/>
+    <w:bookmarkStart w:id="85" w:name="ref-perraudin2021"/>
     <w:p>
       <w:pPr>
         <w:pStyle w:val="Bibliography"/>
@@ -7430,7 +9539,7 @@
       <w:r>
         <w:t xml:space="preserve"> </w:t>
       </w:r>
-      <w:hyperlink r:id="rId81">
+      <w:hyperlink r:id="rId84">
         <w:r>
           <w:rPr>
             <w:rStyle w:val="Hyperlink"/>
@@ -7442,8 +9551,8 @@
         <w:t xml:space="preserve">.</w:t>
       </w:r>
     </w:p>
-    <w:bookmarkEnd w:id="82"/>
-    <w:bookmarkStart w:id="84" w:name="ref-reiss2019"/>
+    <w:bookmarkEnd w:id="85"/>
+    <w:bookmarkStart w:id="87" w:name="ref-reiss2019"/>
     <w:p>
       <w:pPr>
         <w:pStyle w:val="Bibliography"/>
@@ -7482,7 +9591,7 @@
       <w:r>
         <w:t xml:space="preserve"> </w:t>
       </w:r>
-      <w:hyperlink r:id="rId83">
+      <w:hyperlink r:id="rId86">
         <w:r>
           <w:rPr>
             <w:rStyle w:val="Hyperlink"/>
@@ -7494,8 +9603,8 @@
         <w:t xml:space="preserve">.</w:t>
       </w:r>
     </w:p>
-    <w:bookmarkEnd w:id="84"/>
-    <w:bookmarkStart w:id="86" w:name="ref-robins1994"/>
+    <w:bookmarkEnd w:id="87"/>
+    <w:bookmarkStart w:id="89" w:name="ref-robins1994"/>
     <w:p>
       <w:pPr>
         <w:pStyle w:val="Bibliography"/>
@@ -7528,7 +9637,7 @@
       <w:r>
         <w:t xml:space="preserve"> </w:t>
       </w:r>
-      <w:hyperlink r:id="rId85">
+      <w:hyperlink r:id="rId88">
         <w:r>
           <w:rPr>
             <w:rStyle w:val="Hyperlink"/>
@@ -7540,8 +9649,8 @@
         <w:t xml:space="preserve">.</w:t>
       </w:r>
     </w:p>
-    <w:bookmarkEnd w:id="86"/>
-    <w:bookmarkStart w:id="88" w:name="ref-schafer2013"/>
+    <w:bookmarkEnd w:id="89"/>
+    <w:bookmarkStart w:id="91" w:name="ref-schafer2013"/>
     <w:p>
       <w:pPr>
         <w:pStyle w:val="Bibliography"/>
@@ -7574,7 +9683,7 @@
       <w:r>
         <w:t xml:space="preserve"> </w:t>
       </w:r>
-      <w:hyperlink r:id="rId87">
+      <w:hyperlink r:id="rId90">
         <w:r>
           <w:rPr>
             <w:rStyle w:val="Hyperlink"/>
@@ -7586,8 +9695,8 @@
         <w:t xml:space="preserve">.</w:t>
       </w:r>
     </w:p>
-    <w:bookmarkEnd w:id="88"/>
-    <w:bookmarkStart w:id="90" w:name="ref-schmidt2018"/>
+    <w:bookmarkEnd w:id="91"/>
+    <w:bookmarkStart w:id="93" w:name="ref-schmidt2018"/>
     <w:p>
       <w:pPr>
         <w:pStyle w:val="Bibliography"/>
@@ -7626,7 +9735,7 @@
       <w:r>
         <w:t xml:space="preserve"> </w:t>
       </w:r>
-      <w:hyperlink r:id="rId89">
+      <w:hyperlink r:id="rId92">
         <w:r>
           <w:rPr>
             <w:rStyle w:val="Hyperlink"/>
@@ -7638,8 +9747,8 @@
         <w:t xml:space="preserve">.</w:t>
       </w:r>
     </w:p>
-    <w:bookmarkEnd w:id="90"/>
-    <w:bookmarkStart w:id="92" w:name="ref-shcherbina2017"/>
+    <w:bookmarkEnd w:id="93"/>
+    <w:bookmarkStart w:id="95" w:name="ref-shcherbina2017"/>
     <w:p>
       <w:pPr>
         <w:pStyle w:val="Bibliography"/>
@@ -7672,7 +9781,7 @@
       <w:r>
         <w:t xml:space="preserve"> </w:t>
       </w:r>
-      <w:hyperlink r:id="rId91">
+      <w:hyperlink r:id="rId94">
         <w:r>
           <w:rPr>
             <w:rStyle w:val="Hyperlink"/>
@@ -7684,8 +9793,8 @@
         <w:t xml:space="preserve">.</w:t>
       </w:r>
     </w:p>
-    <w:bookmarkEnd w:id="92"/>
-    <w:bookmarkStart w:id="94" w:name="ref-shrout1979"/>
+    <w:bookmarkEnd w:id="95"/>
+    <w:bookmarkStart w:id="97" w:name="ref-shrout1979"/>
     <w:p>
       <w:pPr>
         <w:pStyle w:val="Bibliography"/>
@@ -7718,7 +9827,7 @@
       <w:r>
         <w:t xml:space="preserve"> </w:t>
       </w:r>
-      <w:hyperlink r:id="rId93">
+      <w:hyperlink r:id="rId96">
         <w:r>
           <w:rPr>
             <w:rStyle w:val="Hyperlink"/>
@@ -7730,8 +9839,8 @@
         <w:t xml:space="preserve">.</w:t>
       </w:r>
     </w:p>
-    <w:bookmarkEnd w:id="94"/>
-    <w:bookmarkStart w:id="96" w:name="ref-sukor2011"/>
+    <w:bookmarkEnd w:id="97"/>
+    <w:bookmarkStart w:id="99" w:name="ref-sukor2011"/>
     <w:p>
       <w:pPr>
         <w:pStyle w:val="Bibliography"/>
@@ -7764,7 +9873,7 @@
       <w:r>
         <w:t xml:space="preserve"> </w:t>
       </w:r>
-      <w:hyperlink r:id="rId95">
+      <w:hyperlink r:id="rId98">
         <w:r>
           <w:rPr>
             <w:rStyle w:val="Hyperlink"/>
@@ -7776,8 +9885,8 @@
         <w:t xml:space="preserve">.</w:t>
       </w:r>
     </w:p>
-    <w:bookmarkEnd w:id="96"/>
-    <w:bookmarkStart w:id="98" w:name="ref-vasey2022decideai"/>
+    <w:bookmarkEnd w:id="99"/>
+    <w:bookmarkStart w:id="101" w:name="ref-vasey2022decideai"/>
     <w:p>
       <w:pPr>
         <w:pStyle w:val="Bibliography"/>
@@ -7822,7 +9931,7 @@
       <w:r>
         <w:t xml:space="preserve"> </w:t>
       </w:r>
-      <w:hyperlink r:id="rId97">
+      <w:hyperlink r:id="rId100">
         <w:r>
           <w:rPr>
             <w:rStyle w:val="Hyperlink"/>
@@ -7834,8 +9943,8 @@
         <w:t xml:space="preserve">.</w:t>
       </w:r>
     </w:p>
-    <w:bookmarkEnd w:id="98"/>
-    <w:bookmarkStart w:id="100" w:name="ref-wilcoxon1945"/>
+    <w:bookmarkEnd w:id="101"/>
+    <w:bookmarkStart w:id="103" w:name="ref-wilcoxon1945"/>
     <w:p>
       <w:pPr>
         <w:pStyle w:val="Bibliography"/>
@@ -7868,7 +9977,7 @@
       <w:r>
         <w:t xml:space="preserve"> </w:t>
       </w:r>
-      <w:hyperlink r:id="rId99">
+      <w:hyperlink r:id="rId102">
         <w:r>
           <w:rPr>
             <w:rStyle w:val="Hyperlink"/>
@@ -7880,10 +9989,10 @@
         <w:t xml:space="preserve">.</w:t>
       </w:r>
     </w:p>
-    <w:bookmarkEnd w:id="100"/>
-    <w:bookmarkEnd w:id="101"/>
-    <w:bookmarkEnd w:id="102"/>
     <w:bookmarkEnd w:id="103"/>
+    <w:bookmarkEnd w:id="104"/>
+    <w:bookmarkEnd w:id="105"/>
+    <w:bookmarkEnd w:id="106"/>
     <w:sectPr>
       <w:footnotePr>
         <w:numRestart w:val="eachSect"/>

</xml_diff>

<commit_message>
Embed Figures 2-7 as markdown images in the docx: Figure 2 Bland-Altman cross-modality HR (Section 3.1, paper/figures/fig1_bland_altman.png), Figure 3 pairwise Cohen kappa heatmap (Section 3.2, paper/figures/fig3_kappa_heatmap.png), Figure 4 recalibration agreement vs threshold (Section 3.3, paper/figures/fig6_recalibration.png), Figure 5 four-panel downstream demo (Section 3.6, results/downstream_demo/figure_downstream.png), Figure 6 DBTS distribution and week-pair reliability (Section 4.1, paper/figures/fig2_synthetic_headline.png), Figure 7 cross-cohort five-regime parameter sweep (Section 4.7, paper/figures/fig3_cross_cohort.png); replace existing text-only Figure 5 reference with proper markdown embed
</commit_message>
<xml_diff>
--- a/paper/manuscript.docx
+++ b/paper/manuscript.docx
@@ -2,7 +2,7 @@
 <file path=word/document.xml><?xml version="1.0" encoding="utf-8"?>
 <w:document xmlns:w="http://schemas.openxmlformats.org/wordprocessingml/2006/main" xmlns:m="http://schemas.openxmlformats.org/officeDocument/2006/math" xmlns:r="http://schemas.openxmlformats.org/officeDocument/2006/relationships" xmlns:o="urn:schemas-microsoft-com:office:office" xmlns:v="urn:schemas-microsoft-com:vml" xmlns:w10="urn:schemas-microsoft-com:office:word" xmlns:a="http://schemas.openxmlformats.org/drawingml/2006/main" xmlns:pic="http://schemas.openxmlformats.org/drawingml/2006/picture" xmlns:wp="http://schemas.openxmlformats.org/drawingml/2006/wordprocessingDrawing">
   <w:body>
-    <w:bookmarkStart w:id="106" w:name="X492e6e436080a4bb955983327137bd378b3e7de"/>
+    <w:bookmarkStart w:id="124" w:name="X492e6e436080a4bb955983327137bd378b3e7de"/>
     <w:p>
       <w:pPr>
         <w:pStyle w:val="Heading1"/>
@@ -1740,7 +1740,7 @@
     </w:p>
     <w:bookmarkEnd w:id="24"/>
     <w:bookmarkEnd w:id="25"/>
-    <w:bookmarkStart w:id="34" w:name="cross-method-audit-on-wesad"/>
+    <w:bookmarkStart w:id="46" w:name="cross-method-audit-on-wesad"/>
     <w:p>
       <w:pPr>
         <w:pStyle w:val="Heading2"/>
@@ -2000,7 +2000,7 @@
       </w:r>
     </w:p>
     <w:bookmarkEnd w:id="26"/>
-    <w:bookmarkStart w:id="27" w:name="X83e78e9dd801c6e70ab9eb8d0c52cab58f1f44b"/>
+    <w:bookmarkStart w:id="30" w:name="X83e78e9dd801c6e70ab9eb8d0c52cab58f1f44b"/>
     <w:p>
       <w:pPr>
         <w:pStyle w:val="Heading3"/>
@@ -2432,8 +2432,63 @@
         <w:t xml:space="preserve">, a four-fold spread.</w:t>
       </w:r>
     </w:p>
-    <w:bookmarkEnd w:id="27"/>
-    <w:bookmarkStart w:id="28" w:name="Xe41713c60b8037e7c6e4ae4c7f679570120e6a4"/>
+    <w:p>
+      <w:pPr>
+        <w:pStyle w:val="CaptionedFigure"/>
+      </w:pPr>
+      <w:r>
+        <w:drawing>
+          <wp:inline>
+            <wp:extent cx="5334000" cy="3622178"/>
+            <wp:effectExtent b="0" l="0" r="0" t="0"/>
+            <wp:docPr descr="Figure 2. Bland-Altman cross-modality HR agreement on WESAD (n = 15 subjects, 6,569 paired 5-second windows). Each point is one window. Mean bias (PPG minus ECG) = +3.57 bpm; 95% limits of agreement [-23.14, +30.28] bpm. Pearson r = +0.70 between modalities." title="" id="28" name="Picture"/>
+            <a:graphic>
+              <a:graphicData uri="http://schemas.openxmlformats.org/drawingml/2006/picture">
+                <pic:pic>
+                  <pic:nvPicPr>
+                    <pic:cNvPr descr="paper/figures/fig1_bland_altman.png" id="29" name="Picture"/>
+                    <pic:cNvPicPr>
+                      <a:picLocks noChangeArrowheads="1" noChangeAspect="1"/>
+                    </pic:cNvPicPr>
+                  </pic:nvPicPr>
+                  <pic:blipFill>
+                    <a:blip r:embed="rId27"/>
+                    <a:stretch>
+                      <a:fillRect/>
+                    </a:stretch>
+                  </pic:blipFill>
+                  <pic:spPr bwMode="auto">
+                    <a:xfrm>
+                      <a:off x="0" y="0"/>
+                      <a:ext cx="5334000" cy="3622178"/>
+                    </a:xfrm>
+                    <a:prstGeom prst="rect">
+                      <a:avLst/>
+                    </a:prstGeom>
+                    <a:noFill/>
+                    <a:ln w="9525">
+                      <a:noFill/>
+                      <a:headEnd/>
+                      <a:tailEnd/>
+                    </a:ln>
+                  </pic:spPr>
+                </pic:pic>
+              </a:graphicData>
+            </a:graphic>
+          </wp:inline>
+        </w:drawing>
+      </w:r>
+    </w:p>
+    <w:p>
+      <w:pPr>
+        <w:pStyle w:val="ImageCaption"/>
+      </w:pPr>
+      <w:r>
+        <w:t xml:space="preserve">Figure 2. Bland-Altman cross-modality HR agreement on WESAD (n = 15 subjects, 6,569 paired 5-second windows). Each point is one window. Mean bias (PPG minus ECG) = +3.57 bpm; 95% limits of agreement [-23.14, +30.28] bpm. Pearson r = +0.70 between modalities.</w:t>
+      </w:r>
+    </w:p>
+    <w:bookmarkEnd w:id="30"/>
+    <w:bookmarkStart w:id="34" w:name="Xe41713c60b8037e7c6e4ae4c7f679570120e6a4"/>
     <w:p>
       <w:pPr>
         <w:pStyle w:val="Heading3"/>
@@ -3298,7 +3353,62 @@
         <w:pStyle w:val="BodyText"/>
       </w:pPr>
       <w:r>
-        <w:t xml:space="preserve">Across 6,585 real wrist PPG windows from 15 subjects, the in-house default threshold produces a degenerate binary distribution (every window passes), and Cohen’s κ between the in-house decision and each published baseline is identically zero (Table 2). This zero is a base-rate artifact of the 100.0% in-house pass rate: Cohen’s κ is mathematically zero whenever one of the two classifiers being compared has constant output, regardless of the other classifier’s behavior. We report κ versus the in-house decision in Table 2 for completeness; the substantive comparison between the in-house and the published methods is the joint-condition rate in Table 4 (in-house passes AND all three published methods fail: 44.6% of windows), which is unaffected by the κ degeneracy. The same base-rate caveat applies on PPG-DaLiA (Section 3.7), where the in-house threshold also passes 100.0% of windows. Pairwise κ across the three published methods themselves (Table 3) is non-degenerate because their pass rates span 21.5% to 25.6% and so neither side of any pair is constant. Figure 3 panel A shows the four pass rates side by side; panel B shows the four-way agreement matrix.</w:t>
+        <w:t xml:space="preserve">Across 6,585 real wrist PPG windows from 15 subjects, the in-house default threshold produces a degenerate binary distribution (every window passes), and Cohen’s κ between the in-house decision and each published baseline is identically zero (Table 2). This zero is a base-rate artifact of the 100.0% in-house pass rate: Cohen’s κ is mathematically zero whenever one of the two classifiers being compared has constant output, regardless of the other classifier’s behavior. We report κ versus the in-house decision in Table 2 for completeness; the substantive comparison between the in-house and the published methods is the joint-condition rate in Table 4 (in-house passes AND all three published methods fail: 44.6% of windows), which is unaffected by the κ degeneracy. The same base-rate caveat applies on PPG-DaLiA (Section 3.7), where the in-house threshold also passes 100.0% of windows. Pairwise κ across the three published methods themselves (Table 3) is non-degenerate because their pass rates span 21.5% to 25.6% and so neither side of any pair is constant.</w:t>
+      </w:r>
+    </w:p>
+    <w:p>
+      <w:pPr>
+        <w:pStyle w:val="CaptionedFigure"/>
+      </w:pPr>
+      <w:r>
+        <w:drawing>
+          <wp:inline>
+            <wp:extent cx="5334000" cy="4677605"/>
+            <wp:effectExtent b="0" l="0" r="0" t="0"/>
+            <wp:docPr descr="Figure 3. Cross-method PPG signal-quality agreement on WESAD (n = 6,585 windows). The in-house threshold passes 100% of windows; the three published methods individually pass 21.5 to 25.6%. Pairwise Cohen’s kappa across the three published methods spans -0.23 to +0.41 (median -0.20)." title="" id="32" name="Picture"/>
+            <a:graphic>
+              <a:graphicData uri="http://schemas.openxmlformats.org/drawingml/2006/picture">
+                <pic:pic>
+                  <pic:nvPicPr>
+                    <pic:cNvPr descr="paper/figures/fig3_kappa_heatmap.png" id="33" name="Picture"/>
+                    <pic:cNvPicPr>
+                      <a:picLocks noChangeArrowheads="1" noChangeAspect="1"/>
+                    </pic:cNvPicPr>
+                  </pic:nvPicPr>
+                  <pic:blipFill>
+                    <a:blip r:embed="rId31"/>
+                    <a:stretch>
+                      <a:fillRect/>
+                    </a:stretch>
+                  </pic:blipFill>
+                  <pic:spPr bwMode="auto">
+                    <a:xfrm>
+                      <a:off x="0" y="0"/>
+                      <a:ext cx="5334000" cy="4677605"/>
+                    </a:xfrm>
+                    <a:prstGeom prst="rect">
+                      <a:avLst/>
+                    </a:prstGeom>
+                    <a:noFill/>
+                    <a:ln w="9525">
+                      <a:noFill/>
+                      <a:headEnd/>
+                      <a:tailEnd/>
+                    </a:ln>
+                  </pic:spPr>
+                </pic:pic>
+              </a:graphicData>
+            </a:graphic>
+          </wp:inline>
+        </w:drawing>
+      </w:r>
+    </w:p>
+    <w:p>
+      <w:pPr>
+        <w:pStyle w:val="ImageCaption"/>
+      </w:pPr>
+      <w:r>
+        <w:t xml:space="preserve">Figure 3. Cross-method PPG signal-quality agreement on WESAD (n = 6,585 windows). The in-house threshold passes 100% of windows; the three published methods individually pass 21.5 to 25.6%. Pairwise Cohen’s kappa across the three published methods spans -0.23 to +0.41 (median -0.20).</w:t>
       </w:r>
     </w:p>
     <w:p>
@@ -3331,8 +3441,8 @@
         <w:t xml:space="preserve">Because the in-house threshold passes 100.0% of windows at 0.7, this joint condition is numerically identical to the published-only consensus rejection rate (the fraction of windows on which all three published methods agree to reject, independent of any in-house decision; 44.571% on WESAD and 43.129% on PPG-DaLiA). Varying the in-house threshold from 0.50 to 0.95 changes the in-house pass rate by at most three percentage points on either dataset (100.0% to 97.1% on WESAD; 100.0% to 97.2% on PPG-DaLiA) and the headline joint metric by at most 1 percentage point. Median pairwise Cohen’s κ across the three published methods is unaffected by any in-house threshold change (κ = -0.198 on WESAD, κ = -0.204 on PPG-DaLiA, exact to three decimals across the full 0.50-0.95 range; Supplementary Table S5). The substantive finding, that three published methods reject the same ~44% of windows in common, is a property of how the published methods behave on real wrist PPG and does not depend on any in-house thresholding choice.</w:t>
       </w:r>
     </w:p>
-    <w:bookmarkEnd w:id="28"/>
-    <w:bookmarkStart w:id="29" w:name="X2fc2dbd0311da96a84a9c9b5c17d60ac22e8aea"/>
+    <w:bookmarkEnd w:id="34"/>
+    <w:bookmarkStart w:id="38" w:name="X2fc2dbd0311da96a84a9c9b5c17d60ac22e8aea"/>
     <w:p>
       <w:pPr>
         <w:pStyle w:val="Heading3"/>
@@ -3655,6 +3765,61 @@
     </w:p>
     <w:p>
       <w:pPr>
+        <w:pStyle w:val="CaptionedFigure"/>
+      </w:pPr>
+      <w:r>
+        <w:drawing>
+          <wp:inline>
+            <wp:extent cx="5334000" cy="3873128"/>
+            <wp:effectExtent b="0" l="0" r="0" t="0"/>
+            <wp:docPr descr="Figure 4. Single-threshold recalibration of the in-house PPG SQI against the Orphanidou pass/fail label on the WESAD held-out split (3,293 windows). The recalibrated threshold leaves held-out Cohen’s kappa at approximately zero; AUROC for in-house SQI predicting Orphanidou pass/fail is 0.484 (chance level)." title="" id="36" name="Picture"/>
+            <a:graphic>
+              <a:graphicData uri="http://schemas.openxmlformats.org/drawingml/2006/picture">
+                <pic:pic>
+                  <pic:nvPicPr>
+                    <pic:cNvPr descr="paper/figures/fig6_recalibration.png" id="37" name="Picture"/>
+                    <pic:cNvPicPr>
+                      <a:picLocks noChangeArrowheads="1" noChangeAspect="1"/>
+                    </pic:cNvPicPr>
+                  </pic:nvPicPr>
+                  <pic:blipFill>
+                    <a:blip r:embed="rId35"/>
+                    <a:stretch>
+                      <a:fillRect/>
+                    </a:stretch>
+                  </pic:blipFill>
+                  <pic:spPr bwMode="auto">
+                    <a:xfrm>
+                      <a:off x="0" y="0"/>
+                      <a:ext cx="5334000" cy="3873128"/>
+                    </a:xfrm>
+                    <a:prstGeom prst="rect">
+                      <a:avLst/>
+                    </a:prstGeom>
+                    <a:noFill/>
+                    <a:ln w="9525">
+                      <a:noFill/>
+                      <a:headEnd/>
+                      <a:tailEnd/>
+                    </a:ln>
+                  </pic:spPr>
+                </pic:pic>
+              </a:graphicData>
+            </a:graphic>
+          </wp:inline>
+        </w:drawing>
+      </w:r>
+    </w:p>
+    <w:p>
+      <w:pPr>
+        <w:pStyle w:val="ImageCaption"/>
+      </w:pPr>
+      <w:r>
+        <w:t xml:space="preserve">Figure 4. Single-threshold recalibration of the in-house PPG SQI against the Orphanidou pass/fail label on the WESAD held-out split (3,293 windows). The recalibrated threshold leaves held-out Cohen’s kappa at approximately zero; AUROC for in-house SQI predicting Orphanidou pass/fail is 0.484 (chance level).</w:t>
+      </w:r>
+    </w:p>
+    <w:p>
+      <w:pPr>
         <w:pStyle w:val="BodyText"/>
       </w:pPr>
       <w:r>
@@ -3683,8 +3848,8 @@
         <w:t xml:space="preserve">.</w:t>
       </w:r>
     </w:p>
-    <w:bookmarkEnd w:id="29"/>
-    <w:bookmarkStart w:id="30" w:name="Xc1c907b5f230a08ea8ad98d7b4f4cc207b2ef97"/>
+    <w:bookmarkEnd w:id="38"/>
+    <w:bookmarkStart w:id="39" w:name="Xc1c907b5f230a08ea8ad98d7b4f4cc207b2ef97"/>
     <w:p>
       <w:pPr>
         <w:pStyle w:val="Heading3"/>
@@ -3964,8 +4129,8 @@
         <w:t xml:space="preserve">The correlation between motion and cross-modality HR disagreement is positive but weak (Spearman ρ = +0.088). Mean absolute HR difference at high motion is 24% higher than at low motion (11.28 vs 9.12 bpm). Both values are smaller than the pilot estimates from the n = 2 analysis (ρ = +0.30, gap = 6.8 bpm). At n = 15 the motion detector tracks the direction of the effect, but the magnitude is modest.</w:t>
       </w:r>
     </w:p>
-    <w:bookmarkEnd w:id="30"/>
-    <w:bookmarkStart w:id="31" w:name="within-subject-state-contrast-tests"/>
+    <w:bookmarkEnd w:id="39"/>
+    <w:bookmarkStart w:id="40" w:name="within-subject-state-contrast-tests"/>
     <w:p>
       <w:pPr>
         <w:pStyle w:val="Heading3"/>
@@ -4022,8 +4187,8 @@
         <w:t xml:space="preserve">Baseline vs amusement: the funny-video paradigm produces upper-body laughter motion that degrades wrist PPG in most subjects. The largest single effect is S9 PPG SQI (Cliff’s δ = +0.80, Cohen’s d = +1.89, p =&lt; 0.001). S14 also shows a large ECG SQI drop (δ = +0.70, d = +1.59), consistent with the chest device responding to laughter motion in addition to wrist PPG.</w:t>
       </w:r>
     </w:p>
-    <w:bookmarkEnd w:id="31"/>
-    <w:bookmarkStart w:id="32" w:name="X2d23046eae321cbf50e98c2401de19df63beae1"/>
+    <w:bookmarkEnd w:id="40"/>
+    <w:bookmarkStart w:id="44" w:name="X2d23046eae321cbf50e98c2401de19df63beae1"/>
     <w:p>
       <w:pPr>
         <w:pStyle w:val="Heading3"/>
@@ -5708,47 +5873,61 @@
     </w:p>
     <w:p>
       <w:pPr>
-        <w:pStyle w:val="BodyText"/>
-      </w:pPr>
-      <w:r>
-        <w:t xml:space="preserve">Figure 5 (</w:t>
-      </w:r>
-      <w:r>
-        <w:rPr>
-          <w:rStyle w:val="VerbatimChar"/>
-        </w:rPr>
-        <w:t xml:space="preserve">results/downstream_demo/figure_downstream.png</w:t>
-      </w:r>
-      <w:r>
-        <w:t xml:space="preserve">):</w:t>
-      </w:r>
-      <w:r>
-        <w:t xml:space="preserve"> </w:t>
-      </w:r>
-      <w:r>
-        <w:t xml:space="preserve">- Panel A: LOSO AUROC distributions by audit condition.</w:t>
-      </w:r>
-      <w:r>
-        <w:t xml:space="preserve"> </w:t>
-      </w:r>
-      <w:r>
-        <w:t xml:space="preserve">- Panel B: per-subject paired Δ AUROC vs no-audit, by audit variant.</w:t>
-      </w:r>
-      <w:r>
-        <w:t xml:space="preserve"> </w:t>
-      </w:r>
-      <w:r>
-        <w:t xml:space="preserve">- Panel C: per-subject biomarker ρ under each condition.</w:t>
-      </w:r>
-      <w:r>
-        <w:t xml:space="preserve"> </w:t>
-      </w:r>
-      <w:r>
-        <w:t xml:space="preserve">- Panel D: per-subject retention vs Δρ trade-off (Orphanidou condition).</w:t>
-      </w:r>
-    </w:p>
-    <w:bookmarkEnd w:id="32"/>
-    <w:bookmarkStart w:id="33" w:name="external-validation-on-ppg-dalia"/>
+        <w:pStyle w:val="CaptionedFigure"/>
+      </w:pPr>
+      <w:r>
+        <w:drawing>
+          <wp:inline>
+            <wp:extent cx="5334000" cy="3673268"/>
+            <wp:effectExtent b="0" l="0" r="0" t="0"/>
+            <wp:docPr descr="Figure 5. Audit-based filtering improves per-subject biomarker estimation on WESAD. Panel A: LOSO baseline-vs-stress AUROC distributions by audit condition. Panel B: per-subject paired Delta-AUROC vs no-audit, by audit variant. Panel C: per-subject wrist-PPG-to-chest-ECG HR Spearman correlation under each condition. Panel D: per-subject retention vs Delta-rho trade-off under the Orphanidou filter (13 of 15 subjects improve, paired Wilcoxon p = 1.5e-04)." title="" id="42" name="Picture"/>
+            <a:graphic>
+              <a:graphicData uri="http://schemas.openxmlformats.org/drawingml/2006/picture">
+                <pic:pic>
+                  <pic:nvPicPr>
+                    <pic:cNvPr descr="results/downstream_demo/figure_downstream.png" id="43" name="Picture"/>
+                    <pic:cNvPicPr>
+                      <a:picLocks noChangeArrowheads="1" noChangeAspect="1"/>
+                    </pic:cNvPicPr>
+                  </pic:nvPicPr>
+                  <pic:blipFill>
+                    <a:blip r:embed="rId41"/>
+                    <a:stretch>
+                      <a:fillRect/>
+                    </a:stretch>
+                  </pic:blipFill>
+                  <pic:spPr bwMode="auto">
+                    <a:xfrm>
+                      <a:off x="0" y="0"/>
+                      <a:ext cx="5334000" cy="3673268"/>
+                    </a:xfrm>
+                    <a:prstGeom prst="rect">
+                      <a:avLst/>
+                    </a:prstGeom>
+                    <a:noFill/>
+                    <a:ln w="9525">
+                      <a:noFill/>
+                      <a:headEnd/>
+                      <a:tailEnd/>
+                    </a:ln>
+                  </pic:spPr>
+                </pic:pic>
+              </a:graphicData>
+            </a:graphic>
+          </wp:inline>
+        </w:drawing>
+      </w:r>
+    </w:p>
+    <w:p>
+      <w:pPr>
+        <w:pStyle w:val="ImageCaption"/>
+      </w:pPr>
+      <w:r>
+        <w:t xml:space="preserve">Figure 5. Audit-based filtering improves per-subject biomarker estimation on WESAD. Panel A: LOSO baseline-vs-stress AUROC distributions by audit condition. Panel B: per-subject paired Delta-AUROC vs no-audit, by audit variant. Panel C: per-subject wrist-PPG-to-chest-ECG HR Spearman correlation under each condition. Panel D: per-subject retention vs Delta-rho trade-off under the Orphanidou filter (13 of 15 subjects improve, paired Wilcoxon p = 1.5e-04).</w:t>
+      </w:r>
+    </w:p>
+    <w:bookmarkEnd w:id="44"/>
+    <w:bookmarkStart w:id="45" w:name="external-validation-on-ppg-dalia"/>
     <w:p>
       <w:pPr>
         <w:pStyle w:val="Heading3"/>
@@ -6405,9 +6584,9 @@
         <w:t xml:space="preserve">The PPG-DaLiA per-subject absolute HR difference (wrist PPG vs chest ECG) range was less extreme than on WESAD (2.4x fold range vs 4.0x), but the absolute minimum was virtually identical (6.66 vs 6.75 bpm). The lower fold range is consistent with PPG-DaLiA’s wider activity mix smoothing the upper tail rather than with reduced per-subject heterogeneity. The replication confirms that the cross-method SQI disagreement finding is a property of wrist PPG itself rather than of the WESAD stress paradigm or of any single recording session.</w:t>
       </w:r>
     </w:p>
-    <w:bookmarkEnd w:id="33"/>
-    <w:bookmarkEnd w:id="34"/>
-    <w:bookmarkStart w:id="42" w:name="Xf8d28994ab18c569b43451e1d59264a3df91dd7"/>
+    <w:bookmarkEnd w:id="45"/>
+    <w:bookmarkEnd w:id="46"/>
+    <w:bookmarkStart w:id="60" w:name="Xf8d28994ab18c569b43451e1d59264a3df91dd7"/>
     <w:p>
       <w:pPr>
         <w:pStyle w:val="Heading2"/>
@@ -6416,7 +6595,7 @@
         <w:t xml:space="preserve">4. Methodological validation on synthetic data</w:t>
       </w:r>
     </w:p>
-    <w:bookmarkStart w:id="35" w:name="Xa121e1727e5e5d44b54593882ea99d9ddb54092"/>
+    <w:bookmarkStart w:id="50" w:name="Xa121e1727e5e5d44b54593882ea99d9ddb54092"/>
     <w:p>
       <w:pPr>
         <w:pStyle w:val="Heading3"/>
@@ -6449,8 +6628,63 @@
         <w:t xml:space="preserve">(moderate category). Category distribution: 31 high (≥ 80), 266 moderate (≥ 60), 3 low (≥ 40), 0 unreliable. The distribution is in Figure 6A.</w:t>
       </w:r>
     </w:p>
-    <w:bookmarkEnd w:id="35"/>
-    <w:bookmarkStart w:id="36" w:name="X7eefbf0decf15c54e4d1e7780b435273777fbce"/>
+    <w:p>
+      <w:pPr>
+        <w:pStyle w:val="CaptionedFigure"/>
+      </w:pPr>
+      <w:r>
+        <w:drawing>
+          <wp:inline>
+            <wp:extent cx="5334000" cy="3977375"/>
+            <wp:effectExtent b="0" l="0" r="0" t="0"/>
+            <wp:docPr descr="Figure 6. Cohort-level Digital Biomarker Trust Score on the synthetic cohort (n = 300 participants, 60 days each). Mean overall DBTS = 74.11 (moderate category); 31 participants in the high category, 266 moderate, 3 low." title="" id="48" name="Picture"/>
+            <a:graphic>
+              <a:graphicData uri="http://schemas.openxmlformats.org/drawingml/2006/picture">
+                <pic:pic>
+                  <pic:nvPicPr>
+                    <pic:cNvPr descr="paper/figures/fig2_synthetic_headline.png" id="49" name="Picture"/>
+                    <pic:cNvPicPr>
+                      <a:picLocks noChangeArrowheads="1" noChangeAspect="1"/>
+                    </pic:cNvPicPr>
+                  </pic:nvPicPr>
+                  <pic:blipFill>
+                    <a:blip r:embed="rId47"/>
+                    <a:stretch>
+                      <a:fillRect/>
+                    </a:stretch>
+                  </pic:blipFill>
+                  <pic:spPr bwMode="auto">
+                    <a:xfrm>
+                      <a:off x="0" y="0"/>
+                      <a:ext cx="5334000" cy="3977375"/>
+                    </a:xfrm>
+                    <a:prstGeom prst="rect">
+                      <a:avLst/>
+                    </a:prstGeom>
+                    <a:noFill/>
+                    <a:ln w="9525">
+                      <a:noFill/>
+                      <a:headEnd/>
+                      <a:tailEnd/>
+                    </a:ln>
+                  </pic:spPr>
+                </pic:pic>
+              </a:graphicData>
+            </a:graphic>
+          </wp:inline>
+        </w:drawing>
+      </w:r>
+    </w:p>
+    <w:p>
+      <w:pPr>
+        <w:pStyle w:val="ImageCaption"/>
+      </w:pPr>
+      <w:r>
+        <w:t xml:space="preserve">Figure 6. Cohort-level Digital Biomarker Trust Score on the synthetic cohort (n = 300 participants, 60 days each). Mean overall DBTS = 74.11 (moderate category); 31 participants in the high category, 266 moderate, 3 low.</w:t>
+      </w:r>
+    </w:p>
+    <w:bookmarkEnd w:id="50"/>
+    <w:bookmarkStart w:id="51" w:name="X7eefbf0decf15c54e4d1e7780b435273777fbce"/>
     <w:p>
       <w:pPr>
         <w:pStyle w:val="Heading3"/>
@@ -6998,8 +7232,8 @@
         <w:t xml:space="preserve">number.</w:t>
       </w:r>
     </w:p>
-    <w:bookmarkEnd w:id="36"/>
-    <w:bookmarkStart w:id="37" w:name="Xda95753af269ca0e3094d252b044c654d56e36b"/>
+    <w:bookmarkEnd w:id="51"/>
+    <w:bookmarkStart w:id="52" w:name="Xda95753af269ca0e3094d252b044c654d56e36b"/>
     <w:p>
       <w:pPr>
         <w:pStyle w:val="Heading3"/>
@@ -7016,8 +7250,8 @@
         <w:t xml:space="preserve">We also report an ICC(2,1) days-as-raters analysis as an internal noise-floor check (full numbers in supplement Table S1). The ICC and bootstrap week-pair r agree on metric ranking, with ICC uniformly more conservative because it treats within-week noise as rater disagreement. The bootstrap week-pair r is the recommended headline statistic for clinical claims; the ICC is included as a diagnostic.</w:t>
       </w:r>
     </w:p>
-    <w:bookmarkEnd w:id="37"/>
-    <w:bookmarkStart w:id="38" w:name="fairness-disparities-recovered"/>
+    <w:bookmarkEnd w:id="52"/>
+    <w:bookmarkStart w:id="53" w:name="fairness-disparities-recovered"/>
     <w:p>
       <w:pPr>
         <w:pStyle w:val="Heading3"/>
@@ -7360,8 +7594,8 @@
         <w:t xml:space="preserve">The injected effects were 0.85 vs 1.00 SQI multiplier for device C vs A (recovers as a 13.02-point gap) and 0.12 × proxy for skin tone (recovers as a 9.53-point gap). Both gaps have bootstrap 95% CIs (Section 2.7).</w:t>
       </w:r>
     </w:p>
-    <w:bookmarkEnd w:id="38"/>
-    <w:bookmarkStart w:id="39" w:name="causal-adjusted-confounding"/>
+    <w:bookmarkEnd w:id="53"/>
+    <w:bookmarkStart w:id="54" w:name="causal-adjusted-confounding"/>
     <w:p>
       <w:pPr>
         <w:pStyle w:val="Heading3"/>
@@ -7906,8 +8140,8 @@
         <w:t xml:space="preserve">The heat_index → HRV and heat_index → sleep_efficiency rows in Table 13 illustrate the diagnostic in the opposite direction. The framework’s positivity check flags a violation for both heat_index treatments (Kish effective sample size 63%), meaning the propensity-score model produced effective sample sizes too small to support reliable adjusted estimation. The AIPW point estimates for the heat_index treatments are consequently reported with a positivity-violation warning attached to the analysis output and are not interpreted as substantive causal claims. The rows are included in Table 13 to demonstrate that the framework refuses to commit to a causal interpretation when the propensity-score assumption is empirically inadequate, rather than reporting a point estimate with the same authority as the active_minutes case. Positivity and E-value sensitivity output for both treatments is in supplement section S2.</w:t>
       </w:r>
     </w:p>
-    <w:bookmarkEnd w:id="39"/>
-    <w:bookmarkStart w:id="40" w:name="learned-trust-score-weights"/>
+    <w:bookmarkEnd w:id="54"/>
+    <w:bookmarkStart w:id="55" w:name="learned-trust-score-weights"/>
     <w:p>
       <w:pPr>
         <w:pStyle w:val="Heading3"/>
@@ -7924,8 +8158,8 @@
         <w:t xml:space="preserve">A 6-component weight-simplex search (Dirichlet sampling plus local grid refinement, 360 candidates) returned holdout Spearman ρ = +0.668 (n_holdout = 90) against a week-over-week HRV RMSSD reproducibility target, compared with +0.592 in training (n_train = 210). The learned weights emphasize signal_quality over confounding_risk but remain within the convex hull of plausible weightings; the default weights are within 0.08 Spearman of the optimum, supporting the policy of shipping the defaults and exposing the weights as user-configurable. Full training-vs-holdout breakdown in supplement section S6.</w:t>
       </w:r>
     </w:p>
-    <w:bookmarkEnd w:id="40"/>
-    <w:bookmarkStart w:id="41" w:name="cross-cohort-generalization"/>
+    <w:bookmarkEnd w:id="55"/>
+    <w:bookmarkStart w:id="59" w:name="cross-cohort-generalization"/>
     <w:p>
       <w:pPr>
         <w:pStyle w:val="Heading3"/>
@@ -7942,9 +8176,64 @@
         <w:t xml:space="preserve">Across five synthetic regimes (default, strong environment, inverted skin-tone, severe device bias, clean world) and eight qualitative predictions, seven of eight predictions pass (Figure 7, panel C). The one failure is consistent with random variation: in the clean-world regime, small-sample random imbalance produces a non-zero empirical device-B offset despite zero injected bias. The audit responds to cohort parameters in the predicted direction, including the sign-flip on the skin-tone gap when the injected penalty is inverted (Figure 7, panel B). Full per-regime table in supplement Table S2.</w:t>
       </w:r>
     </w:p>
-    <w:bookmarkEnd w:id="41"/>
-    <w:bookmarkEnd w:id="42"/>
-    <w:bookmarkStart w:id="46" w:name="discussion"/>
+    <w:p>
+      <w:pPr>
+        <w:pStyle w:val="CaptionedFigure"/>
+      </w:pPr>
+      <w:r>
+        <w:drawing>
+          <wp:inline>
+            <wp:extent cx="5334000" cy="1751128"/>
+            <wp:effectExtent b="0" l="0" r="0" t="0"/>
+            <wp:docPr descr="Figure 7. Cross-cohort parameter-sweep validation across five synthetic regimes (default, strong environment, inverted skin-tone, severe device bias, clean world). Seven of eight qualitative predictions pass. The sign-flip on the skin-tone gap under the inverted-penalty regime confirms that the audit responds to cohort parameters rather than to fixed generator values." title="" id="57" name="Picture"/>
+            <a:graphic>
+              <a:graphicData uri="http://schemas.openxmlformats.org/drawingml/2006/picture">
+                <pic:pic>
+                  <pic:nvPicPr>
+                    <pic:cNvPr descr="paper/figures/fig3_cross_cohort.png" id="58" name="Picture"/>
+                    <pic:cNvPicPr>
+                      <a:picLocks noChangeArrowheads="1" noChangeAspect="1"/>
+                    </pic:cNvPicPr>
+                  </pic:nvPicPr>
+                  <pic:blipFill>
+                    <a:blip r:embed="rId56"/>
+                    <a:stretch>
+                      <a:fillRect/>
+                    </a:stretch>
+                  </pic:blipFill>
+                  <pic:spPr bwMode="auto">
+                    <a:xfrm>
+                      <a:off x="0" y="0"/>
+                      <a:ext cx="5334000" cy="1751128"/>
+                    </a:xfrm>
+                    <a:prstGeom prst="rect">
+                      <a:avLst/>
+                    </a:prstGeom>
+                    <a:noFill/>
+                    <a:ln w="9525">
+                      <a:noFill/>
+                      <a:headEnd/>
+                      <a:tailEnd/>
+                    </a:ln>
+                  </pic:spPr>
+                </pic:pic>
+              </a:graphicData>
+            </a:graphic>
+          </wp:inline>
+        </w:drawing>
+      </w:r>
+    </w:p>
+    <w:p>
+      <w:pPr>
+        <w:pStyle w:val="ImageCaption"/>
+      </w:pPr>
+      <w:r>
+        <w:t xml:space="preserve">Figure 7. Cross-cohort parameter-sweep validation across five synthetic regimes (default, strong environment, inverted skin-tone, severe device bias, clean world). Seven of eight qualitative predictions pass. The sign-flip on the skin-tone gap under the inverted-penalty regime confirms that the audit responds to cohort parameters rather than to fixed generator values.</w:t>
+      </w:r>
+    </w:p>
+    <w:bookmarkEnd w:id="59"/>
+    <w:bookmarkEnd w:id="60"/>
+    <w:bookmarkStart w:id="64" w:name="discussion"/>
     <w:p>
       <w:pPr>
         <w:pStyle w:val="Heading2"/>
@@ -7953,7 +8242,7 @@
         <w:t xml:space="preserve">5. Discussion</w:t>
       </w:r>
     </w:p>
-    <w:bookmarkStart w:id="43" w:name="principal-findings"/>
+    <w:bookmarkStart w:id="61" w:name="principal-findings"/>
     <w:p>
       <w:pPr>
         <w:pStyle w:val="Heading3"/>
@@ -8033,8 +8322,8 @@
         <w:t xml:space="preserve">Mean |HR_PPG - HR_ECG| during stress ranges from 6.75 bpm (S15) to 26.02 bpm (S11), a four-fold spread across 15 subjects. The direction of the per-state quality change also varies (most subjects’ PPG SQI drops during stress; S15’s rises). Any conclusion from pooled WESAD wrist-PPG analysis is at risk of being driven by a small number of subjects. Restricting downstream models to multi-baseline-pass windows improves per-subject wrist-PPG-to-chest-ECG HR correlation by a median of +0.110 (13 of 15 subjects improved, paired Wilcoxon p = 1.5e-04), with the largest gains in subjects whose unfiltered correlation was modest (S10: 0.65 → 0.78, S9: 0.47 → 0.76).</w:t>
       </w:r>
     </w:p>
-    <w:bookmarkEnd w:id="43"/>
-    <w:bookmarkStart w:id="44" w:name="relation-to-prior-work"/>
+    <w:bookmarkEnd w:id="61"/>
+    <w:bookmarkStart w:id="62" w:name="relation-to-prior-work"/>
     <w:p>
       <w:pPr>
         <w:pStyle w:val="Heading3"/>
@@ -8089,8 +8378,8 @@
         <w:t xml:space="preserve">, which focuses on feature engineering and aggregation rather than auditing. Our framework can be combined with FLIRT rather than replacing it: FLIRT produces the features; our pipeline checks whether those features are reliable enough to model.</w:t>
       </w:r>
     </w:p>
-    <w:bookmarkEnd w:id="44"/>
-    <w:bookmarkStart w:id="45" w:name="limitations"/>
+    <w:bookmarkEnd w:id="62"/>
+    <w:bookmarkStart w:id="63" w:name="limitations"/>
     <w:p>
       <w:pPr>
         <w:pStyle w:val="Heading3"/>
@@ -8385,9 +8674,9 @@
         <w:t xml:space="preserve">This is a single-author methodology paper with no clinical or biomedical-engineering co-authors. The recommendations in Section 6 are aimed at the wearable-AI research community (multi-baseline SQI auditing as standard supplementary material in wearable-AI publications) and do not constitute clinical guidance. Translation of any cross-method-audit recommendation into patient-facing clinical practice should include co-authorship by clinical specialists with relevant device experience; the synthetic-cohort validation in Section 4 and the WESAD/PPG-DaLiA empirical study in Section 3 are methodological contributions rather than clinical findings.</w:t>
       </w:r>
     </w:p>
-    <w:bookmarkEnd w:id="45"/>
-    <w:bookmarkEnd w:id="46"/>
-    <w:bookmarkStart w:id="47" w:name="conclusions"/>
+    <w:bookmarkEnd w:id="63"/>
+    <w:bookmarkEnd w:id="64"/>
+    <w:bookmarkStart w:id="65" w:name="conclusions"/>
     <w:p>
       <w:pPr>
         <w:pStyle w:val="Heading2"/>
@@ -8427,8 +8716,8 @@
         <w:t xml:space="preserve">(MIT licensed) and runs end-to-end from a fixed seed in approximately three minutes on a modern laptop CPU.</w:t>
       </w:r>
     </w:p>
-    <w:bookmarkEnd w:id="47"/>
-    <w:bookmarkStart w:id="48" w:name="code-and-data-availability"/>
+    <w:bookmarkEnd w:id="65"/>
+    <w:bookmarkStart w:id="66" w:name="code-and-data-availability"/>
     <w:p>
       <w:pPr>
         <w:pStyle w:val="Heading2"/>
@@ -8463,8 +8752,8 @@
         <w:t xml:space="preserve">, also publicly available from the UCI Machine Learning Repository. Both are released without restrictions for research use.</w:t>
       </w:r>
     </w:p>
-    <w:bookmarkEnd w:id="48"/>
-    <w:bookmarkStart w:id="49" w:name="author-contributions"/>
+    <w:bookmarkEnd w:id="66"/>
+    <w:bookmarkStart w:id="67" w:name="author-contributions"/>
     <w:p>
       <w:pPr>
         <w:pStyle w:val="Heading2"/>
@@ -8481,8 +8770,8 @@
         <w:t xml:space="preserve">Ceyhun Olcan: Conceptualization, Data curation, Formal analysis, Investigation, Methodology, Software, Validation, Visualization, Writing - original draft, Writing - review and editing.</w:t>
       </w:r>
     </w:p>
-    <w:bookmarkEnd w:id="49"/>
-    <w:bookmarkStart w:id="50" w:name="funding"/>
+    <w:bookmarkEnd w:id="67"/>
+    <w:bookmarkStart w:id="68" w:name="funding"/>
     <w:p>
       <w:pPr>
         <w:pStyle w:val="Heading2"/>
@@ -8499,8 +8788,8 @@
         <w:t xml:space="preserve">No external funding supported this work.</w:t>
       </w:r>
     </w:p>
-    <w:bookmarkEnd w:id="50"/>
-    <w:bookmarkStart w:id="51" w:name="ethics-statement"/>
+    <w:bookmarkEnd w:id="68"/>
+    <w:bookmarkStart w:id="69" w:name="ethics-statement"/>
     <w:p>
       <w:pPr>
         <w:pStyle w:val="Heading2"/>
@@ -8526,8 +8815,8 @@
         <w:t xml:space="preserve">, released under terms permitting research use. No new human-subjects data were collected; institutional review board approval was therefore not required for this work.</w:t>
       </w:r>
     </w:p>
-    <w:bookmarkEnd w:id="51"/>
-    <w:bookmarkStart w:id="52" w:name="competing-interests"/>
+    <w:bookmarkEnd w:id="69"/>
+    <w:bookmarkStart w:id="70" w:name="competing-interests"/>
     <w:p>
       <w:pPr>
         <w:pStyle w:val="Heading2"/>
@@ -8544,8 +8833,8 @@
         <w:t xml:space="preserve">The author declares no competing interests.</w:t>
       </w:r>
     </w:p>
-    <w:bookmarkEnd w:id="52"/>
-    <w:bookmarkStart w:id="53" w:name="references"/>
+    <w:bookmarkEnd w:id="70"/>
+    <w:bookmarkStart w:id="71" w:name="references"/>
     <w:p>
       <w:pPr>
         <w:pStyle w:val="Heading2"/>
@@ -8577,8 +8866,8 @@
         <w:t xml:space="preserve">for full citations (Orphanidou et al. 2015, Sukor et al. 2011, Clifford et al. 2012, Robins et al. 1994, Shrout &amp; Fleiss 1979, Bland &amp; Altman 1986, Schmidt et al. 2018, Perraudin et al. 2021, Föll et al. 2021, Mertes et al. 2022, Efron &amp; Tibshirani 1993, Malik 1996).</w:t>
       </w:r>
     </w:p>
-    <w:bookmarkEnd w:id="53"/>
-    <w:bookmarkStart w:id="105" w:name="supplementary-materials"/>
+    <w:bookmarkEnd w:id="71"/>
+    <w:bookmarkStart w:id="123" w:name="supplementary-materials"/>
     <w:p>
       <w:pPr>
         <w:pStyle w:val="Heading2"/>
@@ -8722,8 +9011,8 @@
         <w:t xml:space="preserve">: full release history of the toolkit.</w:t>
       </w:r>
     </w:p>
-    <w:bookmarkStart w:id="104" w:name="refs"/>
-    <w:bookmarkStart w:id="55" w:name="ref-allen2007"/>
+    <w:bookmarkStart w:id="122" w:name="refs"/>
+    <w:bookmarkStart w:id="73" w:name="ref-allen2007"/>
     <w:p>
       <w:pPr>
         <w:pStyle w:val="Bibliography"/>
@@ -8756,7 +9045,7 @@
       <w:r>
         <w:t xml:space="preserve"> </w:t>
       </w:r>
-      <w:hyperlink r:id="rId54">
+      <w:hyperlink r:id="rId72">
         <w:r>
           <w:rPr>
             <w:rStyle w:val="Hyperlink"/>
@@ -8768,8 +9057,8 @@
         <w:t xml:space="preserve">.</w:t>
       </w:r>
     </w:p>
-    <w:bookmarkEnd w:id="55"/>
-    <w:bookmarkStart w:id="57" w:name="ref-bent2020"/>
+    <w:bookmarkEnd w:id="73"/>
+    <w:bookmarkStart w:id="75" w:name="ref-bent2020"/>
     <w:p>
       <w:pPr>
         <w:pStyle w:val="Bibliography"/>
@@ -8802,7 +9091,7 @@
       <w:r>
         <w:t xml:space="preserve"> </w:t>
       </w:r>
-      <w:hyperlink r:id="rId56">
+      <w:hyperlink r:id="rId74">
         <w:r>
           <w:rPr>
             <w:rStyle w:val="Hyperlink"/>
@@ -8814,8 +9103,8 @@
         <w:t xml:space="preserve">.</w:t>
       </w:r>
     </w:p>
-    <w:bookmarkEnd w:id="57"/>
-    <w:bookmarkStart w:id="59" w:name="ref-bland1986"/>
+    <w:bookmarkEnd w:id="75"/>
+    <w:bookmarkStart w:id="77" w:name="ref-bland1986"/>
     <w:p>
       <w:pPr>
         <w:pStyle w:val="Bibliography"/>
@@ -8848,7 +9137,7 @@
       <w:r>
         <w:t xml:space="preserve"> </w:t>
       </w:r>
-      <w:hyperlink r:id="rId58">
+      <w:hyperlink r:id="rId76">
         <w:r>
           <w:rPr>
             <w:rStyle w:val="Hyperlink"/>
@@ -8860,8 +9149,8 @@
         <w:t xml:space="preserve">.</w:t>
       </w:r>
     </w:p>
-    <w:bookmarkEnd w:id="59"/>
-    <w:bookmarkStart w:id="61" w:name="ref-bossuyt2015stard"/>
+    <w:bookmarkEnd w:id="77"/>
+    <w:bookmarkStart w:id="79" w:name="ref-bossuyt2015stard"/>
     <w:p>
       <w:pPr>
         <w:pStyle w:val="Bibliography"/>
@@ -8906,7 +9195,7 @@
       <w:r>
         <w:t xml:space="preserve"> </w:t>
       </w:r>
-      <w:hyperlink r:id="rId60">
+      <w:hyperlink r:id="rId78">
         <w:r>
           <w:rPr>
             <w:rStyle w:val="Hyperlink"/>
@@ -8918,8 +9207,8 @@
         <w:t xml:space="preserve">.</w:t>
       </w:r>
     </w:p>
-    <w:bookmarkEnd w:id="61"/>
-    <w:bookmarkStart w:id="63" w:name="ref-cliff1993"/>
+    <w:bookmarkEnd w:id="79"/>
+    <w:bookmarkStart w:id="81" w:name="ref-cliff1993"/>
     <w:p>
       <w:pPr>
         <w:pStyle w:val="Bibliography"/>
@@ -8952,7 +9241,7 @@
       <w:r>
         <w:t xml:space="preserve"> </w:t>
       </w:r>
-      <w:hyperlink r:id="rId62">
+      <w:hyperlink r:id="rId80">
         <w:r>
           <w:rPr>
             <w:rStyle w:val="Hyperlink"/>
@@ -8964,8 +9253,8 @@
         <w:t xml:space="preserve">.</w:t>
       </w:r>
     </w:p>
-    <w:bookmarkEnd w:id="63"/>
-    <w:bookmarkStart w:id="65" w:name="ref-clifford2012"/>
+    <w:bookmarkEnd w:id="81"/>
+    <w:bookmarkStart w:id="83" w:name="ref-clifford2012"/>
     <w:p>
       <w:pPr>
         <w:pStyle w:val="Bibliography"/>
@@ -8998,7 +9287,7 @@
       <w:r>
         <w:t xml:space="preserve"> </w:t>
       </w:r>
-      <w:hyperlink r:id="rId64">
+      <w:hyperlink r:id="rId82">
         <w:r>
           <w:rPr>
             <w:rStyle w:val="Hyperlink"/>
@@ -9010,8 +9299,8 @@
         <w:t xml:space="preserve">.</w:t>
       </w:r>
     </w:p>
-    <w:bookmarkEnd w:id="65"/>
-    <w:bookmarkStart w:id="66" w:name="ref-cohen1988"/>
+    <w:bookmarkEnd w:id="83"/>
+    <w:bookmarkStart w:id="84" w:name="ref-cohen1988"/>
     <w:p>
       <w:pPr>
         <w:pStyle w:val="Bibliography"/>
@@ -9033,8 +9322,8 @@
         <w:t xml:space="preserve">. 2nd ed. Lawrence Erlbaum Associates.</w:t>
       </w:r>
     </w:p>
-    <w:bookmarkEnd w:id="66"/>
-    <w:bookmarkStart w:id="68" w:name="ref-collins2024tripodai"/>
+    <w:bookmarkEnd w:id="84"/>
+    <w:bookmarkStart w:id="86" w:name="ref-collins2024tripodai"/>
     <w:p>
       <w:pPr>
         <w:pStyle w:val="Bibliography"/>
@@ -9085,7 +9374,7 @@
       <w:r>
         <w:t xml:space="preserve"> </w:t>
       </w:r>
-      <w:hyperlink r:id="rId67">
+      <w:hyperlink r:id="rId85">
         <w:r>
           <w:rPr>
             <w:rStyle w:val="Hyperlink"/>
@@ -9097,8 +9386,8 @@
         <w:t xml:space="preserve">.</w:t>
       </w:r>
     </w:p>
-    <w:bookmarkEnd w:id="68"/>
-    <w:bookmarkStart w:id="69" w:name="ref-efron1993"/>
+    <w:bookmarkEnd w:id="86"/>
+    <w:bookmarkStart w:id="87" w:name="ref-efron1993"/>
     <w:p>
       <w:pPr>
         <w:pStyle w:val="Bibliography"/>
@@ -9120,8 +9409,8 @@
         <w:t xml:space="preserve">. Chapman &amp; Hall/CRC.</w:t>
       </w:r>
     </w:p>
-    <w:bookmarkEnd w:id="69"/>
-    <w:bookmarkStart w:id="71" w:name="ref-elgendi2016"/>
+    <w:bookmarkEnd w:id="87"/>
+    <w:bookmarkStart w:id="89" w:name="ref-elgendi2016"/>
     <w:p>
       <w:pPr>
         <w:pStyle w:val="Bibliography"/>
@@ -9154,7 +9443,7 @@
       <w:r>
         <w:t xml:space="preserve"> </w:t>
       </w:r>
-      <w:hyperlink r:id="rId70">
+      <w:hyperlink r:id="rId88">
         <w:r>
           <w:rPr>
             <w:rStyle w:val="Hyperlink"/>
@@ -9166,8 +9455,8 @@
         <w:t xml:space="preserve">.</w:t>
       </w:r>
     </w:p>
-    <w:bookmarkEnd w:id="71"/>
-    <w:bookmarkStart w:id="73" w:name="ref-foll2021"/>
+    <w:bookmarkEnd w:id="89"/>
+    <w:bookmarkStart w:id="91" w:name="ref-foll2021"/>
     <w:p>
       <w:pPr>
         <w:pStyle w:val="Bibliography"/>
@@ -9206,7 +9495,7 @@
       <w:r>
         <w:t xml:space="preserve"> </w:t>
       </w:r>
-      <w:hyperlink r:id="rId72">
+      <w:hyperlink r:id="rId90">
         <w:r>
           <w:rPr>
             <w:rStyle w:val="Hyperlink"/>
@@ -9218,8 +9507,8 @@
         <w:t xml:space="preserve">.</w:t>
       </w:r>
     </w:p>
-    <w:bookmarkEnd w:id="73"/>
-    <w:bookmarkStart w:id="75" w:name="ref-liu2020consortai"/>
+    <w:bookmarkEnd w:id="91"/>
+    <w:bookmarkStart w:id="93" w:name="ref-liu2020consortai"/>
     <w:p>
       <w:pPr>
         <w:pStyle w:val="Bibliography"/>
@@ -9264,7 +9553,7 @@
       <w:r>
         <w:t xml:space="preserve"> </w:t>
       </w:r>
-      <w:hyperlink r:id="rId74">
+      <w:hyperlink r:id="rId92">
         <w:r>
           <w:rPr>
             <w:rStyle w:val="Hyperlink"/>
@@ -9276,8 +9565,8 @@
         <w:t xml:space="preserve">.</w:t>
       </w:r>
     </w:p>
-    <w:bookmarkEnd w:id="75"/>
-    <w:bookmarkStart w:id="77" w:name="ref-malik1996"/>
+    <w:bookmarkEnd w:id="93"/>
+    <w:bookmarkStart w:id="95" w:name="ref-malik1996"/>
     <w:p>
       <w:pPr>
         <w:pStyle w:val="Bibliography"/>
@@ -9343,7 +9632,7 @@
       <w:r>
         <w:t xml:space="preserve"> </w:t>
       </w:r>
-      <w:hyperlink r:id="rId76">
+      <w:hyperlink r:id="rId94">
         <w:r>
           <w:rPr>
             <w:rStyle w:val="Hyperlink"/>
@@ -9355,8 +9644,8 @@
         <w:t xml:space="preserve">.</w:t>
       </w:r>
     </w:p>
-    <w:bookmarkEnd w:id="77"/>
-    <w:bookmarkStart w:id="79" w:name="ref-charlton2021ppgproc"/>
+    <w:bookmarkEnd w:id="95"/>
+    <w:bookmarkStart w:id="97" w:name="ref-charlton2021ppgproc"/>
     <w:p>
       <w:pPr>
         <w:pStyle w:val="Bibliography"/>
@@ -9392,7 +9681,7 @@
       <w:r>
         <w:t xml:space="preserve"> </w:t>
       </w:r>
-      <w:hyperlink r:id="rId78">
+      <w:hyperlink r:id="rId96">
         <w:r>
           <w:rPr>
             <w:rStyle w:val="Hyperlink"/>
@@ -9404,8 +9693,8 @@
         <w:t xml:space="preserve">.</w:t>
       </w:r>
     </w:p>
-    <w:bookmarkEnd w:id="79"/>
-    <w:bookmarkStart w:id="81" w:name="ref-mertes2022"/>
+    <w:bookmarkEnd w:id="97"/>
+    <w:bookmarkStart w:id="99" w:name="ref-mertes2022"/>
     <w:p>
       <w:pPr>
         <w:pStyle w:val="Bibliography"/>
@@ -9450,7 +9739,7 @@
       <w:r>
         <w:t xml:space="preserve"> </w:t>
       </w:r>
-      <w:hyperlink r:id="rId80">
+      <w:hyperlink r:id="rId98">
         <w:r>
           <w:rPr>
             <w:rStyle w:val="Hyperlink"/>
@@ -9462,8 +9751,8 @@
         <w:t xml:space="preserve">.</w:t>
       </w:r>
     </w:p>
-    <w:bookmarkEnd w:id="81"/>
-    <w:bookmarkStart w:id="83" w:name="ref-orphanidou2015"/>
+    <w:bookmarkEnd w:id="99"/>
+    <w:bookmarkStart w:id="101" w:name="ref-orphanidou2015"/>
     <w:p>
       <w:pPr>
         <w:pStyle w:val="Bibliography"/>
@@ -9496,7 +9785,7 @@
       <w:r>
         <w:t xml:space="preserve"> </w:t>
       </w:r>
-      <w:hyperlink r:id="rId82">
+      <w:hyperlink r:id="rId100">
         <w:r>
           <w:rPr>
             <w:rStyle w:val="Hyperlink"/>
@@ -9508,8 +9797,8 @@
         <w:t xml:space="preserve">.</w:t>
       </w:r>
     </w:p>
-    <w:bookmarkEnd w:id="83"/>
-    <w:bookmarkStart w:id="85" w:name="ref-perraudin2021"/>
+    <w:bookmarkEnd w:id="101"/>
+    <w:bookmarkStart w:id="103" w:name="ref-perraudin2021"/>
     <w:p>
       <w:pPr>
         <w:pStyle w:val="Bibliography"/>
@@ -9542,7 +9831,7 @@
       <w:r>
         <w:t xml:space="preserve"> </w:t>
       </w:r>
-      <w:hyperlink r:id="rId84">
+      <w:hyperlink r:id="rId102">
         <w:r>
           <w:rPr>
             <w:rStyle w:val="Hyperlink"/>
@@ -9554,8 +9843,8 @@
         <w:t xml:space="preserve">.</w:t>
       </w:r>
     </w:p>
-    <w:bookmarkEnd w:id="85"/>
-    <w:bookmarkStart w:id="87" w:name="ref-reiss2019"/>
+    <w:bookmarkEnd w:id="103"/>
+    <w:bookmarkStart w:id="105" w:name="ref-reiss2019"/>
     <w:p>
       <w:pPr>
         <w:pStyle w:val="Bibliography"/>
@@ -9594,7 +9883,7 @@
       <w:r>
         <w:t xml:space="preserve"> </w:t>
       </w:r>
-      <w:hyperlink r:id="rId86">
+      <w:hyperlink r:id="rId104">
         <w:r>
           <w:rPr>
             <w:rStyle w:val="Hyperlink"/>
@@ -9606,8 +9895,8 @@
         <w:t xml:space="preserve">.</w:t>
       </w:r>
     </w:p>
-    <w:bookmarkEnd w:id="87"/>
-    <w:bookmarkStart w:id="89" w:name="ref-robins1994"/>
+    <w:bookmarkEnd w:id="105"/>
+    <w:bookmarkStart w:id="107" w:name="ref-robins1994"/>
     <w:p>
       <w:pPr>
         <w:pStyle w:val="Bibliography"/>
@@ -9640,7 +9929,7 @@
       <w:r>
         <w:t xml:space="preserve"> </w:t>
       </w:r>
-      <w:hyperlink r:id="rId88">
+      <w:hyperlink r:id="rId106">
         <w:r>
           <w:rPr>
             <w:rStyle w:val="Hyperlink"/>
@@ -9652,8 +9941,8 @@
         <w:t xml:space="preserve">.</w:t>
       </w:r>
     </w:p>
-    <w:bookmarkEnd w:id="89"/>
-    <w:bookmarkStart w:id="91" w:name="ref-schafer2013"/>
+    <w:bookmarkEnd w:id="107"/>
+    <w:bookmarkStart w:id="109" w:name="ref-schafer2013"/>
     <w:p>
       <w:pPr>
         <w:pStyle w:val="Bibliography"/>
@@ -9686,7 +9975,7 @@
       <w:r>
         <w:t xml:space="preserve"> </w:t>
       </w:r>
-      <w:hyperlink r:id="rId90">
+      <w:hyperlink r:id="rId108">
         <w:r>
           <w:rPr>
             <w:rStyle w:val="Hyperlink"/>
@@ -9698,8 +9987,8 @@
         <w:t xml:space="preserve">.</w:t>
       </w:r>
     </w:p>
-    <w:bookmarkEnd w:id="91"/>
-    <w:bookmarkStart w:id="93" w:name="ref-schmidt2018"/>
+    <w:bookmarkEnd w:id="109"/>
+    <w:bookmarkStart w:id="111" w:name="ref-schmidt2018"/>
     <w:p>
       <w:pPr>
         <w:pStyle w:val="Bibliography"/>
@@ -9738,7 +10027,7 @@
       <w:r>
         <w:t xml:space="preserve"> </w:t>
       </w:r>
-      <w:hyperlink r:id="rId92">
+      <w:hyperlink r:id="rId110">
         <w:r>
           <w:rPr>
             <w:rStyle w:val="Hyperlink"/>
@@ -9750,8 +10039,8 @@
         <w:t xml:space="preserve">.</w:t>
       </w:r>
     </w:p>
-    <w:bookmarkEnd w:id="93"/>
-    <w:bookmarkStart w:id="95" w:name="ref-shcherbina2017"/>
+    <w:bookmarkEnd w:id="111"/>
+    <w:bookmarkStart w:id="113" w:name="ref-shcherbina2017"/>
     <w:p>
       <w:pPr>
         <w:pStyle w:val="Bibliography"/>
@@ -9784,7 +10073,7 @@
       <w:r>
         <w:t xml:space="preserve"> </w:t>
       </w:r>
-      <w:hyperlink r:id="rId94">
+      <w:hyperlink r:id="rId112">
         <w:r>
           <w:rPr>
             <w:rStyle w:val="Hyperlink"/>
@@ -9796,8 +10085,8 @@
         <w:t xml:space="preserve">.</w:t>
       </w:r>
     </w:p>
-    <w:bookmarkEnd w:id="95"/>
-    <w:bookmarkStart w:id="97" w:name="ref-shrout1979"/>
+    <w:bookmarkEnd w:id="113"/>
+    <w:bookmarkStart w:id="115" w:name="ref-shrout1979"/>
     <w:p>
       <w:pPr>
         <w:pStyle w:val="Bibliography"/>
@@ -9830,7 +10119,7 @@
       <w:r>
         <w:t xml:space="preserve"> </w:t>
       </w:r>
-      <w:hyperlink r:id="rId96">
+      <w:hyperlink r:id="rId114">
         <w:r>
           <w:rPr>
             <w:rStyle w:val="Hyperlink"/>
@@ -9842,8 +10131,8 @@
         <w:t xml:space="preserve">.</w:t>
       </w:r>
     </w:p>
-    <w:bookmarkEnd w:id="97"/>
-    <w:bookmarkStart w:id="99" w:name="ref-sukor2011"/>
+    <w:bookmarkEnd w:id="115"/>
+    <w:bookmarkStart w:id="117" w:name="ref-sukor2011"/>
     <w:p>
       <w:pPr>
         <w:pStyle w:val="Bibliography"/>
@@ -9876,7 +10165,7 @@
       <w:r>
         <w:t xml:space="preserve"> </w:t>
       </w:r>
-      <w:hyperlink r:id="rId98">
+      <w:hyperlink r:id="rId116">
         <w:r>
           <w:rPr>
             <w:rStyle w:val="Hyperlink"/>
@@ -9888,8 +10177,8 @@
         <w:t xml:space="preserve">.</w:t>
       </w:r>
     </w:p>
-    <w:bookmarkEnd w:id="99"/>
-    <w:bookmarkStart w:id="101" w:name="ref-vasey2022decideai"/>
+    <w:bookmarkEnd w:id="117"/>
+    <w:bookmarkStart w:id="119" w:name="ref-vasey2022decideai"/>
     <w:p>
       <w:pPr>
         <w:pStyle w:val="Bibliography"/>
@@ -9934,7 +10223,7 @@
       <w:r>
         <w:t xml:space="preserve"> </w:t>
       </w:r>
-      <w:hyperlink r:id="rId100">
+      <w:hyperlink r:id="rId118">
         <w:r>
           <w:rPr>
             <w:rStyle w:val="Hyperlink"/>
@@ -9946,8 +10235,8 @@
         <w:t xml:space="preserve">.</w:t>
       </w:r>
     </w:p>
-    <w:bookmarkEnd w:id="101"/>
-    <w:bookmarkStart w:id="103" w:name="ref-wilcoxon1945"/>
+    <w:bookmarkEnd w:id="119"/>
+    <w:bookmarkStart w:id="121" w:name="ref-wilcoxon1945"/>
     <w:p>
       <w:pPr>
         <w:pStyle w:val="Bibliography"/>
@@ -9980,7 +10269,7 @@
       <w:r>
         <w:t xml:space="preserve"> </w:t>
       </w:r>
-      <w:hyperlink r:id="rId102">
+      <w:hyperlink r:id="rId120">
         <w:r>
           <w:rPr>
             <w:rStyle w:val="Hyperlink"/>
@@ -9992,10 +10281,10 @@
         <w:t xml:space="preserve">.</w:t>
       </w:r>
     </w:p>
-    <w:bookmarkEnd w:id="103"/>
-    <w:bookmarkEnd w:id="104"/>
-    <w:bookmarkEnd w:id="105"/>
-    <w:bookmarkEnd w:id="106"/>
+    <w:bookmarkEnd w:id="121"/>
+    <w:bookmarkEnd w:id="122"/>
+    <w:bookmarkEnd w:id="123"/>
+    <w:bookmarkEnd w:id="124"/>
     <w:sectPr>
       <w:footnotePr>
         <w:numRestart w:val="eachSect"/>

</xml_diff>

<commit_message>
Add Supplementary Figures S2, S3, S4 to supplement.docx: S2 threshold-sensitivity curve on both datasets (paper/figures/figS2_threshold_sensitivity.png, from results/real_data/threshold_sensitivity.csv), S3 LOSO per-subject held-out kappa with degenerate-vs-non-degenerate color coding (paper/figures/figS3_loso_recalibration.png, from results/real_data/loso_recalibration.csv), S4 verdict-gap stacked bar as a second view of the headline finding (paper/figures/fig4_rejection_cascade.png, recycled); add new supplement sections S8 (LOSO recalibration) and S9 (consensus rejection alternative view); cross-references in manuscript Sections 3.2 and 3.3; correct LOSO count drift in Section 3.3 prose from 9/6 to 10/5 with per-subject breakdown matching the CSV; refactor scripts/compile_paper.py to compile both manuscript and supplement in one command; add scripts/make_supp_figs.py as the canonical generator for S2 and S3
</commit_message>
<xml_diff>
--- a/paper/manuscript.docx
+++ b/paper/manuscript.docx
@@ -3342,7 +3342,7 @@
         <w:pStyle w:val="BodyText"/>
       </w:pPr>
       <w:r>
-        <w:t xml:space="preserve">**** 44.6% of real wrist PPG windows are rejected by Orphanidou AND Sukor AND Elgendi simultaneously - three baselines, three different physical properties, three concordant rejections - and yet the in-house default threshold (0.70) passes every single one of them. The case for the in-house SQI binarization being inappropriate on real wrist PPG no longer rests on agreement with any one baseline; it rests on consensus rejection across three orthogonal published methods that each test a distinct property of pulse waveforms.</w:t>
+        <w:t xml:space="preserve">**** 44.6% of real wrist PPG windows are rejected by Orphanidou AND Sukor AND Elgendi simultaneously - three baselines, three different physical properties, three concordant rejections - and yet the in-house default threshold (0.70) passes every single one of them (a stacked-bar view of the same finding is in Supplementary Figure S4). The case for the in-house SQI binarization being inappropriate on real wrist PPG no longer rests on agreement with any one baseline; it rests on consensus rejection across three orthogonal published methods that each test a distinct property of pulse waveforms.</w:t>
       </w:r>
     </w:p>
     <w:p>
@@ -3435,7 +3435,7 @@
         <w:t xml:space="preserve"> </w:t>
       </w:r>
       <w:r>
-        <w:t xml:space="preserve">Because the in-house threshold passes 100.0% of windows at 0.7, this joint condition is numerically identical to the published-only consensus rejection rate (the fraction of windows on which all three published methods agree to reject, independent of any in-house decision; 44.571% on WESAD and 43.129% on PPG-DaLiA). Varying the in-house threshold from 0.50 to 0.95 changes the in-house pass rate by at most three percentage points on either dataset (100.0% to 97.1% on WESAD; 100.0% to 97.2% on PPG-DaLiA) and the headline joint metric by at most 1 percentage point. Median pairwise Cohen’s κ across the three published methods is unaffected by any in-house threshold change (κ = -0.198 on WESAD, κ = -0.204 on PPG-DaLiA, exact to three decimals across the full 0.50-0.95 range; Supplementary Table S5). The substantive finding, that three published methods reject the same ~44% of windows in common, is a property of how the published methods behave on real wrist PPG and does not depend on any in-house thresholding choice.</w:t>
+        <w:t xml:space="preserve">Because the in-house threshold passes 100.0% of windows at 0.7, this joint condition is numerically identical to the published-only consensus rejection rate (the fraction of windows on which all three published methods agree to reject, independent of any in-house decision; 44.571% on WESAD and 43.129% on PPG-DaLiA). Varying the in-house threshold from 0.50 to 0.95 changes the in-house pass rate by at most three percentage points on either dataset (100.0% to 97.1% on WESAD; 100.0% to 97.2% on PPG-DaLiA) and the headline joint metric by at most 1 percentage point. Median pairwise Cohen’s κ across the three published methods is unaffected by any in-house threshold change (κ = -0.198 on WESAD, κ = -0.204 on PPG-DaLiA, exact to three decimals across the full 0.50-0.95 range; Supplementary Table S5 and Supplementary Figure S2). The substantive finding, that three published methods reject the same ~44% of windows in common, is a property of how the published methods behave on real wrist PPG and does not depend on any in-house thresholding choice.</w:t>
       </w:r>
     </w:p>
     <w:bookmarkEnd w:id="34"/>
@@ -3830,7 +3830,7 @@
         <w:t xml:space="preserve"> </w:t>
       </w:r>
       <w:r>
-        <w:t xml:space="preserve">To verify the random window-level split does not bias the recalibration conclusion, we re-ran the threshold search as leave-one-subject-out cross-validation (n = 15 folds): for each held-out subject the threshold was selected on the other 14 subjects to maximize κ versus Orphanidou, then evaluated on the held-out subject. Mean held-out Cohen’s κ across the 15 folds is -0.063 (median 0.000, range -0.321 to +0.002). For 9 of 15 subjects the train search settles on threshold 0.85, under which the in-house SQI still passes 100% of the held-out subject’s windows and held-out κ is degenerate at 0. For the remaining 6 subjects the train search lands on stricter thresholds (0.98 to 0.99) that produce non-trivial in-house pass/fail variation; on those held-out subjects κ is uniformly non-positive (range -0.321 to +0.002), meaning that when the in-house SQI is forced to make discriminating decisions it anti-correlates with the Orphanidou baseline rather than agreeing with it. The negative result therefore holds under both the random-window split reported in Table 5 (Δκ ≈ 0.000) and the more conservative subject-level LOSO split (mean held-out κ = -0.063). The full per-subject LOSO output is at</w:t>
+        <w:t xml:space="preserve">To verify the random window-level split does not bias the recalibration conclusion, we re-ran the threshold search as leave-one-subject-out cross-validation (n = 15 folds): for each held-out subject the threshold was selected on the other 14 subjects to maximize κ versus Orphanidou, then evaluated on the held-out subject. Mean held-out Cohen’s κ across the 15 folds is -0.063 (median 0.000, range -0.321 to +0.002). For 10 of 15 subjects the train search settles on threshold 0.85, under which the in-house SQI still passes 100% of the held-out subject’s windows and held-out κ is degenerate at 0. For the remaining 5 subjects the train search lands on stricter thresholds (0.98 to 0.99) that produce non-trivial in-house pass/fail variation; on these held-out subjects κ ranges from -0.321 to +0.002, with 4 of 5 strongly negative (S10, S13, S16, S9 at κ between -0.32 and -0.16) and the fifth (S17) at +0.0017, essentially zero, meaning that when the in-house SQI is forced to make discriminating decisions it does not recover agreement with the Orphanidou baseline. The negative result therefore holds under both the random-window split reported in Table 5 (Δκ ≈ 0.000) and the more conservative subject-level LOSO split (mean held-out κ = -0.063). The full per-subject LOSO output is at</w:t>
       </w:r>
       <w:r>
         <w:t xml:space="preserve"> </w:t>
@@ -3842,7 +3842,10 @@
         <w:t xml:space="preserve">results/real_data/loso_recalibration.csv</w:t>
       </w:r>
       <w:r>
-        <w:t xml:space="preserve">.</w:t>
+        <w:t xml:space="preserve"> </w:t>
+      </w:r>
+      <w:r>
+        <w:t xml:space="preserve">and is visualized in Supplementary Figure S3.</w:t>
       </w:r>
     </w:p>
     <w:bookmarkEnd w:id="38"/>

</xml_diff>

<commit_message>
Remove fabricated citation mertes2022 and nonexistent AppleWatch-MIMIC dataset reference from Limitations; reword to a generic longitudinal multi-device corpus and the All of Us Research Program; recompile manuscript.docx and supplement.docx (24 cited references, all resolve)
</commit_message>
<xml_diff>
--- a/paper/manuscript.docx
+++ b/paper/manuscript.docx
@@ -2,7 +2,7 @@
 <file path=word/document.xml><?xml version="1.0" encoding="utf-8"?>
 <w:document xmlns:w="http://schemas.openxmlformats.org/wordprocessingml/2006/main" xmlns:m="http://schemas.openxmlformats.org/officeDocument/2006/math" xmlns:r="http://schemas.openxmlformats.org/officeDocument/2006/relationships" xmlns:o="urn:schemas-microsoft-com:office:office" xmlns:v="urn:schemas-microsoft-com:vml" xmlns:w10="urn:schemas-microsoft-com:office:word" xmlns:a="http://schemas.openxmlformats.org/drawingml/2006/main" xmlns:pic="http://schemas.openxmlformats.org/drawingml/2006/picture" xmlns:wp="http://schemas.openxmlformats.org/drawingml/2006/wordprocessingDrawing">
   <w:body>
-    <w:bookmarkStart w:id="124" w:name="X492e6e436080a4bb955983327137bd378b3e7de"/>
+    <w:bookmarkStart w:id="122" w:name="X492e6e436080a4bb955983327137bd378b3e7de"/>
     <w:p>
       <w:pPr>
         <w:pStyle w:val="Heading1"/>
@@ -8467,19 +8467,7 @@
         <w:t xml:space="preserve"> </w:t>
       </w:r>
       <w:r>
-        <w:t xml:space="preserve">WESAD and PPG-DaLiA both record wrist photoplethysmography from the Empatica E4 wrist device with synchronous chest ECG from the RespiBAN chest device. The cross-method SQI disagreement finding replicates across the two recording paradigms (stress and amusement on WESAD; eight ambulatory activities on PPG-DaLiA), which controls for activity-specific and stress-specific effects, but does not test whether the pattern holds on other consumer wearables (e.g., Apple Watch, Fitbit, Garmin, Oura). PPG noise profiles depend on optical design, sensor sampling rate, and on-device preprocessing, all of which differ across vendor families. Confirming the pattern on additional device families is an open question for follow-up work, and a longitudinal-wearable corpus such as AppleWatch-MIMIC</w:t>
-      </w:r>
-      <w:r>
-        <w:t xml:space="preserve"> </w:t>
-      </w:r>
-      <w:r>
-        <w:t xml:space="preserve">(Mertes et al. 2022)</w:t>
-      </w:r>
-      <w:r>
-        <w:t xml:space="preserve"> </w:t>
-      </w:r>
-      <w:r>
-        <w:t xml:space="preserve">would provide the natural next test.</w:t>
+        <w:t xml:space="preserve">WESAD and PPG-DaLiA both record wrist photoplethysmography from the Empatica E4 wrist device with synchronous chest ECG from the RespiBAN chest device. The cross-method SQI disagreement finding replicates across the two recording paradigms (stress and amusement on WESAD; eight ambulatory activities on PPG-DaLiA), which controls for activity-specific and stress-specific effects, but does not test whether the pattern holds on other consumer wearables (e.g., Apple Watch, Fitbit, Garmin, Oura). PPG noise profiles depend on optical design, sensor sampling rate, and on-device preprocessing, all of which differ across vendor families. Confirming the pattern on additional device families is an open question for follow-up work, and a longitudinal multi-device wearable corpus would provide the natural next test.</w:t>
       </w:r>
     </w:p>
     <w:p>
@@ -8557,19 +8545,7 @@
         <w:t xml:space="preserve"> </w:t>
       </w:r>
       <w:r>
-        <w:t xml:space="preserve">WESAD has a single ~100-minute session per subject. Test-retest reliability, weekly drift, missingness dynamics, and longitudinal device-bias analyses cannot be validated on WESAD. They are validated on the synthetic cohort, where ground truth is controlled. Real-data validation of those analyses requires a longitudinal dataset such as AppleWatch-MIMIC</w:t>
-      </w:r>
-      <w:r>
-        <w:t xml:space="preserve"> </w:t>
-      </w:r>
-      <w:r>
-        <w:t xml:space="preserve">(Mertes et al. 2022)</w:t>
-      </w:r>
-      <w:r>
-        <w:t xml:space="preserve"> </w:t>
-      </w:r>
-      <w:r>
-        <w:t xml:space="preserve">or All of Us.</w:t>
+        <w:t xml:space="preserve">WESAD has a single ~100-minute session per subject. Test-retest reliability, weekly drift, missingness dynamics, and longitudinal device-bias analyses cannot be validated on WESAD. They are validated on the synthetic cohort, where ground truth is controlled. Real-data validation of those analyses requires a longitudinal dataset such as the All of Us Research Program.</w:t>
       </w:r>
     </w:p>
     <w:p>
@@ -8867,7 +8843,7 @@
       </w:r>
     </w:p>
     <w:bookmarkEnd w:id="71"/>
-    <w:bookmarkStart w:id="123" w:name="supplementary-materials"/>
+    <w:bookmarkStart w:id="121" w:name="supplementary-materials"/>
     <w:p>
       <w:pPr>
         <w:pStyle w:val="Heading2"/>
@@ -9011,7 +8987,7 @@
         <w:t xml:space="preserve">: full release history of the toolkit.</w:t>
       </w:r>
     </w:p>
-    <w:bookmarkStart w:id="122" w:name="refs"/>
+    <w:bookmarkStart w:id="120" w:name="refs"/>
     <w:bookmarkStart w:id="73" w:name="ref-allen2007"/>
     <w:p>
       <w:pPr>
@@ -9694,31 +9670,19 @@
       </w:r>
     </w:p>
     <w:bookmarkEnd w:id="97"/>
-    <w:bookmarkStart w:id="99" w:name="ref-mertes2022"/>
+    <w:bookmarkStart w:id="99" w:name="ref-orphanidou2015"/>
     <w:p>
       <w:pPr>
         <w:pStyle w:val="Bibliography"/>
       </w:pPr>
       <w:r>
-        <w:t xml:space="preserve">Mertes, Gerd, Yifeng Long, Zhibin Liu, Yang Li, Yifan Yang, and David A. Clifton. 2022.</w:t>
-      </w:r>
-      <w:r>
-        <w:t xml:space="preserve"> </w:t>
-      </w:r>
-      <w:r>
-        <w:t xml:space="preserve">“The</w:t>
-      </w:r>
-      <w:r>
-        <w:t xml:space="preserve"> </w:t>
-      </w:r>
-      <w:r>
-        <w:t xml:space="preserve">Apple Watch</w:t>
-      </w:r>
-      <w:r>
-        <w:t xml:space="preserve"> </w:t>
-      </w:r>
-      <w:r>
-        <w:t xml:space="preserve">for Monitoring Mental Health-Related Physiological Symptoms: A Literature Review.”</w:t>
+        <w:t xml:space="preserve">Orphanidou, Christina, Timothy Bonnici, Peter Charlton, David Clifton, David Vallance, and Lionel Tarassenko. 2015.</w:t>
+      </w:r>
+      <w:r>
+        <w:t xml:space="preserve"> </w:t>
+      </w:r>
+      <w:r>
+        <w:t xml:space="preserve">“Signal-Quality Indices for the Electrocardiogram and Photoplethysmogram Derived from Optical Pulse-Rate Measurements.”</w:t>
       </w:r>
       <w:r>
         <w:t xml:space="preserve"> </w:t>
@@ -9728,64 +9692,18 @@
           <w:i/>
           <w:iCs/>
         </w:rPr>
-        <w:t xml:space="preserve">Frontiers in Psychiatry</w:t>
-      </w:r>
-      <w:r>
-        <w:t xml:space="preserve"> </w:t>
-      </w:r>
-      <w:r>
-        <w:t xml:space="preserve">13: 1003133.</w:t>
+        <w:t xml:space="preserve">IEEE Journal of Biomedical and Health Informatics</w:t>
+      </w:r>
+      <w:r>
+        <w:t xml:space="preserve"> </w:t>
+      </w:r>
+      <w:r>
+        <w:t xml:space="preserve">19 (3): 832–38.</w:t>
       </w:r>
       <w:r>
         <w:t xml:space="preserve"> </w:t>
       </w:r>
       <w:hyperlink r:id="rId98">
-        <w:r>
-          <w:rPr>
-            <w:rStyle w:val="Hyperlink"/>
-          </w:rPr>
-          <w:t xml:space="preserve">https://doi.org/10.3389/fpsyt.2022.1003133</w:t>
-        </w:r>
-      </w:hyperlink>
-      <w:r>
-        <w:t xml:space="preserve">.</w:t>
-      </w:r>
-    </w:p>
-    <w:bookmarkEnd w:id="99"/>
-    <w:bookmarkStart w:id="101" w:name="ref-orphanidou2015"/>
-    <w:p>
-      <w:pPr>
-        <w:pStyle w:val="Bibliography"/>
-      </w:pPr>
-      <w:r>
-        <w:t xml:space="preserve">Orphanidou, Christina, Timothy Bonnici, Peter Charlton, David Clifton, David Vallance, and Lionel Tarassenko. 2015.</w:t>
-      </w:r>
-      <w:r>
-        <w:t xml:space="preserve"> </w:t>
-      </w:r>
-      <w:r>
-        <w:t xml:space="preserve">“Signal-Quality Indices for the Electrocardiogram and Photoplethysmogram Derived from Optical Pulse-Rate Measurements.”</w:t>
-      </w:r>
-      <w:r>
-        <w:t xml:space="preserve"> </w:t>
-      </w:r>
-      <w:r>
-        <w:rPr>
-          <w:i/>
-          <w:iCs/>
-        </w:rPr>
-        <w:t xml:space="preserve">IEEE Journal of Biomedical and Health Informatics</w:t>
-      </w:r>
-      <w:r>
-        <w:t xml:space="preserve"> </w:t>
-      </w:r>
-      <w:r>
-        <w:t xml:space="preserve">19 (3): 832–38.</w:t>
-      </w:r>
-      <w:r>
-        <w:t xml:space="preserve"> </w:t>
-      </w:r>
-      <w:hyperlink r:id="rId100">
         <w:r>
           <w:rPr>
             <w:rStyle w:val="Hyperlink"/>
@@ -9797,8 +9715,8 @@
         <w:t xml:space="preserve">.</w:t>
       </w:r>
     </w:p>
-    <w:bookmarkEnd w:id="101"/>
-    <w:bookmarkStart w:id="103" w:name="ref-perraudin2021"/>
+    <w:bookmarkEnd w:id="99"/>
+    <w:bookmarkStart w:id="101" w:name="ref-perraudin2021"/>
     <w:p>
       <w:pPr>
         <w:pStyle w:val="Bibliography"/>
@@ -9831,7 +9749,7 @@
       <w:r>
         <w:t xml:space="preserve"> </w:t>
       </w:r>
-      <w:hyperlink r:id="rId102">
+      <w:hyperlink r:id="rId100">
         <w:r>
           <w:rPr>
             <w:rStyle w:val="Hyperlink"/>
@@ -9843,8 +9761,8 @@
         <w:t xml:space="preserve">.</w:t>
       </w:r>
     </w:p>
-    <w:bookmarkEnd w:id="103"/>
-    <w:bookmarkStart w:id="105" w:name="ref-reiss2019"/>
+    <w:bookmarkEnd w:id="101"/>
+    <w:bookmarkStart w:id="103" w:name="ref-reiss2019"/>
     <w:p>
       <w:pPr>
         <w:pStyle w:val="Bibliography"/>
@@ -9883,7 +9801,7 @@
       <w:r>
         <w:t xml:space="preserve"> </w:t>
       </w:r>
-      <w:hyperlink r:id="rId104">
+      <w:hyperlink r:id="rId102">
         <w:r>
           <w:rPr>
             <w:rStyle w:val="Hyperlink"/>
@@ -9895,8 +9813,8 @@
         <w:t xml:space="preserve">.</w:t>
       </w:r>
     </w:p>
-    <w:bookmarkEnd w:id="105"/>
-    <w:bookmarkStart w:id="107" w:name="ref-robins1994"/>
+    <w:bookmarkEnd w:id="103"/>
+    <w:bookmarkStart w:id="105" w:name="ref-robins1994"/>
     <w:p>
       <w:pPr>
         <w:pStyle w:val="Bibliography"/>
@@ -9929,7 +9847,7 @@
       <w:r>
         <w:t xml:space="preserve"> </w:t>
       </w:r>
-      <w:hyperlink r:id="rId106">
+      <w:hyperlink r:id="rId104">
         <w:r>
           <w:rPr>
             <w:rStyle w:val="Hyperlink"/>
@@ -9941,8 +9859,8 @@
         <w:t xml:space="preserve">.</w:t>
       </w:r>
     </w:p>
-    <w:bookmarkEnd w:id="107"/>
-    <w:bookmarkStart w:id="109" w:name="ref-schafer2013"/>
+    <w:bookmarkEnd w:id="105"/>
+    <w:bookmarkStart w:id="107" w:name="ref-schafer2013"/>
     <w:p>
       <w:pPr>
         <w:pStyle w:val="Bibliography"/>
@@ -9975,7 +9893,7 @@
       <w:r>
         <w:t xml:space="preserve"> </w:t>
       </w:r>
-      <w:hyperlink r:id="rId108">
+      <w:hyperlink r:id="rId106">
         <w:r>
           <w:rPr>
             <w:rStyle w:val="Hyperlink"/>
@@ -9987,8 +9905,8 @@
         <w:t xml:space="preserve">.</w:t>
       </w:r>
     </w:p>
-    <w:bookmarkEnd w:id="109"/>
-    <w:bookmarkStart w:id="111" w:name="ref-schmidt2018"/>
+    <w:bookmarkEnd w:id="107"/>
+    <w:bookmarkStart w:id="109" w:name="ref-schmidt2018"/>
     <w:p>
       <w:pPr>
         <w:pStyle w:val="Bibliography"/>
@@ -10027,7 +9945,7 @@
       <w:r>
         <w:t xml:space="preserve"> </w:t>
       </w:r>
-      <w:hyperlink r:id="rId110">
+      <w:hyperlink r:id="rId108">
         <w:r>
           <w:rPr>
             <w:rStyle w:val="Hyperlink"/>
@@ -10039,8 +9957,8 @@
         <w:t xml:space="preserve">.</w:t>
       </w:r>
     </w:p>
-    <w:bookmarkEnd w:id="111"/>
-    <w:bookmarkStart w:id="113" w:name="ref-shcherbina2017"/>
+    <w:bookmarkEnd w:id="109"/>
+    <w:bookmarkStart w:id="111" w:name="ref-shcherbina2017"/>
     <w:p>
       <w:pPr>
         <w:pStyle w:val="Bibliography"/>
@@ -10073,7 +9991,7 @@
       <w:r>
         <w:t xml:space="preserve"> </w:t>
       </w:r>
-      <w:hyperlink r:id="rId112">
+      <w:hyperlink r:id="rId110">
         <w:r>
           <w:rPr>
             <w:rStyle w:val="Hyperlink"/>
@@ -10085,8 +10003,8 @@
         <w:t xml:space="preserve">.</w:t>
       </w:r>
     </w:p>
-    <w:bookmarkEnd w:id="113"/>
-    <w:bookmarkStart w:id="115" w:name="ref-shrout1979"/>
+    <w:bookmarkEnd w:id="111"/>
+    <w:bookmarkStart w:id="113" w:name="ref-shrout1979"/>
     <w:p>
       <w:pPr>
         <w:pStyle w:val="Bibliography"/>
@@ -10119,7 +10037,7 @@
       <w:r>
         <w:t xml:space="preserve"> </w:t>
       </w:r>
-      <w:hyperlink r:id="rId114">
+      <w:hyperlink r:id="rId112">
         <w:r>
           <w:rPr>
             <w:rStyle w:val="Hyperlink"/>
@@ -10131,8 +10049,8 @@
         <w:t xml:space="preserve">.</w:t>
       </w:r>
     </w:p>
-    <w:bookmarkEnd w:id="115"/>
-    <w:bookmarkStart w:id="117" w:name="ref-sukor2011"/>
+    <w:bookmarkEnd w:id="113"/>
+    <w:bookmarkStart w:id="115" w:name="ref-sukor2011"/>
     <w:p>
       <w:pPr>
         <w:pStyle w:val="Bibliography"/>
@@ -10165,7 +10083,7 @@
       <w:r>
         <w:t xml:space="preserve"> </w:t>
       </w:r>
-      <w:hyperlink r:id="rId116">
+      <w:hyperlink r:id="rId114">
         <w:r>
           <w:rPr>
             <w:rStyle w:val="Hyperlink"/>
@@ -10177,8 +10095,8 @@
         <w:t xml:space="preserve">.</w:t>
       </w:r>
     </w:p>
-    <w:bookmarkEnd w:id="117"/>
-    <w:bookmarkStart w:id="119" w:name="ref-vasey2022decideai"/>
+    <w:bookmarkEnd w:id="115"/>
+    <w:bookmarkStart w:id="117" w:name="ref-vasey2022decideai"/>
     <w:p>
       <w:pPr>
         <w:pStyle w:val="Bibliography"/>
@@ -10223,7 +10141,7 @@
       <w:r>
         <w:t xml:space="preserve"> </w:t>
       </w:r>
-      <w:hyperlink r:id="rId118">
+      <w:hyperlink r:id="rId116">
         <w:r>
           <w:rPr>
             <w:rStyle w:val="Hyperlink"/>
@@ -10235,8 +10153,8 @@
         <w:t xml:space="preserve">.</w:t>
       </w:r>
     </w:p>
-    <w:bookmarkEnd w:id="119"/>
-    <w:bookmarkStart w:id="121" w:name="ref-wilcoxon1945"/>
+    <w:bookmarkEnd w:id="117"/>
+    <w:bookmarkStart w:id="119" w:name="ref-wilcoxon1945"/>
     <w:p>
       <w:pPr>
         <w:pStyle w:val="Bibliography"/>
@@ -10269,7 +10187,7 @@
       <w:r>
         <w:t xml:space="preserve"> </w:t>
       </w:r>
-      <w:hyperlink r:id="rId120">
+      <w:hyperlink r:id="rId118">
         <w:r>
           <w:rPr>
             <w:rStyle w:val="Hyperlink"/>
@@ -10281,10 +10199,10 @@
         <w:t xml:space="preserve">.</w:t>
       </w:r>
     </w:p>
+    <w:bookmarkEnd w:id="119"/>
+    <w:bookmarkEnd w:id="120"/>
     <w:bookmarkEnd w:id="121"/>
     <w:bookmarkEnd w:id="122"/>
-    <w:bookmarkEnd w:id="123"/>
-    <w:bookmarkEnd w:id="124"/>
     <w:sectPr>
       <w:footnotePr>
         <w:numRestart w:val="eachSect"/>

</xml_diff>

<commit_message>
Add McLean 2023 as closest prior art; cite previously-unused fairness references (Sjoding, Obermeyer, Vyas) in Sections 2.7 and 2.8; remove three duplicate bib keys; recompile
</commit_message>
<xml_diff>
--- a/paper/manuscript.docx
+++ b/paper/manuscript.docx
@@ -2,7 +2,7 @@
 <file path=word/document.xml><?xml version="1.0" encoding="utf-8"?>
 <w:document xmlns:w="http://schemas.openxmlformats.org/wordprocessingml/2006/main" xmlns:m="http://schemas.openxmlformats.org/officeDocument/2006/math" xmlns:r="http://schemas.openxmlformats.org/officeDocument/2006/relationships" xmlns:o="urn:schemas-microsoft-com:office:office" xmlns:v="urn:schemas-microsoft-com:vml" xmlns:w10="urn:schemas-microsoft-com:office:word" xmlns:a="http://schemas.openxmlformats.org/drawingml/2006/main" xmlns:pic="http://schemas.openxmlformats.org/drawingml/2006/picture" xmlns:wp="http://schemas.openxmlformats.org/drawingml/2006/wordprocessingDrawing">
   <w:body>
-    <w:bookmarkStart w:id="122" w:name="X492e6e436080a4bb955983327137bd378b3e7de"/>
+    <w:bookmarkStart w:id="130" w:name="X492e6e436080a4bb955983327137bd378b3e7de"/>
     <w:p>
       <w:pPr>
         <w:pStyle w:val="Heading1"/>
@@ -405,7 +405,16 @@
         <w:pStyle w:val="BodyText"/>
       </w:pPr>
       <w:r>
-        <w:t xml:space="preserve">What no public benchmark has quantified is how much the published SQI methods agree or disagree with each other on the same real wearable-PPG dataset, and what the downstream impact of audit-based filtering is on biomarker estimation. We address this gap by performing a multi-baseline SQI audit on the public WESAD dataset</w:t>
+        <w:t xml:space="preserve">Prior work has argued that a single quality threshold cannot serve all measurement contexts and has proposed sliding-scale quality metrics validated against visual inspection</w:t>
+      </w:r>
+      <w:r>
+        <w:t xml:space="preserve"> </w:t>
+      </w:r>
+      <w:r>
+        <w:t xml:space="preserve">(McLean et al. 2023)</w:t>
+      </w:r>
+      <w:r>
+        <w:t xml:space="preserve">. What no public benchmark has quantified is how much the published SQI methods agree or disagree with each other on the same real wearable-PPG dataset, and what the downstream impact of audit-based filtering is on biomarker estimation. We address this gap by performing a multi-baseline SQI audit on the public WESAD dataset</w:t>
       </w:r>
       <w:r>
         <w:t xml:space="preserve"> </w:t>
@@ -1463,7 +1472,16 @@
         <w:pStyle w:val="FirstParagraph"/>
       </w:pPr>
       <w:r>
-        <w:t xml:space="preserve">Stratified bootstrap analysis over any categorical column (device family, skin-tone quartile, sex, age band). For each stratum and each DBTS component, we report the mean, 95% cluster-bootstrap CI (resampling participants, not rows), and the Q1-vs-Q4 disparity with its CI. Forest plots are generated automatically.</w:t>
+        <w:t xml:space="preserve">Demographic bias in clinical algorithms and health-related measurement is well documented</w:t>
+      </w:r>
+      <w:r>
+        <w:t xml:space="preserve"> </w:t>
+      </w:r>
+      <w:r>
+        <w:t xml:space="preserve">(Obermeyer et al. 2019; Vyas et al. 2020)</w:t>
+      </w:r>
+      <w:r>
+        <w:t xml:space="preserve">, motivating a routine subgroup check. Stratified bootstrap analysis over any categorical column (device family, skin-tone quartile, sex, age band). For each stratum and each DBTS component, we report the mean, 95% cluster-bootstrap CI (resampling participants, not rows), and the Q1-vs-Q4 disparity with its CI. Forest plots are generated automatically.</w:t>
       </w:r>
     </w:p>
     <w:bookmarkEnd w:id="21"/>
@@ -2514,7 +2532,7 @@
         <w:t xml:space="preserve"> </w:t>
       </w:r>
       <w:r>
-        <w:t xml:space="preserve">(Bent et al. 2020; Shcherbina et al. 2017)</w:t>
+        <w:t xml:space="preserve">(Bent et al. 2020; Shcherbina et al. 2017; Sjoding et al. 2020)</w:t>
       </w:r>
       <w:r>
         <w:t xml:space="preserve">: Orphanidou (2015)</w:t>
@@ -8843,7 +8861,7 @@
       </w:r>
     </w:p>
     <w:bookmarkEnd w:id="71"/>
-    <w:bookmarkStart w:id="121" w:name="supplementary-materials"/>
+    <w:bookmarkStart w:id="129" w:name="supplementary-materials"/>
     <w:p>
       <w:pPr>
         <w:pStyle w:val="Heading2"/>
@@ -8987,7 +9005,7 @@
         <w:t xml:space="preserve">: full release history of the toolkit.</w:t>
       </w:r>
     </w:p>
-    <w:bookmarkStart w:id="120" w:name="refs"/>
+    <w:bookmarkStart w:id="128" w:name="refs"/>
     <w:bookmarkStart w:id="73" w:name="ref-allen2007"/>
     <w:p>
       <w:pPr>
@@ -9621,25 +9639,19 @@
       </w:r>
     </w:p>
     <w:bookmarkEnd w:id="95"/>
-    <w:bookmarkStart w:id="97" w:name="ref-charlton2021ppgproc"/>
+    <w:bookmarkStart w:id="97" w:name="ref-mclean2023sliding"/>
     <w:p>
       <w:pPr>
         <w:pStyle w:val="Bibliography"/>
       </w:pPr>
       <w:r>
-        <w:t xml:space="preserve">Mejı́a-Mejı́a, Elisa, John Allen, Karthik Budidha, Chadi El-Hajj, Panayiotis A Kyriacou, and Peter H Charlton. 2021.</w:t>
-      </w:r>
-      <w:r>
-        <w:t xml:space="preserve"> </w:t>
-      </w:r>
-      <w:r>
-        <w:t xml:space="preserve">“Photoplethysmography Signal Processing and Synthesis.”</w:t>
-      </w:r>
-      <w:r>
-        <w:t xml:space="preserve"> </w:t>
-      </w:r>
-      <w:r>
-        <w:t xml:space="preserve">In</w:t>
+        <w:t xml:space="preserve">McLean, Marnie K., R. Glenn Weaver, Abbi Lane, et al. 2023.</w:t>
+      </w:r>
+      <w:r>
+        <w:t xml:space="preserve"> </w:t>
+      </w:r>
+      <w:r>
+        <w:t xml:space="preserve">“A Sliding Scale Signal Quality Metric of Photoplethysmography Applicable to Measuring Heart Rate Across Clinical Contexts with Chest Mounting as a Case Study.”</w:t>
       </w:r>
       <w:r>
         <w:t xml:space="preserve"> </w:t>
@@ -9649,6 +9661,58 @@
           <w:i/>
           <w:iCs/>
         </w:rPr>
+        <w:t xml:space="preserve">Sensors</w:t>
+      </w:r>
+      <w:r>
+        <w:t xml:space="preserve"> </w:t>
+      </w:r>
+      <w:r>
+        <w:t xml:space="preserve">23 (7): 3429.</w:t>
+      </w:r>
+      <w:r>
+        <w:t xml:space="preserve"> </w:t>
+      </w:r>
+      <w:hyperlink r:id="rId96">
+        <w:r>
+          <w:rPr>
+            <w:rStyle w:val="Hyperlink"/>
+          </w:rPr>
+          <w:t xml:space="preserve">https://doi.org/10.3390/s23073429</w:t>
+        </w:r>
+      </w:hyperlink>
+      <w:r>
+        <w:t xml:space="preserve">.</w:t>
+      </w:r>
+    </w:p>
+    <w:bookmarkEnd w:id="97"/>
+    <w:bookmarkStart w:id="99" w:name="ref-charlton2021ppgproc"/>
+    <w:p>
+      <w:pPr>
+        <w:pStyle w:val="Bibliography"/>
+      </w:pPr>
+      <w:r>
+        <w:t xml:space="preserve">Mejı́a-Mejı́a, Elisa, John Allen, Karthik Budidha, Chadi El-Hajj, Panayiotis A Kyriacou, and Peter H Charlton. 2021.</w:t>
+      </w:r>
+      <w:r>
+        <w:t xml:space="preserve"> </w:t>
+      </w:r>
+      <w:r>
+        <w:t xml:space="preserve">“Photoplethysmography Signal Processing and Synthesis.”</w:t>
+      </w:r>
+      <w:r>
+        <w:t xml:space="preserve"> </w:t>
+      </w:r>
+      <w:r>
+        <w:t xml:space="preserve">In</w:t>
+      </w:r>
+      <w:r>
+        <w:t xml:space="preserve"> </w:t>
+      </w:r>
+      <w:r>
+        <w:rPr>
+          <w:i/>
+          <w:iCs/>
+        </w:rPr>
         <w:t xml:space="preserve">Photoplethysmography: Technology, Signal Analysis and Applications</w:t>
       </w:r>
       <w:r>
@@ -9657,7 +9721,7 @@
       <w:r>
         <w:t xml:space="preserve"> </w:t>
       </w:r>
-      <w:hyperlink r:id="rId96">
+      <w:hyperlink r:id="rId98">
         <w:r>
           <w:rPr>
             <w:rStyle w:val="Hyperlink"/>
@@ -9669,20 +9733,20 @@
         <w:t xml:space="preserve">.</w:t>
       </w:r>
     </w:p>
-    <w:bookmarkEnd w:id="97"/>
-    <w:bookmarkStart w:id="99" w:name="ref-orphanidou2015"/>
+    <w:bookmarkEnd w:id="99"/>
+    <w:bookmarkStart w:id="101" w:name="ref-obermeyer2019"/>
     <w:p>
       <w:pPr>
         <w:pStyle w:val="Bibliography"/>
       </w:pPr>
       <w:r>
-        <w:t xml:space="preserve">Orphanidou, Christina, Timothy Bonnici, Peter Charlton, David Clifton, David Vallance, and Lionel Tarassenko. 2015.</w:t>
-      </w:r>
-      <w:r>
-        <w:t xml:space="preserve"> </w:t>
-      </w:r>
-      <w:r>
-        <w:t xml:space="preserve">“Signal-Quality Indices for the Electrocardiogram and Photoplethysmogram Derived from Optical Pulse-Rate Measurements.”</w:t>
+        <w:t xml:space="preserve">Obermeyer, Ziad, Brian Powers, Christine Vogeli, and Sendhil Mullainathan. 2019.</w:t>
+      </w:r>
+      <w:r>
+        <w:t xml:space="preserve"> </w:t>
+      </w:r>
+      <w:r>
+        <w:t xml:space="preserve">“Dissecting Racial Bias in an Algorithm Used to Manage the Health of Populations.”</w:t>
       </w:r>
       <w:r>
         <w:t xml:space="preserve"> </w:t>
@@ -9692,6 +9756,52 @@
           <w:i/>
           <w:iCs/>
         </w:rPr>
+        <w:t xml:space="preserve">Science</w:t>
+      </w:r>
+      <w:r>
+        <w:t xml:space="preserve"> </w:t>
+      </w:r>
+      <w:r>
+        <w:t xml:space="preserve">366 (6464): 447–53.</w:t>
+      </w:r>
+      <w:r>
+        <w:t xml:space="preserve"> </w:t>
+      </w:r>
+      <w:hyperlink r:id="rId100">
+        <w:r>
+          <w:rPr>
+            <w:rStyle w:val="Hyperlink"/>
+          </w:rPr>
+          <w:t xml:space="preserve">https://doi.org/10.1126/science.aax2342</w:t>
+        </w:r>
+      </w:hyperlink>
+      <w:r>
+        <w:t xml:space="preserve">.</w:t>
+      </w:r>
+    </w:p>
+    <w:bookmarkEnd w:id="101"/>
+    <w:bookmarkStart w:id="103" w:name="ref-orphanidou2015"/>
+    <w:p>
+      <w:pPr>
+        <w:pStyle w:val="Bibliography"/>
+      </w:pPr>
+      <w:r>
+        <w:t xml:space="preserve">Orphanidou, Christina, Timothy Bonnici, Peter Charlton, David Clifton, David Vallance, and Lionel Tarassenko. 2015.</w:t>
+      </w:r>
+      <w:r>
+        <w:t xml:space="preserve"> </w:t>
+      </w:r>
+      <w:r>
+        <w:t xml:space="preserve">“Signal-Quality Indices for the Electrocardiogram and Photoplethysmogram Derived from Optical Pulse-Rate Measurements.”</w:t>
+      </w:r>
+      <w:r>
+        <w:t xml:space="preserve"> </w:t>
+      </w:r>
+      <w:r>
+        <w:rPr>
+          <w:i/>
+          <w:iCs/>
+        </w:rPr>
         <w:t xml:space="preserve">IEEE Journal of Biomedical and Health Informatics</w:t>
       </w:r>
       <w:r>
@@ -9703,7 +9813,7 @@
       <w:r>
         <w:t xml:space="preserve"> </w:t>
       </w:r>
-      <w:hyperlink r:id="rId98">
+      <w:hyperlink r:id="rId102">
         <w:r>
           <w:rPr>
             <w:rStyle w:val="Hyperlink"/>
@@ -9715,8 +9825,8 @@
         <w:t xml:space="preserve">.</w:t>
       </w:r>
     </w:p>
-    <w:bookmarkEnd w:id="99"/>
-    <w:bookmarkStart w:id="101" w:name="ref-perraudin2021"/>
+    <w:bookmarkEnd w:id="103"/>
+    <w:bookmarkStart w:id="105" w:name="ref-perraudin2021"/>
     <w:p>
       <w:pPr>
         <w:pStyle w:val="Bibliography"/>
@@ -9749,7 +9859,7 @@
       <w:r>
         <w:t xml:space="preserve"> </w:t>
       </w:r>
-      <w:hyperlink r:id="rId100">
+      <w:hyperlink r:id="rId104">
         <w:r>
           <w:rPr>
             <w:rStyle w:val="Hyperlink"/>
@@ -9761,8 +9871,8 @@
         <w:t xml:space="preserve">.</w:t>
       </w:r>
     </w:p>
-    <w:bookmarkEnd w:id="101"/>
-    <w:bookmarkStart w:id="103" w:name="ref-reiss2019"/>
+    <w:bookmarkEnd w:id="105"/>
+    <w:bookmarkStart w:id="107" w:name="ref-reiss2019"/>
     <w:p>
       <w:pPr>
         <w:pStyle w:val="Bibliography"/>
@@ -9801,7 +9911,7 @@
       <w:r>
         <w:t xml:space="preserve"> </w:t>
       </w:r>
-      <w:hyperlink r:id="rId102">
+      <w:hyperlink r:id="rId106">
         <w:r>
           <w:rPr>
             <w:rStyle w:val="Hyperlink"/>
@@ -9813,8 +9923,8 @@
         <w:t xml:space="preserve">.</w:t>
       </w:r>
     </w:p>
-    <w:bookmarkEnd w:id="103"/>
-    <w:bookmarkStart w:id="105" w:name="ref-robins1994"/>
+    <w:bookmarkEnd w:id="107"/>
+    <w:bookmarkStart w:id="109" w:name="ref-robins1994"/>
     <w:p>
       <w:pPr>
         <w:pStyle w:val="Bibliography"/>
@@ -9847,7 +9957,7 @@
       <w:r>
         <w:t xml:space="preserve"> </w:t>
       </w:r>
-      <w:hyperlink r:id="rId104">
+      <w:hyperlink r:id="rId108">
         <w:r>
           <w:rPr>
             <w:rStyle w:val="Hyperlink"/>
@@ -9859,8 +9969,8 @@
         <w:t xml:space="preserve">.</w:t>
       </w:r>
     </w:p>
-    <w:bookmarkEnd w:id="105"/>
-    <w:bookmarkStart w:id="107" w:name="ref-schafer2013"/>
+    <w:bookmarkEnd w:id="109"/>
+    <w:bookmarkStart w:id="111" w:name="ref-schafer2013"/>
     <w:p>
       <w:pPr>
         <w:pStyle w:val="Bibliography"/>
@@ -9893,7 +10003,7 @@
       <w:r>
         <w:t xml:space="preserve"> </w:t>
       </w:r>
-      <w:hyperlink r:id="rId106">
+      <w:hyperlink r:id="rId110">
         <w:r>
           <w:rPr>
             <w:rStyle w:val="Hyperlink"/>
@@ -9905,8 +10015,8 @@
         <w:t xml:space="preserve">.</w:t>
       </w:r>
     </w:p>
-    <w:bookmarkEnd w:id="107"/>
-    <w:bookmarkStart w:id="109" w:name="ref-schmidt2018"/>
+    <w:bookmarkEnd w:id="111"/>
+    <w:bookmarkStart w:id="113" w:name="ref-schmidt2018"/>
     <w:p>
       <w:pPr>
         <w:pStyle w:val="Bibliography"/>
@@ -9945,7 +10055,7 @@
       <w:r>
         <w:t xml:space="preserve"> </w:t>
       </w:r>
-      <w:hyperlink r:id="rId108">
+      <w:hyperlink r:id="rId112">
         <w:r>
           <w:rPr>
             <w:rStyle w:val="Hyperlink"/>
@@ -9957,8 +10067,8 @@
         <w:t xml:space="preserve">.</w:t>
       </w:r>
     </w:p>
-    <w:bookmarkEnd w:id="109"/>
-    <w:bookmarkStart w:id="111" w:name="ref-shcherbina2017"/>
+    <w:bookmarkEnd w:id="113"/>
+    <w:bookmarkStart w:id="115" w:name="ref-shcherbina2017"/>
     <w:p>
       <w:pPr>
         <w:pStyle w:val="Bibliography"/>
@@ -9991,7 +10101,7 @@
       <w:r>
         <w:t xml:space="preserve"> </w:t>
       </w:r>
-      <w:hyperlink r:id="rId110">
+      <w:hyperlink r:id="rId114">
         <w:r>
           <w:rPr>
             <w:rStyle w:val="Hyperlink"/>
@@ -10003,8 +10113,8 @@
         <w:t xml:space="preserve">.</w:t>
       </w:r>
     </w:p>
-    <w:bookmarkEnd w:id="111"/>
-    <w:bookmarkStart w:id="113" w:name="ref-shrout1979"/>
+    <w:bookmarkEnd w:id="115"/>
+    <w:bookmarkStart w:id="117" w:name="ref-shrout1979"/>
     <w:p>
       <w:pPr>
         <w:pStyle w:val="Bibliography"/>
@@ -10037,7 +10147,7 @@
       <w:r>
         <w:t xml:space="preserve"> </w:t>
       </w:r>
-      <w:hyperlink r:id="rId112">
+      <w:hyperlink r:id="rId116">
         <w:r>
           <w:rPr>
             <w:rStyle w:val="Hyperlink"/>
@@ -10049,20 +10159,20 @@
         <w:t xml:space="preserve">.</w:t>
       </w:r>
     </w:p>
-    <w:bookmarkEnd w:id="113"/>
-    <w:bookmarkStart w:id="115" w:name="ref-sukor2011"/>
+    <w:bookmarkEnd w:id="117"/>
+    <w:bookmarkStart w:id="119" w:name="ref-sjoding2020"/>
     <w:p>
       <w:pPr>
         <w:pStyle w:val="Bibliography"/>
       </w:pPr>
       <w:r>
-        <w:t xml:space="preserve">Sukor, J. A., S. J. Redmond, and N. H. Lovell. 2011.</w:t>
-      </w:r>
-      <w:r>
-        <w:t xml:space="preserve"> </w:t>
-      </w:r>
-      <w:r>
-        <w:t xml:space="preserve">“Signal Quality Measures for Pulse Oximetry Through Waveform Morphology Analysis.”</w:t>
+        <w:t xml:space="preserve">Sjoding, Michael W, Robert P Dickson, Theodore J Iwashyna, Steven E Gay, and Thomas S Valley. 2020.</w:t>
+      </w:r>
+      <w:r>
+        <w:t xml:space="preserve"> </w:t>
+      </w:r>
+      <w:r>
+        <w:t xml:space="preserve">“Racial Bias in Pulse Oximetry Measurement.”</w:t>
       </w:r>
       <w:r>
         <w:t xml:space="preserve"> </w:t>
@@ -10072,6 +10182,52 @@
           <w:i/>
           <w:iCs/>
         </w:rPr>
+        <w:t xml:space="preserve">New England Journal of Medicine</w:t>
+      </w:r>
+      <w:r>
+        <w:t xml:space="preserve"> </w:t>
+      </w:r>
+      <w:r>
+        <w:t xml:space="preserve">383 (25): 2477–78.</w:t>
+      </w:r>
+      <w:r>
+        <w:t xml:space="preserve"> </w:t>
+      </w:r>
+      <w:hyperlink r:id="rId118">
+        <w:r>
+          <w:rPr>
+            <w:rStyle w:val="Hyperlink"/>
+          </w:rPr>
+          <w:t xml:space="preserve">https://doi.org/10.1056/NEJMc2029240</w:t>
+        </w:r>
+      </w:hyperlink>
+      <w:r>
+        <w:t xml:space="preserve">.</w:t>
+      </w:r>
+    </w:p>
+    <w:bookmarkEnd w:id="119"/>
+    <w:bookmarkStart w:id="121" w:name="ref-sukor2011"/>
+    <w:p>
+      <w:pPr>
+        <w:pStyle w:val="Bibliography"/>
+      </w:pPr>
+      <w:r>
+        <w:t xml:space="preserve">Sukor, J. A., S. J. Redmond, and N. H. Lovell. 2011.</w:t>
+      </w:r>
+      <w:r>
+        <w:t xml:space="preserve"> </w:t>
+      </w:r>
+      <w:r>
+        <w:t xml:space="preserve">“Signal Quality Measures for Pulse Oximetry Through Waveform Morphology Analysis.”</w:t>
+      </w:r>
+      <w:r>
+        <w:t xml:space="preserve"> </w:t>
+      </w:r>
+      <w:r>
+        <w:rPr>
+          <w:i/>
+          <w:iCs/>
+        </w:rPr>
         <w:t xml:space="preserve">Physiological Measurement</w:t>
       </w:r>
       <w:r>
@@ -10083,7 +10239,7 @@
       <w:r>
         <w:t xml:space="preserve"> </w:t>
       </w:r>
-      <w:hyperlink r:id="rId114">
+      <w:hyperlink r:id="rId120">
         <w:r>
           <w:rPr>
             <w:rStyle w:val="Hyperlink"/>
@@ -10095,8 +10251,8 @@
         <w:t xml:space="preserve">.</w:t>
       </w:r>
     </w:p>
-    <w:bookmarkEnd w:id="115"/>
-    <w:bookmarkStart w:id="117" w:name="ref-vasey2022decideai"/>
+    <w:bookmarkEnd w:id="121"/>
+    <w:bookmarkStart w:id="123" w:name="ref-vasey2022decideai"/>
     <w:p>
       <w:pPr>
         <w:pStyle w:val="Bibliography"/>
@@ -10141,7 +10297,7 @@
       <w:r>
         <w:t xml:space="preserve"> </w:t>
       </w:r>
-      <w:hyperlink r:id="rId116">
+      <w:hyperlink r:id="rId122">
         <w:r>
           <w:rPr>
             <w:rStyle w:val="Hyperlink"/>
@@ -10153,20 +10309,20 @@
         <w:t xml:space="preserve">.</w:t>
       </w:r>
     </w:p>
-    <w:bookmarkEnd w:id="117"/>
-    <w:bookmarkStart w:id="119" w:name="ref-wilcoxon1945"/>
+    <w:bookmarkEnd w:id="123"/>
+    <w:bookmarkStart w:id="125" w:name="ref-vyas2020"/>
     <w:p>
       <w:pPr>
         <w:pStyle w:val="Bibliography"/>
       </w:pPr>
       <w:r>
-        <w:t xml:space="preserve">Wilcoxon, Frank. 1945.</w:t>
-      </w:r>
-      <w:r>
-        <w:t xml:space="preserve"> </w:t>
-      </w:r>
-      <w:r>
-        <w:t xml:space="preserve">“Individual Comparisons by Ranking Methods.”</w:t>
+        <w:t xml:space="preserve">Vyas, Darshali A, Leo G Eisenstein, and David S Jones. 2020.</w:t>
+      </w:r>
+      <w:r>
+        <w:t xml:space="preserve"> </w:t>
+      </w:r>
+      <w:r>
+        <w:t xml:space="preserve">“Hidden in Plain Sight—Reconsidering the Use of Race Correction in Clinical Algorithms.”</w:t>
       </w:r>
       <w:r>
         <w:t xml:space="preserve"> </w:t>
@@ -10176,6 +10332,52 @@
           <w:i/>
           <w:iCs/>
         </w:rPr>
+        <w:t xml:space="preserve">New England Journal of Medicine</w:t>
+      </w:r>
+      <w:r>
+        <w:t xml:space="preserve"> </w:t>
+      </w:r>
+      <w:r>
+        <w:t xml:space="preserve">383 (9): 874–82.</w:t>
+      </w:r>
+      <w:r>
+        <w:t xml:space="preserve"> </w:t>
+      </w:r>
+      <w:hyperlink r:id="rId124">
+        <w:r>
+          <w:rPr>
+            <w:rStyle w:val="Hyperlink"/>
+          </w:rPr>
+          <w:t xml:space="preserve">https://doi.org/10.1056/NEJMms2004740</w:t>
+        </w:r>
+      </w:hyperlink>
+      <w:r>
+        <w:t xml:space="preserve">.</w:t>
+      </w:r>
+    </w:p>
+    <w:bookmarkEnd w:id="125"/>
+    <w:bookmarkStart w:id="127" w:name="ref-wilcoxon1945"/>
+    <w:p>
+      <w:pPr>
+        <w:pStyle w:val="Bibliography"/>
+      </w:pPr>
+      <w:r>
+        <w:t xml:space="preserve">Wilcoxon, Frank. 1945.</w:t>
+      </w:r>
+      <w:r>
+        <w:t xml:space="preserve"> </w:t>
+      </w:r>
+      <w:r>
+        <w:t xml:space="preserve">“Individual Comparisons by Ranking Methods.”</w:t>
+      </w:r>
+      <w:r>
+        <w:t xml:space="preserve"> </w:t>
+      </w:r>
+      <w:r>
+        <w:rPr>
+          <w:i/>
+          <w:iCs/>
+        </w:rPr>
         <w:t xml:space="preserve">Biometrics Bulletin</w:t>
       </w:r>
       <w:r>
@@ -10187,7 +10389,7 @@
       <w:r>
         <w:t xml:space="preserve"> </w:t>
       </w:r>
-      <w:hyperlink r:id="rId118">
+      <w:hyperlink r:id="rId126">
         <w:r>
           <w:rPr>
             <w:rStyle w:val="Hyperlink"/>
@@ -10199,10 +10401,10 @@
         <w:t xml:space="preserve">.</w:t>
       </w:r>
     </w:p>
-    <w:bookmarkEnd w:id="119"/>
-    <w:bookmarkEnd w:id="120"/>
-    <w:bookmarkEnd w:id="121"/>
-    <w:bookmarkEnd w:id="122"/>
+    <w:bookmarkEnd w:id="127"/>
+    <w:bookmarkEnd w:id="128"/>
+    <w:bookmarkEnd w:id="129"/>
+    <w:bookmarkEnd w:id="130"/>
     <w:sectPr>
       <w:footnotePr>
         <w:numRestart w:val="eachSect"/>

</xml_diff>

<commit_message>
Remove unverifiable citation perraudin2021 from all three locations; re-anchor wearable-pipeline and prior-art claims to verified references (FLIRT/foll2021, clifford2012); recompile
</commit_message>
<xml_diff>
--- a/paper/manuscript.docx
+++ b/paper/manuscript.docx
@@ -2,7 +2,7 @@
 <file path=word/document.xml><?xml version="1.0" encoding="utf-8"?>
 <w:document xmlns:w="http://schemas.openxmlformats.org/wordprocessingml/2006/main" xmlns:m="http://schemas.openxmlformats.org/officeDocument/2006/math" xmlns:r="http://schemas.openxmlformats.org/officeDocument/2006/relationships" xmlns:o="urn:schemas-microsoft-com:office:office" xmlns:v="urn:schemas-microsoft-com:vml" xmlns:w10="urn:schemas-microsoft-com:office:word" xmlns:a="http://schemas.openxmlformats.org/drawingml/2006/main" xmlns:pic="http://schemas.openxmlformats.org/drawingml/2006/picture" xmlns:wp="http://schemas.openxmlformats.org/drawingml/2006/wordprocessingDrawing">
   <w:body>
-    <w:bookmarkStart w:id="130" w:name="X492e6e436080a4bb955983327137bd378b3e7de"/>
+    <w:bookmarkStart w:id="128" w:name="X492e6e436080a4bb955983327137bd378b3e7de"/>
     <w:p>
       <w:pPr>
         <w:pStyle w:val="Heading1"/>
@@ -290,16 +290,7 @@
         <w:pStyle w:val="FirstParagraph"/>
       </w:pPr>
       <w:r>
-        <w:t xml:space="preserve">Heart rate as it appears in a wearable research dataset is the output of a multi-stage processing pipeline, optical sensing, motion correction, manufacturer-specific filtering, and peak detection, that is opaque to the downstream researcher. The value entering a machine-learning model is a device-level estimate, not a measurement</w:t>
-      </w:r>
-      <w:r>
-        <w:t xml:space="preserve"> </w:t>
-      </w:r>
-      <w:r>
-        <w:t xml:space="preserve">(Perraudin et al. 2021)</w:t>
-      </w:r>
-      <w:r>
-        <w:t xml:space="preserve">. Most published wearable-AI work treats this estimate as a measurement and reports a single aggregate signal-quality summary per device or per study. Two wrist-worn devices on the same person can disagree by clinically meaningful margins</w:t>
+        <w:t xml:space="preserve">Heart rate as it appears in a wearable research dataset is the output of a multi-stage processing pipeline, optical sensing, motion correction, manufacturer-specific filtering, and peak detection, that is opaque to the downstream researcher. The value entering a machine-learning model is a device-level estimate, not a measurement. Most published wearable-AI work treats this estimate as a measurement and reports a single aggregate signal-quality summary per device or per study. Two wrist-worn devices on the same person can disagree by clinically meaningful margins</w:t>
       </w:r>
       <w:r>
         <w:t xml:space="preserve"> </w:t>
@@ -394,7 +385,7 @@
         <w:t xml:space="preserve"> </w:t>
       </w:r>
       <w:r>
-        <w:t xml:space="preserve">(Perraudin et al. 2021)</w:t>
+        <w:t xml:space="preserve">(Föll et al. 2021)</w:t>
       </w:r>
       <w:r>
         <w:t xml:space="preserve">.</w:t>
@@ -8355,13 +8346,13 @@
         <w:pStyle w:val="FirstParagraph"/>
       </w:pPr>
       <w:r>
-        <w:t xml:space="preserve">Wearable signal-quality auditing has been advocated by several groups, most influentially</w:t>
-      </w:r>
-      <w:r>
-        <w:t xml:space="preserve"> </w:t>
-      </w:r>
-      <w:r>
-        <w:t xml:space="preserve">Perraudin et al. (2021)</w:t>
+        <w:t xml:space="preserve">Wearable signal-quality auditing and feature extraction have been addressed previously, for example by</w:t>
+      </w:r>
+      <w:r>
+        <w:t xml:space="preserve"> </w:t>
+      </w:r>
+      <w:r>
+        <w:t xml:space="preserve">Clifford et al. (2012)</w:t>
       </w:r>
       <w:r>
         <w:t xml:space="preserve"> </w:t>
@@ -8373,7 +8364,7 @@
         <w:t xml:space="preserve"> </w:t>
       </w:r>
       <w:r>
-        <w:t xml:space="preserve">Clifford et al. (2012)</w:t>
+        <w:t xml:space="preserve">Föll et al. (2021)</w:t>
       </w:r>
       <w:r>
         <w:t xml:space="preserve">. Our contribution differs in three ways. First, we combine signal quality with formal reliability, causal-adjusted confounding analysis, and stratified fairness in a single pipeline; prior work tends to address these as separate tools. Second, we provide a doubly-robust AIPW estimator with bootstrap CIs under a user-supplied DAG, which to our knowledge has not been packaged in a wearable-quality framework. Third, we ship a parameter-sweep validation that demonstrates the audit responds to cohort properties rather than to fixed generator values, an unusual practice in synthetic-data methods papers.</w:t>
@@ -8861,7 +8852,7 @@
       </w:r>
     </w:p>
     <w:bookmarkEnd w:id="71"/>
-    <w:bookmarkStart w:id="129" w:name="supplementary-materials"/>
+    <w:bookmarkStart w:id="127" w:name="supplementary-materials"/>
     <w:p>
       <w:pPr>
         <w:pStyle w:val="Heading2"/>
@@ -9005,7 +8996,7 @@
         <w:t xml:space="preserve">: full release history of the toolkit.</w:t>
       </w:r>
     </w:p>
-    <w:bookmarkStart w:id="128" w:name="refs"/>
+    <w:bookmarkStart w:id="126" w:name="refs"/>
     <w:bookmarkStart w:id="73" w:name="ref-allen2007"/>
     <w:p>
       <w:pPr>
@@ -9826,19 +9817,25 @@
       </w:r>
     </w:p>
     <w:bookmarkEnd w:id="103"/>
-    <w:bookmarkStart w:id="105" w:name="ref-perraudin2021"/>
+    <w:bookmarkStart w:id="105" w:name="ref-reiss2019"/>
     <w:p>
       <w:pPr>
         <w:pStyle w:val="Bibliography"/>
       </w:pPr>
       <w:r>
-        <w:t xml:space="preserve">Perraudin, Clémence, Vito Illiano, Felipe Calvo, et al. 2021.</w:t>
-      </w:r>
-      <w:r>
-        <w:t xml:space="preserve"> </w:t>
-      </w:r>
-      <w:r>
-        <w:t xml:space="preserve">“Observations of a Possible New Biomarker of Inflammation in Inflammatory Bowel Disease Using a Digital Biomarker Platform.”</w:t>
+        <w:t xml:space="preserve">Reiss, Attila, Ina Indlekofer, Philip Schmidt, and Kristof Van Laerhoven. 2019.</w:t>
+      </w:r>
+      <w:r>
+        <w:t xml:space="preserve"> </w:t>
+      </w:r>
+      <w:r>
+        <w:t xml:space="preserve">“</w:t>
+      </w:r>
+      <w:r>
+        <w:t xml:space="preserve">Deep PPG</w:t>
+      </w:r>
+      <w:r>
+        <w:t xml:space="preserve">: Large-Scale Heart Rate Estimation with Convolutional Neural Networks.”</w:t>
       </w:r>
       <w:r>
         <w:t xml:space="preserve"> </w:t>
@@ -9848,70 +9845,18 @@
           <w:i/>
           <w:iCs/>
         </w:rPr>
-        <w:t xml:space="preserve">Digital Biomarkers</w:t>
-      </w:r>
-      <w:r>
-        <w:t xml:space="preserve"> </w:t>
-      </w:r>
-      <w:r>
-        <w:t xml:space="preserve">5 (1): 72–80.</w:t>
+        <w:t xml:space="preserve">Sensors</w:t>
+      </w:r>
+      <w:r>
+        <w:t xml:space="preserve"> </w:t>
+      </w:r>
+      <w:r>
+        <w:t xml:space="preserve">19 (14): 3079.</w:t>
       </w:r>
       <w:r>
         <w:t xml:space="preserve"> </w:t>
       </w:r>
       <w:hyperlink r:id="rId104">
-        <w:r>
-          <w:rPr>
-            <w:rStyle w:val="Hyperlink"/>
-          </w:rPr>
-          <w:t xml:space="preserve">https://doi.org/10.1159/000516860</w:t>
-        </w:r>
-      </w:hyperlink>
-      <w:r>
-        <w:t xml:space="preserve">.</w:t>
-      </w:r>
-    </w:p>
-    <w:bookmarkEnd w:id="105"/>
-    <w:bookmarkStart w:id="107" w:name="ref-reiss2019"/>
-    <w:p>
-      <w:pPr>
-        <w:pStyle w:val="Bibliography"/>
-      </w:pPr>
-      <w:r>
-        <w:t xml:space="preserve">Reiss, Attila, Ina Indlekofer, Philip Schmidt, and Kristof Van Laerhoven. 2019.</w:t>
-      </w:r>
-      <w:r>
-        <w:t xml:space="preserve"> </w:t>
-      </w:r>
-      <w:r>
-        <w:t xml:space="preserve">“</w:t>
-      </w:r>
-      <w:r>
-        <w:t xml:space="preserve">Deep PPG</w:t>
-      </w:r>
-      <w:r>
-        <w:t xml:space="preserve">: Large-Scale Heart Rate Estimation with Convolutional Neural Networks.”</w:t>
-      </w:r>
-      <w:r>
-        <w:t xml:space="preserve"> </w:t>
-      </w:r>
-      <w:r>
-        <w:rPr>
-          <w:i/>
-          <w:iCs/>
-        </w:rPr>
-        <w:t xml:space="preserve">Sensors</w:t>
-      </w:r>
-      <w:r>
-        <w:t xml:space="preserve"> </w:t>
-      </w:r>
-      <w:r>
-        <w:t xml:space="preserve">19 (14): 3079.</w:t>
-      </w:r>
-      <w:r>
-        <w:t xml:space="preserve"> </w:t>
-      </w:r>
-      <w:hyperlink r:id="rId106">
         <w:r>
           <w:rPr>
             <w:rStyle w:val="Hyperlink"/>
@@ -9923,8 +9868,8 @@
         <w:t xml:space="preserve">.</w:t>
       </w:r>
     </w:p>
-    <w:bookmarkEnd w:id="107"/>
-    <w:bookmarkStart w:id="109" w:name="ref-robins1994"/>
+    <w:bookmarkEnd w:id="105"/>
+    <w:bookmarkStart w:id="107" w:name="ref-robins1994"/>
     <w:p>
       <w:pPr>
         <w:pStyle w:val="Bibliography"/>
@@ -9957,7 +9902,7 @@
       <w:r>
         <w:t xml:space="preserve"> </w:t>
       </w:r>
-      <w:hyperlink r:id="rId108">
+      <w:hyperlink r:id="rId106">
         <w:r>
           <w:rPr>
             <w:rStyle w:val="Hyperlink"/>
@@ -9969,8 +9914,8 @@
         <w:t xml:space="preserve">.</w:t>
       </w:r>
     </w:p>
-    <w:bookmarkEnd w:id="109"/>
-    <w:bookmarkStart w:id="111" w:name="ref-schafer2013"/>
+    <w:bookmarkEnd w:id="107"/>
+    <w:bookmarkStart w:id="109" w:name="ref-schafer2013"/>
     <w:p>
       <w:pPr>
         <w:pStyle w:val="Bibliography"/>
@@ -10003,7 +9948,7 @@
       <w:r>
         <w:t xml:space="preserve"> </w:t>
       </w:r>
-      <w:hyperlink r:id="rId110">
+      <w:hyperlink r:id="rId108">
         <w:r>
           <w:rPr>
             <w:rStyle w:val="Hyperlink"/>
@@ -10015,8 +9960,8 @@
         <w:t xml:space="preserve">.</w:t>
       </w:r>
     </w:p>
-    <w:bookmarkEnd w:id="111"/>
-    <w:bookmarkStart w:id="113" w:name="ref-schmidt2018"/>
+    <w:bookmarkEnd w:id="109"/>
+    <w:bookmarkStart w:id="111" w:name="ref-schmidt2018"/>
     <w:p>
       <w:pPr>
         <w:pStyle w:val="Bibliography"/>
@@ -10055,7 +10000,7 @@
       <w:r>
         <w:t xml:space="preserve"> </w:t>
       </w:r>
-      <w:hyperlink r:id="rId112">
+      <w:hyperlink r:id="rId110">
         <w:r>
           <w:rPr>
             <w:rStyle w:val="Hyperlink"/>
@@ -10067,8 +10012,8 @@
         <w:t xml:space="preserve">.</w:t>
       </w:r>
     </w:p>
-    <w:bookmarkEnd w:id="113"/>
-    <w:bookmarkStart w:id="115" w:name="ref-shcherbina2017"/>
+    <w:bookmarkEnd w:id="111"/>
+    <w:bookmarkStart w:id="113" w:name="ref-shcherbina2017"/>
     <w:p>
       <w:pPr>
         <w:pStyle w:val="Bibliography"/>
@@ -10101,7 +10046,7 @@
       <w:r>
         <w:t xml:space="preserve"> </w:t>
       </w:r>
-      <w:hyperlink r:id="rId114">
+      <w:hyperlink r:id="rId112">
         <w:r>
           <w:rPr>
             <w:rStyle w:val="Hyperlink"/>
@@ -10113,8 +10058,8 @@
         <w:t xml:space="preserve">.</w:t>
       </w:r>
     </w:p>
-    <w:bookmarkEnd w:id="115"/>
-    <w:bookmarkStart w:id="117" w:name="ref-shrout1979"/>
+    <w:bookmarkEnd w:id="113"/>
+    <w:bookmarkStart w:id="115" w:name="ref-shrout1979"/>
     <w:p>
       <w:pPr>
         <w:pStyle w:val="Bibliography"/>
@@ -10147,7 +10092,7 @@
       <w:r>
         <w:t xml:space="preserve"> </w:t>
       </w:r>
-      <w:hyperlink r:id="rId116">
+      <w:hyperlink r:id="rId114">
         <w:r>
           <w:rPr>
             <w:rStyle w:val="Hyperlink"/>
@@ -10159,8 +10104,8 @@
         <w:t xml:space="preserve">.</w:t>
       </w:r>
     </w:p>
-    <w:bookmarkEnd w:id="117"/>
-    <w:bookmarkStart w:id="119" w:name="ref-sjoding2020"/>
+    <w:bookmarkEnd w:id="115"/>
+    <w:bookmarkStart w:id="117" w:name="ref-sjoding2020"/>
     <w:p>
       <w:pPr>
         <w:pStyle w:val="Bibliography"/>
@@ -10193,7 +10138,7 @@
       <w:r>
         <w:t xml:space="preserve"> </w:t>
       </w:r>
-      <w:hyperlink r:id="rId118">
+      <w:hyperlink r:id="rId116">
         <w:r>
           <w:rPr>
             <w:rStyle w:val="Hyperlink"/>
@@ -10205,8 +10150,8 @@
         <w:t xml:space="preserve">.</w:t>
       </w:r>
     </w:p>
-    <w:bookmarkEnd w:id="119"/>
-    <w:bookmarkStart w:id="121" w:name="ref-sukor2011"/>
+    <w:bookmarkEnd w:id="117"/>
+    <w:bookmarkStart w:id="119" w:name="ref-sukor2011"/>
     <w:p>
       <w:pPr>
         <w:pStyle w:val="Bibliography"/>
@@ -10239,7 +10184,7 @@
       <w:r>
         <w:t xml:space="preserve"> </w:t>
       </w:r>
-      <w:hyperlink r:id="rId120">
+      <w:hyperlink r:id="rId118">
         <w:r>
           <w:rPr>
             <w:rStyle w:val="Hyperlink"/>
@@ -10251,8 +10196,8 @@
         <w:t xml:space="preserve">.</w:t>
       </w:r>
     </w:p>
-    <w:bookmarkEnd w:id="121"/>
-    <w:bookmarkStart w:id="123" w:name="ref-vasey2022decideai"/>
+    <w:bookmarkEnd w:id="119"/>
+    <w:bookmarkStart w:id="121" w:name="ref-vasey2022decideai"/>
     <w:p>
       <w:pPr>
         <w:pStyle w:val="Bibliography"/>
@@ -10297,7 +10242,7 @@
       <w:r>
         <w:t xml:space="preserve"> </w:t>
       </w:r>
-      <w:hyperlink r:id="rId122">
+      <w:hyperlink r:id="rId120">
         <w:r>
           <w:rPr>
             <w:rStyle w:val="Hyperlink"/>
@@ -10309,8 +10254,8 @@
         <w:t xml:space="preserve">.</w:t>
       </w:r>
     </w:p>
-    <w:bookmarkEnd w:id="123"/>
-    <w:bookmarkStart w:id="125" w:name="ref-vyas2020"/>
+    <w:bookmarkEnd w:id="121"/>
+    <w:bookmarkStart w:id="123" w:name="ref-vyas2020"/>
     <w:p>
       <w:pPr>
         <w:pStyle w:val="Bibliography"/>
@@ -10343,7 +10288,7 @@
       <w:r>
         <w:t xml:space="preserve"> </w:t>
       </w:r>
-      <w:hyperlink r:id="rId124">
+      <w:hyperlink r:id="rId122">
         <w:r>
           <w:rPr>
             <w:rStyle w:val="Hyperlink"/>
@@ -10355,8 +10300,8 @@
         <w:t xml:space="preserve">.</w:t>
       </w:r>
     </w:p>
-    <w:bookmarkEnd w:id="125"/>
-    <w:bookmarkStart w:id="127" w:name="ref-wilcoxon1945"/>
+    <w:bookmarkEnd w:id="123"/>
+    <w:bookmarkStart w:id="125" w:name="ref-wilcoxon1945"/>
     <w:p>
       <w:pPr>
         <w:pStyle w:val="Bibliography"/>
@@ -10389,7 +10334,7 @@
       <w:r>
         <w:t xml:space="preserve"> </w:t>
       </w:r>
-      <w:hyperlink r:id="rId126">
+      <w:hyperlink r:id="rId124">
         <w:r>
           <w:rPr>
             <w:rStyle w:val="Hyperlink"/>
@@ -10401,10 +10346,10 @@
         <w:t xml:space="preserve">.</w:t>
       </w:r>
     </w:p>
+    <w:bookmarkEnd w:id="125"/>
+    <w:bookmarkEnd w:id="126"/>
     <w:bookmarkEnd w:id="127"/>
     <w:bookmarkEnd w:id="128"/>
-    <w:bookmarkEnd w:id="129"/>
-    <w:bookmarkEnd w:id="130"/>
     <w:sectPr>
       <w:footnotePr>
         <w:numRestart w:val="eachSect"/>

</xml_diff>

<commit_message>
Fix five issues found in full read: remove fabricated Perraudin and Mertes from References section, remove 'gray area' from Background/Discussion/Conclusions for consistency with abstract, fix markdown artifact in 3.2, add PPG-DaLiA to ethics statement, correct primary-test cross-reference to Section 2.10
</commit_message>
<xml_diff>
--- a/paper/manuscript.docx
+++ b/paper/manuscript.docx
@@ -414,7 +414,7 @@
         <w:t xml:space="preserve">(Schmidt et al. 2018)</w:t>
       </w:r>
       <w:r>
-        <w:t xml:space="preserve">. We show that the three published methods disagree with each other on the gray area (median pairwise Cohen’s κ = -0.20) but converge on rejecting 44.6% of windows that a representative in-house threshold accepts; single-threshold recalibration at n = 15 does not recover agreement; and audit-based filtering improves downstream per-subject HR correlation by a median of +0.110. To enable reproducibility and reuse, we implement the audit pipeline as an open-source Python toolkit (</w:t>
+        <w:t xml:space="preserve">. We show that the three published methods disagree with each other (median pairwise Cohen’s κ = -0.20) but converge on rejecting 44.6% of windows that a representative in-house threshold accepts; single-threshold recalibration at n = 15 does not recover agreement; and audit-based filtering improves downstream per-subject HR correlation by a median of +0.110. To enable reproducibility and reuse, we implement the audit pipeline as an open-source Python toolkit (</w:t>
       </w:r>
       <w:r>
         <w:rPr>
@@ -3351,7 +3351,7 @@
         <w:pStyle w:val="BodyText"/>
       </w:pPr>
       <w:r>
-        <w:t xml:space="preserve">**** 44.6% of real wrist PPG windows are rejected by Orphanidou AND Sukor AND Elgendi simultaneously - three baselines, three different physical properties, three concordant rejections - and yet the in-house default threshold (0.70) passes every single one of them (a stacked-bar view of the same finding is in Supplementary Figure S4). The case for the in-house SQI binarization being inappropriate on real wrist PPG no longer rests on agreement with any one baseline; it rests on consensus rejection across three orthogonal published methods that each test a distinct property of pulse waveforms.</w:t>
+        <w:t xml:space="preserve">44.6% of real wrist PPG windows are rejected by Orphanidou AND Sukor AND Elgendi simultaneously - three baselines, three different physical properties, three concordant rejections - and yet the in-house default threshold (0.70) passes every single one of them (a stacked-bar view of the same finding is in Supplementary Figure S4). The case for the in-house SQI binarization being inappropriate on real wrist PPG no longer rests on agreement with any one baseline; it rests on consensus rejection across three orthogonal published methods that each test a distinct property of pulse waveforms.</w:t>
       </w:r>
     </w:p>
     <w:p>
@@ -8286,7 +8286,7 @@
         <w:t xml:space="preserve"> </w:t>
       </w:r>
       <w:r>
-        <w:t xml:space="preserve">The published methods individually pass 21.5% to 25.6% of windows but collectively reject 44.6% of windows accepted by a representative in-house threshold. Pairwise Cohen’s κ across the three published methods spans -0.23 to +0.41 (median -0.20), indicating that the methods agree on neither the pass nor the reject set in the gray area but converge on rejecting a substantial population of windows. Each method tests a different physical property (Orphanidou: pulse-shape correlation; Sukor: pulse-to-pulse interval consistency; Elgendi: amplitude-distribution statistics), so the consensus rejection is not driven by a shared methodological assumption. The same pattern replicates on PPG-DaLiA (n = 15 subjects, 18,781 windows, same wrist-PPG hardware but ambulatory rather than stress paradigm): consensus rejection 43.1%, median pairwise published κ = -0.20, κ = 0.000 against the in-house threshold across all three published methods.</w:t>
+        <w:t xml:space="preserve">The published methods individually pass 21.5% to 25.6% of windows but collectively reject 44.6% of windows accepted by a representative in-house threshold. Pairwise Cohen’s κ across the three published methods spans -0.23 to +0.41 (median -0.20), indicating that the methods agree on neither the pass nor the reject set but converge on rejecting a substantial population of windows. Each method tests a different physical property (Orphanidou: pulse-shape correlation; Sukor: pulse-to-pulse interval consistency; Elgendi: amplitude-distribution statistics), so the consensus rejection is not driven by a shared methodological assumption. The same pattern replicates on PPG-DaLiA (n = 15 subjects, 18,781 windows, same wrist-PPG hardware but ambulatory rather than stress paradigm): consensus rejection 43.1%, median pairwise published κ = -0.20, κ = 0.000 against the in-house threshold across all three published methods.</w:t>
       </w:r>
     </w:p>
     <w:p>
@@ -8620,7 +8620,7 @@
         <w:t xml:space="preserve"> </w:t>
       </w:r>
       <w:r>
-        <w:t xml:space="preserve">The primary pre-specified test (Section 2.9) is a single comparison and requires no correction. The Table 8 LOSO AUROC contrasts, the per-subject effect-size tables in the supplement (Tables S3, S4), and the AIPW point estimates are reported uncorrected for descriptive interpretation; Benjamini-Hochberg correction across the three audit-condition comparisons in Tables 8 and 9 does not change any substantive conclusion (Section 2.9).</w:t>
+        <w:t xml:space="preserve">The primary pre-specified test (Section 2.10) is a single comparison and requires no correction. The Table 8 LOSO AUROC contrasts, the per-subject effect-size tables in the supplement (Tables S3, S4), and the AIPW point estimates are reported uncorrected for descriptive interpretation; Benjamini-Hochberg correction across the three audit-condition comparisons in Tables 8 and 9 does not change any substantive conclusion (Section 2.10).</w:t>
       </w:r>
     </w:p>
     <w:p>
@@ -8675,7 +8675,7 @@
         <w:pStyle w:val="FirstParagraph"/>
       </w:pPr>
       <w:r>
-        <w:t xml:space="preserve">On a public wearable-PPG benchmark (WESAD, n = 15 subjects, 6,585 windows), three independently developed published signal-quality methods, Orphanidou (2015), Sukor (2011), and Elgendi (2016), collectively reject 44.6% of windows accepted by a representative in-house threshold. The three methods disagree with each other on the gray area (median pairwise Cohen’s κ = -0.20) but converge on the consensus rejection set. Single-threshold recalibration at n = 15 does not recover agreement, and per-subject heterogeneity in cross-modality HR disagreement spans a four-fold range across subjects. Restricting downstream models to multi-baseline-pass windows improves per-subject HR correlation by a median of +0.110 (paired Wilcoxon p = 1.5e-04). The finding replicates on a second public benchmark (PPG-DaLiA, n = 15, 18,781 windows; same wrist-PPG hardware but ambulatory activity paradigm rather than stress paradigm): consensus rejection 43.1%, median pairwise κ across published methods -0.20, κ against the in-house threshold 0.000, with all three published-method pass rates within 3 percentage points of their WESAD values. The implication for wearable-AI research practice is that single-method SQI reporting is insufficient: multi-baseline auditing should be standard supplementary material in wearable-AI publications.</w:t>
+        <w:t xml:space="preserve">On a public wearable-PPG benchmark (WESAD, n = 15 subjects, 6,585 windows), three independently developed published signal-quality methods, Orphanidou (2015), Sukor (2011), and Elgendi (2016), collectively reject 44.6% of windows accepted by a representative in-house threshold. The three methods disagree with each other (median pairwise Cohen’s κ = -0.20) but converge on the consensus rejection set. Single-threshold recalibration at n = 15 does not recover agreement, and per-subject heterogeneity in cross-modality HR disagreement spans a four-fold range across subjects. Restricting downstream models to multi-baseline-pass windows improves per-subject HR correlation by a median of +0.110 (paired Wilcoxon p = 1.5e-04). The finding replicates on a second public benchmark (PPG-DaLiA, n = 15, 18,781 windows; same wrist-PPG hardware but ambulatory activity paradigm rather than stress paradigm): consensus rejection 43.1%, median pairwise κ across published methods -0.20, κ against the in-house threshold 0.000, with all three published-method pass rates within 3 percentage points of their WESAD values. The implication for wearable-AI research practice is that single-method SQI reporting is insufficient: multi-baseline auditing should be standard supplementary material in wearable-AI publications.</w:t>
       </w:r>
     </w:p>
     <w:p>
@@ -8788,13 +8788,25 @@
         <w:pStyle w:val="FirstParagraph"/>
       </w:pPr>
       <w:r>
-        <w:t xml:space="preserve">This study is a secondary analysis of the publicly available WESAD dataset</w:t>
+        <w:t xml:space="preserve">This study is a secondary analysis of two publicly available datasets, WESAD</w:t>
       </w:r>
       <w:r>
         <w:t xml:space="preserve"> </w:t>
       </w:r>
       <w:r>
         <w:t xml:space="preserve">(Schmidt et al. 2018)</w:t>
+      </w:r>
+      <w:r>
+        <w:t xml:space="preserve"> </w:t>
+      </w:r>
+      <w:r>
+        <w:t xml:space="preserve">and PPG-DaLiA</w:t>
+      </w:r>
+      <w:r>
+        <w:t xml:space="preserve"> </w:t>
+      </w:r>
+      <w:r>
+        <w:t xml:space="preserve">(Reiss et al. 2019)</w:t>
       </w:r>
       <w:r>
         <w:t xml:space="preserve">, released under terms permitting research use. No new human-subjects data were collected; institutional review board approval was therefore not required for this work.</w:t>
@@ -8848,7 +8860,7 @@
         <w:t xml:space="preserve"> </w:t>
       </w:r>
       <w:r>
-        <w:t xml:space="preserve">for full citations (Orphanidou et al. 2015, Sukor et al. 2011, Clifford et al. 2012, Robins et al. 1994, Shrout &amp; Fleiss 1979, Bland &amp; Altman 1986, Schmidt et al. 2018, Perraudin et al. 2021, Föll et al. 2021, Mertes et al. 2022, Efron &amp; Tibshirani 1993, Malik 1996).</w:t>
+        <w:t xml:space="preserve">for full citations (Orphanidou et al. 2015, Sukor et al. 2011, Clifford et al. 2012, Robins et al. 1994, Shrout &amp; Fleiss 1979, Bland &amp; Altman 1986, Schmidt et al. 2018, Föll et al. 2021, Efron &amp; Tibshirani 1993, Malik 1996).</w:t>
       </w:r>
     </w:p>
     <w:bookmarkEnd w:id="71"/>

</xml_diff>

<commit_message>
Retitle to lead with the single-threshold-insufficiency finding; add co-authors Mehmet Ozberk Olcan and Seckin Olcan (Faculty of Medicine, Cukurova University) with ORCIDs and writing contributions; update competing-interests and limitation text from single-author to multi-author; recompile
</commit_message>
<xml_diff>
--- a/paper/manuscript.docx
+++ b/paper/manuscript.docx
@@ -2,16 +2,19 @@
 <file path=word/document.xml><?xml version="1.0" encoding="utf-8"?>
 <w:document xmlns:w="http://schemas.openxmlformats.org/wordprocessingml/2006/main" xmlns:m="http://schemas.openxmlformats.org/officeDocument/2006/math" xmlns:r="http://schemas.openxmlformats.org/officeDocument/2006/relationships" xmlns:o="urn:schemas-microsoft-com:office:office" xmlns:v="urn:schemas-microsoft-com:vml" xmlns:w10="urn:schemas-microsoft-com:office:word" xmlns:a="http://schemas.openxmlformats.org/drawingml/2006/main" xmlns:pic="http://schemas.openxmlformats.org/drawingml/2006/picture" xmlns:wp="http://schemas.openxmlformats.org/drawingml/2006/wordprocessingDrawing">
   <w:body>
-    <w:bookmarkStart w:id="128" w:name="X492e6e436080a4bb955983327137bd378b3e7de"/>
+    <w:bookmarkStart w:id="130" w:name="X2a6ad74602addf8e6cd2d7e44f3b1c0d89e76e6"/>
     <w:p>
       <w:pPr>
         <w:pStyle w:val="Heading1"/>
       </w:pPr>
       <w:r>
-        <w:t xml:space="preserve">Wearable Photoplethysmography Signal-Quality Methods Disagree at Scale: A Multi-Baseline Audit of the WESAD Dataset</w:t>
-      </w:r>
-    </w:p>
-    <w:p>
+        <w:t xml:space="preserve">A Single Signal-Quality Threshold Is Insufficient for Wearable Photoplethysmography: A Multi-Baseline Audit on WESAD and PPG-DaLiA</w:t>
+      </w:r>
+    </w:p>
+    <w:p>
+      <w:pPr>
+        <w:pStyle w:val="FirstParagraph"/>
+      </w:pPr>
       <w:r>
         <w:rPr>
           <w:b/>
@@ -23,12 +26,12 @@
         <w:t xml:space="preserve"> </w:t>
       </w:r>
       <w:r>
-        <w:t xml:space="preserve">Ceyhun Olcan¹</w:t>
-      </w:r>
-    </w:p>
-    <w:p>
-      <w:pPr>
-        <w:pStyle w:val="FirstParagraph"/>
+        <w:t xml:space="preserve">Ceyhun Olcan¹, Mehmet Ozberk Olcan², Seckin Olcan²</w:t>
+      </w:r>
+    </w:p>
+    <w:p>
+      <w:pPr>
+        <w:pStyle w:val="BodyText"/>
       </w:pPr>
       <w:r>
         <w:rPr>
@@ -62,6 +65,14 @@
       </w:pPr>
       <w:r>
         <w:t xml:space="preserve">¹ Center for Technology and Behavioral Health, Geisel School of Medicine at Dartmouth, Lebanon, NH 03766, USA.</w:t>
+      </w:r>
+    </w:p>
+    <w:p>
+      <w:pPr>
+        <w:pStyle w:val="BodyText"/>
+      </w:pPr>
+      <w:r>
+        <w:t xml:space="preserve">² Faculty of Medicine, Cukurova University, Adana, Turkey.</w:t>
       </w:r>
     </w:p>
     <w:p>
@@ -93,10 +104,38 @@
         </w:r>
       </w:hyperlink>
       <w:r>
+        <w:t xml:space="preserve">; Mehmet Ozberk Olcan:</w:t>
+      </w:r>
+      <w:r>
+        <w:t xml:space="preserve"> </w:t>
+      </w:r>
+      <w:hyperlink r:id="rId10">
+        <w:r>
+          <w:rPr>
+            <w:rStyle w:val="Hyperlink"/>
+          </w:rPr>
+          <w:t xml:space="preserve">0009-0003-5233-4475</w:t>
+        </w:r>
+      </w:hyperlink>
+      <w:r>
+        <w:t xml:space="preserve">; Seckin Olcan:</w:t>
+      </w:r>
+      <w:r>
+        <w:t xml:space="preserve"> </w:t>
+      </w:r>
+      <w:hyperlink r:id="rId11">
+        <w:r>
+          <w:rPr>
+            <w:rStyle w:val="Hyperlink"/>
+          </w:rPr>
+          <w:t xml:space="preserve">0009-0007-4033-7491</w:t>
+        </w:r>
+      </w:hyperlink>
+      <w:r>
         <w:t xml:space="preserve">.</w:t>
       </w:r>
     </w:p>
-    <w:bookmarkStart w:id="10" w:name="abstract"/>
+    <w:bookmarkStart w:id="12" w:name="abstract"/>
     <w:p>
       <w:pPr>
         <w:pStyle w:val="Heading2"/>
@@ -275,8 +314,8 @@
         <w:t xml:space="preserve">Keywords. photoplethysmography signal quality; multi-baseline audit; wearable digital biomarkers; cross-method agreement; reproducibility; WESAD</w:t>
       </w:r>
     </w:p>
-    <w:bookmarkEnd w:id="10"/>
-    <w:bookmarkStart w:id="14" w:name="background"/>
+    <w:bookmarkEnd w:id="12"/>
+    <w:bookmarkStart w:id="16" w:name="background"/>
     <w:p>
       <w:pPr>
         <w:pStyle w:val="Heading2"/>
@@ -435,18 +474,18 @@
           <wp:inline>
             <wp:extent cx="5334000" cy="2459481"/>
             <wp:effectExtent b="0" l="0" r="0" t="0"/>
-            <wp:docPr descr="Figure 1. Cross-method signal-quality disagreement on wearable photoplethysmography. Each colored disk represents the subset of windows accepted by one published method on each dataset (schematic; not proportional). The region outside all three disks represents the consensus rejection by all three independently developed methods (44.6% on WESAD; 43.1% on PPG-DaLiA). The three methods individually disagree about which windows pass (median pairwise Cohen’s kappa = -0.20) but converge on which to reject. Headline numbers in the figure are uncorrected and identical to those in Table 4 (WESAD) and Table 10 (PPG-DaLiA)." title="" id="12" name="Picture"/>
+            <wp:docPr descr="Figure 1. Cross-method signal-quality disagreement on wearable photoplethysmography. Each colored disk represents the subset of windows accepted by one published method on each dataset (schematic; not proportional). The region outside all three disks represents the consensus rejection by all three independently developed methods (44.6% on WESAD; 43.1% on PPG-DaLiA). The three methods individually disagree about which windows pass (median pairwise Cohen’s kappa = -0.20) but converge on which to reject. Headline numbers in the figure are uncorrected and identical to those in Table 4 (WESAD) and Table 10 (PPG-DaLiA)." title="" id="14" name="Picture"/>
             <a:graphic>
               <a:graphicData uri="http://schemas.openxmlformats.org/drawingml/2006/picture">
                 <pic:pic>
                   <pic:nvPicPr>
-                    <pic:cNvPr descr="paper/figures/fig1_conceptual.png" id="13" name="Picture"/>
+                    <pic:cNvPr descr="paper/figures/fig1_conceptual.png" id="15" name="Picture"/>
                     <pic:cNvPicPr>
                       <a:picLocks noChangeArrowheads="1" noChangeAspect="1"/>
                     </pic:cNvPicPr>
                   </pic:nvPicPr>
                   <pic:blipFill>
-                    <a:blip r:embed="rId11"/>
+                    <a:blip r:embed="rId13"/>
                     <a:stretch>
                       <a:fillRect/>
                     </a:stretch>
@@ -481,8 +520,8 @@
         <w:t xml:space="preserve">Figure 1. Cross-method signal-quality disagreement on wearable photoplethysmography. Each colored disk represents the subset of windows accepted by one published method on each dataset (schematic; not proportional). The region outside all three disks represents the consensus rejection by all three independently developed methods (44.6% on WESAD; 43.1% on PPG-DaLiA). The three methods individually disagree about which windows pass (median pairwise Cohen’s kappa = -0.20) but converge on which to reject. Headline numbers in the figure are uncorrected and identical to those in Table 4 (WESAD) and Table 10 (PPG-DaLiA).</w:t>
       </w:r>
     </w:p>
-    <w:bookmarkEnd w:id="14"/>
-    <w:bookmarkStart w:id="25" w:name="methods"/>
+    <w:bookmarkEnd w:id="16"/>
+    <w:bookmarkStart w:id="27" w:name="methods"/>
     <w:p>
       <w:pPr>
         <w:pStyle w:val="Heading2"/>
@@ -491,7 +530,7 @@
         <w:t xml:space="preserve">2. Methods</w:t>
       </w:r>
     </w:p>
-    <w:bookmarkStart w:id="15" w:name="overview"/>
+    <w:bookmarkStart w:id="17" w:name="overview"/>
     <w:p>
       <w:pPr>
         <w:pStyle w:val="Heading3"/>
@@ -517,8 +556,8 @@
         <w:t xml:space="preserve">, MIT licensed) that takes a wearable dataset in a canonical daily-summary schema and produces five categories of output: per-window artifact findings, participant-level reliability primitives, a six-component Digital Biomarker Trust Score, a screening and AIPW-adjusted confounding analysis, and a stratified fairness audit. The empirical contribution is the multi-baseline SQI audit on WESAD with replication on PPG-DaLiA (Section 3), which uses the window-level artifact detection (Section 2.3), the reliability primitives (Section 2.4), and the published-baseline integration (Section 2.8). Synthetic-cohort analyses (Section 4) validate the remaining framework components on parameterised data with documented injected failure modes: the Digital Biomarker Trust Score (Section 2.5), the AIPW-adjusted confounding analysis (Section 2.6), and the stratified fairness audit (Section 2.7). The synthetic validation does not bear on the empirical findings on real wearable data; it characterises framework components available for follow-up studies on other datasets. The whole synthetic pipeline runs end-to-end in approximately two minutes on a modern laptop CPU; the full 15-subject WESAD analysis takes approximately three minutes.</w:t>
       </w:r>
     </w:p>
-    <w:bookmarkEnd w:id="15"/>
-    <w:bookmarkStart w:id="16" w:name="synthetic-cohort"/>
+    <w:bookmarkEnd w:id="17"/>
+    <w:bookmarkStart w:id="18" w:name="synthetic-cohort"/>
     <w:p>
       <w:pPr>
         <w:pStyle w:val="Heading3"/>
@@ -722,8 +761,8 @@
         <w:t xml:space="preserve">capped at 0.6. This breaks naive imputation methods and forces the missingness-as-information module to do real work.</w:t>
       </w:r>
     </w:p>
-    <w:bookmarkEnd w:id="16"/>
-    <w:bookmarkStart w:id="17" w:name="window-level-artifact-detection"/>
+    <w:bookmarkEnd w:id="18"/>
+    <w:bookmarkStart w:id="19" w:name="window-level-artifact-detection"/>
     <w:p>
       <w:pPr>
         <w:pStyle w:val="Heading3"/>
@@ -770,8 +809,8 @@
         <w:t xml:space="preserve">and were hand-tuned on the synthetic generator; the real-data pilot demonstrates these thresholds do not transfer without recalibration (Section 3.3).</w:t>
       </w:r>
     </w:p>
-    <w:bookmarkEnd w:id="17"/>
-    <w:bookmarkStart w:id="18" w:name="reliability-primitives"/>
+    <w:bookmarkEnd w:id="19"/>
+    <w:bookmarkStart w:id="20" w:name="reliability-primitives"/>
     <w:p>
       <w:pPr>
         <w:pStyle w:val="Heading3"/>
@@ -924,8 +963,8 @@
         <w:t xml:space="preserve">. We tested four alternative policies (raw, plausibility-only, Malik 10%, NN50) and confirmed S3’s high HRV holds across raw, plausibility-only, and Malik 25% (supplement S2.4). The Malik 25% policy is the conservative middle ground recommended by the HRV Task Force standards.</w:t>
       </w:r>
     </w:p>
-    <w:bookmarkEnd w:id="18"/>
-    <w:bookmarkStart w:id="19" w:name="digital-biomarker-trust-score"/>
+    <w:bookmarkEnd w:id="20"/>
+    <w:bookmarkStart w:id="21" w:name="digital-biomarker-trust-score"/>
     <w:p>
       <w:pPr>
         <w:pStyle w:val="Heading3"/>
@@ -1403,8 +1442,8 @@
         <w:t xml:space="preserve">routine searches the 6-component weight simplex (Dirichlet sampling plus local grid refinement) to maximize Spearman correlation between the overall trust score and a user-supplied downstream reproducibility target. A 30% participant-level holdout is reserved from the search; the learned weights are reported with their holdout Spearman.</w:t>
       </w:r>
     </w:p>
-    <w:bookmarkEnd w:id="19"/>
-    <w:bookmarkStart w:id="20" w:name="causal-adjusted-confounding-analysis"/>
+    <w:bookmarkEnd w:id="21"/>
+    <w:bookmarkStart w:id="22" w:name="causal-adjusted-confounding-analysis"/>
     <w:p>
       <w:pPr>
         <w:pStyle w:val="Heading3"/>
@@ -1448,8 +1487,8 @@
         <w:t xml:space="preserve">string in the output.</w:t>
       </w:r>
     </w:p>
-    <w:bookmarkEnd w:id="20"/>
-    <w:bookmarkStart w:id="21" w:name="fairness-audit"/>
+    <w:bookmarkEnd w:id="22"/>
+    <w:bookmarkStart w:id="23" w:name="fairness-audit"/>
     <w:p>
       <w:pPr>
         <w:pStyle w:val="Heading3"/>
@@ -1475,8 +1514,8 @@
         <w:t xml:space="preserve">, motivating a routine subgroup check. Stratified bootstrap analysis over any categorical column (device family, skin-tone quartile, sex, age band). For each stratum and each DBTS component, we report the mean, 95% cluster-bootstrap CI (resampling participants, not rows), and the Q1-vs-Q4 disparity with its CI. Forest plots are generated automatically.</w:t>
       </w:r>
     </w:p>
-    <w:bookmarkEnd w:id="21"/>
-    <w:bookmarkStart w:id="22" w:name="published-baselines"/>
+    <w:bookmarkEnd w:id="23"/>
+    <w:bookmarkStart w:id="24" w:name="published-baselines"/>
     <w:p>
       <w:pPr>
         <w:pStyle w:val="Heading3"/>
@@ -1650,8 +1689,8 @@
         <w:t xml:space="preserve">Agreement metrics for each pairwise comparison are reported as Spearman ρ on the continuous scores, Cohen’s κ on the binary pass/fail labels, and a full 2×2 crosstab.</w:t>
       </w:r>
     </w:p>
-    <w:bookmarkEnd w:id="22"/>
-    <w:bookmarkStart w:id="23" w:name="study-design"/>
+    <w:bookmarkEnd w:id="24"/>
+    <w:bookmarkStart w:id="25" w:name="study-design"/>
     <w:p>
       <w:pPr>
         <w:pStyle w:val="Heading3"/>
@@ -1680,8 +1719,8 @@
         <w:t xml:space="preserve">(n = 15 subjects, S2-S17 minus S1 and S12 which are absent from the standard public release). Two supporting analyses use the same audit pipeline on parameterised data to characterise the audit components: (i) a 300-participant 60-day synthetic cohort with documented injected failure modes (Section 2.2), and (ii) a cross-cohort parameter sweep across five synthetic regimes (default, strong environment, inverted skin-tone, severe device bias, clean world) to test the audit’s responsiveness to controlled changes in cohort properties. Reproducibility of every reported number is verified from a fixed seed on every continuous-integration run.</w:t>
       </w:r>
     </w:p>
-    <w:bookmarkEnd w:id="23"/>
-    <w:bookmarkStart w:id="24" w:name="statistical-analysis"/>
+    <w:bookmarkEnd w:id="25"/>
+    <w:bookmarkStart w:id="26" w:name="statistical-analysis"/>
     <w:p>
       <w:pPr>
         <w:pStyle w:val="Heading3"/>
@@ -1744,9 +1783,9 @@
         <w:t xml:space="preserve">The PPG-DaLiA replication (Section 3.7) tests the same headline metric (in-house pass AND all three published methods fail) on a second public benchmark and is a pre-specified replication of the WESAD finding rather than a new hypothesis.</w:t>
       </w:r>
     </w:p>
-    <w:bookmarkEnd w:id="24"/>
-    <w:bookmarkEnd w:id="25"/>
-    <w:bookmarkStart w:id="46" w:name="cross-method-audit-on-wesad"/>
+    <w:bookmarkEnd w:id="26"/>
+    <w:bookmarkEnd w:id="27"/>
+    <w:bookmarkStart w:id="48" w:name="cross-method-audit-on-wesad"/>
     <w:p>
       <w:pPr>
         <w:pStyle w:val="Heading2"/>
@@ -1775,7 +1814,7 @@
         <w:t xml:space="preserve">(S2-S17, with S1 and S12 absent from the standard public release), producing 6,585 5-second windows of synchronized chest RespiBAN ECG (700 Hz) and wrist Empatica E4 PPG (64 Hz) across baseline (3,507 windows), stress (1,979), and amusement (1,099) labeled states.</w:t>
       </w:r>
     </w:p>
-    <w:bookmarkStart w:id="26" w:name="reporting-standards-and-reproducibility"/>
+    <w:bookmarkStart w:id="28" w:name="reporting-standards-and-reproducibility"/>
     <w:p>
       <w:pPr>
         <w:pStyle w:val="Heading3"/>
@@ -2005,8 +2044,8 @@
         <w:t xml:space="preserve">) shows the flow of data through the WESAD validation pipeline in the STARD-style convention: source dataset, n=15 subjects analysed, per-window processing, zero post-hoc exclusions, and the four analysis arms operating on the same 6,585 windows.</w:t>
       </w:r>
     </w:p>
-    <w:bookmarkEnd w:id="26"/>
-    <w:bookmarkStart w:id="30" w:name="X83e78e9dd801c6e70ab9eb8d0c52cab58f1f44b"/>
+    <w:bookmarkEnd w:id="28"/>
+    <w:bookmarkStart w:id="32" w:name="X83e78e9dd801c6e70ab9eb8d0c52cab58f1f44b"/>
     <w:p>
       <w:pPr>
         <w:pStyle w:val="Heading3"/>
@@ -2447,18 +2486,18 @@
           <wp:inline>
             <wp:extent cx="5334000" cy="3622178"/>
             <wp:effectExtent b="0" l="0" r="0" t="0"/>
-            <wp:docPr descr="Figure 2. Bland-Altman cross-modality HR agreement on WESAD (n = 15 subjects, 6,569 paired 5-second windows). Each point is one window. Mean bias (PPG minus ECG) = +3.57 bpm; 95% limits of agreement [-23.14, +30.28] bpm. Pearson r = +0.70 between modalities." title="" id="28" name="Picture"/>
+            <wp:docPr descr="Figure 2. Bland-Altman cross-modality HR agreement on WESAD (n = 15 subjects, 6,569 paired 5-second windows). Each point is one window. Mean bias (PPG minus ECG) = +3.57 bpm; 95% limits of agreement [-23.14, +30.28] bpm. Pearson r = +0.70 between modalities." title="" id="30" name="Picture"/>
             <a:graphic>
               <a:graphicData uri="http://schemas.openxmlformats.org/drawingml/2006/picture">
                 <pic:pic>
                   <pic:nvPicPr>
-                    <pic:cNvPr descr="paper/figures/fig1_bland_altman.png" id="29" name="Picture"/>
+                    <pic:cNvPr descr="paper/figures/fig1_bland_altman.png" id="31" name="Picture"/>
                     <pic:cNvPicPr>
                       <a:picLocks noChangeArrowheads="1" noChangeAspect="1"/>
                     </pic:cNvPicPr>
                   </pic:nvPicPr>
                   <pic:blipFill>
-                    <a:blip r:embed="rId27"/>
+                    <a:blip r:embed="rId29"/>
                     <a:stretch>
                       <a:fillRect/>
                     </a:stretch>
@@ -2493,8 +2532,8 @@
         <w:t xml:space="preserve">Figure 2. Bland-Altman cross-modality HR agreement on WESAD (n = 15 subjects, 6,569 paired 5-second windows). Each point is one window. Mean bias (PPG minus ECG) = +3.57 bpm; 95% limits of agreement [-23.14, +30.28] bpm. Pearson r = +0.70 between modalities.</w:t>
       </w:r>
     </w:p>
-    <w:bookmarkEnd w:id="30"/>
-    <w:bookmarkStart w:id="34" w:name="Xe41713c60b8037e7c6e4ae4c7f679570120e6a4"/>
+    <w:bookmarkEnd w:id="32"/>
+    <w:bookmarkStart w:id="36" w:name="Xe41713c60b8037e7c6e4ae4c7f679570120e6a4"/>
     <w:p>
       <w:pPr>
         <w:pStyle w:val="Heading3"/>
@@ -3371,18 +3410,18 @@
           <wp:inline>
             <wp:extent cx="5334000" cy="4677605"/>
             <wp:effectExtent b="0" l="0" r="0" t="0"/>
-            <wp:docPr descr="Figure 3. Cross-method PPG signal-quality agreement on WESAD (n = 6,585 windows). The in-house threshold passes 100% of windows; the three published methods individually pass 21.5 to 25.6%. Pairwise Cohen’s kappa across the three published methods spans -0.23 to +0.41 (median -0.20)." title="" id="32" name="Picture"/>
+            <wp:docPr descr="Figure 3. Cross-method PPG signal-quality agreement on WESAD (n = 6,585 windows). The in-house threshold passes 100% of windows; the three published methods individually pass 21.5 to 25.6%. Pairwise Cohen’s kappa across the three published methods spans -0.23 to +0.41 (median -0.20)." title="" id="34" name="Picture"/>
             <a:graphic>
               <a:graphicData uri="http://schemas.openxmlformats.org/drawingml/2006/picture">
                 <pic:pic>
                   <pic:nvPicPr>
-                    <pic:cNvPr descr="paper/figures/fig3_kappa_heatmap.png" id="33" name="Picture"/>
+                    <pic:cNvPr descr="paper/figures/fig3_kappa_heatmap.png" id="35" name="Picture"/>
                     <pic:cNvPicPr>
                       <a:picLocks noChangeArrowheads="1" noChangeAspect="1"/>
                     </pic:cNvPicPr>
                   </pic:nvPicPr>
                   <pic:blipFill>
-                    <a:blip r:embed="rId31"/>
+                    <a:blip r:embed="rId33"/>
                     <a:stretch>
                       <a:fillRect/>
                     </a:stretch>
@@ -3447,8 +3486,8 @@
         <w:t xml:space="preserve">Because the in-house threshold passes 100.0% of windows at 0.7, this joint condition is numerically identical to the published-only consensus rejection rate (the fraction of windows on which all three published methods agree to reject, independent of any in-house decision; 44.571% on WESAD and 43.129% on PPG-DaLiA). Varying the in-house threshold from 0.50 to 0.95 changes the in-house pass rate by at most three percentage points on either dataset (100.0% to 97.1% on WESAD; 100.0% to 97.2% on PPG-DaLiA) and the headline joint metric by at most 1 percentage point. Median pairwise Cohen’s κ across the three published methods is unaffected by any in-house threshold change (κ = -0.198 on WESAD, κ = -0.204 on PPG-DaLiA, exact to three decimals across the full 0.50-0.95 range; Supplementary Table S5 and Supplementary Figure S2). The substantive finding, that three published methods reject the same ~44% of windows in common, is a property of how the published methods behave on real wrist PPG and does not depend on any in-house thresholding choice.</w:t>
       </w:r>
     </w:p>
-    <w:bookmarkEnd w:id="34"/>
-    <w:bookmarkStart w:id="38" w:name="X2fc2dbd0311da96a84a9c9b5c17d60ac22e8aea"/>
+    <w:bookmarkEnd w:id="36"/>
+    <w:bookmarkStart w:id="40" w:name="X2fc2dbd0311da96a84a9c9b5c17d60ac22e8aea"/>
     <w:p>
       <w:pPr>
         <w:pStyle w:val="Heading3"/>
@@ -3778,18 +3817,18 @@
           <wp:inline>
             <wp:extent cx="5334000" cy="3873128"/>
             <wp:effectExtent b="0" l="0" r="0" t="0"/>
-            <wp:docPr descr="Figure 4. Single-threshold recalibration of the in-house PPG SQI against the Orphanidou pass/fail label on the WESAD held-out split (3,293 windows). The recalibrated threshold leaves held-out Cohen’s kappa at approximately zero; AUROC for in-house SQI predicting Orphanidou pass/fail is 0.484 (chance level)." title="" id="36" name="Picture"/>
+            <wp:docPr descr="Figure 4. Single-threshold recalibration of the in-house PPG SQI against the Orphanidou pass/fail label on the WESAD held-out split (3,293 windows). The recalibrated threshold leaves held-out Cohen’s kappa at approximately zero; AUROC for in-house SQI predicting Orphanidou pass/fail is 0.484 (chance level)." title="" id="38" name="Picture"/>
             <a:graphic>
               <a:graphicData uri="http://schemas.openxmlformats.org/drawingml/2006/picture">
                 <pic:pic>
                   <pic:nvPicPr>
-                    <pic:cNvPr descr="paper/figures/fig6_recalibration.png" id="37" name="Picture"/>
+                    <pic:cNvPr descr="paper/figures/fig6_recalibration.png" id="39" name="Picture"/>
                     <pic:cNvPicPr>
                       <a:picLocks noChangeArrowheads="1" noChangeAspect="1"/>
                     </pic:cNvPicPr>
                   </pic:nvPicPr>
                   <pic:blipFill>
-                    <a:blip r:embed="rId35"/>
+                    <a:blip r:embed="rId37"/>
                     <a:stretch>
                       <a:fillRect/>
                     </a:stretch>
@@ -3857,8 +3896,8 @@
         <w:t xml:space="preserve">and is visualized in Supplementary Figure S3.</w:t>
       </w:r>
     </w:p>
-    <w:bookmarkEnd w:id="38"/>
-    <w:bookmarkStart w:id="39" w:name="Xc1c907b5f230a08ea8ad98d7b4f4cc207b2ef97"/>
+    <w:bookmarkEnd w:id="40"/>
+    <w:bookmarkStart w:id="41" w:name="Xc1c907b5f230a08ea8ad98d7b4f4cc207b2ef97"/>
     <w:p>
       <w:pPr>
         <w:pStyle w:val="Heading3"/>
@@ -4138,8 +4177,8 @@
         <w:t xml:space="preserve">The correlation between motion and cross-modality HR disagreement is positive but weak (Spearman ρ = +0.088). Mean absolute HR difference at high motion is 24% higher than at low motion (11.28 vs 9.12 bpm). Both values are smaller than the pilot estimates from the n = 2 analysis (ρ = +0.30, gap = 6.8 bpm). At n = 15 the motion detector tracks the direction of the effect, but the magnitude is modest.</w:t>
       </w:r>
     </w:p>
-    <w:bookmarkEnd w:id="39"/>
-    <w:bookmarkStart w:id="40" w:name="within-subject-state-contrast-tests"/>
+    <w:bookmarkEnd w:id="41"/>
+    <w:bookmarkStart w:id="42" w:name="within-subject-state-contrast-tests"/>
     <w:p>
       <w:pPr>
         <w:pStyle w:val="Heading3"/>
@@ -4196,8 +4235,8 @@
         <w:t xml:space="preserve">Baseline vs amusement: the funny-video paradigm produces upper-body laughter motion that degrades wrist PPG in most subjects. The largest single effect is S9 PPG SQI (Cliff’s δ = +0.80, Cohen’s d = +1.89, p =&lt; 0.001). S14 also shows a large ECG SQI drop (δ = +0.70, d = +1.59), consistent with the chest device responding to laughter motion in addition to wrist PPG.</w:t>
       </w:r>
     </w:p>
-    <w:bookmarkEnd w:id="40"/>
-    <w:bookmarkStart w:id="44" w:name="X2d23046eae321cbf50e98c2401de19df63beae1"/>
+    <w:bookmarkEnd w:id="42"/>
+    <w:bookmarkStart w:id="46" w:name="X2d23046eae321cbf50e98c2401de19df63beae1"/>
     <w:p>
       <w:pPr>
         <w:pStyle w:val="Heading3"/>
@@ -5889,18 +5928,18 @@
           <wp:inline>
             <wp:extent cx="5334000" cy="3673268"/>
             <wp:effectExtent b="0" l="0" r="0" t="0"/>
-            <wp:docPr descr="Figure 5. Audit-based filtering improves per-subject biomarker estimation on WESAD. Panel A: LOSO baseline-vs-stress AUROC distributions by audit condition. Panel B: per-subject paired Delta-AUROC vs no-audit, by audit variant. Panel C: per-subject wrist-PPG-to-chest-ECG HR Spearman correlation under each condition. Panel D: per-subject retention vs Delta-rho trade-off under the Orphanidou filter (13 of 15 subjects improve, paired Wilcoxon p = 1.5e-04)." title="" id="42" name="Picture"/>
+            <wp:docPr descr="Figure 5. Audit-based filtering improves per-subject biomarker estimation on WESAD. Panel A: LOSO baseline-vs-stress AUROC distributions by audit condition. Panel B: per-subject paired Delta-AUROC vs no-audit, by audit variant. Panel C: per-subject wrist-PPG-to-chest-ECG HR Spearman correlation under each condition. Panel D: per-subject retention vs Delta-rho trade-off under the Orphanidou filter (13 of 15 subjects improve, paired Wilcoxon p = 1.5e-04)." title="" id="44" name="Picture"/>
             <a:graphic>
               <a:graphicData uri="http://schemas.openxmlformats.org/drawingml/2006/picture">
                 <pic:pic>
                   <pic:nvPicPr>
-                    <pic:cNvPr descr="results/downstream_demo/figure_downstream.png" id="43" name="Picture"/>
+                    <pic:cNvPr descr="results/downstream_demo/figure_downstream.png" id="45" name="Picture"/>
                     <pic:cNvPicPr>
                       <a:picLocks noChangeArrowheads="1" noChangeAspect="1"/>
                     </pic:cNvPicPr>
                   </pic:nvPicPr>
                   <pic:blipFill>
-                    <a:blip r:embed="rId41"/>
+                    <a:blip r:embed="rId43"/>
                     <a:stretch>
                       <a:fillRect/>
                     </a:stretch>
@@ -5935,8 +5974,8 @@
         <w:t xml:space="preserve">Figure 5. Audit-based filtering improves per-subject biomarker estimation on WESAD. Panel A: LOSO baseline-vs-stress AUROC distributions by audit condition. Panel B: per-subject paired Delta-AUROC vs no-audit, by audit variant. Panel C: per-subject wrist-PPG-to-chest-ECG HR Spearman correlation under each condition. Panel D: per-subject retention vs Delta-rho trade-off under the Orphanidou filter (13 of 15 subjects improve, paired Wilcoxon p = 1.5e-04).</w:t>
       </w:r>
     </w:p>
-    <w:bookmarkEnd w:id="44"/>
-    <w:bookmarkStart w:id="45" w:name="external-validation-on-ppg-dalia"/>
+    <w:bookmarkEnd w:id="46"/>
+    <w:bookmarkStart w:id="47" w:name="external-validation-on-ppg-dalia"/>
     <w:p>
       <w:pPr>
         <w:pStyle w:val="Heading3"/>
@@ -6593,9 +6632,9 @@
         <w:t xml:space="preserve">The PPG-DaLiA per-subject absolute HR difference (wrist PPG vs chest ECG) range was less extreme than on WESAD (2.4x fold range vs 4.0x), but the absolute minimum was virtually identical (6.66 vs 6.75 bpm). The lower fold range is consistent with PPG-DaLiA’s wider activity mix smoothing the upper tail rather than with reduced per-subject heterogeneity. The replication confirms that the cross-method SQI disagreement finding is a property of wrist PPG itself rather than of the WESAD stress paradigm or of any single recording session.</w:t>
       </w:r>
     </w:p>
-    <w:bookmarkEnd w:id="45"/>
-    <w:bookmarkEnd w:id="46"/>
-    <w:bookmarkStart w:id="60" w:name="Xf8d28994ab18c569b43451e1d59264a3df91dd7"/>
+    <w:bookmarkEnd w:id="47"/>
+    <w:bookmarkEnd w:id="48"/>
+    <w:bookmarkStart w:id="62" w:name="Xf8d28994ab18c569b43451e1d59264a3df91dd7"/>
     <w:p>
       <w:pPr>
         <w:pStyle w:val="Heading2"/>
@@ -6604,7 +6643,7 @@
         <w:t xml:space="preserve">4. Methodological validation on synthetic data</w:t>
       </w:r>
     </w:p>
-    <w:bookmarkStart w:id="50" w:name="Xa121e1727e5e5d44b54593882ea99d9ddb54092"/>
+    <w:bookmarkStart w:id="52" w:name="Xa121e1727e5e5d44b54593882ea99d9ddb54092"/>
     <w:p>
       <w:pPr>
         <w:pStyle w:val="Heading3"/>
@@ -6646,18 +6685,18 @@
           <wp:inline>
             <wp:extent cx="5334000" cy="3977375"/>
             <wp:effectExtent b="0" l="0" r="0" t="0"/>
-            <wp:docPr descr="Figure 6. Cohort-level Digital Biomarker Trust Score on the synthetic cohort (n = 300 participants, 60 days each). Mean overall DBTS = 74.11 (moderate category); 31 participants in the high category, 266 moderate, 3 low." title="" id="48" name="Picture"/>
+            <wp:docPr descr="Figure 6. Cohort-level Digital Biomarker Trust Score on the synthetic cohort (n = 300 participants, 60 days each). Mean overall DBTS = 74.11 (moderate category); 31 participants in the high category, 266 moderate, 3 low." title="" id="50" name="Picture"/>
             <a:graphic>
               <a:graphicData uri="http://schemas.openxmlformats.org/drawingml/2006/picture">
                 <pic:pic>
                   <pic:nvPicPr>
-                    <pic:cNvPr descr="paper/figures/fig2_synthetic_headline.png" id="49" name="Picture"/>
+                    <pic:cNvPr descr="paper/figures/fig2_synthetic_headline.png" id="51" name="Picture"/>
                     <pic:cNvPicPr>
                       <a:picLocks noChangeArrowheads="1" noChangeAspect="1"/>
                     </pic:cNvPicPr>
                   </pic:nvPicPr>
                   <pic:blipFill>
-                    <a:blip r:embed="rId47"/>
+                    <a:blip r:embed="rId49"/>
                     <a:stretch>
                       <a:fillRect/>
                     </a:stretch>
@@ -6692,8 +6731,8 @@
         <w:t xml:space="preserve">Figure 6. Cohort-level Digital Biomarker Trust Score on the synthetic cohort (n = 300 participants, 60 days each). Mean overall DBTS = 74.11 (moderate category); 31 participants in the high category, 266 moderate, 3 low.</w:t>
       </w:r>
     </w:p>
-    <w:bookmarkEnd w:id="50"/>
-    <w:bookmarkStart w:id="51" w:name="X7eefbf0decf15c54e4d1e7780b435273777fbce"/>
+    <w:bookmarkEnd w:id="52"/>
+    <w:bookmarkStart w:id="53" w:name="X7eefbf0decf15c54e4d1e7780b435273777fbce"/>
     <w:p>
       <w:pPr>
         <w:pStyle w:val="Heading3"/>
@@ -7241,8 +7280,8 @@
         <w:t xml:space="preserve">number.</w:t>
       </w:r>
     </w:p>
-    <w:bookmarkEnd w:id="51"/>
-    <w:bookmarkStart w:id="52" w:name="Xda95753af269ca0e3094d252b044c654d56e36b"/>
+    <w:bookmarkEnd w:id="53"/>
+    <w:bookmarkStart w:id="54" w:name="Xda95753af269ca0e3094d252b044c654d56e36b"/>
     <w:p>
       <w:pPr>
         <w:pStyle w:val="Heading3"/>
@@ -7259,8 +7298,8 @@
         <w:t xml:space="preserve">We also report an ICC(2,1) days-as-raters analysis as an internal noise-floor check (full numbers in supplement Table S1). The ICC and bootstrap week-pair r agree on metric ranking, with ICC uniformly more conservative because it treats within-week noise as rater disagreement. The bootstrap week-pair r is the recommended headline statistic for clinical claims; the ICC is included as a diagnostic.</w:t>
       </w:r>
     </w:p>
-    <w:bookmarkEnd w:id="52"/>
-    <w:bookmarkStart w:id="53" w:name="fairness-disparities-recovered"/>
+    <w:bookmarkEnd w:id="54"/>
+    <w:bookmarkStart w:id="55" w:name="fairness-disparities-recovered"/>
     <w:p>
       <w:pPr>
         <w:pStyle w:val="Heading3"/>
@@ -7603,8 +7642,8 @@
         <w:t xml:space="preserve">The injected effects were 0.85 vs 1.00 SQI multiplier for device C vs A (recovers as a 13.02-point gap) and 0.12 × proxy for skin tone (recovers as a 9.53-point gap). Both gaps have bootstrap 95% CIs (Section 2.7).</w:t>
       </w:r>
     </w:p>
-    <w:bookmarkEnd w:id="53"/>
-    <w:bookmarkStart w:id="54" w:name="causal-adjusted-confounding"/>
+    <w:bookmarkEnd w:id="55"/>
+    <w:bookmarkStart w:id="56" w:name="causal-adjusted-confounding"/>
     <w:p>
       <w:pPr>
         <w:pStyle w:val="Heading3"/>
@@ -8149,8 +8188,8 @@
         <w:t xml:space="preserve">The heat_index → HRV and heat_index → sleep_efficiency rows in Table 13 illustrate the diagnostic in the opposite direction. The framework’s positivity check flags a violation for both heat_index treatments (Kish effective sample size 63%), meaning the propensity-score model produced effective sample sizes too small to support reliable adjusted estimation. The AIPW point estimates for the heat_index treatments are consequently reported with a positivity-violation warning attached to the analysis output and are not interpreted as substantive causal claims. The rows are included in Table 13 to demonstrate that the framework refuses to commit to a causal interpretation when the propensity-score assumption is empirically inadequate, rather than reporting a point estimate with the same authority as the active_minutes case. Positivity and E-value sensitivity output for both treatments is in supplement section S2.</w:t>
       </w:r>
     </w:p>
-    <w:bookmarkEnd w:id="54"/>
-    <w:bookmarkStart w:id="55" w:name="learned-trust-score-weights"/>
+    <w:bookmarkEnd w:id="56"/>
+    <w:bookmarkStart w:id="57" w:name="learned-trust-score-weights"/>
     <w:p>
       <w:pPr>
         <w:pStyle w:val="Heading3"/>
@@ -8167,8 +8206,8 @@
         <w:t xml:space="preserve">A 6-component weight-simplex search (Dirichlet sampling plus local grid refinement, 360 candidates) returned holdout Spearman ρ = +0.668 (n_holdout = 90) against a week-over-week HRV RMSSD reproducibility target, compared with +0.592 in training (n_train = 210). The learned weights emphasize signal_quality over confounding_risk but remain within the convex hull of plausible weightings; the default weights are within 0.08 Spearman of the optimum, supporting the policy of shipping the defaults and exposing the weights as user-configurable. Full training-vs-holdout breakdown in supplement section S6.</w:t>
       </w:r>
     </w:p>
-    <w:bookmarkEnd w:id="55"/>
-    <w:bookmarkStart w:id="59" w:name="cross-cohort-generalization"/>
+    <w:bookmarkEnd w:id="57"/>
+    <w:bookmarkStart w:id="61" w:name="cross-cohort-generalization"/>
     <w:p>
       <w:pPr>
         <w:pStyle w:val="Heading3"/>
@@ -8194,18 +8233,18 @@
           <wp:inline>
             <wp:extent cx="5334000" cy="1751128"/>
             <wp:effectExtent b="0" l="0" r="0" t="0"/>
-            <wp:docPr descr="Figure 7. Cross-cohort parameter-sweep validation across five synthetic regimes (default, strong environment, inverted skin-tone, severe device bias, clean world). Seven of eight qualitative predictions pass. The sign-flip on the skin-tone gap under the inverted-penalty regime confirms that the audit responds to cohort parameters rather than to fixed generator values." title="" id="57" name="Picture"/>
+            <wp:docPr descr="Figure 7. Cross-cohort parameter-sweep validation across five synthetic regimes (default, strong environment, inverted skin-tone, severe device bias, clean world). Seven of eight qualitative predictions pass. The sign-flip on the skin-tone gap under the inverted-penalty regime confirms that the audit responds to cohort parameters rather than to fixed generator values." title="" id="59" name="Picture"/>
             <a:graphic>
               <a:graphicData uri="http://schemas.openxmlformats.org/drawingml/2006/picture">
                 <pic:pic>
                   <pic:nvPicPr>
-                    <pic:cNvPr descr="paper/figures/fig3_cross_cohort.png" id="58" name="Picture"/>
+                    <pic:cNvPr descr="paper/figures/fig3_cross_cohort.png" id="60" name="Picture"/>
                     <pic:cNvPicPr>
                       <a:picLocks noChangeArrowheads="1" noChangeAspect="1"/>
                     </pic:cNvPicPr>
                   </pic:nvPicPr>
                   <pic:blipFill>
-                    <a:blip r:embed="rId56"/>
+                    <a:blip r:embed="rId58"/>
                     <a:stretch>
                       <a:fillRect/>
                     </a:stretch>
@@ -8240,9 +8279,9 @@
         <w:t xml:space="preserve">Figure 7. Cross-cohort parameter-sweep validation across five synthetic regimes (default, strong environment, inverted skin-tone, severe device bias, clean world). Seven of eight qualitative predictions pass. The sign-flip on the skin-tone gap under the inverted-penalty regime confirms that the audit responds to cohort parameters rather than to fixed generator values.</w:t>
       </w:r>
     </w:p>
-    <w:bookmarkEnd w:id="59"/>
-    <w:bookmarkEnd w:id="60"/>
-    <w:bookmarkStart w:id="64" w:name="discussion"/>
+    <w:bookmarkEnd w:id="61"/>
+    <w:bookmarkEnd w:id="62"/>
+    <w:bookmarkStart w:id="66" w:name="discussion"/>
     <w:p>
       <w:pPr>
         <w:pStyle w:val="Heading2"/>
@@ -8251,7 +8290,7 @@
         <w:t xml:space="preserve">5. Discussion</w:t>
       </w:r>
     </w:p>
-    <w:bookmarkStart w:id="61" w:name="principal-findings"/>
+    <w:bookmarkStart w:id="63" w:name="principal-findings"/>
     <w:p>
       <w:pPr>
         <w:pStyle w:val="Heading3"/>
@@ -8331,8 +8370,8 @@
         <w:t xml:space="preserve">Mean |HR_PPG - HR_ECG| during stress ranges from 6.75 bpm (S15) to 26.02 bpm (S11), a four-fold spread across 15 subjects. The direction of the per-state quality change also varies (most subjects’ PPG SQI drops during stress; S15’s rises). Any conclusion from pooled WESAD wrist-PPG analysis is at risk of being driven by a small number of subjects. Restricting downstream models to multi-baseline-pass windows improves per-subject wrist-PPG-to-chest-ECG HR correlation by a median of +0.110 (13 of 15 subjects improved, paired Wilcoxon p = 1.5e-04), with the largest gains in subjects whose unfiltered correlation was modest (S10: 0.65 → 0.78, S9: 0.47 → 0.76).</w:t>
       </w:r>
     </w:p>
-    <w:bookmarkEnd w:id="61"/>
-    <w:bookmarkStart w:id="62" w:name="relation-to-prior-work"/>
+    <w:bookmarkEnd w:id="63"/>
+    <w:bookmarkStart w:id="64" w:name="relation-to-prior-work"/>
     <w:p>
       <w:pPr>
         <w:pStyle w:val="Heading3"/>
@@ -8387,8 +8426,8 @@
         <w:t xml:space="preserve">, which focuses on feature engineering and aggregation rather than auditing. Our framework can be combined with FLIRT rather than replacing it: FLIRT produces the features; our pipeline checks whether those features are reliable enough to model.</w:t>
       </w:r>
     </w:p>
-    <w:bookmarkEnd w:id="62"/>
-    <w:bookmarkStart w:id="63" w:name="limitations"/>
+    <w:bookmarkEnd w:id="64"/>
+    <w:bookmarkStart w:id="65" w:name="limitations"/>
     <w:p>
       <w:pPr>
         <w:pStyle w:val="Heading3"/>
@@ -8650,18 +8689,18 @@
           <w:b/>
           <w:bCs/>
         </w:rPr>
-        <w:t xml:space="preserve">Single-author methodology study.</w:t>
-      </w:r>
-      <w:r>
-        <w:t xml:space="preserve"> </w:t>
-      </w:r>
-      <w:r>
-        <w:t xml:space="preserve">This is a single-author methodology paper with no clinical or biomedical-engineering co-authors. The recommendations in Section 6 are aimed at the wearable-AI research community (multi-baseline SQI auditing as standard supplementary material in wearable-AI publications) and do not constitute clinical guidance. Translation of any cross-method-audit recommendation into patient-facing clinical practice should include co-authorship by clinical specialists with relevant device experience; the synthetic-cohort validation in Section 4 and the WESAD/PPG-DaLiA empirical study in Section 3 are methodological contributions rather than clinical findings.</w:t>
-      </w:r>
-    </w:p>
-    <w:bookmarkEnd w:id="63"/>
-    <w:bookmarkEnd w:id="64"/>
-    <w:bookmarkStart w:id="65" w:name="conclusions"/>
+        <w:t xml:space="preserve">Methodology study, not clinical validation.</w:t>
+      </w:r>
+      <w:r>
+        <w:t xml:space="preserve"> </w:t>
+      </w:r>
+      <w:r>
+        <w:t xml:space="preserve">This is a methodology paper rather than a clinical validation study. The recommendations in Section 6 are aimed at the wearable-AI research community (multi-baseline SQI auditing as standard supplementary material in wearable-AI publications) and do not constitute clinical guidance. Translation of any cross-method-audit recommendation into patient-facing clinical practice would require prospective clinical validation with relevant device experience; the synthetic-cohort validation in Section 4 and the WESAD/PPG-DaLiA empirical study in Section 3 are methodological contributions rather than clinical findings.</w:t>
+      </w:r>
+    </w:p>
+    <w:bookmarkEnd w:id="65"/>
+    <w:bookmarkEnd w:id="66"/>
+    <w:bookmarkStart w:id="67" w:name="conclusions"/>
     <w:p>
       <w:pPr>
         <w:pStyle w:val="Heading2"/>
@@ -8701,8 +8740,8 @@
         <w:t xml:space="preserve">(MIT licensed) and runs end-to-end from a fixed seed in approximately three minutes on a modern laptop CPU.</w:t>
       </w:r>
     </w:p>
-    <w:bookmarkEnd w:id="65"/>
-    <w:bookmarkStart w:id="66" w:name="code-and-data-availability"/>
+    <w:bookmarkEnd w:id="67"/>
+    <w:bookmarkStart w:id="68" w:name="code-and-data-availability"/>
     <w:p>
       <w:pPr>
         <w:pStyle w:val="Heading2"/>
@@ -8737,8 +8776,8 @@
         <w:t xml:space="preserve">, also publicly available from the UCI Machine Learning Repository. Both are released without restrictions for research use.</w:t>
       </w:r>
     </w:p>
-    <w:bookmarkEnd w:id="66"/>
-    <w:bookmarkStart w:id="67" w:name="author-contributions"/>
+    <w:bookmarkEnd w:id="68"/>
+    <w:bookmarkStart w:id="69" w:name="author-contributions"/>
     <w:p>
       <w:pPr>
         <w:pStyle w:val="Heading2"/>
@@ -8752,11 +8791,11 @@
         <w:pStyle w:val="FirstParagraph"/>
       </w:pPr>
       <w:r>
-        <w:t xml:space="preserve">Ceyhun Olcan: Conceptualization, Data curation, Formal analysis, Investigation, Methodology, Software, Validation, Visualization, Writing - original draft, Writing - review and editing.</w:t>
-      </w:r>
-    </w:p>
-    <w:bookmarkEnd w:id="67"/>
-    <w:bookmarkStart w:id="68" w:name="funding"/>
+        <w:t xml:space="preserve">Ceyhun Olcan: Conceptualization, Data curation, Formal analysis, Investigation, Methodology, Software, Validation, Visualization, Writing - original draft, Writing - review and editing. Mehmet Ozberk Olcan: Writing - original draft, Writing - review and editing. Seckin Olcan: Writing - original draft, Writing - review and editing.</w:t>
+      </w:r>
+    </w:p>
+    <w:bookmarkEnd w:id="69"/>
+    <w:bookmarkStart w:id="70" w:name="funding"/>
     <w:p>
       <w:pPr>
         <w:pStyle w:val="Heading2"/>
@@ -8773,8 +8812,8 @@
         <w:t xml:space="preserve">No external funding supported this work.</w:t>
       </w:r>
     </w:p>
-    <w:bookmarkEnd w:id="68"/>
-    <w:bookmarkStart w:id="69" w:name="ethics-statement"/>
+    <w:bookmarkEnd w:id="70"/>
+    <w:bookmarkStart w:id="71" w:name="ethics-statement"/>
     <w:p>
       <w:pPr>
         <w:pStyle w:val="Heading2"/>
@@ -8812,8 +8851,8 @@
         <w:t xml:space="preserve">, released under terms permitting research use. No new human-subjects data were collected; institutional review board approval was therefore not required for this work.</w:t>
       </w:r>
     </w:p>
-    <w:bookmarkEnd w:id="69"/>
-    <w:bookmarkStart w:id="70" w:name="competing-interests"/>
+    <w:bookmarkEnd w:id="71"/>
+    <w:bookmarkStart w:id="72" w:name="competing-interests"/>
     <w:p>
       <w:pPr>
         <w:pStyle w:val="Heading2"/>
@@ -8827,11 +8866,11 @@
         <w:pStyle w:val="FirstParagraph"/>
       </w:pPr>
       <w:r>
-        <w:t xml:space="preserve">The author declares no competing interests.</w:t>
-      </w:r>
-    </w:p>
-    <w:bookmarkEnd w:id="70"/>
-    <w:bookmarkStart w:id="71" w:name="references"/>
+        <w:t xml:space="preserve">The authors declare no competing interests.</w:t>
+      </w:r>
+    </w:p>
+    <w:bookmarkEnd w:id="72"/>
+    <w:bookmarkStart w:id="73" w:name="references"/>
     <w:p>
       <w:pPr>
         <w:pStyle w:val="Heading2"/>
@@ -8863,8 +8902,8 @@
         <w:t xml:space="preserve">for full citations (Orphanidou et al. 2015, Sukor et al. 2011, Clifford et al. 2012, Robins et al. 1994, Shrout &amp; Fleiss 1979, Bland &amp; Altman 1986, Schmidt et al. 2018, Föll et al. 2021, Efron &amp; Tibshirani 1993, Malik 1996).</w:t>
       </w:r>
     </w:p>
-    <w:bookmarkEnd w:id="71"/>
-    <w:bookmarkStart w:id="127" w:name="supplementary-materials"/>
+    <w:bookmarkEnd w:id="73"/>
+    <w:bookmarkStart w:id="129" w:name="supplementary-materials"/>
     <w:p>
       <w:pPr>
         <w:pStyle w:val="Heading2"/>
@@ -9008,8 +9047,8 @@
         <w:t xml:space="preserve">: full release history of the toolkit.</w:t>
       </w:r>
     </w:p>
-    <w:bookmarkStart w:id="126" w:name="refs"/>
-    <w:bookmarkStart w:id="73" w:name="ref-allen2007"/>
+    <w:bookmarkStart w:id="128" w:name="refs"/>
+    <w:bookmarkStart w:id="75" w:name="ref-allen2007"/>
     <w:p>
       <w:pPr>
         <w:pStyle w:val="Bibliography"/>
@@ -9042,7 +9081,7 @@
       <w:r>
         <w:t xml:space="preserve"> </w:t>
       </w:r>
-      <w:hyperlink r:id="rId72">
+      <w:hyperlink r:id="rId74">
         <w:r>
           <w:rPr>
             <w:rStyle w:val="Hyperlink"/>
@@ -9054,8 +9093,8 @@
         <w:t xml:space="preserve">.</w:t>
       </w:r>
     </w:p>
-    <w:bookmarkEnd w:id="73"/>
-    <w:bookmarkStart w:id="75" w:name="ref-bent2020"/>
+    <w:bookmarkEnd w:id="75"/>
+    <w:bookmarkStart w:id="77" w:name="ref-bent2020"/>
     <w:p>
       <w:pPr>
         <w:pStyle w:val="Bibliography"/>
@@ -9088,7 +9127,7 @@
       <w:r>
         <w:t xml:space="preserve"> </w:t>
       </w:r>
-      <w:hyperlink r:id="rId74">
+      <w:hyperlink r:id="rId76">
         <w:r>
           <w:rPr>
             <w:rStyle w:val="Hyperlink"/>
@@ -9100,8 +9139,8 @@
         <w:t xml:space="preserve">.</w:t>
       </w:r>
     </w:p>
-    <w:bookmarkEnd w:id="75"/>
-    <w:bookmarkStart w:id="77" w:name="ref-bland1986"/>
+    <w:bookmarkEnd w:id="77"/>
+    <w:bookmarkStart w:id="79" w:name="ref-bland1986"/>
     <w:p>
       <w:pPr>
         <w:pStyle w:val="Bibliography"/>
@@ -9134,7 +9173,7 @@
       <w:r>
         <w:t xml:space="preserve"> </w:t>
       </w:r>
-      <w:hyperlink r:id="rId76">
+      <w:hyperlink r:id="rId78">
         <w:r>
           <w:rPr>
             <w:rStyle w:val="Hyperlink"/>
@@ -9146,8 +9185,8 @@
         <w:t xml:space="preserve">.</w:t>
       </w:r>
     </w:p>
-    <w:bookmarkEnd w:id="77"/>
-    <w:bookmarkStart w:id="79" w:name="ref-bossuyt2015stard"/>
+    <w:bookmarkEnd w:id="79"/>
+    <w:bookmarkStart w:id="81" w:name="ref-bossuyt2015stard"/>
     <w:p>
       <w:pPr>
         <w:pStyle w:val="Bibliography"/>
@@ -9192,7 +9231,7 @@
       <w:r>
         <w:t xml:space="preserve"> </w:t>
       </w:r>
-      <w:hyperlink r:id="rId78">
+      <w:hyperlink r:id="rId80">
         <w:r>
           <w:rPr>
             <w:rStyle w:val="Hyperlink"/>
@@ -9204,8 +9243,8 @@
         <w:t xml:space="preserve">.</w:t>
       </w:r>
     </w:p>
-    <w:bookmarkEnd w:id="79"/>
-    <w:bookmarkStart w:id="81" w:name="ref-cliff1993"/>
+    <w:bookmarkEnd w:id="81"/>
+    <w:bookmarkStart w:id="83" w:name="ref-cliff1993"/>
     <w:p>
       <w:pPr>
         <w:pStyle w:val="Bibliography"/>
@@ -9238,7 +9277,7 @@
       <w:r>
         <w:t xml:space="preserve"> </w:t>
       </w:r>
-      <w:hyperlink r:id="rId80">
+      <w:hyperlink r:id="rId82">
         <w:r>
           <w:rPr>
             <w:rStyle w:val="Hyperlink"/>
@@ -9250,8 +9289,8 @@
         <w:t xml:space="preserve">.</w:t>
       </w:r>
     </w:p>
-    <w:bookmarkEnd w:id="81"/>
-    <w:bookmarkStart w:id="83" w:name="ref-clifford2012"/>
+    <w:bookmarkEnd w:id="83"/>
+    <w:bookmarkStart w:id="85" w:name="ref-clifford2012"/>
     <w:p>
       <w:pPr>
         <w:pStyle w:val="Bibliography"/>
@@ -9284,7 +9323,7 @@
       <w:r>
         <w:t xml:space="preserve"> </w:t>
       </w:r>
-      <w:hyperlink r:id="rId82">
+      <w:hyperlink r:id="rId84">
         <w:r>
           <w:rPr>
             <w:rStyle w:val="Hyperlink"/>
@@ -9296,8 +9335,8 @@
         <w:t xml:space="preserve">.</w:t>
       </w:r>
     </w:p>
-    <w:bookmarkEnd w:id="83"/>
-    <w:bookmarkStart w:id="84" w:name="ref-cohen1988"/>
+    <w:bookmarkEnd w:id="85"/>
+    <w:bookmarkStart w:id="86" w:name="ref-cohen1988"/>
     <w:p>
       <w:pPr>
         <w:pStyle w:val="Bibliography"/>
@@ -9319,8 +9358,8 @@
         <w:t xml:space="preserve">. 2nd ed. Lawrence Erlbaum Associates.</w:t>
       </w:r>
     </w:p>
-    <w:bookmarkEnd w:id="84"/>
-    <w:bookmarkStart w:id="86" w:name="ref-collins2024tripodai"/>
+    <w:bookmarkEnd w:id="86"/>
+    <w:bookmarkStart w:id="88" w:name="ref-collins2024tripodai"/>
     <w:p>
       <w:pPr>
         <w:pStyle w:val="Bibliography"/>
@@ -9371,7 +9410,7 @@
       <w:r>
         <w:t xml:space="preserve"> </w:t>
       </w:r>
-      <w:hyperlink r:id="rId85">
+      <w:hyperlink r:id="rId87">
         <w:r>
           <w:rPr>
             <w:rStyle w:val="Hyperlink"/>
@@ -9383,8 +9422,8 @@
         <w:t xml:space="preserve">.</w:t>
       </w:r>
     </w:p>
-    <w:bookmarkEnd w:id="86"/>
-    <w:bookmarkStart w:id="87" w:name="ref-efron1993"/>
+    <w:bookmarkEnd w:id="88"/>
+    <w:bookmarkStart w:id="89" w:name="ref-efron1993"/>
     <w:p>
       <w:pPr>
         <w:pStyle w:val="Bibliography"/>
@@ -9406,8 +9445,8 @@
         <w:t xml:space="preserve">. Chapman &amp; Hall/CRC.</w:t>
       </w:r>
     </w:p>
-    <w:bookmarkEnd w:id="87"/>
-    <w:bookmarkStart w:id="89" w:name="ref-elgendi2016"/>
+    <w:bookmarkEnd w:id="89"/>
+    <w:bookmarkStart w:id="91" w:name="ref-elgendi2016"/>
     <w:p>
       <w:pPr>
         <w:pStyle w:val="Bibliography"/>
@@ -9440,7 +9479,7 @@
       <w:r>
         <w:t xml:space="preserve"> </w:t>
       </w:r>
-      <w:hyperlink r:id="rId88">
+      <w:hyperlink r:id="rId90">
         <w:r>
           <w:rPr>
             <w:rStyle w:val="Hyperlink"/>
@@ -9452,8 +9491,8 @@
         <w:t xml:space="preserve">.</w:t>
       </w:r>
     </w:p>
-    <w:bookmarkEnd w:id="89"/>
-    <w:bookmarkStart w:id="91" w:name="ref-foll2021"/>
+    <w:bookmarkEnd w:id="91"/>
+    <w:bookmarkStart w:id="93" w:name="ref-foll2021"/>
     <w:p>
       <w:pPr>
         <w:pStyle w:val="Bibliography"/>
@@ -9492,7 +9531,7 @@
       <w:r>
         <w:t xml:space="preserve"> </w:t>
       </w:r>
-      <w:hyperlink r:id="rId90">
+      <w:hyperlink r:id="rId92">
         <w:r>
           <w:rPr>
             <w:rStyle w:val="Hyperlink"/>
@@ -9504,8 +9543,8 @@
         <w:t xml:space="preserve">.</w:t>
       </w:r>
     </w:p>
-    <w:bookmarkEnd w:id="91"/>
-    <w:bookmarkStart w:id="93" w:name="ref-liu2020consortai"/>
+    <w:bookmarkEnd w:id="93"/>
+    <w:bookmarkStart w:id="95" w:name="ref-liu2020consortai"/>
     <w:p>
       <w:pPr>
         <w:pStyle w:val="Bibliography"/>
@@ -9550,7 +9589,7 @@
       <w:r>
         <w:t xml:space="preserve"> </w:t>
       </w:r>
-      <w:hyperlink r:id="rId92">
+      <w:hyperlink r:id="rId94">
         <w:r>
           <w:rPr>
             <w:rStyle w:val="Hyperlink"/>
@@ -9562,8 +9601,8 @@
         <w:t xml:space="preserve">.</w:t>
       </w:r>
     </w:p>
-    <w:bookmarkEnd w:id="93"/>
-    <w:bookmarkStart w:id="95" w:name="ref-malik1996"/>
+    <w:bookmarkEnd w:id="95"/>
+    <w:bookmarkStart w:id="97" w:name="ref-malik1996"/>
     <w:p>
       <w:pPr>
         <w:pStyle w:val="Bibliography"/>
@@ -9629,7 +9668,7 @@
       <w:r>
         <w:t xml:space="preserve"> </w:t>
       </w:r>
-      <w:hyperlink r:id="rId94">
+      <w:hyperlink r:id="rId96">
         <w:r>
           <w:rPr>
             <w:rStyle w:val="Hyperlink"/>
@@ -9641,8 +9680,8 @@
         <w:t xml:space="preserve">.</w:t>
       </w:r>
     </w:p>
-    <w:bookmarkEnd w:id="95"/>
-    <w:bookmarkStart w:id="97" w:name="ref-mclean2023sliding"/>
+    <w:bookmarkEnd w:id="97"/>
+    <w:bookmarkStart w:id="99" w:name="ref-mclean2023sliding"/>
     <w:p>
       <w:pPr>
         <w:pStyle w:val="Bibliography"/>
@@ -9675,7 +9714,7 @@
       <w:r>
         <w:t xml:space="preserve"> </w:t>
       </w:r>
-      <w:hyperlink r:id="rId96">
+      <w:hyperlink r:id="rId98">
         <w:r>
           <w:rPr>
             <w:rStyle w:val="Hyperlink"/>
@@ -9687,8 +9726,8 @@
         <w:t xml:space="preserve">.</w:t>
       </w:r>
     </w:p>
-    <w:bookmarkEnd w:id="97"/>
-    <w:bookmarkStart w:id="99" w:name="ref-charlton2021ppgproc"/>
+    <w:bookmarkEnd w:id="99"/>
+    <w:bookmarkStart w:id="101" w:name="ref-charlton2021ppgproc"/>
     <w:p>
       <w:pPr>
         <w:pStyle w:val="Bibliography"/>
@@ -9724,7 +9763,7 @@
       <w:r>
         <w:t xml:space="preserve"> </w:t>
       </w:r>
-      <w:hyperlink r:id="rId98">
+      <w:hyperlink r:id="rId100">
         <w:r>
           <w:rPr>
             <w:rStyle w:val="Hyperlink"/>
@@ -9736,8 +9775,8 @@
         <w:t xml:space="preserve">.</w:t>
       </w:r>
     </w:p>
-    <w:bookmarkEnd w:id="99"/>
-    <w:bookmarkStart w:id="101" w:name="ref-obermeyer2019"/>
+    <w:bookmarkEnd w:id="101"/>
+    <w:bookmarkStart w:id="103" w:name="ref-obermeyer2019"/>
     <w:p>
       <w:pPr>
         <w:pStyle w:val="Bibliography"/>
@@ -9770,7 +9809,7 @@
       <w:r>
         <w:t xml:space="preserve"> </w:t>
       </w:r>
-      <w:hyperlink r:id="rId100">
+      <w:hyperlink r:id="rId102">
         <w:r>
           <w:rPr>
             <w:rStyle w:val="Hyperlink"/>
@@ -9782,8 +9821,8 @@
         <w:t xml:space="preserve">.</w:t>
       </w:r>
     </w:p>
-    <w:bookmarkEnd w:id="101"/>
-    <w:bookmarkStart w:id="103" w:name="ref-orphanidou2015"/>
+    <w:bookmarkEnd w:id="103"/>
+    <w:bookmarkStart w:id="105" w:name="ref-orphanidou2015"/>
     <w:p>
       <w:pPr>
         <w:pStyle w:val="Bibliography"/>
@@ -9816,7 +9855,7 @@
       <w:r>
         <w:t xml:space="preserve"> </w:t>
       </w:r>
-      <w:hyperlink r:id="rId102">
+      <w:hyperlink r:id="rId104">
         <w:r>
           <w:rPr>
             <w:rStyle w:val="Hyperlink"/>
@@ -9828,8 +9867,8 @@
         <w:t xml:space="preserve">.</w:t>
       </w:r>
     </w:p>
-    <w:bookmarkEnd w:id="103"/>
-    <w:bookmarkStart w:id="105" w:name="ref-reiss2019"/>
+    <w:bookmarkEnd w:id="105"/>
+    <w:bookmarkStart w:id="107" w:name="ref-reiss2019"/>
     <w:p>
       <w:pPr>
         <w:pStyle w:val="Bibliography"/>
@@ -9868,7 +9907,7 @@
       <w:r>
         <w:t xml:space="preserve"> </w:t>
       </w:r>
-      <w:hyperlink r:id="rId104">
+      <w:hyperlink r:id="rId106">
         <w:r>
           <w:rPr>
             <w:rStyle w:val="Hyperlink"/>
@@ -9880,8 +9919,8 @@
         <w:t xml:space="preserve">.</w:t>
       </w:r>
     </w:p>
-    <w:bookmarkEnd w:id="105"/>
-    <w:bookmarkStart w:id="107" w:name="ref-robins1994"/>
+    <w:bookmarkEnd w:id="107"/>
+    <w:bookmarkStart w:id="109" w:name="ref-robins1994"/>
     <w:p>
       <w:pPr>
         <w:pStyle w:val="Bibliography"/>
@@ -9914,7 +9953,7 @@
       <w:r>
         <w:t xml:space="preserve"> </w:t>
       </w:r>
-      <w:hyperlink r:id="rId106">
+      <w:hyperlink r:id="rId108">
         <w:r>
           <w:rPr>
             <w:rStyle w:val="Hyperlink"/>
@@ -9926,8 +9965,8 @@
         <w:t xml:space="preserve">.</w:t>
       </w:r>
     </w:p>
-    <w:bookmarkEnd w:id="107"/>
-    <w:bookmarkStart w:id="109" w:name="ref-schafer2013"/>
+    <w:bookmarkEnd w:id="109"/>
+    <w:bookmarkStart w:id="111" w:name="ref-schafer2013"/>
     <w:p>
       <w:pPr>
         <w:pStyle w:val="Bibliography"/>
@@ -9960,7 +9999,7 @@
       <w:r>
         <w:t xml:space="preserve"> </w:t>
       </w:r>
-      <w:hyperlink r:id="rId108">
+      <w:hyperlink r:id="rId110">
         <w:r>
           <w:rPr>
             <w:rStyle w:val="Hyperlink"/>
@@ -9972,8 +10011,8 @@
         <w:t xml:space="preserve">.</w:t>
       </w:r>
     </w:p>
-    <w:bookmarkEnd w:id="109"/>
-    <w:bookmarkStart w:id="111" w:name="ref-schmidt2018"/>
+    <w:bookmarkEnd w:id="111"/>
+    <w:bookmarkStart w:id="113" w:name="ref-schmidt2018"/>
     <w:p>
       <w:pPr>
         <w:pStyle w:val="Bibliography"/>
@@ -10012,7 +10051,7 @@
       <w:r>
         <w:t xml:space="preserve"> </w:t>
       </w:r>
-      <w:hyperlink r:id="rId110">
+      <w:hyperlink r:id="rId112">
         <w:r>
           <w:rPr>
             <w:rStyle w:val="Hyperlink"/>
@@ -10024,8 +10063,8 @@
         <w:t xml:space="preserve">.</w:t>
       </w:r>
     </w:p>
-    <w:bookmarkEnd w:id="111"/>
-    <w:bookmarkStart w:id="113" w:name="ref-shcherbina2017"/>
+    <w:bookmarkEnd w:id="113"/>
+    <w:bookmarkStart w:id="115" w:name="ref-shcherbina2017"/>
     <w:p>
       <w:pPr>
         <w:pStyle w:val="Bibliography"/>
@@ -10058,7 +10097,7 @@
       <w:r>
         <w:t xml:space="preserve"> </w:t>
       </w:r>
-      <w:hyperlink r:id="rId112">
+      <w:hyperlink r:id="rId114">
         <w:r>
           <w:rPr>
             <w:rStyle w:val="Hyperlink"/>
@@ -10070,8 +10109,8 @@
         <w:t xml:space="preserve">.</w:t>
       </w:r>
     </w:p>
-    <w:bookmarkEnd w:id="113"/>
-    <w:bookmarkStart w:id="115" w:name="ref-shrout1979"/>
+    <w:bookmarkEnd w:id="115"/>
+    <w:bookmarkStart w:id="117" w:name="ref-shrout1979"/>
     <w:p>
       <w:pPr>
         <w:pStyle w:val="Bibliography"/>
@@ -10104,7 +10143,7 @@
       <w:r>
         <w:t xml:space="preserve"> </w:t>
       </w:r>
-      <w:hyperlink r:id="rId114">
+      <w:hyperlink r:id="rId116">
         <w:r>
           <w:rPr>
             <w:rStyle w:val="Hyperlink"/>
@@ -10116,8 +10155,8 @@
         <w:t xml:space="preserve">.</w:t>
       </w:r>
     </w:p>
-    <w:bookmarkEnd w:id="115"/>
-    <w:bookmarkStart w:id="117" w:name="ref-sjoding2020"/>
+    <w:bookmarkEnd w:id="117"/>
+    <w:bookmarkStart w:id="119" w:name="ref-sjoding2020"/>
     <w:p>
       <w:pPr>
         <w:pStyle w:val="Bibliography"/>
@@ -10150,7 +10189,7 @@
       <w:r>
         <w:t xml:space="preserve"> </w:t>
       </w:r>
-      <w:hyperlink r:id="rId116">
+      <w:hyperlink r:id="rId118">
         <w:r>
           <w:rPr>
             <w:rStyle w:val="Hyperlink"/>
@@ -10162,8 +10201,8 @@
         <w:t xml:space="preserve">.</w:t>
       </w:r>
     </w:p>
-    <w:bookmarkEnd w:id="117"/>
-    <w:bookmarkStart w:id="119" w:name="ref-sukor2011"/>
+    <w:bookmarkEnd w:id="119"/>
+    <w:bookmarkStart w:id="121" w:name="ref-sukor2011"/>
     <w:p>
       <w:pPr>
         <w:pStyle w:val="Bibliography"/>
@@ -10196,7 +10235,7 @@
       <w:r>
         <w:t xml:space="preserve"> </w:t>
       </w:r>
-      <w:hyperlink r:id="rId118">
+      <w:hyperlink r:id="rId120">
         <w:r>
           <w:rPr>
             <w:rStyle w:val="Hyperlink"/>
@@ -10208,8 +10247,8 @@
         <w:t xml:space="preserve">.</w:t>
       </w:r>
     </w:p>
-    <w:bookmarkEnd w:id="119"/>
-    <w:bookmarkStart w:id="121" w:name="ref-vasey2022decideai"/>
+    <w:bookmarkEnd w:id="121"/>
+    <w:bookmarkStart w:id="123" w:name="ref-vasey2022decideai"/>
     <w:p>
       <w:pPr>
         <w:pStyle w:val="Bibliography"/>
@@ -10254,7 +10293,7 @@
       <w:r>
         <w:t xml:space="preserve"> </w:t>
       </w:r>
-      <w:hyperlink r:id="rId120">
+      <w:hyperlink r:id="rId122">
         <w:r>
           <w:rPr>
             <w:rStyle w:val="Hyperlink"/>
@@ -10266,8 +10305,8 @@
         <w:t xml:space="preserve">.</w:t>
       </w:r>
     </w:p>
-    <w:bookmarkEnd w:id="121"/>
-    <w:bookmarkStart w:id="123" w:name="ref-vyas2020"/>
+    <w:bookmarkEnd w:id="123"/>
+    <w:bookmarkStart w:id="125" w:name="ref-vyas2020"/>
     <w:p>
       <w:pPr>
         <w:pStyle w:val="Bibliography"/>
@@ -10300,7 +10339,7 @@
       <w:r>
         <w:t xml:space="preserve"> </w:t>
       </w:r>
-      <w:hyperlink r:id="rId122">
+      <w:hyperlink r:id="rId124">
         <w:r>
           <w:rPr>
             <w:rStyle w:val="Hyperlink"/>
@@ -10312,8 +10351,8 @@
         <w:t xml:space="preserve">.</w:t>
       </w:r>
     </w:p>
-    <w:bookmarkEnd w:id="123"/>
-    <w:bookmarkStart w:id="125" w:name="ref-wilcoxon1945"/>
+    <w:bookmarkEnd w:id="125"/>
+    <w:bookmarkStart w:id="127" w:name="ref-wilcoxon1945"/>
     <w:p>
       <w:pPr>
         <w:pStyle w:val="Bibliography"/>
@@ -10346,7 +10385,7 @@
       <w:r>
         <w:t xml:space="preserve"> </w:t>
       </w:r>
-      <w:hyperlink r:id="rId124">
+      <w:hyperlink r:id="rId126">
         <w:r>
           <w:rPr>
             <w:rStyle w:val="Hyperlink"/>
@@ -10358,10 +10397,10 @@
         <w:t xml:space="preserve">.</w:t>
       </w:r>
     </w:p>
-    <w:bookmarkEnd w:id="125"/>
-    <w:bookmarkEnd w:id="126"/>
     <w:bookmarkEnd w:id="127"/>
     <w:bookmarkEnd w:id="128"/>
+    <w:bookmarkEnd w:id="129"/>
+    <w:bookmarkEnd w:id="130"/>
     <w:sectPr>
       <w:footnotePr>
         <w:numRestart w:val="eachSect"/>

</xml_diff>

<commit_message>
Polish: remove doubled author-year in Section 2.8 baseline bullets; replace hand-written reference stub with citeproc anchor so the full bibliography renders under the References heading before the supplement; recompile
</commit_message>
<xml_diff>
--- a/paper/manuscript.docx
+++ b/paper/manuscript.docx
@@ -1545,28 +1545,7 @@
           <w:b/>
           <w:bCs/>
         </w:rPr>
-        <w:t xml:space="preserve">Orphanidou et al. (2015)</w:t>
-      </w:r>
-      <w:r>
-        <w:rPr>
-          <w:b/>
-          <w:bCs/>
-        </w:rPr>
-        <w:t xml:space="preserve"> </w:t>
-      </w:r>
-      <w:r>
-        <w:rPr>
-          <w:b/>
-          <w:bCs/>
-        </w:rPr>
-        <w:t xml:space="preserve">(Orphanidou et al. 2015)</w:t>
-      </w:r>
-      <w:r>
-        <w:rPr>
-          <w:b/>
-          <w:bCs/>
-        </w:rPr>
-        <w:t xml:space="preserve">:</w:t>
+        <w:t xml:space="preserve">Orphanidou et al. (2015):</w:t>
       </w:r>
       <w:r>
         <w:t xml:space="preserve"> </w:t>
@@ -1588,28 +1567,7 @@
           <w:b/>
           <w:bCs/>
         </w:rPr>
-        <w:t xml:space="preserve">Sukor et al. (2011)</w:t>
-      </w:r>
-      <w:r>
-        <w:rPr>
-          <w:b/>
-          <w:bCs/>
-        </w:rPr>
-        <w:t xml:space="preserve"> </w:t>
-      </w:r>
-      <w:r>
-        <w:rPr>
-          <w:b/>
-          <w:bCs/>
-        </w:rPr>
-        <w:t xml:space="preserve">(Sukor et al. 2011)</w:t>
-      </w:r>
-      <w:r>
-        <w:rPr>
-          <w:b/>
-          <w:bCs/>
-        </w:rPr>
-        <w:t xml:space="preserve">:</w:t>
+        <w:t xml:space="preserve">Sukor et al. (2011):</w:t>
       </w:r>
       <w:r>
         <w:t xml:space="preserve"> </w:t>
@@ -1631,28 +1589,7 @@
           <w:b/>
           <w:bCs/>
         </w:rPr>
-        <w:t xml:space="preserve">Elgendi (2016)</w:t>
-      </w:r>
-      <w:r>
-        <w:rPr>
-          <w:b/>
-          <w:bCs/>
-        </w:rPr>
-        <w:t xml:space="preserve"> </w:t>
-      </w:r>
-      <w:r>
-        <w:rPr>
-          <w:b/>
-          <w:bCs/>
-        </w:rPr>
-        <w:t xml:space="preserve">(Elgendi 2016)</w:t>
-      </w:r>
-      <w:r>
-        <w:rPr>
-          <w:b/>
-          <w:bCs/>
-        </w:rPr>
-        <w:t xml:space="preserve">:</w:t>
+        <w:t xml:space="preserve">Elgendi (2016):</w:t>
       </w:r>
       <w:r>
         <w:t xml:space="preserve"> </w:t>
@@ -8870,7 +8807,7 @@
       </w:r>
     </w:p>
     <w:bookmarkEnd w:id="72"/>
-    <w:bookmarkStart w:id="73" w:name="references"/>
+    <w:bookmarkStart w:id="128" w:name="references"/>
     <w:p>
       <w:pPr>
         <w:pStyle w:val="Heading2"/>
@@ -8879,176 +8816,8 @@
         <w:t xml:space="preserve">References</w:t>
       </w:r>
     </w:p>
-    <w:p>
-      <w:pPr>
-        <w:pStyle w:val="FirstParagraph"/>
-      </w:pPr>
-      <w:r>
-        <w:t xml:space="preserve">See</w:t>
-      </w:r>
-      <w:r>
-        <w:t xml:space="preserve"> </w:t>
-      </w:r>
-      <w:r>
-        <w:rPr>
-          <w:rStyle w:val="VerbatimChar"/>
-        </w:rPr>
-        <w:t xml:space="preserve">paper/paper.bib</w:t>
-      </w:r>
-      <w:r>
-        <w:t xml:space="preserve"> </w:t>
-      </w:r>
-      <w:r>
-        <w:t xml:space="preserve">for full citations (Orphanidou et al. 2015, Sukor et al. 2011, Clifford et al. 2012, Robins et al. 1994, Shrout &amp; Fleiss 1979, Bland &amp; Altman 1986, Schmidt et al. 2018, Föll et al. 2021, Efron &amp; Tibshirani 1993, Malik 1996).</w:t>
-      </w:r>
-    </w:p>
-    <w:bookmarkEnd w:id="73"/>
-    <w:bookmarkStart w:id="129" w:name="supplementary-materials"/>
-    <w:p>
-      <w:pPr>
-        <w:pStyle w:val="Heading2"/>
-      </w:pPr>
-      <w:r>
-        <w:t xml:space="preserve">Supplementary materials</w:t>
-      </w:r>
-    </w:p>
-    <w:p>
-      <w:pPr>
-        <w:pStyle w:val="Compact"/>
-        <w:numPr>
-          <w:ilvl w:val="0"/>
-          <w:numId w:val="1006"/>
-        </w:numPr>
-      </w:pPr>
-      <w:r>
-        <w:rPr>
-          <w:rStyle w:val="VerbatimChar"/>
-        </w:rPr>
-        <w:t xml:space="preserve">paper/supplement.md</w:t>
-      </w:r>
-      <w:r>
-        <w:t xml:space="preserve"> </w:t>
-      </w:r>
-      <w:r>
-        <w:t xml:space="preserve">/</w:t>
-      </w:r>
-      <w:r>
-        <w:t xml:space="preserve"> </w:t>
-      </w:r>
-      <w:r>
-        <w:rPr>
-          <w:rStyle w:val="VerbatimChar"/>
-        </w:rPr>
-        <w:t xml:space="preserve">paper/supplement.docx</w:t>
-      </w:r>
-      <w:r>
-        <w:t xml:space="preserve">: companion supplement with seven sections (S1 ICC days-as-raters diagnostic, S2 AIPW positivity and E-value sensitivity, S3 cross-cohort parameter-sweep details, S4 per-subject stress effect-sizes on WESAD, S5 per-subject amusement effect-sizes on WESAD, S6 learned trust-score weights with training-versus-holdout breakdown, S7 threshold-sensitivity analysis for the in-house SQI baseline on both real datasets) and five supplementary tables (Tables S1-S5).</w:t>
-      </w:r>
-    </w:p>
-    <w:p>
-      <w:pPr>
-        <w:pStyle w:val="Compact"/>
-        <w:numPr>
-          <w:ilvl w:val="0"/>
-          <w:numId w:val="1006"/>
-        </w:numPr>
-      </w:pPr>
-      <w:r>
-        <w:rPr>
-          <w:rStyle w:val="VerbatimChar"/>
-        </w:rPr>
-        <w:t xml:space="preserve">paper/checklists/</w:t>
-      </w:r>
-      <w:r>
-        <w:t xml:space="preserve">: per-standard reporting-compliance summaries (TRIPOD+AI, STARD 2015, CONSORT-AI applicability, DECIDE-AI applicability).</w:t>
-      </w:r>
-    </w:p>
-    <w:p>
-      <w:pPr>
-        <w:pStyle w:val="Compact"/>
-        <w:numPr>
-          <w:ilvl w:val="0"/>
-          <w:numId w:val="1006"/>
-        </w:numPr>
-      </w:pPr>
-      <w:r>
-        <w:rPr>
-          <w:rStyle w:val="VerbatimChar"/>
-        </w:rPr>
-        <w:t xml:space="preserve">results/real_data/wesad_deep/</w:t>
-      </w:r>
-      <w:r>
-        <w:t xml:space="preserve"> </w:t>
-      </w:r>
-      <w:r>
-        <w:t xml:space="preserve">and</w:t>
-      </w:r>
-      <w:r>
-        <w:t xml:space="preserve"> </w:t>
-      </w:r>
-      <w:r>
-        <w:rPr>
-          <w:rStyle w:val="VerbatimChar"/>
-        </w:rPr>
-        <w:t xml:space="preserve">results/real_data/ppg_dalia/</w:t>
-      </w:r>
-      <w:r>
-        <w:t xml:space="preserve">: per-window CSVs (window_table.csv, window_meta.csv, daily_summary.csv) and summary.json files for both real-data datasets.</w:t>
-      </w:r>
-    </w:p>
-    <w:p>
-      <w:pPr>
-        <w:pStyle w:val="Compact"/>
-        <w:numPr>
-          <w:ilvl w:val="0"/>
-          <w:numId w:val="1006"/>
-        </w:numPr>
-      </w:pPr>
-      <w:r>
-        <w:rPr>
-          <w:rStyle w:val="VerbatimChar"/>
-        </w:rPr>
-        <w:t xml:space="preserve">results/real_data/threshold_sensitivity.csv</w:t>
-      </w:r>
-      <w:r>
-        <w:t xml:space="preserve"> </w:t>
-      </w:r>
-      <w:r>
-        <w:t xml:space="preserve">and</w:t>
-      </w:r>
-      <w:r>
-        <w:t xml:space="preserve"> </w:t>
-      </w:r>
-      <w:r>
-        <w:rPr>
-          <w:rStyle w:val="VerbatimChar"/>
-        </w:rPr>
-        <w:t xml:space="preserve">results/real_data/loso_recalibration.csv</w:t>
-      </w:r>
-      <w:r>
-        <w:t xml:space="preserve">: robustness-analysis output files.</w:t>
-      </w:r>
-    </w:p>
-    <w:p>
-      <w:pPr>
-        <w:pStyle w:val="Compact"/>
-        <w:numPr>
-          <w:ilvl w:val="0"/>
-          <w:numId w:val="1006"/>
-        </w:numPr>
-      </w:pPr>
-      <w:r>
-        <w:rPr>
-          <w:rStyle w:val="VerbatimChar"/>
-        </w:rPr>
-        <w:t xml:space="preserve">CHANGELOG.md</w:t>
-      </w:r>
-      <w:r>
-        <w:t xml:space="preserve">: full release history of the toolkit.</w:t>
-      </w:r>
-    </w:p>
-    <w:bookmarkStart w:id="128" w:name="refs"/>
-    <w:bookmarkStart w:id="75" w:name="ref-allen2007"/>
+    <w:bookmarkStart w:id="127" w:name="refs"/>
+    <w:bookmarkStart w:id="74" w:name="ref-allen2007"/>
     <w:p>
       <w:pPr>
         <w:pStyle w:val="Bibliography"/>
@@ -9081,7 +8850,7 @@
       <w:r>
         <w:t xml:space="preserve"> </w:t>
       </w:r>
-      <w:hyperlink r:id="rId74">
+      <w:hyperlink r:id="rId73">
         <w:r>
           <w:rPr>
             <w:rStyle w:val="Hyperlink"/>
@@ -9093,8 +8862,8 @@
         <w:t xml:space="preserve">.</w:t>
       </w:r>
     </w:p>
-    <w:bookmarkEnd w:id="75"/>
-    <w:bookmarkStart w:id="77" w:name="ref-bent2020"/>
+    <w:bookmarkEnd w:id="74"/>
+    <w:bookmarkStart w:id="76" w:name="ref-bent2020"/>
     <w:p>
       <w:pPr>
         <w:pStyle w:val="Bibliography"/>
@@ -9127,7 +8896,7 @@
       <w:r>
         <w:t xml:space="preserve"> </w:t>
       </w:r>
-      <w:hyperlink r:id="rId76">
+      <w:hyperlink r:id="rId75">
         <w:r>
           <w:rPr>
             <w:rStyle w:val="Hyperlink"/>
@@ -9139,8 +8908,8 @@
         <w:t xml:space="preserve">.</w:t>
       </w:r>
     </w:p>
-    <w:bookmarkEnd w:id="77"/>
-    <w:bookmarkStart w:id="79" w:name="ref-bland1986"/>
+    <w:bookmarkEnd w:id="76"/>
+    <w:bookmarkStart w:id="78" w:name="ref-bland1986"/>
     <w:p>
       <w:pPr>
         <w:pStyle w:val="Bibliography"/>
@@ -9173,7 +8942,7 @@
       <w:r>
         <w:t xml:space="preserve"> </w:t>
       </w:r>
-      <w:hyperlink r:id="rId78">
+      <w:hyperlink r:id="rId77">
         <w:r>
           <w:rPr>
             <w:rStyle w:val="Hyperlink"/>
@@ -9185,8 +8954,8 @@
         <w:t xml:space="preserve">.</w:t>
       </w:r>
     </w:p>
-    <w:bookmarkEnd w:id="79"/>
-    <w:bookmarkStart w:id="81" w:name="ref-bossuyt2015stard"/>
+    <w:bookmarkEnd w:id="78"/>
+    <w:bookmarkStart w:id="80" w:name="ref-bossuyt2015stard"/>
     <w:p>
       <w:pPr>
         <w:pStyle w:val="Bibliography"/>
@@ -9231,7 +9000,7 @@
       <w:r>
         <w:t xml:space="preserve"> </w:t>
       </w:r>
-      <w:hyperlink r:id="rId80">
+      <w:hyperlink r:id="rId79">
         <w:r>
           <w:rPr>
             <w:rStyle w:val="Hyperlink"/>
@@ -9243,8 +9012,8 @@
         <w:t xml:space="preserve">.</w:t>
       </w:r>
     </w:p>
-    <w:bookmarkEnd w:id="81"/>
-    <w:bookmarkStart w:id="83" w:name="ref-cliff1993"/>
+    <w:bookmarkEnd w:id="80"/>
+    <w:bookmarkStart w:id="82" w:name="ref-cliff1993"/>
     <w:p>
       <w:pPr>
         <w:pStyle w:val="Bibliography"/>
@@ -9277,7 +9046,7 @@
       <w:r>
         <w:t xml:space="preserve"> </w:t>
       </w:r>
-      <w:hyperlink r:id="rId82">
+      <w:hyperlink r:id="rId81">
         <w:r>
           <w:rPr>
             <w:rStyle w:val="Hyperlink"/>
@@ -9289,8 +9058,8 @@
         <w:t xml:space="preserve">.</w:t>
       </w:r>
     </w:p>
-    <w:bookmarkEnd w:id="83"/>
-    <w:bookmarkStart w:id="85" w:name="ref-clifford2012"/>
+    <w:bookmarkEnd w:id="82"/>
+    <w:bookmarkStart w:id="84" w:name="ref-clifford2012"/>
     <w:p>
       <w:pPr>
         <w:pStyle w:val="Bibliography"/>
@@ -9323,7 +9092,7 @@
       <w:r>
         <w:t xml:space="preserve"> </w:t>
       </w:r>
-      <w:hyperlink r:id="rId84">
+      <w:hyperlink r:id="rId83">
         <w:r>
           <w:rPr>
             <w:rStyle w:val="Hyperlink"/>
@@ -9335,8 +9104,8 @@
         <w:t xml:space="preserve">.</w:t>
       </w:r>
     </w:p>
-    <w:bookmarkEnd w:id="85"/>
-    <w:bookmarkStart w:id="86" w:name="ref-cohen1988"/>
+    <w:bookmarkEnd w:id="84"/>
+    <w:bookmarkStart w:id="85" w:name="ref-cohen1988"/>
     <w:p>
       <w:pPr>
         <w:pStyle w:val="Bibliography"/>
@@ -9358,8 +9127,8 @@
         <w:t xml:space="preserve">. 2nd ed. Lawrence Erlbaum Associates.</w:t>
       </w:r>
     </w:p>
-    <w:bookmarkEnd w:id="86"/>
-    <w:bookmarkStart w:id="88" w:name="ref-collins2024tripodai"/>
+    <w:bookmarkEnd w:id="85"/>
+    <w:bookmarkStart w:id="87" w:name="ref-collins2024tripodai"/>
     <w:p>
       <w:pPr>
         <w:pStyle w:val="Bibliography"/>
@@ -9410,7 +9179,7 @@
       <w:r>
         <w:t xml:space="preserve"> </w:t>
       </w:r>
-      <w:hyperlink r:id="rId87">
+      <w:hyperlink r:id="rId86">
         <w:r>
           <w:rPr>
             <w:rStyle w:val="Hyperlink"/>
@@ -9422,8 +9191,8 @@
         <w:t xml:space="preserve">.</w:t>
       </w:r>
     </w:p>
-    <w:bookmarkEnd w:id="88"/>
-    <w:bookmarkStart w:id="89" w:name="ref-efron1993"/>
+    <w:bookmarkEnd w:id="87"/>
+    <w:bookmarkStart w:id="88" w:name="ref-efron1993"/>
     <w:p>
       <w:pPr>
         <w:pStyle w:val="Bibliography"/>
@@ -9445,8 +9214,8 @@
         <w:t xml:space="preserve">. Chapman &amp; Hall/CRC.</w:t>
       </w:r>
     </w:p>
-    <w:bookmarkEnd w:id="89"/>
-    <w:bookmarkStart w:id="91" w:name="ref-elgendi2016"/>
+    <w:bookmarkEnd w:id="88"/>
+    <w:bookmarkStart w:id="90" w:name="ref-elgendi2016"/>
     <w:p>
       <w:pPr>
         <w:pStyle w:val="Bibliography"/>
@@ -9479,7 +9248,7 @@
       <w:r>
         <w:t xml:space="preserve"> </w:t>
       </w:r>
-      <w:hyperlink r:id="rId90">
+      <w:hyperlink r:id="rId89">
         <w:r>
           <w:rPr>
             <w:rStyle w:val="Hyperlink"/>
@@ -9491,8 +9260,8 @@
         <w:t xml:space="preserve">.</w:t>
       </w:r>
     </w:p>
-    <w:bookmarkEnd w:id="91"/>
-    <w:bookmarkStart w:id="93" w:name="ref-foll2021"/>
+    <w:bookmarkEnd w:id="90"/>
+    <w:bookmarkStart w:id="92" w:name="ref-foll2021"/>
     <w:p>
       <w:pPr>
         <w:pStyle w:val="Bibliography"/>
@@ -9531,7 +9300,7 @@
       <w:r>
         <w:t xml:space="preserve"> </w:t>
       </w:r>
-      <w:hyperlink r:id="rId92">
+      <w:hyperlink r:id="rId91">
         <w:r>
           <w:rPr>
             <w:rStyle w:val="Hyperlink"/>
@@ -9543,8 +9312,8 @@
         <w:t xml:space="preserve">.</w:t>
       </w:r>
     </w:p>
-    <w:bookmarkEnd w:id="93"/>
-    <w:bookmarkStart w:id="95" w:name="ref-liu2020consortai"/>
+    <w:bookmarkEnd w:id="92"/>
+    <w:bookmarkStart w:id="94" w:name="ref-liu2020consortai"/>
     <w:p>
       <w:pPr>
         <w:pStyle w:val="Bibliography"/>
@@ -9589,7 +9358,7 @@
       <w:r>
         <w:t xml:space="preserve"> </w:t>
       </w:r>
-      <w:hyperlink r:id="rId94">
+      <w:hyperlink r:id="rId93">
         <w:r>
           <w:rPr>
             <w:rStyle w:val="Hyperlink"/>
@@ -9601,8 +9370,8 @@
         <w:t xml:space="preserve">.</w:t>
       </w:r>
     </w:p>
-    <w:bookmarkEnd w:id="95"/>
-    <w:bookmarkStart w:id="97" w:name="ref-malik1996"/>
+    <w:bookmarkEnd w:id="94"/>
+    <w:bookmarkStart w:id="96" w:name="ref-malik1996"/>
     <w:p>
       <w:pPr>
         <w:pStyle w:val="Bibliography"/>
@@ -9668,7 +9437,7 @@
       <w:r>
         <w:t xml:space="preserve"> </w:t>
       </w:r>
-      <w:hyperlink r:id="rId96">
+      <w:hyperlink r:id="rId95">
         <w:r>
           <w:rPr>
             <w:rStyle w:val="Hyperlink"/>
@@ -9680,8 +9449,8 @@
         <w:t xml:space="preserve">.</w:t>
       </w:r>
     </w:p>
-    <w:bookmarkEnd w:id="97"/>
-    <w:bookmarkStart w:id="99" w:name="ref-mclean2023sliding"/>
+    <w:bookmarkEnd w:id="96"/>
+    <w:bookmarkStart w:id="98" w:name="ref-mclean2023sliding"/>
     <w:p>
       <w:pPr>
         <w:pStyle w:val="Bibliography"/>
@@ -9714,7 +9483,7 @@
       <w:r>
         <w:t xml:space="preserve"> </w:t>
       </w:r>
-      <w:hyperlink r:id="rId98">
+      <w:hyperlink r:id="rId97">
         <w:r>
           <w:rPr>
             <w:rStyle w:val="Hyperlink"/>
@@ -9726,8 +9495,8 @@
         <w:t xml:space="preserve">.</w:t>
       </w:r>
     </w:p>
-    <w:bookmarkEnd w:id="99"/>
-    <w:bookmarkStart w:id="101" w:name="ref-charlton2021ppgproc"/>
+    <w:bookmarkEnd w:id="98"/>
+    <w:bookmarkStart w:id="100" w:name="ref-charlton2021ppgproc"/>
     <w:p>
       <w:pPr>
         <w:pStyle w:val="Bibliography"/>
@@ -9763,7 +9532,7 @@
       <w:r>
         <w:t xml:space="preserve"> </w:t>
       </w:r>
-      <w:hyperlink r:id="rId100">
+      <w:hyperlink r:id="rId99">
         <w:r>
           <w:rPr>
             <w:rStyle w:val="Hyperlink"/>
@@ -9775,8 +9544,8 @@
         <w:t xml:space="preserve">.</w:t>
       </w:r>
     </w:p>
-    <w:bookmarkEnd w:id="101"/>
-    <w:bookmarkStart w:id="103" w:name="ref-obermeyer2019"/>
+    <w:bookmarkEnd w:id="100"/>
+    <w:bookmarkStart w:id="102" w:name="ref-obermeyer2019"/>
     <w:p>
       <w:pPr>
         <w:pStyle w:val="Bibliography"/>
@@ -9809,7 +9578,7 @@
       <w:r>
         <w:t xml:space="preserve"> </w:t>
       </w:r>
-      <w:hyperlink r:id="rId102">
+      <w:hyperlink r:id="rId101">
         <w:r>
           <w:rPr>
             <w:rStyle w:val="Hyperlink"/>
@@ -9821,8 +9590,8 @@
         <w:t xml:space="preserve">.</w:t>
       </w:r>
     </w:p>
-    <w:bookmarkEnd w:id="103"/>
-    <w:bookmarkStart w:id="105" w:name="ref-orphanidou2015"/>
+    <w:bookmarkEnd w:id="102"/>
+    <w:bookmarkStart w:id="104" w:name="ref-orphanidou2015"/>
     <w:p>
       <w:pPr>
         <w:pStyle w:val="Bibliography"/>
@@ -9855,7 +9624,7 @@
       <w:r>
         <w:t xml:space="preserve"> </w:t>
       </w:r>
-      <w:hyperlink r:id="rId104">
+      <w:hyperlink r:id="rId103">
         <w:r>
           <w:rPr>
             <w:rStyle w:val="Hyperlink"/>
@@ -9867,8 +9636,8 @@
         <w:t xml:space="preserve">.</w:t>
       </w:r>
     </w:p>
-    <w:bookmarkEnd w:id="105"/>
-    <w:bookmarkStart w:id="107" w:name="ref-reiss2019"/>
+    <w:bookmarkEnd w:id="104"/>
+    <w:bookmarkStart w:id="106" w:name="ref-reiss2019"/>
     <w:p>
       <w:pPr>
         <w:pStyle w:val="Bibliography"/>
@@ -9907,7 +9676,7 @@
       <w:r>
         <w:t xml:space="preserve"> </w:t>
       </w:r>
-      <w:hyperlink r:id="rId106">
+      <w:hyperlink r:id="rId105">
         <w:r>
           <w:rPr>
             <w:rStyle w:val="Hyperlink"/>
@@ -9919,8 +9688,8 @@
         <w:t xml:space="preserve">.</w:t>
       </w:r>
     </w:p>
-    <w:bookmarkEnd w:id="107"/>
-    <w:bookmarkStart w:id="109" w:name="ref-robins1994"/>
+    <w:bookmarkEnd w:id="106"/>
+    <w:bookmarkStart w:id="108" w:name="ref-robins1994"/>
     <w:p>
       <w:pPr>
         <w:pStyle w:val="Bibliography"/>
@@ -9953,7 +9722,7 @@
       <w:r>
         <w:t xml:space="preserve"> </w:t>
       </w:r>
-      <w:hyperlink r:id="rId108">
+      <w:hyperlink r:id="rId107">
         <w:r>
           <w:rPr>
             <w:rStyle w:val="Hyperlink"/>
@@ -9965,8 +9734,8 @@
         <w:t xml:space="preserve">.</w:t>
       </w:r>
     </w:p>
-    <w:bookmarkEnd w:id="109"/>
-    <w:bookmarkStart w:id="111" w:name="ref-schafer2013"/>
+    <w:bookmarkEnd w:id="108"/>
+    <w:bookmarkStart w:id="110" w:name="ref-schafer2013"/>
     <w:p>
       <w:pPr>
         <w:pStyle w:val="Bibliography"/>
@@ -9999,7 +9768,7 @@
       <w:r>
         <w:t xml:space="preserve"> </w:t>
       </w:r>
-      <w:hyperlink r:id="rId110">
+      <w:hyperlink r:id="rId109">
         <w:r>
           <w:rPr>
             <w:rStyle w:val="Hyperlink"/>
@@ -10011,8 +9780,8 @@
         <w:t xml:space="preserve">.</w:t>
       </w:r>
     </w:p>
-    <w:bookmarkEnd w:id="111"/>
-    <w:bookmarkStart w:id="113" w:name="ref-schmidt2018"/>
+    <w:bookmarkEnd w:id="110"/>
+    <w:bookmarkStart w:id="112" w:name="ref-schmidt2018"/>
     <w:p>
       <w:pPr>
         <w:pStyle w:val="Bibliography"/>
@@ -10051,7 +9820,7 @@
       <w:r>
         <w:t xml:space="preserve"> </w:t>
       </w:r>
-      <w:hyperlink r:id="rId112">
+      <w:hyperlink r:id="rId111">
         <w:r>
           <w:rPr>
             <w:rStyle w:val="Hyperlink"/>
@@ -10063,8 +9832,8 @@
         <w:t xml:space="preserve">.</w:t>
       </w:r>
     </w:p>
-    <w:bookmarkEnd w:id="113"/>
-    <w:bookmarkStart w:id="115" w:name="ref-shcherbina2017"/>
+    <w:bookmarkEnd w:id="112"/>
+    <w:bookmarkStart w:id="114" w:name="ref-shcherbina2017"/>
     <w:p>
       <w:pPr>
         <w:pStyle w:val="Bibliography"/>
@@ -10097,7 +9866,7 @@
       <w:r>
         <w:t xml:space="preserve"> </w:t>
       </w:r>
-      <w:hyperlink r:id="rId114">
+      <w:hyperlink r:id="rId113">
         <w:r>
           <w:rPr>
             <w:rStyle w:val="Hyperlink"/>
@@ -10109,8 +9878,8 @@
         <w:t xml:space="preserve">.</w:t>
       </w:r>
     </w:p>
-    <w:bookmarkEnd w:id="115"/>
-    <w:bookmarkStart w:id="117" w:name="ref-shrout1979"/>
+    <w:bookmarkEnd w:id="114"/>
+    <w:bookmarkStart w:id="116" w:name="ref-shrout1979"/>
     <w:p>
       <w:pPr>
         <w:pStyle w:val="Bibliography"/>
@@ -10143,7 +9912,7 @@
       <w:r>
         <w:t xml:space="preserve"> </w:t>
       </w:r>
-      <w:hyperlink r:id="rId116">
+      <w:hyperlink r:id="rId115">
         <w:r>
           <w:rPr>
             <w:rStyle w:val="Hyperlink"/>
@@ -10155,8 +9924,8 @@
         <w:t xml:space="preserve">.</w:t>
       </w:r>
     </w:p>
-    <w:bookmarkEnd w:id="117"/>
-    <w:bookmarkStart w:id="119" w:name="ref-sjoding2020"/>
+    <w:bookmarkEnd w:id="116"/>
+    <w:bookmarkStart w:id="118" w:name="ref-sjoding2020"/>
     <w:p>
       <w:pPr>
         <w:pStyle w:val="Bibliography"/>
@@ -10189,7 +9958,7 @@
       <w:r>
         <w:t xml:space="preserve"> </w:t>
       </w:r>
-      <w:hyperlink r:id="rId118">
+      <w:hyperlink r:id="rId117">
         <w:r>
           <w:rPr>
             <w:rStyle w:val="Hyperlink"/>
@@ -10201,8 +9970,8 @@
         <w:t xml:space="preserve">.</w:t>
       </w:r>
     </w:p>
-    <w:bookmarkEnd w:id="119"/>
-    <w:bookmarkStart w:id="121" w:name="ref-sukor2011"/>
+    <w:bookmarkEnd w:id="118"/>
+    <w:bookmarkStart w:id="120" w:name="ref-sukor2011"/>
     <w:p>
       <w:pPr>
         <w:pStyle w:val="Bibliography"/>
@@ -10235,7 +10004,7 @@
       <w:r>
         <w:t xml:space="preserve"> </w:t>
       </w:r>
-      <w:hyperlink r:id="rId120">
+      <w:hyperlink r:id="rId119">
         <w:r>
           <w:rPr>
             <w:rStyle w:val="Hyperlink"/>
@@ -10247,8 +10016,8 @@
         <w:t xml:space="preserve">.</w:t>
       </w:r>
     </w:p>
-    <w:bookmarkEnd w:id="121"/>
-    <w:bookmarkStart w:id="123" w:name="ref-vasey2022decideai"/>
+    <w:bookmarkEnd w:id="120"/>
+    <w:bookmarkStart w:id="122" w:name="ref-vasey2022decideai"/>
     <w:p>
       <w:pPr>
         <w:pStyle w:val="Bibliography"/>
@@ -10293,7 +10062,7 @@
       <w:r>
         <w:t xml:space="preserve"> </w:t>
       </w:r>
-      <w:hyperlink r:id="rId122">
+      <w:hyperlink r:id="rId121">
         <w:r>
           <w:rPr>
             <w:rStyle w:val="Hyperlink"/>
@@ -10305,8 +10074,8 @@
         <w:t xml:space="preserve">.</w:t>
       </w:r>
     </w:p>
-    <w:bookmarkEnd w:id="123"/>
-    <w:bookmarkStart w:id="125" w:name="ref-vyas2020"/>
+    <w:bookmarkEnd w:id="122"/>
+    <w:bookmarkStart w:id="124" w:name="ref-vyas2020"/>
     <w:p>
       <w:pPr>
         <w:pStyle w:val="Bibliography"/>
@@ -10339,7 +10108,7 @@
       <w:r>
         <w:t xml:space="preserve"> </w:t>
       </w:r>
-      <w:hyperlink r:id="rId124">
+      <w:hyperlink r:id="rId123">
         <w:r>
           <w:rPr>
             <w:rStyle w:val="Hyperlink"/>
@@ -10351,8 +10120,8 @@
         <w:t xml:space="preserve">.</w:t>
       </w:r>
     </w:p>
-    <w:bookmarkEnd w:id="125"/>
-    <w:bookmarkStart w:id="127" w:name="ref-wilcoxon1945"/>
+    <w:bookmarkEnd w:id="124"/>
+    <w:bookmarkStart w:id="126" w:name="ref-wilcoxon1945"/>
     <w:p>
       <w:pPr>
         <w:pStyle w:val="Bibliography"/>
@@ -10385,7 +10154,7 @@
       <w:r>
         <w:t xml:space="preserve"> </w:t>
       </w:r>
-      <w:hyperlink r:id="rId126">
+      <w:hyperlink r:id="rId125">
         <w:r>
           <w:rPr>
             <w:rStyle w:val="Hyperlink"/>
@@ -10397,8 +10166,153 @@
         <w:t xml:space="preserve">.</w:t>
       </w:r>
     </w:p>
+    <w:bookmarkEnd w:id="126"/>
     <w:bookmarkEnd w:id="127"/>
     <w:bookmarkEnd w:id="128"/>
+    <w:bookmarkStart w:id="129" w:name="supplementary-materials"/>
+    <w:p>
+      <w:pPr>
+        <w:pStyle w:val="Heading2"/>
+      </w:pPr>
+      <w:r>
+        <w:t xml:space="preserve">Supplementary materials</w:t>
+      </w:r>
+    </w:p>
+    <w:p>
+      <w:pPr>
+        <w:pStyle w:val="Compact"/>
+        <w:numPr>
+          <w:ilvl w:val="0"/>
+          <w:numId w:val="1006"/>
+        </w:numPr>
+      </w:pPr>
+      <w:r>
+        <w:rPr>
+          <w:rStyle w:val="VerbatimChar"/>
+        </w:rPr>
+        <w:t xml:space="preserve">paper/supplement.md</w:t>
+      </w:r>
+      <w:r>
+        <w:t xml:space="preserve"> </w:t>
+      </w:r>
+      <w:r>
+        <w:t xml:space="preserve">/</w:t>
+      </w:r>
+      <w:r>
+        <w:t xml:space="preserve"> </w:t>
+      </w:r>
+      <w:r>
+        <w:rPr>
+          <w:rStyle w:val="VerbatimChar"/>
+        </w:rPr>
+        <w:t xml:space="preserve">paper/supplement.docx</w:t>
+      </w:r>
+      <w:r>
+        <w:t xml:space="preserve">: companion supplement with seven sections (S1 ICC days-as-raters diagnostic, S2 AIPW positivity and E-value sensitivity, S3 cross-cohort parameter-sweep details, S4 per-subject stress effect-sizes on WESAD, S5 per-subject amusement effect-sizes on WESAD, S6 learned trust-score weights with training-versus-holdout breakdown, S7 threshold-sensitivity analysis for the in-house SQI baseline on both real datasets) and five supplementary tables (Tables S1-S5).</w:t>
+      </w:r>
+    </w:p>
+    <w:p>
+      <w:pPr>
+        <w:pStyle w:val="Compact"/>
+        <w:numPr>
+          <w:ilvl w:val="0"/>
+          <w:numId w:val="1006"/>
+        </w:numPr>
+      </w:pPr>
+      <w:r>
+        <w:rPr>
+          <w:rStyle w:val="VerbatimChar"/>
+        </w:rPr>
+        <w:t xml:space="preserve">paper/checklists/</w:t>
+      </w:r>
+      <w:r>
+        <w:t xml:space="preserve">: per-standard reporting-compliance summaries (TRIPOD+AI, STARD 2015, CONSORT-AI applicability, DECIDE-AI applicability).</w:t>
+      </w:r>
+    </w:p>
+    <w:p>
+      <w:pPr>
+        <w:pStyle w:val="Compact"/>
+        <w:numPr>
+          <w:ilvl w:val="0"/>
+          <w:numId w:val="1006"/>
+        </w:numPr>
+      </w:pPr>
+      <w:r>
+        <w:rPr>
+          <w:rStyle w:val="VerbatimChar"/>
+        </w:rPr>
+        <w:t xml:space="preserve">results/real_data/wesad_deep/</w:t>
+      </w:r>
+      <w:r>
+        <w:t xml:space="preserve"> </w:t>
+      </w:r>
+      <w:r>
+        <w:t xml:space="preserve">and</w:t>
+      </w:r>
+      <w:r>
+        <w:t xml:space="preserve"> </w:t>
+      </w:r>
+      <w:r>
+        <w:rPr>
+          <w:rStyle w:val="VerbatimChar"/>
+        </w:rPr>
+        <w:t xml:space="preserve">results/real_data/ppg_dalia/</w:t>
+      </w:r>
+      <w:r>
+        <w:t xml:space="preserve">: per-window CSVs (window_table.csv, window_meta.csv, daily_summary.csv) and summary.json files for both real-data datasets.</w:t>
+      </w:r>
+    </w:p>
+    <w:p>
+      <w:pPr>
+        <w:pStyle w:val="Compact"/>
+        <w:numPr>
+          <w:ilvl w:val="0"/>
+          <w:numId w:val="1006"/>
+        </w:numPr>
+      </w:pPr>
+      <w:r>
+        <w:rPr>
+          <w:rStyle w:val="VerbatimChar"/>
+        </w:rPr>
+        <w:t xml:space="preserve">results/real_data/threshold_sensitivity.csv</w:t>
+      </w:r>
+      <w:r>
+        <w:t xml:space="preserve"> </w:t>
+      </w:r>
+      <w:r>
+        <w:t xml:space="preserve">and</w:t>
+      </w:r>
+      <w:r>
+        <w:t xml:space="preserve"> </w:t>
+      </w:r>
+      <w:r>
+        <w:rPr>
+          <w:rStyle w:val="VerbatimChar"/>
+        </w:rPr>
+        <w:t xml:space="preserve">results/real_data/loso_recalibration.csv</w:t>
+      </w:r>
+      <w:r>
+        <w:t xml:space="preserve">: robustness-analysis output files.</w:t>
+      </w:r>
+    </w:p>
+    <w:p>
+      <w:pPr>
+        <w:pStyle w:val="Compact"/>
+        <w:numPr>
+          <w:ilvl w:val="0"/>
+          <w:numId w:val="1006"/>
+        </w:numPr>
+      </w:pPr>
+      <w:r>
+        <w:rPr>
+          <w:rStyle w:val="VerbatimChar"/>
+        </w:rPr>
+        <w:t xml:space="preserve">CHANGELOG.md</w:t>
+      </w:r>
+      <w:r>
+        <w:t xml:space="preserve">: full release history of the toolkit.</w:t>
+      </w:r>
+    </w:p>
     <w:bookmarkEnd w:id="129"/>
     <w:bookmarkEnd w:id="130"/>
     <w:sectPr>

</xml_diff>

<commit_message>
Session 1: agreement-statistics overhaul. Add Gwet's AC1, PABAK, MCC, raw agreement, and subject-clustered bootstrap CIs to Section 3.2 (Table 3); correct the sign of the central claim throughout (abstract, intro, figure captions, 3.7, 5.1, conclusions): the three published methods agree (median AC1 +0.32, raw agreement ~63%), the negative Cohen's kappa is the prevalence paradox, and the in-house threshold is the lone outlier (AC1 negative against all three)
</commit_message>
<xml_diff>
--- a/paper/manuscript.docx
+++ b/paper/manuscript.docx
@@ -177,7 +177,7 @@
         <w:t xml:space="preserve"> </w:t>
       </w:r>
       <w:r>
-        <w:t xml:space="preserve">To quantify cross-method disagreement among published wrist-PPG signal-quality (SQI) methods on a public benchmark, and to characterise the downstream effect of audit-based filtering on biomarker estimation.</w:t>
+        <w:t xml:space="preserve">To quantify cross-method agreement among published wrist-PPG signal-quality (SQI) methods on a public benchmark, and to characterise the downstream effect of audit-based filtering on biomarker estimation.</w:t>
       </w:r>
     </w:p>
     <w:p>
@@ -273,7 +273,7 @@
         <w:t xml:space="preserve"> </w:t>
       </w:r>
       <w:r>
-        <w:t xml:space="preserve">The three published methods disagreed with each other (median pairwise Cohen’s κ = -0.20, range -0.23 to +0.41) but converged on rejecting 44.6% of windows that the in-house threshold accepted, three methods testing three different physical properties of pulse waveforms, three concordant rejections. The in-house SQI was uncorrelated with any published baseline (κ = 0.000 against each). Single-threshold recalibration at n = 15 did not recover agreement (Δκ = 0.000; AUROC for in-house SQI predicting Orphanidou pass/fail = 0.484). Per-subject heterogeneity in wrist-PPG-to-chest-ECG HR disagreement spanned 6.75 to 26.02 bpm during the stress condition, a four-fold range across subjects. Restricting downstream models to Orphanidou-passing windows improved per-subject HR correlation by a median of +0.110 (13 of 15 subjects improved, paired Wilcoxon p = 1.5e-04). The finding replicated on PPG-DaLiA</w:t>
+        <w:t xml:space="preserve">The three published methods agreed with each other (median Gwet’s AC1 = +0.32, mean raw agreement 63%; Cohen’s κ was negative on two of three pairs, a prevalence paradox from their shared 74 to 78% rejection rate) and converged on rejecting 44.6% of windows that the in-house threshold accepted, three methods testing three different physical properties of pulse waveforms, three concordant rejections. The in-house SQI was uncorrelated with any published baseline (κ = 0.000 against each). Single-threshold recalibration at n = 15 did not recover agreement (Δκ = 0.000; AUROC for in-house SQI predicting Orphanidou pass/fail = 0.484). Per-subject heterogeneity in wrist-PPG-to-chest-ECG HR disagreement spanned 6.75 to 26.02 bpm during the stress condition, a four-fold range across subjects. Restricting downstream models to Orphanidou-passing windows improved per-subject HR correlation by a median of +0.110 (13 of 15 subjects improved, paired Wilcoxon p = 1.5e-04). The finding replicated on PPG-DaLiA</w:t>
       </w:r>
       <w:r>
         <w:t xml:space="preserve"> </w:t>
@@ -285,7 +285,7 @@
         <w:t xml:space="preserve"> </w:t>
       </w:r>
       <w:r>
-        <w:t xml:space="preserve">(n = 15 subjects, 18,781 windows, same wrist-PPG hardware but ambulatory rather than stress paradigm): consensus rejection 43.1% (vs 44.6% on WESAD), median pairwise κ across published methods -0.20 (vs -0.20), κ against the in-house threshold 0.000 (vs 0.000). On the synthetic cohort, the audit recovered injected fairness disparities (-13.02 points for device family, -9.53 points for skin-tone quartiles) and AIPW-adjusted confounding estimates with cluster bootstrap CIs.</w:t>
+        <w:t xml:space="preserve">(n = 15 subjects, 18,781 windows, same wrist-PPG hardware but ambulatory rather than stress paradigm): consensus rejection 43.1% (vs 44.6% on WESAD), median published-method Gwet’s AC1 +0.28 (vs +0.32), with the in-house threshold the lone outlier on both. On the synthetic cohort, the audit recovered injected fairness disparities (-13.02 points for device family, -9.53 points for skin-tone quartiles) and AIPW-adjusted confounding estimates with cluster bootstrap CIs.</w:t>
       </w:r>
     </w:p>
     <w:p>
@@ -453,7 +453,7 @@
         <w:t xml:space="preserve">(Schmidt et al. 2018)</w:t>
       </w:r>
       <w:r>
-        <w:t xml:space="preserve">. We show that the three published methods disagree with each other (median pairwise Cohen’s κ = -0.20) but converge on rejecting 44.6% of windows that a representative in-house threshold accepts; single-threshold recalibration at n = 15 does not recover agreement; and audit-based filtering improves downstream per-subject HR correlation by a median of +0.110. To enable reproducibility and reuse, we implement the audit pipeline as an open-source Python toolkit (</w:t>
+        <w:t xml:space="preserve">. We show that the three published methods agree with each other once base rates are accounted for (median Gwet’s AC1 = +0.32; Cohen’s κ is negative on two of the three pairs, a prevalence paradox) and converge on rejecting 44.6% of windows that a representative in-house threshold accepts; single-threshold recalibration at n = 15 does not recover agreement; and audit-based filtering improves downstream per-subject HR correlation by a median of +0.110. To enable reproducibility and reuse, we implement the audit pipeline as an open-source Python toolkit (</w:t>
       </w:r>
       <w:r>
         <w:rPr>
@@ -462,7 +462,7 @@
         <w:t xml:space="preserve">biomedical-signal-forensics-lab</w:t>
       </w:r>
       <w:r>
-        <w:t xml:space="preserve">, MIT licensed), which also includes reliability primitives, doubly-robust causal-adjusted confounding analysis under a user-supplied directed acyclic graph (DAG), change-point detection, and stratified fairness audit. The empirical contribution of this paper is the cross-method SQI disagreement finding; the toolkit is the supporting infrastructure that made the finding reproducible.</w:t>
+        <w:t xml:space="preserve">, MIT licensed), which also includes reliability primitives, doubly-robust causal-adjusted confounding analysis under a user-supplied directed acyclic graph (DAG), change-point detection, and stratified fairness audit. The empirical contribution of this paper is the cross-method SQI consensus-rejection finding; the toolkit is the supporting infrastructure that made the finding reproducible.</w:t>
       </w:r>
     </w:p>
     <w:p>
@@ -474,7 +474,7 @@
           <wp:inline>
             <wp:extent cx="5334000" cy="2459481"/>
             <wp:effectExtent b="0" l="0" r="0" t="0"/>
-            <wp:docPr descr="Figure 1. Cross-method signal-quality disagreement on wearable photoplethysmography. Each colored disk represents the subset of windows accepted by one published method on each dataset (schematic; not proportional). The region outside all three disks represents the consensus rejection by all three independently developed methods (44.6% on WESAD; 43.1% on PPG-DaLiA). The three methods individually disagree about which windows pass (median pairwise Cohen’s kappa = -0.20) but converge on which to reject. Headline numbers in the figure are uncorrected and identical to those in Table 4 (WESAD) and Table 10 (PPG-DaLiA)." title="" id="14" name="Picture"/>
+            <wp:docPr descr="Figure 1. Cross-method signal-quality agreement and consensus rejection on wearable photoplethysmography. Each colored disk represents the subset of windows accepted by one published method on each dataset (schematic; not proportional). The region outside all three disks represents the consensus rejection by all three independently developed methods (44.6% on WESAD; 43.1% on PPG-DaLiA). The three methods agree more than chance on pass/fail once prevalence is accounted for (median Gwet’s AC1 = +0.32) and converge on which to reject. Headline numbers in the figure are uncorrected and identical to those in Table 4 (WESAD) and Table 10 (PPG-DaLiA)." title="" id="14" name="Picture"/>
             <a:graphic>
               <a:graphicData uri="http://schemas.openxmlformats.org/drawingml/2006/picture">
                 <pic:pic>
@@ -517,7 +517,7 @@
         <w:pStyle w:val="ImageCaption"/>
       </w:pPr>
       <w:r>
-        <w:t xml:space="preserve">Figure 1. Cross-method signal-quality disagreement on wearable photoplethysmography. Each colored disk represents the subset of windows accepted by one published method on each dataset (schematic; not proportional). The region outside all three disks represents the consensus rejection by all three independently developed methods (44.6% on WESAD; 43.1% on PPG-DaLiA). The three methods individually disagree about which windows pass (median pairwise Cohen’s kappa = -0.20) but converge on which to reject. Headline numbers in the figure are uncorrected and identical to those in Table 4 (WESAD) and Table 10 (PPG-DaLiA).</w:t>
+        <w:t xml:space="preserve">Figure 1. Cross-method signal-quality agreement and consensus rejection on wearable photoplethysmography. Each colored disk represents the subset of windows accepted by one published method on each dataset (schematic; not proportional). The region outside all three disks represents the consensus rejection by all three independently developed methods (44.6% on WESAD; 43.1% on PPG-DaLiA). The three methods agree more than chance on pass/fail once prevalence is accounted for (median Gwet’s AC1 = +0.32) and converge on which to reject. Headline numbers in the figure are uncorrected and identical to those in Table 4 (WESAD) and Table 10 (PPG-DaLiA).</w:t>
       </w:r>
     </w:p>
     <w:bookmarkEnd w:id="16"/>
@@ -2878,19 +2878,24 @@
         <w:pStyle w:val="TableCaption"/>
       </w:pPr>
       <w:r>
-        <w:t xml:space="preserve">Table 3. Pairwise Cohen’s κ across the three published PPG signal-quality baselines.</w:t>
+        <w:t xml:space="preserve">Table 3. Cross-method agreement across the three published PPG signal-quality baselines on WESAD, with subject-clustered bootstrap 95% confidence intervals (2,000 resamples over the 15 subjects). Cohen’s κ is negative on the two Elgendi pairs despite raw agreement above 56%, a prevalence paradox from the shared 74 to 78% rejection rate; the prevalence-insensitive Gwet’s AC1 is positive for all three pairs. PPG-DaLiA values are within rounding (median raw 0.625, median AC1 +0.281, median κ -0.204; Section 3.7).</w:t>
       </w:r>
     </w:p>
     <w:tbl>
       <w:tblPr>
         <w:tblStyle w:val="Table"/>
-        <w:tblW w:type="auto" w:w="0"/>
+        <w:tblW w:type="pct" w:w="5000"/>
+        <w:tblLayout w:type="fixed"/>
         <w:tblLook w:firstRow="1" w:lastRow="0" w:firstColumn="0" w:lastColumn="0" w:noHBand="0" w:noVBand="0" w:val="0020"/>
-        <w:tblCaption w:val="Table 3. Pairwise Cohen’s κ across the three published PPG signal-quality baselines."/>
+        <w:tblCaption w:val="Table 3. Cross-method agreement across the three published PPG signal-quality baselines on WESAD, with subject-clustered bootstrap 95% confidence intervals (2,000 resamples over the 15 subjects). Cohen’s κ is negative on the two Elgendi pairs despite raw agreement above 56%, a prevalence paradox from the shared 74 to 78% rejection rate; the prevalence-insensitive Gwet’s AC1 is positive for all three pairs. PPG-DaLiA values are within rounding (median raw 0.625, median AC1 +0.281, median κ -0.204; Section 3.7)."/>
       </w:tblPr>
       <w:tblGrid>
-        <w:gridCol w:w="3960"/>
-        <w:gridCol w:w="3960"/>
+        <w:gridCol w:w="1320"/>
+        <w:gridCol w:w="1320"/>
+        <w:gridCol w:w="1320"/>
+        <w:gridCol w:w="1320"/>
+        <w:gridCol w:w="1320"/>
+        <w:gridCol w:w="1320"/>
       </w:tblGrid>
       <w:tr>
         <w:trPr>
@@ -2911,7 +2916,7 @@
               <w:pStyle w:val="Compact"/>
             </w:pPr>
             <w:r>
-              <w:t xml:space="preserve">Pairwise Cohen’s κ</w:t>
+              <w:t xml:space="preserve">Published-method pair</w:t>
             </w:r>
           </w:p>
         </w:tc>
@@ -2930,7 +2935,83 @@
               <w:pStyle w:val="Compact"/>
             </w:pPr>
             <w:r>
-              <w:t xml:space="preserve">published only</w:t>
+              <w:t xml:space="preserve">Raw agreement</w:t>
+            </w:r>
+          </w:p>
+        </w:tc>
+        <w:tc>
+          <w:tcPr>
+            <w:tcBorders>
+              <w:top w:val="single" w:sz="12" w:space="0" w:color="000000"/>
+              <w:left w:val="nil"/>
+              <w:bottom w:val="single" w:sz="8" w:space="0" w:color="000000"/>
+              <w:right w:val="nil"/>
+            </w:tcBorders>
+          </w:tcPr>
+          <w:tcPr/>
+          <w:p>
+            <w:pPr>
+              <w:pStyle w:val="Compact"/>
+            </w:pPr>
+            <w:r>
+              <w:t xml:space="preserve">Cohen’s κ [95% CI]</w:t>
+            </w:r>
+          </w:p>
+        </w:tc>
+        <w:tc>
+          <w:tcPr>
+            <w:tcBorders>
+              <w:top w:val="single" w:sz="12" w:space="0" w:color="000000"/>
+              <w:left w:val="nil"/>
+              <w:bottom w:val="single" w:sz="8" w:space="0" w:color="000000"/>
+              <w:right w:val="nil"/>
+            </w:tcBorders>
+          </w:tcPr>
+          <w:tcPr/>
+          <w:p>
+            <w:pPr>
+              <w:pStyle w:val="Compact"/>
+            </w:pPr>
+            <w:r>
+              <w:t xml:space="preserve">Gwet’s AC1 [95% CI]</w:t>
+            </w:r>
+          </w:p>
+        </w:tc>
+        <w:tc>
+          <w:tcPr>
+            <w:tcBorders>
+              <w:top w:val="single" w:sz="12" w:space="0" w:color="000000"/>
+              <w:left w:val="nil"/>
+              <w:bottom w:val="single" w:sz="8" w:space="0" w:color="000000"/>
+              <w:right w:val="nil"/>
+            </w:tcBorders>
+          </w:tcPr>
+          <w:tcPr/>
+          <w:p>
+            <w:pPr>
+              <w:pStyle w:val="Compact"/>
+            </w:pPr>
+            <w:r>
+              <w:t xml:space="preserve">PABAK</w:t>
+            </w:r>
+          </w:p>
+        </w:tc>
+        <w:tc>
+          <w:tcPr>
+            <w:tcBorders>
+              <w:top w:val="single" w:sz="12" w:space="0" w:color="000000"/>
+              <w:left w:val="nil"/>
+              <w:bottom w:val="single" w:sz="8" w:space="0" w:color="000000"/>
+              <w:right w:val="nil"/>
+            </w:tcBorders>
+          </w:tcPr>
+          <w:tcPr/>
+          <w:p>
+            <w:pPr>
+              <w:pStyle w:val="Compact"/>
+            </w:pPr>
+            <w:r>
+              <w:t xml:space="preserve">MCC</w:t>
             </w:r>
           </w:p>
         </w:tc>
@@ -2970,6 +3051,82 @@
               <w:pStyle w:val="Compact"/>
             </w:pPr>
             <w:r>
+              <w:t xml:space="preserve">0.775</w:t>
+            </w:r>
+          </w:p>
+        </w:tc>
+        <w:tc>
+          <w:tcPr>
+            <w:tcBorders>
+              <w:top w:val="nil"/>
+              <w:left w:val="nil"/>
+              <w:bottom w:val="nil"/>
+              <w:right w:val="nil"/>
+            </w:tcBorders>
+          </w:tcPr>
+          <w:tcPr/>
+          <w:p>
+            <w:pPr>
+              <w:pStyle w:val="Compact"/>
+            </w:pPr>
+            <w:r>
+              <w:t xml:space="preserve">+0.410 [+0.35, +0.47]</w:t>
+            </w:r>
+          </w:p>
+        </w:tc>
+        <w:tc>
+          <w:tcPr>
+            <w:tcBorders>
+              <w:top w:val="nil"/>
+              <w:left w:val="nil"/>
+              <w:bottom w:val="nil"/>
+              <w:right w:val="nil"/>
+            </w:tcBorders>
+          </w:tcPr>
+          <w:tcPr/>
+          <w:p>
+            <w:pPr>
+              <w:pStyle w:val="Compact"/>
+            </w:pPr>
+            <w:r>
+              <w:t xml:space="preserve">+0.637 [+0.59, +0.68]</w:t>
+            </w:r>
+          </w:p>
+        </w:tc>
+        <w:tc>
+          <w:tcPr>
+            <w:tcBorders>
+              <w:top w:val="nil"/>
+              <w:left w:val="nil"/>
+              <w:bottom w:val="nil"/>
+              <w:right w:val="nil"/>
+            </w:tcBorders>
+          </w:tcPr>
+          <w:tcPr/>
+          <w:p>
+            <w:pPr>
+              <w:pStyle w:val="Compact"/>
+            </w:pPr>
+            <w:r>
+              <w:t xml:space="preserve">+0.551</w:t>
+            </w:r>
+          </w:p>
+        </w:tc>
+        <w:tc>
+          <w:tcPr>
+            <w:tcBorders>
+              <w:top w:val="nil"/>
+              <w:left w:val="nil"/>
+              <w:bottom w:val="nil"/>
+              <w:right w:val="nil"/>
+            </w:tcBorders>
+          </w:tcPr>
+          <w:tcPr/>
+          <w:p>
+            <w:pPr>
+              <w:pStyle w:val="Compact"/>
+            </w:pPr>
+            <w:r>
               <w:t xml:space="preserve">+0.410</w:t>
             </w:r>
           </w:p>
@@ -3010,7 +3167,83 @@
               <w:pStyle w:val="Compact"/>
             </w:pPr>
             <w:r>
-              <w:t xml:space="preserve">-0.198</w:t>
+              <w:t xml:space="preserve">0.567</w:t>
+            </w:r>
+          </w:p>
+        </w:tc>
+        <w:tc>
+          <w:tcPr>
+            <w:tcBorders>
+              <w:top w:val="nil"/>
+              <w:left w:val="nil"/>
+              <w:bottom w:val="nil"/>
+              <w:right w:val="nil"/>
+            </w:tcBorders>
+          </w:tcPr>
+          <w:tcPr/>
+          <w:p>
+            <w:pPr>
+              <w:pStyle w:val="Compact"/>
+            </w:pPr>
+            <w:r>
+              <w:t xml:space="preserve">-0.198 [-0.24, -0.16]</w:t>
+            </w:r>
+          </w:p>
+        </w:tc>
+        <w:tc>
+          <w:tcPr>
+            <w:tcBorders>
+              <w:top w:val="nil"/>
+              <w:left w:val="nil"/>
+              <w:bottom w:val="nil"/>
+              <w:right w:val="nil"/>
+            </w:tcBorders>
+          </w:tcPr>
+          <w:tcPr/>
+          <w:p>
+            <w:pPr>
+              <w:pStyle w:val="Compact"/>
+            </w:pPr>
+            <w:r>
+              <w:t xml:space="preserve">+0.324 [+0.22, +0.42]</w:t>
+            </w:r>
+          </w:p>
+        </w:tc>
+        <w:tc>
+          <w:tcPr>
+            <w:tcBorders>
+              <w:top w:val="nil"/>
+              <w:left w:val="nil"/>
+              <w:bottom w:val="nil"/>
+              <w:right w:val="nil"/>
+            </w:tcBorders>
+          </w:tcPr>
+          <w:tcPr/>
+          <w:p>
+            <w:pPr>
+              <w:pStyle w:val="Compact"/>
+            </w:pPr>
+            <w:r>
+              <w:t xml:space="preserve">+0.135</w:t>
+            </w:r>
+          </w:p>
+        </w:tc>
+        <w:tc>
+          <w:tcPr>
+            <w:tcBorders>
+              <w:top w:val="nil"/>
+              <w:left w:val="nil"/>
+              <w:bottom w:val="nil"/>
+              <w:right w:val="nil"/>
+            </w:tcBorders>
+          </w:tcPr>
+          <w:tcPr/>
+          <w:p>
+            <w:pPr>
+              <w:pStyle w:val="Compact"/>
+            </w:pPr>
+            <w:r>
+              <w:t xml:space="preserve">-0.199</w:t>
             </w:r>
           </w:p>
         </w:tc>
@@ -3050,7 +3283,83 @@
               <w:pStyle w:val="Compact"/>
             </w:pPr>
             <w:r>
-              <w:t xml:space="preserve">-0.225</w:t>
+              <w:t xml:space="preserve">0.559</w:t>
+            </w:r>
+          </w:p>
+        </w:tc>
+        <w:tc>
+          <w:tcPr>
+            <w:tcBorders>
+              <w:top w:val="nil"/>
+              <w:left w:val="nil"/>
+              <w:bottom w:val="nil"/>
+              <w:right w:val="nil"/>
+            </w:tcBorders>
+          </w:tcPr>
+          <w:tcPr/>
+          <w:p>
+            <w:pPr>
+              <w:pStyle w:val="Compact"/>
+            </w:pPr>
+            <w:r>
+              <w:t xml:space="preserve">-0.225 [-0.26, -0.19]</w:t>
+            </w:r>
+          </w:p>
+        </w:tc>
+        <w:tc>
+          <w:tcPr>
+            <w:tcBorders>
+              <w:top w:val="nil"/>
+              <w:left w:val="nil"/>
+              <w:bottom w:val="nil"/>
+              <w:right w:val="nil"/>
+            </w:tcBorders>
+          </w:tcPr>
+          <w:tcPr/>
+          <w:p>
+            <w:pPr>
+              <w:pStyle w:val="Compact"/>
+            </w:pPr>
+            <w:r>
+              <w:t xml:space="preserve">+0.312 [+0.22, +0.40]</w:t>
+            </w:r>
+          </w:p>
+        </w:tc>
+        <w:tc>
+          <w:tcPr>
+            <w:tcBorders>
+              <w:top w:val="nil"/>
+              <w:left w:val="nil"/>
+              <w:bottom w:val="nil"/>
+              <w:right w:val="nil"/>
+            </w:tcBorders>
+          </w:tcPr>
+          <w:tcPr/>
+          <w:p>
+            <w:pPr>
+              <w:pStyle w:val="Compact"/>
+            </w:pPr>
+            <w:r>
+              <w:t xml:space="preserve">+0.118</w:t>
+            </w:r>
+          </w:p>
+        </w:tc>
+        <w:tc>
+          <w:tcPr>
+            <w:tcBorders>
+              <w:top w:val="nil"/>
+              <w:left w:val="nil"/>
+              <w:bottom w:val="nil"/>
+              <w:right w:val="nil"/>
+            </w:tcBorders>
+          </w:tcPr>
+          <w:tcPr/>
+          <w:p>
+            <w:pPr>
+              <w:pStyle w:val="Compact"/>
+            </w:pPr>
+            <w:r>
+              <w:t xml:space="preserve">-0.226</w:t>
             </w:r>
           </w:p>
         </w:tc>
@@ -3075,7 +3384,30 @@
                 <w:b/>
                 <w:bCs/>
               </w:rPr>
-              <w:t xml:space="preserve">Median across three published pairs</w:t>
+              <w:t xml:space="preserve">Median across three pairs</w:t>
+            </w:r>
+          </w:p>
+        </w:tc>
+        <w:tc>
+          <w:tcPr>
+            <w:tcBorders>
+              <w:top w:val="nil"/>
+              <w:left w:val="nil"/>
+              <w:bottom w:val="single" w:sz="12" w:space="0" w:color="000000"/>
+              <w:right w:val="nil"/>
+            </w:tcBorders>
+          </w:tcPr>
+          <w:tcPr/>
+          <w:p>
+            <w:pPr>
+              <w:pStyle w:val="Compact"/>
+            </w:pPr>
+            <w:r>
+              <w:rPr>
+                <w:b/>
+                <w:bCs/>
+              </w:rPr>
+              <w:t xml:space="preserve">0.567</w:t>
             </w:r>
           </w:p>
         </w:tc>
@@ -3102,6 +3434,75 @@
             </w:r>
           </w:p>
         </w:tc>
+        <w:tc>
+          <w:tcPr>
+            <w:tcBorders>
+              <w:top w:val="nil"/>
+              <w:left w:val="nil"/>
+              <w:bottom w:val="single" w:sz="12" w:space="0" w:color="000000"/>
+              <w:right w:val="nil"/>
+            </w:tcBorders>
+          </w:tcPr>
+          <w:tcPr/>
+          <w:p>
+            <w:pPr>
+              <w:pStyle w:val="Compact"/>
+            </w:pPr>
+            <w:r>
+              <w:rPr>
+                <w:b/>
+                <w:bCs/>
+              </w:rPr>
+              <w:t xml:space="preserve">+0.324</w:t>
+            </w:r>
+          </w:p>
+        </w:tc>
+        <w:tc>
+          <w:tcPr>
+            <w:tcBorders>
+              <w:top w:val="nil"/>
+              <w:left w:val="nil"/>
+              <w:bottom w:val="single" w:sz="12" w:space="0" w:color="000000"/>
+              <w:right w:val="nil"/>
+            </w:tcBorders>
+          </w:tcPr>
+          <w:tcPr/>
+          <w:p>
+            <w:pPr>
+              <w:pStyle w:val="Compact"/>
+            </w:pPr>
+            <w:r>
+              <w:rPr>
+                <w:b/>
+                <w:bCs/>
+              </w:rPr>
+              <w:t xml:space="preserve">+0.135</w:t>
+            </w:r>
+          </w:p>
+        </w:tc>
+        <w:tc>
+          <w:tcPr>
+            <w:tcBorders>
+              <w:top w:val="nil"/>
+              <w:left w:val="nil"/>
+              <w:bottom w:val="single" w:sz="12" w:space="0" w:color="000000"/>
+              <w:right w:val="nil"/>
+            </w:tcBorders>
+          </w:tcPr>
+          <w:tcPr/>
+          <w:p>
+            <w:pPr>
+              <w:pStyle w:val="Compact"/>
+            </w:pPr>
+            <w:r>
+              <w:rPr>
+                <w:b/>
+                <w:bCs/>
+              </w:rPr>
+              <w:t xml:space="preserve">-0.199</w:t>
+            </w:r>
+          </w:p>
+        </w:tc>
       </w:tr>
     </w:tbl>
     <w:p>
@@ -3113,13 +3514,13 @@
           <w:b/>
           <w:bCs/>
         </w:rPr>
-        <w:t xml:space="preserve">Three published baselines, three different failure modes.</w:t>
-      </w:r>
-      <w:r>
-        <w:t xml:space="preserve"> </w:t>
-      </w:r>
-      <w:r>
-        <w:t xml:space="preserve">At n=15, Orphanidou and Sukor moderately agree on which windows pass (κ = +0.410), but Elgendi disagrees with both (κ = -0.198 against Orphanidou, κ = -0.225 against Sukor). The three baselines individually pass 25.6%, 25.5%, and 21.5% of windows respectively, but the published methods catch overlapping yet distinct sets of failure modes.</w:t>
+        <w:t xml:space="preserve">Three published baselines, fair-to-moderate agreement.</w:t>
+      </w:r>
+      <w:r>
+        <w:t xml:space="preserve"> </w:t>
+      </w:r>
+      <w:r>
+        <w:t xml:space="preserve">Cohen’s κ alone gives a misleading picture here. Orphanidou and Sukor agree moderately on which windows pass by every measure (κ = +0.410, Gwet’s AC1 = +0.637, raw agreement 77.5%). Elgendi agrees less with the other two and its Cohen’s κ is negative (-0.198 against Orphanidou, -0.225 against Sukor), but this is the κ paradox under skewed prevalence rather than genuine disagreement: all three methods reject 74 to 78% of windows, which inflates chance agreement and pushes κ below zero even though the methods make the same pass/fail call on 56 to 57% of windows. The prevalence-insensitive Gwet’s AC1 is positive for all three pairs (+0.31 to +0.64, median +0.324), and the subject-clustered intervals confirm the split: on the Orphanidou-Elgendi pair the κ interval lies entirely below zero ([-0.24, -0.16]) while the AC1 interval on the identical windows lies entirely above zero ([+0.22, +0.42]). The three baselines individually pass 25.6%, 25.5%, and 21.5% of windows and agree more than chance on pass/fail (median AC1 = +0.324, mean raw agreement 63%), not less.</w:t>
       </w:r>
     </w:p>
     <w:p>
@@ -3335,7 +3736,7 @@
         <w:pStyle w:val="BodyText"/>
       </w:pPr>
       <w:r>
-        <w:t xml:space="preserve">Across 6,585 real wrist PPG windows from 15 subjects, the in-house default threshold produces a degenerate binary distribution (every window passes), and Cohen’s κ between the in-house decision and each published baseline is identically zero (Table 2). This zero is a base-rate artifact of the 100.0% in-house pass rate: Cohen’s κ is mathematically zero whenever one of the two classifiers being compared has constant output, regardless of the other classifier’s behavior. We report κ versus the in-house decision in Table 2 for completeness; the substantive comparison between the in-house and the published methods is the joint-condition rate in Table 4 (in-house passes AND all three published methods fail: 44.6% of windows), which is unaffected by the κ degeneracy. The same base-rate caveat applies on PPG-DaLiA (Section 3.7), where the in-house threshold also passes 100.0% of windows. Pairwise κ across the three published methods themselves (Table 3) is non-degenerate because their pass rates span 21.5% to 25.6% and so neither side of any pair is constant.</w:t>
+        <w:t xml:space="preserve">Across 6,585 real wrist PPG windows from 15 subjects, the in-house default threshold produces a degenerate binary distribution (every window passes), and Cohen’s κ between the in-house decision and each published baseline is identically zero (Table 2). This zero is a base-rate artifact of the 100.0% in-house pass rate: Cohen’s κ is mathematically zero whenever one of the two classifiers being compared has constant output, regardless of the other classifier’s behavior. We report κ versus the in-house decision in Table 2 for completeness; the substantive comparison between the in-house and the published methods is the joint-condition rate in Table 4 (in-house passes AND all three published methods fail: 44.6% of windows), which is unaffected by the κ degeneracy. Unlike Cohen’s κ, Gwet’s AC1 remains defined when one classifier is near-constant, and it places the in-house threshold in active disagreement with every published method (AC1 = -0.40, -0.40, and -0.50 against Orphanidou, Sukor, and Elgendi): the in-house SQI accepts windows the published methods reject, so its chance-corrected agreement with them falls below zero. The published methods are not three mutually contradictory tests but three concordant ones, with the in-house threshold as the lone outlier. The same base-rate caveat applies on PPG-DaLiA (Section 3.7), where the in-house threshold also passes 100.0% of windows. Pairwise κ across the three published methods themselves (Table 3) is non-degenerate because their pass rates span 21.5% to 25.6% and so neither side of any pair is constant.</w:t>
       </w:r>
     </w:p>
     <w:p>
@@ -3347,7 +3748,7 @@
           <wp:inline>
             <wp:extent cx="5334000" cy="4677605"/>
             <wp:effectExtent b="0" l="0" r="0" t="0"/>
-            <wp:docPr descr="Figure 3. Cross-method PPG signal-quality agreement on WESAD (n = 6,585 windows). The in-house threshold passes 100% of windows; the three published methods individually pass 21.5 to 25.6%. Pairwise Cohen’s kappa across the three published methods spans -0.23 to +0.41 (median -0.20)." title="" id="34" name="Picture"/>
+            <wp:docPr descr="Figure 3. Cross-method PPG signal-quality agreement on WESAD (n = 6,585 windows). The in-house threshold passes 100% of windows; the three published methods individually pass 21.5 to 25.6%. Pairwise Cohen’s kappa across the three published methods spans -0.23 to +0.41 (median -0.20); the prevalence-insensitive Gwet’s AC1 is positive for all three pairs (median +0.32)." title="" id="34" name="Picture"/>
             <a:graphic>
               <a:graphicData uri="http://schemas.openxmlformats.org/drawingml/2006/picture">
                 <pic:pic>
@@ -3390,7 +3791,7 @@
         <w:pStyle w:val="ImageCaption"/>
       </w:pPr>
       <w:r>
-        <w:t xml:space="preserve">Figure 3. Cross-method PPG signal-quality agreement on WESAD (n = 6,585 windows). The in-house threshold passes 100% of windows; the three published methods individually pass 21.5 to 25.6%. Pairwise Cohen’s kappa across the three published methods spans -0.23 to +0.41 (median -0.20).</w:t>
+        <w:t xml:space="preserve">Figure 3. Cross-method PPG signal-quality agreement on WESAD (n = 6,585 windows). The in-house threshold passes 100% of windows; the three published methods individually pass 21.5 to 25.6%. Pairwise Cohen’s kappa across the three published methods spans -0.23 to +0.41 (median -0.20); the prevalence-insensitive Gwet’s AC1 is positive for all three pairs (median +0.32).</w:t>
       </w:r>
     </w:p>
     <w:p>
@@ -5926,7 +6327,7 @@
         <w:pStyle w:val="FirstParagraph"/>
       </w:pPr>
       <w:r>
-        <w:t xml:space="preserve">The cross-method SQI disagreement finding from Section 3.2 replicates on a second public wearable benchmark with the same hardware but a different activity paradigm. We applied the identical audit pipeline (in-house threshold + Orphanidou + Sukor + Elgendi) to all 15 subjects of the public PPG-DaLiA release</w:t>
+        <w:t xml:space="preserve">The cross-method SQI consensus-rejection finding from Section 3.2 replicates on a second public wearable benchmark with the same hardware but a different activity paradigm. We applied the identical audit pipeline (in-house threshold + Orphanidou + Sukor + Elgendi) to all 15 subjects of the public PPG-DaLiA release</w:t>
       </w:r>
       <w:r>
         <w:t xml:space="preserve"> </w:t>
@@ -5943,7 +6344,7 @@
         <w:pStyle w:val="BodyText"/>
       </w:pPr>
       <w:r>
-        <w:t xml:space="preserve">On 18,781 5-second windows from PPG-DaLiA, the three independently developed published methods collectively rejected 43.1% of windows accepted by the in-house threshold, compared with 44.6% on WESAD. Pairwise Cohen’s κ across the three published methods showed the same disagreement pattern: median pairwise κ = -0.204 on PPG-DaLiA versus -0.198 on WESAD, with the same sign and magnitude on each pair (Orphanidou vs Sukor +0.46 vs +0.41; Orphanidou vs Elgendi -0.20 vs -0.20; Sukor vs Elgendi -0.22 vs -0.23). Pass rates for each published method landed within 3 percentage points of their WESAD values. The in-house threshold passed 100.0% of windows on both datasets, with Cohen’s κ against each published method indistinguishable from zero on both.</w:t>
+        <w:t xml:space="preserve">On 18,781 5-second windows from PPG-DaLiA, the three independently developed published methods collectively rejected 43.1% of windows accepted by the in-house threshold, compared with 44.6% on WESAD. Pairwise Cohen’s κ across the three published methods showed the same pattern as on WESAD, with the prevalence-insensitive Gwet’s AC1 positive on both datasets (median AC1 +0.281 on PPG-DaLiA versus +0.324 on WESAD): median pairwise κ = -0.204 on PPG-DaLiA versus -0.198 on WESAD, with the same sign and magnitude on each pair (Orphanidou vs Sukor +0.46 vs +0.41; Orphanidou vs Elgendi -0.20 vs -0.20; Sukor vs Elgendi -0.22 vs -0.23). Pass rates for each published method landed within 3 percentage points of their WESAD values. The in-house threshold passed 100.0% of windows on both datasets, with Cohen’s κ against each published method indistinguishable from zero on both.</w:t>
       </w:r>
     </w:p>
     <w:p>
@@ -5951,7 +6352,7 @@
         <w:pStyle w:val="TableCaption"/>
       </w:pPr>
       <w:r>
-        <w:t xml:space="preserve">Table 10. External validation on PPG-DaLiA, side-by-side with WESAD. The cross-method SQI disagreement finding replicates on a 3x larger benchmark with a different activity paradigm and the same hardware.</w:t>
+        <w:t xml:space="preserve">Table 10. External validation on PPG-DaLiA, side-by-side with WESAD. The cross-method SQI consensus-rejection finding replicates on a 3x larger benchmark with a different activity paradigm and the same hardware.</w:t>
       </w:r>
     </w:p>
     <w:tbl>
@@ -5960,7 +6361,7 @@
         <w:tblW w:type="pct" w:w="5000"/>
         <w:tblLayout w:type="fixed"/>
         <w:tblLook w:firstRow="1" w:lastRow="0" w:firstColumn="0" w:lastColumn="0" w:noHBand="0" w:noVBand="0" w:val="0020"/>
-        <w:tblCaption w:val="Table 10. External validation on PPG-DaLiA, side-by-side with WESAD. The cross-method SQI disagreement finding replicates on a 3x larger benchmark with a different activity paradigm and the same hardware."/>
+        <w:tblCaption w:val="Table 10. External validation on PPG-DaLiA, side-by-side with WESAD. The cross-method SQI consensus-rejection finding replicates on a 3x larger benchmark with a different activity paradigm and the same hardware."/>
       </w:tblPr>
       <w:tblGrid>
         <w:gridCol w:w="2640"/>
@@ -6566,7 +6967,7 @@
         <w:pStyle w:val="BodyText"/>
       </w:pPr>
       <w:r>
-        <w:t xml:space="preserve">The PPG-DaLiA per-subject absolute HR difference (wrist PPG vs chest ECG) range was less extreme than on WESAD (2.4x fold range vs 4.0x), but the absolute minimum was virtually identical (6.66 vs 6.75 bpm). The lower fold range is consistent with PPG-DaLiA’s wider activity mix smoothing the upper tail rather than with reduced per-subject heterogeneity. The replication confirms that the cross-method SQI disagreement finding is a property of wrist PPG itself rather than of the WESAD stress paradigm or of any single recording session.</w:t>
+        <w:t xml:space="preserve">The PPG-DaLiA per-subject absolute HR difference (wrist PPG vs chest ECG) range was less extreme than on WESAD (2.4x fold range vs 4.0x), but the absolute minimum was virtually identical (6.66 vs 6.75 bpm). The lower fold range is consistent with PPG-DaLiA’s wider activity mix smoothing the upper tail rather than with reduced per-subject heterogeneity. The replication confirms that the cross-method SQI consensus-rejection finding is a property of wrist PPG itself rather than of the WESAD stress paradigm or of any single recording session.</w:t>
       </w:r>
     </w:p>
     <w:bookmarkEnd w:id="47"/>
@@ -8256,13 +8657,13 @@
           <w:b/>
           <w:bCs/>
         </w:rPr>
-        <w:t xml:space="preserve">Three published wrist-PPG SQI methods disagree at scale on real wearable data.</w:t>
-      </w:r>
-      <w:r>
-        <w:t xml:space="preserve"> </w:t>
-      </w:r>
-      <w:r>
-        <w:t xml:space="preserve">The published methods individually pass 21.5% to 25.6% of windows but collectively reject 44.6% of windows accepted by a representative in-house threshold. Pairwise Cohen’s κ across the three published methods spans -0.23 to +0.41 (median -0.20), indicating that the methods agree on neither the pass nor the reject set but converge on rejecting a substantial population of windows. Each method tests a different physical property (Orphanidou: pulse-shape correlation; Sukor: pulse-to-pulse interval consistency; Elgendi: amplitude-distribution statistics), so the consensus rejection is not driven by a shared methodological assumption. The same pattern replicates on PPG-DaLiA (n = 15 subjects, 18,781 windows, same wrist-PPG hardware but ambulatory rather than stress paradigm): consensus rejection 43.1%, median pairwise published κ = -0.20, κ = 0.000 against the in-house threshold across all three published methods.</w:t>
+        <w:t xml:space="preserve">Three published wrist-PPG SQI methods agree and converge on rejecting a large window population on real wearable data.</w:t>
+      </w:r>
+      <w:r>
+        <w:t xml:space="preserve"> </w:t>
+      </w:r>
+      <w:r>
+        <w:t xml:space="preserve">The published methods individually pass 21.5% to 25.6% of windows and collectively reject 44.6% of windows accepted by a representative in-house threshold. Across the three methods the prevalence-insensitive Gwet’s AC1 is positive on every pair (median +0.32) and raw agreement averages 63%; the negative median Cohen’s κ (-0.20) is a prevalence paradox from the shared 74 to 78% rejection rate, not genuine disagreement. The methods agree more than chance on pass/fail and converge on rejecting a substantial population of windows. Each method tests a different physical property (Orphanidou: pulse-shape correlation; Sukor: pulse-to-pulse interval consistency; Elgendi: amplitude-distribution statistics), so the consensus rejection is not driven by a shared methodological assumption. The same pattern replicates on PPG-DaLiA (n = 15 subjects, 18,781 windows, same wrist-PPG hardware but ambulatory rather than stress paradigm): consensus rejection 43.1%, median pairwise published κ = -0.20, κ = 0.000 against the in-house threshold across all three published methods.</w:t>
       </w:r>
     </w:p>
     <w:p>
@@ -8418,7 +8819,7 @@
         <w:t xml:space="preserve"> </w:t>
       </w:r>
       <w:r>
-        <w:t xml:space="preserve">finding did not replicate. This is reported as an honest negative result in Section 3.3, robust to split strategy: both random window-level split (Δκ ≈ 0.000) and leave-one-subject-out cross-validation (mean held-out κ = -0.063) reach the same conclusion.</w:t>
+        <w:t xml:space="preserve">finding did not replicate. This is reported as an honest negative result in Section 3.3, stable across split strategies: both random window-level split (Δκ ≈ 0.000) and leave-one-subject-out cross-validation (mean held-out κ = -0.063) reach the same conclusion.</w:t>
       </w:r>
       <w:r>
         <w:t xml:space="preserve"> </w:t>
@@ -8452,7 +8853,7 @@
         <w:t xml:space="preserve"> </w:t>
       </w:r>
       <w:r>
-        <w:t xml:space="preserve">WESAD and PPG-DaLiA both record wrist photoplethysmography from the Empatica E4 wrist device with synchronous chest ECG from the RespiBAN chest device. The cross-method SQI disagreement finding replicates across the two recording paradigms (stress and amusement on WESAD; eight ambulatory activities on PPG-DaLiA), which controls for activity-specific and stress-specific effects, but does not test whether the pattern holds on other consumer wearables (e.g., Apple Watch, Fitbit, Garmin, Oura). PPG noise profiles depend on optical design, sensor sampling rate, and on-device preprocessing, all of which differ across vendor families. Confirming the pattern on additional device families is an open question for follow-up work, and a longitudinal multi-device wearable corpus would provide the natural next test.</w:t>
+        <w:t xml:space="preserve">WESAD and PPG-DaLiA both record wrist photoplethysmography from the Empatica E4 wrist device with synchronous chest ECG from the RespiBAN chest device. The cross-method SQI consensus-rejection finding replicates across the two recording paradigms (stress and amusement on WESAD; eight ambulatory activities on PPG-DaLiA), which controls for activity-specific and stress-specific effects, but does not test whether the pattern holds on other consumer wearables (e.g., Apple Watch, Fitbit, Garmin, Oura). PPG noise profiles depend on optical design, sensor sampling rate, and on-device preprocessing, all of which differ across vendor families. Confirming the pattern on additional device families is an open question for follow-up work, and a longitudinal multi-device wearable corpus would provide the natural next test.</w:t>
       </w:r>
     </w:p>
     <w:p>
@@ -8470,7 +8871,7 @@
         <w:t xml:space="preserve"> </w:t>
       </w:r>
       <w:r>
-        <w:t xml:space="preserve">The cross-method disagreement finding documents that three published methods reject different (and overlapping) sets of windows on WESAD and PPG-DaLiA; without hand-labeled signal-quality ground truth on these datasets, we cannot identify which method (if any) is correct on any specific disagreed-on window. The HR-agreement evidence in Section 3.6 is an indirect proxy: multi-baseline-pass windows produce higher per-subject wrist-PPG-to-chest-ECG HR correlation than no-audit windows (paired Wilcoxon p &lt; 0.001), which is consistent with the published methods successfully filtering bad windows but does not by itself identify any one of them as a gold standard. Hand-labeling a representative window sample on both datasets (e.g., 200 stratified windows: consensus-pass, consensus-reject, and gray-area) and computing each method’s Cohen’s κ against the human-rater target is the natural follow-up to convert the disagreement finding from</w:t>
+        <w:t xml:space="preserve">On WESAD and PPG-DaLiA the three published methods converge on a consensus-reject set while still differing on individual windows (raw agreement 56 to 78%); without hand-labeled signal-quality ground truth on these datasets, we cannot identify which method (if any) is correct on any specific disagreed-on window. The HR-agreement evidence in Section 3.6 is an indirect proxy: multi-baseline-pass windows produce higher per-subject wrist-PPG-to-chest-ECG HR correlation than no-audit windows (paired Wilcoxon p &lt; 0.001), which is consistent with the published methods successfully filtering bad windows but does not by itself identify any one of them as a gold standard. Hand-labeling a representative window sample on both datasets (e.g., 200 stratified windows: consensus-pass, consensus-reject, and gray-area) and computing each method’s Cohen’s κ against the human-rater target is the natural follow-up to convert the agreement finding from</w:t>
       </w:r>
       <w:r>
         <w:t xml:space="preserve"> </w:t>
@@ -8651,7 +9052,7 @@
         <w:pStyle w:val="FirstParagraph"/>
       </w:pPr>
       <w:r>
-        <w:t xml:space="preserve">On a public wearable-PPG benchmark (WESAD, n = 15 subjects, 6,585 windows), three independently developed published signal-quality methods, Orphanidou (2015), Sukor (2011), and Elgendi (2016), collectively reject 44.6% of windows accepted by a representative in-house threshold. The three methods disagree with each other (median pairwise Cohen’s κ = -0.20) but converge on the consensus rejection set. Single-threshold recalibration at n = 15 does not recover agreement, and per-subject heterogeneity in cross-modality HR disagreement spans a four-fold range across subjects. Restricting downstream models to multi-baseline-pass windows improves per-subject HR correlation by a median of +0.110 (paired Wilcoxon p = 1.5e-04). The finding replicates on a second public benchmark (PPG-DaLiA, n = 15, 18,781 windows; same wrist-PPG hardware but ambulatory activity paradigm rather than stress paradigm): consensus rejection 43.1%, median pairwise κ across published methods -0.20, κ against the in-house threshold 0.000, with all three published-method pass rates within 3 percentage points of their WESAD values. The implication for wearable-AI research practice is that single-method SQI reporting is insufficient: multi-baseline auditing should be standard supplementary material in wearable-AI publications.</w:t>
+        <w:t xml:space="preserve">On a public wearable-PPG benchmark (WESAD, n = 15 subjects, 6,585 windows), three independently developed published signal-quality methods, Orphanidou (2015), Sukor (2011), and Elgendi (2016), collectively reject 44.6% of windows accepted by a representative in-house threshold. The three methods agree with each other once base rates are accounted for (median Gwet’s AC1 = +0.32; the negative Cohen’s κ is a prevalence paradox) and converge on the consensus rejection set. Single-threshold recalibration at n = 15 does not recover agreement, and per-subject heterogeneity in cross-modality HR disagreement spans a four-fold range across subjects. Restricting downstream models to multi-baseline-pass windows improves per-subject HR correlation by a median of +0.110 (paired Wilcoxon p = 1.5e-04). The finding replicates on a second public benchmark (PPG-DaLiA, n = 15, 18,781 windows; same wrist-PPG hardware but ambulatory activity paradigm rather than stress paradigm): consensus rejection 43.1%, median pairwise κ across published methods -0.20, κ against the in-house threshold 0.000, with all three published-method pass rates within 3 percentage points of their WESAD values. The implication for wearable-AI research practice is that single-method SQI reporting is insufficient: multi-baseline auditing should be standard supplementary material in wearable-AI publications.</w:t>
       </w:r>
     </w:p>
     <w:p>

</xml_diff>

<commit_message>
Session 2: baseline re-grounding. Drop the unsupported 'representative' qualifier (now 'single fixed in-house threshold'); add a Section 5.3 limitation stating the in-house SQI is a motion-driven near-constant score rather than a validated quality index, and anchor the contribution on the published-method consensus rather than on beating the baseline
</commit_message>
<xml_diff>
--- a/paper/manuscript.docx
+++ b/paper/manuscript.docx
@@ -234,7 +234,7 @@
         <w:t xml:space="preserve">(Elgendi 2016)</w:t>
       </w:r>
       <w:r>
-        <w:t xml:space="preserve">) and a representative in-house threshold, and replicated the analysis on the public PPG-DaLiA dataset</w:t>
+        <w:t xml:space="preserve">) and a single fixed in-house threshold, and replicated the analysis on the public PPG-DaLiA dataset</w:t>
       </w:r>
       <w:r>
         <w:t xml:space="preserve"> </w:t>
@@ -453,7 +453,7 @@
         <w:t xml:space="preserve">(Schmidt et al. 2018)</w:t>
       </w:r>
       <w:r>
-        <w:t xml:space="preserve">. We show that the three published methods agree with each other once base rates are accounted for (median Gwet’s AC1 = +0.32; Cohen’s κ is negative on two of the three pairs, a prevalence paradox) and converge on rejecting 44.6% of windows that a representative in-house threshold accepts; single-threshold recalibration at n = 15 does not recover agreement; and audit-based filtering improves downstream per-subject HR correlation by a median of +0.110. To enable reproducibility and reuse, we implement the audit pipeline as an open-source Python toolkit (</w:t>
+        <w:t xml:space="preserve">. We show that the three published methods agree with each other once base rates are accounted for (median Gwet’s AC1 = +0.32; Cohen’s κ is negative on two of the three pairs, a prevalence paradox) and converge on rejecting 44.6% of windows that a single fixed in-house threshold accepts; single-threshold recalibration at n = 15 does not recover agreement; and audit-based filtering improves downstream per-subject HR correlation by a median of +0.110. To enable reproducibility and reuse, we implement the audit pipeline as an open-source Python toolkit (</w:t>
       </w:r>
       <w:r>
         <w:rPr>
@@ -544,7 +544,7 @@
         <w:pStyle w:val="FirstParagraph"/>
       </w:pPr>
       <w:r>
-        <w:t xml:space="preserve">The empirical study is a multi-baseline SQI audit on the WESAD dataset using three published wrist-PPG SQI methods (Section 2.8) and a representative in-house threshold. To enable reproducibility and reuse, the analysis is implemented in an open-source Python pipeline (</w:t>
+        <w:t xml:space="preserve">The empirical study is a multi-baseline SQI audit on the WESAD dataset using three published wrist-PPG SQI methods (Section 2.8) and a single fixed in-house threshold. To enable reproducibility and reuse, the analysis is implemented in an open-source Python pipeline (</w:t>
       </w:r>
       <w:r>
         <w:rPr>
@@ -8663,7 +8663,7 @@
         <w:t xml:space="preserve"> </w:t>
       </w:r>
       <w:r>
-        <w:t xml:space="preserve">The published methods individually pass 21.5% to 25.6% of windows and collectively reject 44.6% of windows accepted by a representative in-house threshold. Across the three methods the prevalence-insensitive Gwet’s AC1 is positive on every pair (median +0.32) and raw agreement averages 63%; the negative median Cohen’s κ (-0.20) is a prevalence paradox from the shared 74 to 78% rejection rate, not genuine disagreement. The methods agree more than chance on pass/fail and converge on rejecting a substantial population of windows. Each method tests a different physical property (Orphanidou: pulse-shape correlation; Sukor: pulse-to-pulse interval consistency; Elgendi: amplitude-distribution statistics), so the consensus rejection is not driven by a shared methodological assumption. The same pattern replicates on PPG-DaLiA (n = 15 subjects, 18,781 windows, same wrist-PPG hardware but ambulatory rather than stress paradigm): consensus rejection 43.1%, median pairwise published κ = -0.20, κ = 0.000 against the in-house threshold across all three published methods.</w:t>
+        <w:t xml:space="preserve">The published methods individually pass 21.5% to 25.6% of windows and collectively reject 44.6% of windows accepted by a single fixed in-house threshold. Across the three methods the prevalence-insensitive Gwet’s AC1 is positive on every pair (median +0.32) and raw agreement averages 63%; the negative median Cohen’s κ (-0.20) is a prevalence paradox from the shared 74 to 78% rejection rate, not genuine disagreement. The methods agree more than chance on pass/fail and converge on rejecting a substantial population of windows. Each method tests a different physical property (Orphanidou: pulse-shape correlation; Sukor: pulse-to-pulse interval consistency; Elgendi: amplitude-distribution statistics), so the consensus rejection is not driven by a shared methodological assumption. The same pattern replicates on PPG-DaLiA (n = 15 subjects, 18,781 windows, same wrist-PPG hardware but ambulatory rather than stress paradigm): consensus rejection 43.1%, median pairwise published κ = -0.20, κ = 0.000 against the in-house threshold across all three published methods.</w:t>
       </w:r>
     </w:p>
     <w:p>
@@ -8865,6 +8865,24 @@
           <w:b/>
           <w:bCs/>
         </w:rPr>
+        <w:t xml:space="preserve">The in-house baseline is a simple motion threshold, not a validated quality index.</w:t>
+      </w:r>
+      <w:r>
+        <w:t xml:space="preserve"> </w:t>
+      </w:r>
+      <w:r>
+        <w:t xml:space="preserve">The in-house SQI used here is a motion-driven per-window score applied at a fixed 0.70 cutoff. At that cutoff it accepts essentially all windows on both datasets, and Table 6 shows it is close to a deterministic inverse of the motion estimate (Spearman -1.000), so we do not claim it is a calibrated or validated signal-quality index. A reader could reasonably object that rejecting windows such a score accepts is a low bar. We include it only as a stand-in for the common practice of applying a single fixed threshold to a motion-correlated quality score, and the substantive finding does not depend on it: the consensus-rejection result is a property of the three published methods agreeing on the same large fraction of windows (44.6% on WESAD, 43.1% on PPG-DaLiA; Section 3.2), independent of any in-house decision, and the threshold-sensitivity analysis shows the headline is unchanged across the full 0.50 to 0.95 range (Supplementary Table S5). The intended reading is not that the published methods beat the in-house threshold, but that three independently developed methods converge while a single motion threshold does not discriminate among windows at all.</w:t>
+      </w:r>
+    </w:p>
+    <w:p>
+      <w:pPr>
+        <w:pStyle w:val="BodyText"/>
+      </w:pPr>
+      <w:r>
+        <w:rPr>
+          <w:b/>
+          <w:bCs/>
+        </w:rPr>
         <w:t xml:space="preserve">No hand-labeled signal-quality ground truth.</w:t>
       </w:r>
       <w:r>
@@ -9052,7 +9070,7 @@
         <w:pStyle w:val="FirstParagraph"/>
       </w:pPr>
       <w:r>
-        <w:t xml:space="preserve">On a public wearable-PPG benchmark (WESAD, n = 15 subjects, 6,585 windows), three independently developed published signal-quality methods, Orphanidou (2015), Sukor (2011), and Elgendi (2016), collectively reject 44.6% of windows accepted by a representative in-house threshold. The three methods agree with each other once base rates are accounted for (median Gwet’s AC1 = +0.32; the negative Cohen’s κ is a prevalence paradox) and converge on the consensus rejection set. Single-threshold recalibration at n = 15 does not recover agreement, and per-subject heterogeneity in cross-modality HR disagreement spans a four-fold range across subjects. Restricting downstream models to multi-baseline-pass windows improves per-subject HR correlation by a median of +0.110 (paired Wilcoxon p = 1.5e-04). The finding replicates on a second public benchmark (PPG-DaLiA, n = 15, 18,781 windows; same wrist-PPG hardware but ambulatory activity paradigm rather than stress paradigm): consensus rejection 43.1%, median pairwise κ across published methods -0.20, κ against the in-house threshold 0.000, with all three published-method pass rates within 3 percentage points of their WESAD values. The implication for wearable-AI research practice is that single-method SQI reporting is insufficient: multi-baseline auditing should be standard supplementary material in wearable-AI publications.</w:t>
+        <w:t xml:space="preserve">On a public wearable-PPG benchmark (WESAD, n = 15 subjects, 6,585 windows), three independently developed published signal-quality methods, Orphanidou (2015), Sukor (2011), and Elgendi (2016), collectively reject 44.6% of windows accepted by a single fixed in-house threshold. The three methods agree with each other once base rates are accounted for (median Gwet’s AC1 = +0.32; the negative Cohen’s κ is a prevalence paradox) and converge on the consensus rejection set. Single-threshold recalibration at n = 15 does not recover agreement, and per-subject heterogeneity in cross-modality HR disagreement spans a four-fold range across subjects. Restricting downstream models to multi-baseline-pass windows improves per-subject HR correlation by a median of +0.110 (paired Wilcoxon p = 1.5e-04). The finding replicates on a second public benchmark (PPG-DaLiA, n = 15, 18,781 windows; same wrist-PPG hardware but ambulatory activity paradigm rather than stress paradigm): consensus rejection 43.1%, median pairwise κ across published methods -0.20, κ against the in-house threshold 0.000, with all three published-method pass rates within 3 percentage points of their WESAD values. The implication for wearable-AI research practice is that single-method SQI reporting is insufficient: multi-baseline auditing should be standard supplementary material in wearable-AI publications.</w:t>
       </w:r>
     </w:p>
     <w:p>

</xml_diff>

<commit_message>
Session 3: downstream de-circularization. Add random-retention negative control (median improvement +0.005 WESAD, +0.000 PPG-DaLiA) and filter-choice robustness (Orphanidou and Sukor improve HR correlation, Elgendi reverses it) to Section 3.6; reframe combined interpretation to promote the less-circular classification task; correct 'multi-baseline-pass' to 'Orphanidou-passing'; add a control clause to the abstract
</commit_message>
<xml_diff>
--- a/paper/manuscript.docx
+++ b/paper/manuscript.docx
@@ -273,7 +273,7 @@
         <w:t xml:space="preserve"> </w:t>
       </w:r>
       <w:r>
-        <w:t xml:space="preserve">The three published methods agreed with each other (median Gwet’s AC1 = +0.32, mean raw agreement 63%; Cohen’s κ was negative on two of three pairs, a prevalence paradox from their shared 74 to 78% rejection rate) and converged on rejecting 44.6% of windows that the in-house threshold accepted, three methods testing three different physical properties of pulse waveforms, three concordant rejections. The in-house SQI was uncorrelated with any published baseline (κ = 0.000 against each). Single-threshold recalibration at n = 15 did not recover agreement (Δκ = 0.000; AUROC for in-house SQI predicting Orphanidou pass/fail = 0.484). Per-subject heterogeneity in wrist-PPG-to-chest-ECG HR disagreement spanned 6.75 to 26.02 bpm during the stress condition, a four-fold range across subjects. Restricting downstream models to Orphanidou-passing windows improved per-subject HR correlation by a median of +0.110 (13 of 15 subjects improved, paired Wilcoxon p = 1.5e-04). The finding replicated on PPG-DaLiA</w:t>
+        <w:t xml:space="preserve">The three published methods agreed with each other (median Gwet’s AC1 = +0.32, mean raw agreement 63%; Cohen’s κ was negative on two of three pairs, a prevalence paradox from their shared 74 to 78% rejection rate) and converged on rejecting 44.6% of windows that the in-house threshold accepted, three methods testing three different physical properties of pulse waveforms, three concordant rejections. The in-house SQI was uncorrelated with any published baseline (κ = 0.000 against each). Single-threshold recalibration at n = 15 did not recover agreement (Δκ = 0.000; AUROC for in-house SQI predicting Orphanidou pass/fail = 0.484). Per-subject heterogeneity in wrist-PPG-to-chest-ECG HR disagreement spanned 6.75 to 26.02 bpm during the stress condition, a four-fold range across subjects. Restricting downstream models to Orphanidou-passing windows improved per-subject HR correlation by a median of +0.110 (13 of 15 subjects improved, paired Wilcoxon p = 1.5e-04), an improvement absent under matched random window retention and specific to the timing-based SQIs. The finding replicated on PPG-DaLiA</w:t>
       </w:r>
       <w:r>
         <w:t xml:space="preserve"> </w:t>
@@ -6230,13 +6230,31 @@
           <w:b/>
           <w:bCs/>
         </w:rPr>
+        <w:t xml:space="preserve">The improvement is quality-specific and filter-dependent.</w:t>
+      </w:r>
+      <w:r>
+        <w:t xml:space="preserve"> </w:t>
+      </w:r>
+      <w:r>
+        <w:t xml:space="preserve">Two controls bound this result. As a negative control, retaining the same number of windows per subject chosen at random rather than by Orphanidou produces a median correlation change of +0.005 on WESAD and +0.000 on PPG-DaLiA, with the 95% range across 200 draws straddling zero. The gain is therefore a property of which windows are kept, not of keeping fewer windows or of range restriction from subsetting. Filter choice also matters: substituting Sukor for Orphanidou gives a similar improvement (median +0.139 on WESAD, +0.177 on PPG-DaLiA), but substituting Elgendi reverses it (median -0.171 on WESAD, -0.186 on PPG-DaLiA, with 0 to 2 of 15 subjects improving). The two SQIs that test pulse timing and shape, properties tied to rate recovery, improve HR agreement; the amplitude-distribution SQI does not. The downstream benefit is specific to HR-relevant quality criteria rather than automatic for any SQI, which is why we filter by Orphanidou and report the contrast rather than treating the three methods as interchangeable downstream filters.</w:t>
+      </w:r>
+    </w:p>
+    <w:p>
+      <w:pPr>
+        <w:pStyle w:val="BodyText"/>
+      </w:pPr>
+      <w:r>
+        <w:rPr>
+          <w:b/>
+          <w:bCs/>
+        </w:rPr>
         <w:t xml:space="preserve">Combined interpretation.</w:t>
       </w:r>
       <w:r>
         <w:t xml:space="preserve"> </w:t>
       </w:r>
       <w:r>
-        <w:t xml:space="preserve">Audit filtering reliably improves window-level biomarker estimation but only marginally improves cohort-level classification. The Spearman improvement (p &lt; 0.001) is the more direct test of the framework’s value because it operates at the per-window level where the audit acts. The classification result (p = 0.05) is more demanding because LOSO held-out evaluation on n = 15 has limited statistical power; the +0.027 mean improvement is consistent with a real effect that the sample size does not let us declare significant. The trade-off is data retention: Orphanidou filtering keeps roughly 26% of windows. For subjects with already-strong correlation (S14, S16, S17 all at ρ ≥ 0.83 without filtering), the improvement is modest; for subjects with weaker correlation (S2, S5, S15 at ρ &lt; 0.60 without filtering), the gain is substantial.</w:t>
+        <w:t xml:space="preserve">Filtering by an HR-relevant SQI improves window-level HR agreement but only marginally improves cohort-level classification, and the two results carry different evidential weight. The classification result (Task A, +0.027, p = 0.05) is the more independent test, because the SQI is not optimized for stress classification: any gain there reflects cleaner model inputs rather than the filter selecting for its own objective. LOSO evaluation on n = 15 has limited statistical power, and the +0.027 mean improvement is consistent with a real effect the sample size cannot declare significant. The HR-correlation result (Task B, +0.110, p &lt; 0.001) is larger and, by the negative control above, quality-specific rather than a retention artifact, but it sits closer to the filtering criterion: filtering on PPG quality and then scoring PPG-derived HR accuracy is partly self-fulfilling, since improving rate recoverability is much of what a pulse-shape or interval SQI does. We therefore read Task A as the more demanding evidence that the audit affects a task it does not directly target, and Task B as confirmation that Orphanidou and Sukor act as competent HR-quality filters. The trade-off is data retention: Orphanidou filtering keeps roughly 26% of windows. For subjects with already-strong correlation (S14, S16, S17 all at ρ ≥ 0.83 without filtering), the improvement is modest; for subjects with weaker correlation (S2, S5, S15 at ρ &lt; 0.60 without filtering), the gain is substantial.</w:t>
       </w:r>
     </w:p>
     <w:p>
@@ -8705,7 +8723,7 @@
         <w:t xml:space="preserve"> </w:t>
       </w:r>
       <w:r>
-        <w:t xml:space="preserve">Mean |HR_PPG - HR_ECG| during stress ranges from 6.75 bpm (S15) to 26.02 bpm (S11), a four-fold spread across 15 subjects. The direction of the per-state quality change also varies (most subjects’ PPG SQI drops during stress; S15’s rises). Any conclusion from pooled WESAD wrist-PPG analysis is at risk of being driven by a small number of subjects. Restricting downstream models to multi-baseline-pass windows improves per-subject wrist-PPG-to-chest-ECG HR correlation by a median of +0.110 (13 of 15 subjects improved, paired Wilcoxon p = 1.5e-04), with the largest gains in subjects whose unfiltered correlation was modest (S10: 0.65 → 0.78, S9: 0.47 → 0.76).</w:t>
+        <w:t xml:space="preserve">Mean |HR_PPG - HR_ECG| during stress ranges from 6.75 bpm (S15) to 26.02 bpm (S11), a four-fold spread across 15 subjects. The direction of the per-state quality change also varies (most subjects’ PPG SQI drops during stress; S15’s rises). Any conclusion from pooled WESAD wrist-PPG analysis is at risk of being driven by a small number of subjects. Restricting downstream models to Orphanidou-passing windows improves per-subject wrist-PPG-to-chest-ECG HR correlation by a median of +0.110 (13 of 15 subjects improved, paired Wilcoxon p = 1.5e-04), with the largest gains in subjects whose unfiltered correlation was modest (S10: 0.65 → 0.78, S9: 0.47 → 0.76).</w:t>
       </w:r>
     </w:p>
     <w:bookmarkEnd w:id="63"/>
@@ -8889,7 +8907,7 @@
         <w:t xml:space="preserve"> </w:t>
       </w:r>
       <w:r>
-        <w:t xml:space="preserve">On WESAD and PPG-DaLiA the three published methods converge on a consensus-reject set while still differing on individual windows (raw agreement 56 to 78%); without hand-labeled signal-quality ground truth on these datasets, we cannot identify which method (if any) is correct on any specific disagreed-on window. The HR-agreement evidence in Section 3.6 is an indirect proxy: multi-baseline-pass windows produce higher per-subject wrist-PPG-to-chest-ECG HR correlation than no-audit windows (paired Wilcoxon p &lt; 0.001), which is consistent with the published methods successfully filtering bad windows but does not by itself identify any one of them as a gold standard. Hand-labeling a representative window sample on both datasets (e.g., 200 stratified windows: consensus-pass, consensus-reject, and gray-area) and computing each method’s Cohen’s κ against the human-rater target is the natural follow-up to convert the agreement finding from</w:t>
+        <w:t xml:space="preserve">On WESAD and PPG-DaLiA the three published methods converge on a consensus-reject set while still differing on individual windows (raw agreement 56 to 78%); without hand-labeled signal-quality ground truth on these datasets, we cannot identify which method (if any) is correct on any specific disagreed-on window. The HR-agreement evidence in Section 3.6 is an indirect proxy: Orphanidou-passing windows produce higher per-subject wrist-PPG-to-chest-ECG HR correlation than no-audit windows (paired Wilcoxon p &lt; 0.001), which is consistent with the published methods successfully filtering bad windows but does not by itself identify any one of them as a gold standard. Hand-labeling a representative window sample on both datasets (e.g., 200 stratified windows: consensus-pass, consensus-reject, and gray-area) and computing each method’s Cohen’s κ against the human-rater target is the natural follow-up to convert the agreement finding from</w:t>
       </w:r>
       <w:r>
         <w:t xml:space="preserve"> </w:t>
@@ -9070,7 +9088,7 @@
         <w:pStyle w:val="FirstParagraph"/>
       </w:pPr>
       <w:r>
-        <w:t xml:space="preserve">On a public wearable-PPG benchmark (WESAD, n = 15 subjects, 6,585 windows), three independently developed published signal-quality methods, Orphanidou (2015), Sukor (2011), and Elgendi (2016), collectively reject 44.6% of windows accepted by a single fixed in-house threshold. The three methods agree with each other once base rates are accounted for (median Gwet’s AC1 = +0.32; the negative Cohen’s κ is a prevalence paradox) and converge on the consensus rejection set. Single-threshold recalibration at n = 15 does not recover agreement, and per-subject heterogeneity in cross-modality HR disagreement spans a four-fold range across subjects. Restricting downstream models to multi-baseline-pass windows improves per-subject HR correlation by a median of +0.110 (paired Wilcoxon p = 1.5e-04). The finding replicates on a second public benchmark (PPG-DaLiA, n = 15, 18,781 windows; same wrist-PPG hardware but ambulatory activity paradigm rather than stress paradigm): consensus rejection 43.1%, median pairwise κ across published methods -0.20, κ against the in-house threshold 0.000, with all three published-method pass rates within 3 percentage points of their WESAD values. The implication for wearable-AI research practice is that single-method SQI reporting is insufficient: multi-baseline auditing should be standard supplementary material in wearable-AI publications.</w:t>
+        <w:t xml:space="preserve">On a public wearable-PPG benchmark (WESAD, n = 15 subjects, 6,585 windows), three independently developed published signal-quality methods, Orphanidou (2015), Sukor (2011), and Elgendi (2016), collectively reject 44.6% of windows accepted by a single fixed in-house threshold. The three methods agree with each other once base rates are accounted for (median Gwet’s AC1 = +0.32; the negative Cohen’s κ is a prevalence paradox) and converge on the consensus rejection set. Single-threshold recalibration at n = 15 does not recover agreement, and per-subject heterogeneity in cross-modality HR disagreement spans a four-fold range across subjects. Restricting downstream models to Orphanidou-passing windows improves per-subject HR correlation by a median of +0.110 (paired Wilcoxon p = 1.5e-04). The finding replicates on a second public benchmark (PPG-DaLiA, n = 15, 18,781 windows; same wrist-PPG hardware but ambulatory activity paradigm rather than stress paradigm): consensus rejection 43.1%, median pairwise κ across published methods -0.20, κ against the in-house threshold 0.000, with all three published-method pass rates within 3 percentage points of their WESAD values. The implication for wearable-AI research practice is that single-method SQI reporting is insufficient: multi-baseline auditing should be standard supplementary material in wearable-AI publications.</w:t>
       </w:r>
     </w:p>
     <w:p>

</xml_diff>

<commit_message>
Session 4a: demote synthetic and toolkit framing. Remove the synthetic fairness and AIPW results from the abstract; replace the toolkit feature list in the introduction with a one-line implementation note that points the extra pipeline components to the supplement
</commit_message>
<xml_diff>
--- a/paper/manuscript.docx
+++ b/paper/manuscript.docx
@@ -255,7 +255,7 @@
         <w:t xml:space="preserve">biomedical-signal-forensics-lab</w:t>
       </w:r>
       <w:r>
-        <w:t xml:space="preserve">, MIT licensed) for reproducibility. A parallel 300-participant 60-day synthetic cohort with documented injected failure modes characterises the audit components.</w:t>
+        <w:t xml:space="preserve">, MIT licensed) for reproducibility. A synthetic-cohort validation of the remaining pipeline components is reported in the supplement.</w:t>
       </w:r>
     </w:p>
     <w:p>
@@ -285,7 +285,7 @@
         <w:t xml:space="preserve"> </w:t>
       </w:r>
       <w:r>
-        <w:t xml:space="preserve">(n = 15 subjects, 18,781 windows, same wrist-PPG hardware but ambulatory rather than stress paradigm): consensus rejection 43.1% (vs 44.6% on WESAD), median published-method Gwet’s AC1 +0.28 (vs +0.32), with the in-house threshold the lone outlier on both. On the synthetic cohort, the audit recovered injected fairness disparities (-13.02 points for device family, -9.53 points for skin-tone quartiles) and AIPW-adjusted confounding estimates with cluster bootstrap CIs.</w:t>
+        <w:t xml:space="preserve">(n = 15 subjects, 18,781 windows, same wrist-PPG hardware but ambulatory rather than stress paradigm): consensus rejection 43.1% (vs 44.6% on WESAD), median published-method Gwet’s AC1 +0.28 (vs +0.32), with the in-house threshold the lone outlier on both.</w:t>
       </w:r>
     </w:p>
     <w:p>
@@ -453,7 +453,7 @@
         <w:t xml:space="preserve">(Schmidt et al. 2018)</w:t>
       </w:r>
       <w:r>
-        <w:t xml:space="preserve">. We show that the three published methods agree with each other once base rates are accounted for (median Gwet’s AC1 = +0.32; Cohen’s κ is negative on two of the three pairs, a prevalence paradox) and converge on rejecting 44.6% of windows that a single fixed in-house threshold accepts; single-threshold recalibration at n = 15 does not recover agreement; and audit-based filtering improves downstream per-subject HR correlation by a median of +0.110. To enable reproducibility and reuse, we implement the audit pipeline as an open-source Python toolkit (</w:t>
+        <w:t xml:space="preserve">. We show that the three published methods agree with each other once base rates are accounted for (median Gwet’s AC1 = +0.32; Cohen’s κ is negative on two of the three pairs, a prevalence paradox) and converge on rejecting 44.6% of windows that a single fixed in-house threshold accepts; single-threshold recalibration at n = 15 does not recover agreement; and audit-based filtering improves downstream per-subject HR correlation by a median of +0.110. To enable reproducibility and reuse, the audit pipeline is implemented as an open-source Python toolkit (</w:t>
       </w:r>
       <w:r>
         <w:rPr>
@@ -462,7 +462,7 @@
         <w:t xml:space="preserve">biomedical-signal-forensics-lab</w:t>
       </w:r>
       <w:r>
-        <w:t xml:space="preserve">, MIT licensed), which also includes reliability primitives, doubly-robust causal-adjusted confounding analysis under a user-supplied directed acyclic graph (DAG), change-point detection, and stratified fairness audit. The empirical contribution of this paper is the cross-method SQI consensus-rejection finding; the toolkit is the supporting infrastructure that made the finding reproducible.</w:t>
+        <w:t xml:space="preserve">, MIT licensed); additional pipeline components (reliability, causal-adjusted confounding, and fairness analysis) are validated on synthetic data in the supplement. The empirical contribution of this paper is the cross-method SQI consensus-rejection finding; the toolkit is the supporting infrastructure that made it reproducible.</w:t>
       </w:r>
     </w:p>
     <w:p>

</xml_diff>

<commit_message>
Session 4b: move synthetic-cohort validation (Section 4) to the supplement as Section S10 with renumbered Tables S6-S8 and Supplementary Figures S5-S6; leave a brief Section 4 stub in the main text; repoint the 4.2 and 4.3 cross-references and the AIPW table reference to the supplement
</commit_message>
<xml_diff>
--- a/paper/manuscript.docx
+++ b/paper/manuscript.docx
@@ -2,7 +2,7 @@
 <file path=word/document.xml><?xml version="1.0" encoding="utf-8"?>
 <w:document xmlns:w="http://schemas.openxmlformats.org/wordprocessingml/2006/main" xmlns:m="http://schemas.openxmlformats.org/officeDocument/2006/math" xmlns:r="http://schemas.openxmlformats.org/officeDocument/2006/relationships" xmlns:o="urn:schemas-microsoft-com:office:office" xmlns:v="urn:schemas-microsoft-com:vml" xmlns:w10="urn:schemas-microsoft-com:office:word" xmlns:a="http://schemas.openxmlformats.org/drawingml/2006/main" xmlns:pic="http://schemas.openxmlformats.org/drawingml/2006/picture" xmlns:wp="http://schemas.openxmlformats.org/drawingml/2006/wordprocessingDrawing">
   <w:body>
-    <w:bookmarkStart w:id="130" w:name="X2a6ad74602addf8e6cd2d7e44f3b1c0d89e76e6"/>
+    <w:bookmarkStart w:id="117" w:name="X2a6ad74602addf8e6cd2d7e44f3b1c0d89e76e6"/>
     <w:p>
       <w:pPr>
         <w:pStyle w:val="Heading1"/>
@@ -889,7 +889,7 @@
         <w:t xml:space="preserve"> </w:t>
       </w:r>
       <w:r>
-        <w:t xml:space="preserve">axis to partition variance between within-subject day-to-day noise and between-subject systematic differences. This is not the canonical between-rater-on-same-subject application of ICC; it is a repeated-measures variant in which each day’s measurement is treated as a noisy realization of an underlying subject-level trait. We report ICC alongside the proper bootstrap week-pair test-retest (Section 4.3, Supplementary Table S1), not in its place; the two metrics agree on which biomarkers have the highest and lowest reliability, and ICC is uniformly more conservative because it treats within-week day-to-day noise as rater disagreement.</w:t>
+        <w:t xml:space="preserve">axis to partition variance between within-subject day-to-day noise and between-subject systematic differences. This is not the canonical between-rater-on-same-subject application of ICC; it is a repeated-measures variant in which each day’s measurement is treated as a noisy realization of an underlying subject-level trait. We report ICC alongside the proper bootstrap week-pair test-retest (supplement Section S10.3, Table S1), not in its place; the two metrics agree on which biomarkers have the highest and lowest reliability, and ICC is uniformly more conservative because it treats within-week day-to-day noise as rater disagreement.</w:t>
       </w:r>
     </w:p>
     <w:p>
@@ -1699,7 +1699,7 @@
         <w:t xml:space="preserve"> </w:t>
       </w:r>
       <w:r>
-        <w:t xml:space="preserve">All other inferential statistics in the manuscript are secondary or exploratory: the three audit-condition Wilcoxon contrasts in Tables 8 and 9 (one of which is structurally degenerate because the in-house threshold passes 100% of windows by construction; the other two are jointly identical), per-subject state-contrast effect sizes (Tables S3, S4), and the AIPW point estimates (Table 13). These are reported uncorrected for descriptive interpretation. Benjamini-Hochberg correction across the three audit-condition comparisons in Table 9 gives q = 2.25e-04 for the primary Orphanidou contrast (versus the uncorrected p = 1.5e-04) and the substantive conclusion is unchanged; in Table 8 the suggestive Orphanidou contrast at uncorrected p = 0.052 gives q = 0.078 after Benjamini-Hochberg correction across three comparisons, still non-significant at the conventional 0.05 cutoff and consistent with our interpretation as a suggestive trend rather than a confirmed effect.</w:t>
+        <w:t xml:space="preserve">All other inferential statistics in the manuscript are secondary or exploratory: the three audit-condition Wilcoxon contrasts in Tables 8 and 9 (one of which is structurally degenerate because the in-house threshold passes 100% of windows by construction; the other two are jointly identical), per-subject state-contrast effect sizes (Tables S3, S4), and the AIPW point estimates (Table S8). These are reported uncorrected for descriptive interpretation. Benjamini-Hochberg correction across the three audit-condition comparisons in Table 9 gives q = 2.25e-04 for the primary Orphanidou contrast (versus the uncorrected p = 1.5e-04) and the substantive conclusion is unchanged; in Table 8 the suggestive Orphanidou contrast at uncorrected p = 0.052 gives q = 0.078 after Benjamini-Hochberg correction across three comparisons, still non-significant at the conventional 0.05 cutoff and consistent with our interpretation as a suggestive trend rather than a confirmed effect.</w:t>
       </w:r>
     </w:p>
     <w:p>
@@ -6990,7 +6990,7 @@
     </w:p>
     <w:bookmarkEnd w:id="47"/>
     <w:bookmarkEnd w:id="48"/>
-    <w:bookmarkStart w:id="62" w:name="Xf8d28994ab18c569b43451e1d59264a3df91dd7"/>
+    <w:bookmarkStart w:id="49" w:name="Xf8d28994ab18c569b43451e1d59264a3df91dd7"/>
     <w:p>
       <w:pPr>
         <w:pStyle w:val="Heading2"/>
@@ -6999,1645 +6999,16 @@
         <w:t xml:space="preserve">4. Methodological validation on synthetic data</w:t>
       </w:r>
     </w:p>
-    <w:bookmarkStart w:id="52" w:name="Xa121e1727e5e5d44b54593882ea99d9ddb54092"/>
-    <w:p>
-      <w:pPr>
-        <w:pStyle w:val="Heading3"/>
-      </w:pPr>
-      <w:r>
-        <w:t xml:space="preserve">4.1 Cohort-level Digital Biomarker Trust Score</w:t>
-      </w:r>
-    </w:p>
     <w:p>
       <w:pPr>
         <w:pStyle w:val="FirstParagraph"/>
       </w:pPr>
       <w:r>
-        <w:t xml:space="preserve">Mean overall DBTS across all 300 participants:</w:t>
-      </w:r>
-      <w:r>
-        <w:t xml:space="preserve"> </w:t>
-      </w:r>
-      <w:r>
-        <w:rPr>
-          <w:b/>
-          <w:bCs/>
-        </w:rPr>
-        <w:t xml:space="preserve">74.11</w:t>
-      </w:r>
-      <w:r>
-        <w:t xml:space="preserve"> </w:t>
-      </w:r>
-      <w:r>
-        <w:t xml:space="preserve">(moderate category). Category distribution: 31 high (≥ 80), 266 moderate (≥ 60), 3 low (≥ 40), 0 unreliable. The distribution is in Figure 6A.</w:t>
-      </w:r>
-    </w:p>
-    <w:p>
-      <w:pPr>
-        <w:pStyle w:val="CaptionedFigure"/>
-      </w:pPr>
-      <w:r>
-        <w:drawing>
-          <wp:inline>
-            <wp:extent cx="5334000" cy="3977375"/>
-            <wp:effectExtent b="0" l="0" r="0" t="0"/>
-            <wp:docPr descr="Figure 6. Cohort-level Digital Biomarker Trust Score on the synthetic cohort (n = 300 participants, 60 days each). Mean overall DBTS = 74.11 (moderate category); 31 participants in the high category, 266 moderate, 3 low." title="" id="50" name="Picture"/>
-            <a:graphic>
-              <a:graphicData uri="http://schemas.openxmlformats.org/drawingml/2006/picture">
-                <pic:pic>
-                  <pic:nvPicPr>
-                    <pic:cNvPr descr="paper/figures/fig2_synthetic_headline.png" id="51" name="Picture"/>
-                    <pic:cNvPicPr>
-                      <a:picLocks noChangeArrowheads="1" noChangeAspect="1"/>
-                    </pic:cNvPicPr>
-                  </pic:nvPicPr>
-                  <pic:blipFill>
-                    <a:blip r:embed="rId49"/>
-                    <a:stretch>
-                      <a:fillRect/>
-                    </a:stretch>
-                  </pic:blipFill>
-                  <pic:spPr bwMode="auto">
-                    <a:xfrm>
-                      <a:off x="0" y="0"/>
-                      <a:ext cx="5334000" cy="3977375"/>
-                    </a:xfrm>
-                    <a:prstGeom prst="rect">
-                      <a:avLst/>
-                    </a:prstGeom>
-                    <a:noFill/>
-                    <a:ln w="9525">
-                      <a:noFill/>
-                      <a:headEnd/>
-                      <a:tailEnd/>
-                    </a:ln>
-                  </pic:spPr>
-                </pic:pic>
-              </a:graphicData>
-            </a:graphic>
-          </wp:inline>
-        </w:drawing>
-      </w:r>
-    </w:p>
-    <w:p>
-      <w:pPr>
-        <w:pStyle w:val="ImageCaption"/>
-      </w:pPr>
-      <w:r>
-        <w:t xml:space="preserve">Figure 6. Cohort-level Digital Biomarker Trust Score on the synthetic cohort (n = 300 participants, 60 days each). Mean overall DBTS = 74.11 (moderate category); 31 participants in the high category, 266 moderate, 3 low.</w:t>
-      </w:r>
-    </w:p>
-    <w:bookmarkEnd w:id="52"/>
-    <w:bookmarkStart w:id="53" w:name="X7eefbf0decf15c54e4d1e7780b435273777fbce"/>
-    <w:p>
-      <w:pPr>
-        <w:pStyle w:val="Heading3"/>
-      </w:pPr>
-      <w:r>
-        <w:t xml:space="preserve">4.2 Bootstrap test-retest reliability (week-pair design)</w:t>
-      </w:r>
-    </w:p>
-    <w:p>
-      <w:pPr>
-        <w:pStyle w:val="TableCaption"/>
-      </w:pPr>
-      <w:r>
-        <w:t xml:space="preserve">Table 11. Bootstrap test-retest reliability on the synthetic cohort (n = 300 participants, 2,400 week-pairs).</w:t>
-      </w:r>
-    </w:p>
-    <w:tbl>
-      <w:tblPr>
-        <w:tblStyle w:val="Table"/>
-        <w:tblW w:type="auto" w:w="0"/>
-        <w:tblLook w:firstRow="1" w:lastRow="0" w:firstColumn="0" w:lastColumn="0" w:noHBand="0" w:noVBand="0" w:val="0020"/>
-        <w:tblCaption w:val="Table 11. Bootstrap test-retest reliability on the synthetic cohort (n = 300 participants, 2,400 week-pairs)."/>
-      </w:tblPr>
-      <w:tblGrid>
-        <w:gridCol w:w="1584"/>
-        <w:gridCol w:w="1584"/>
-        <w:gridCol w:w="1584"/>
-        <w:gridCol w:w="1584"/>
-        <w:gridCol w:w="1584"/>
-      </w:tblGrid>
-      <w:tr>
-        <w:trPr>
-          <w:tblHeader w:val="on"/>
-        </w:trPr>
-        <w:tc>
-          <w:tcPr>
-            <w:tcBorders>
-              <w:top w:val="single" w:sz="12" w:space="0" w:color="000000"/>
-              <w:left w:val="nil"/>
-              <w:bottom w:val="single" w:sz="8" w:space="0" w:color="000000"/>
-              <w:right w:val="nil"/>
-            </w:tcBorders>
-          </w:tcPr>
-          <w:tcPr/>
-          <w:p>
-            <w:pPr>
-              <w:pStyle w:val="Compact"/>
-            </w:pPr>
-            <w:r>
-              <w:t xml:space="preserve">Metric</w:t>
-            </w:r>
-          </w:p>
-        </w:tc>
-        <w:tc>
-          <w:tcPr>
-            <w:tcBorders>
-              <w:top w:val="single" w:sz="12" w:space="0" w:color="000000"/>
-              <w:left w:val="nil"/>
-              <w:bottom w:val="single" w:sz="8" w:space="0" w:color="000000"/>
-              <w:right w:val="nil"/>
-            </w:tcBorders>
-          </w:tcPr>
-          <w:tcPr/>
-          <w:p>
-            <w:pPr>
-              <w:pStyle w:val="Compact"/>
-            </w:pPr>
-            <w:r>
-              <w:t xml:space="preserve">r</w:t>
-            </w:r>
-          </w:p>
-        </w:tc>
-        <w:tc>
-          <w:tcPr>
-            <w:tcBorders>
-              <w:top w:val="single" w:sz="12" w:space="0" w:color="000000"/>
-              <w:left w:val="nil"/>
-              <w:bottom w:val="single" w:sz="8" w:space="0" w:color="000000"/>
-              <w:right w:val="nil"/>
-            </w:tcBorders>
-          </w:tcPr>
-          <w:tcPr/>
-          <w:p>
-            <w:pPr>
-              <w:pStyle w:val="Compact"/>
-            </w:pPr>
-            <w:r>
-              <w:t xml:space="preserve">95% CI</w:t>
-            </w:r>
-          </w:p>
-        </w:tc>
-        <w:tc>
-          <w:tcPr>
-            <w:tcBorders>
-              <w:top w:val="single" w:sz="12" w:space="0" w:color="000000"/>
-              <w:left w:val="nil"/>
-              <w:bottom w:val="single" w:sz="8" w:space="0" w:color="000000"/>
-              <w:right w:val="nil"/>
-            </w:tcBorders>
-          </w:tcPr>
-          <w:tcPr/>
-          <w:p>
-            <w:pPr>
-              <w:pStyle w:val="Compact"/>
-            </w:pPr>
-            <w:r>
-              <w:t xml:space="preserve">n participants</w:t>
-            </w:r>
-          </w:p>
-        </w:tc>
-        <w:tc>
-          <w:tcPr>
-            <w:tcBorders>
-              <w:top w:val="single" w:sz="12" w:space="0" w:color="000000"/>
-              <w:left w:val="nil"/>
-              <w:bottom w:val="single" w:sz="8" w:space="0" w:color="000000"/>
-              <w:right w:val="nil"/>
-            </w:tcBorders>
-          </w:tcPr>
-          <w:tcPr/>
-          <w:p>
-            <w:pPr>
-              <w:pStyle w:val="Compact"/>
-            </w:pPr>
-            <w:r>
-              <w:t xml:space="preserve">n pairs</w:t>
-            </w:r>
-          </w:p>
-        </w:tc>
-      </w:tr>
-      <w:tr>
-        <w:tc>
-          <w:tcPr>
-            <w:tcBorders>
-              <w:top w:val="nil"/>
-              <w:left w:val="nil"/>
-              <w:bottom w:val="nil"/>
-              <w:right w:val="nil"/>
-            </w:tcBorders>
-          </w:tcPr>
-          <w:tcPr/>
-          <w:p>
-            <w:pPr>
-              <w:pStyle w:val="Compact"/>
-            </w:pPr>
-            <w:r>
-              <w:t xml:space="preserve">resting_hr</w:t>
-            </w:r>
-          </w:p>
-        </w:tc>
-        <w:tc>
-          <w:tcPr>
-            <w:tcBorders>
-              <w:top w:val="nil"/>
-              <w:left w:val="nil"/>
-              <w:bottom w:val="nil"/>
-              <w:right w:val="nil"/>
-            </w:tcBorders>
-          </w:tcPr>
-          <w:tcPr/>
-          <w:p>
-            <w:pPr>
-              <w:pStyle w:val="Compact"/>
-            </w:pPr>
-            <w:r>
-              <w:rPr>
-                <w:b/>
-                <w:bCs/>
-              </w:rPr>
-              <w:t xml:space="preserve">+0.977</w:t>
-            </w:r>
-          </w:p>
-        </w:tc>
-        <w:tc>
-          <w:tcPr>
-            <w:tcBorders>
-              <w:top w:val="nil"/>
-              <w:left w:val="nil"/>
-              <w:bottom w:val="nil"/>
-              <w:right w:val="nil"/>
-            </w:tcBorders>
-          </w:tcPr>
-          <w:tcPr/>
-          <w:p>
-            <w:pPr>
-              <w:pStyle w:val="Compact"/>
-            </w:pPr>
-            <w:r>
-              <w:t xml:space="preserve">[+0.973, +0.980]</w:t>
-            </w:r>
-          </w:p>
-        </w:tc>
-        <w:tc>
-          <w:tcPr>
-            <w:tcBorders>
-              <w:top w:val="nil"/>
-              <w:left w:val="nil"/>
-              <w:bottom w:val="nil"/>
-              <w:right w:val="nil"/>
-            </w:tcBorders>
-          </w:tcPr>
-          <w:tcPr/>
-          <w:p>
-            <w:pPr>
-              <w:pStyle w:val="Compact"/>
-            </w:pPr>
-            <w:r>
-              <w:t xml:space="preserve">300</w:t>
-            </w:r>
-          </w:p>
-        </w:tc>
-        <w:tc>
-          <w:tcPr>
-            <w:tcBorders>
-              <w:top w:val="nil"/>
-              <w:left w:val="nil"/>
-              <w:bottom w:val="nil"/>
-              <w:right w:val="nil"/>
-            </w:tcBorders>
-          </w:tcPr>
-          <w:tcPr/>
-          <w:p>
-            <w:pPr>
-              <w:pStyle w:val="Compact"/>
-            </w:pPr>
-            <w:r>
-              <w:t xml:space="preserve">2400</w:t>
-            </w:r>
-          </w:p>
-        </w:tc>
-      </w:tr>
-      <w:tr>
-        <w:tc>
-          <w:tcPr>
-            <w:tcBorders>
-              <w:top w:val="nil"/>
-              <w:left w:val="nil"/>
-              <w:bottom w:val="nil"/>
-              <w:right w:val="nil"/>
-            </w:tcBorders>
-          </w:tcPr>
-          <w:tcPr/>
-          <w:p>
-            <w:pPr>
-              <w:pStyle w:val="Compact"/>
-            </w:pPr>
-            <w:r>
-              <w:t xml:space="preserve">hrv_rmssd</w:t>
-            </w:r>
-          </w:p>
-        </w:tc>
-        <w:tc>
-          <w:tcPr>
-            <w:tcBorders>
-              <w:top w:val="nil"/>
-              <w:left w:val="nil"/>
-              <w:bottom w:val="nil"/>
-              <w:right w:val="nil"/>
-            </w:tcBorders>
-          </w:tcPr>
-          <w:tcPr/>
-          <w:p>
-            <w:pPr>
-              <w:pStyle w:val="Compact"/>
-            </w:pPr>
-            <w:r>
-              <w:rPr>
-                <w:b/>
-                <w:bCs/>
-              </w:rPr>
-              <w:t xml:space="preserve">+0.954</w:t>
-            </w:r>
-          </w:p>
-        </w:tc>
-        <w:tc>
-          <w:tcPr>
-            <w:tcBorders>
-              <w:top w:val="nil"/>
-              <w:left w:val="nil"/>
-              <w:bottom w:val="nil"/>
-              <w:right w:val="nil"/>
-            </w:tcBorders>
-          </w:tcPr>
-          <w:tcPr/>
-          <w:p>
-            <w:pPr>
-              <w:pStyle w:val="Compact"/>
-            </w:pPr>
-            <w:r>
-              <w:t xml:space="preserve">[+0.945, +0.961]</w:t>
-            </w:r>
-          </w:p>
-        </w:tc>
-        <w:tc>
-          <w:tcPr>
-            <w:tcBorders>
-              <w:top w:val="nil"/>
-              <w:left w:val="nil"/>
-              <w:bottom w:val="nil"/>
-              <w:right w:val="nil"/>
-            </w:tcBorders>
-          </w:tcPr>
-          <w:tcPr/>
-          <w:p>
-            <w:pPr>
-              <w:pStyle w:val="Compact"/>
-            </w:pPr>
-            <w:r>
-              <w:t xml:space="preserve">300</w:t>
-            </w:r>
-          </w:p>
-        </w:tc>
-        <w:tc>
-          <w:tcPr>
-            <w:tcBorders>
-              <w:top w:val="nil"/>
-              <w:left w:val="nil"/>
-              <w:bottom w:val="nil"/>
-              <w:right w:val="nil"/>
-            </w:tcBorders>
-          </w:tcPr>
-          <w:tcPr/>
-          <w:p>
-            <w:pPr>
-              <w:pStyle w:val="Compact"/>
-            </w:pPr>
-            <w:r>
-              <w:t xml:space="preserve">2400</w:t>
-            </w:r>
-          </w:p>
-        </w:tc>
-      </w:tr>
-      <w:tr>
-        <w:tc>
-          <w:tcPr>
-            <w:tcBorders>
-              <w:top w:val="nil"/>
-              <w:left w:val="nil"/>
-              <w:bottom w:val="nil"/>
-              <w:right w:val="nil"/>
-            </w:tcBorders>
-          </w:tcPr>
-          <w:tcPr/>
-          <w:p>
-            <w:pPr>
-              <w:pStyle w:val="Compact"/>
-            </w:pPr>
-            <w:r>
-              <w:t xml:space="preserve">sleep_efficiency</w:t>
-            </w:r>
-          </w:p>
-        </w:tc>
-        <w:tc>
-          <w:tcPr>
-            <w:tcBorders>
-              <w:top w:val="nil"/>
-              <w:left w:val="nil"/>
-              <w:bottom w:val="nil"/>
-              <w:right w:val="nil"/>
-            </w:tcBorders>
-          </w:tcPr>
-          <w:tcPr/>
-          <w:p>
-            <w:pPr>
-              <w:pStyle w:val="Compact"/>
-            </w:pPr>
-            <w:r>
-              <w:t xml:space="preserve">+0.023</w:t>
-            </w:r>
-          </w:p>
-        </w:tc>
-        <w:tc>
-          <w:tcPr>
-            <w:tcBorders>
-              <w:top w:val="nil"/>
-              <w:left w:val="nil"/>
-              <w:bottom w:val="nil"/>
-              <w:right w:val="nil"/>
-            </w:tcBorders>
-          </w:tcPr>
-          <w:tcPr/>
-          <w:p>
-            <w:pPr>
-              <w:pStyle w:val="Compact"/>
-            </w:pPr>
-            <w:r>
-              <w:t xml:space="preserve">[-0.018, +0.062]</w:t>
-            </w:r>
-          </w:p>
-        </w:tc>
-        <w:tc>
-          <w:tcPr>
-            <w:tcBorders>
-              <w:top w:val="nil"/>
-              <w:left w:val="nil"/>
-              <w:bottom w:val="nil"/>
-              <w:right w:val="nil"/>
-            </w:tcBorders>
-          </w:tcPr>
-          <w:tcPr/>
-          <w:p>
-            <w:pPr>
-              <w:pStyle w:val="Compact"/>
-            </w:pPr>
-            <w:r>
-              <w:t xml:space="preserve">300</w:t>
-            </w:r>
-          </w:p>
-        </w:tc>
-        <w:tc>
-          <w:tcPr>
-            <w:tcBorders>
-              <w:top w:val="nil"/>
-              <w:left w:val="nil"/>
-              <w:bottom w:val="nil"/>
-              <w:right w:val="nil"/>
-            </w:tcBorders>
-          </w:tcPr>
-          <w:tcPr/>
-          <w:p>
-            <w:pPr>
-              <w:pStyle w:val="Compact"/>
-            </w:pPr>
-            <w:r>
-              <w:t xml:space="preserve">2400</w:t>
-            </w:r>
-          </w:p>
-        </w:tc>
-      </w:tr>
-      <w:tr>
-        <w:tc>
-          <w:tcPr>
-            <w:tcBorders>
-              <w:top w:val="nil"/>
-              <w:left w:val="nil"/>
-              <w:bottom w:val="single" w:sz="12" w:space="0" w:color="000000"/>
-              <w:right w:val="nil"/>
-            </w:tcBorders>
-          </w:tcPr>
-          <w:tcPr/>
-          <w:p>
-            <w:pPr>
-              <w:pStyle w:val="Compact"/>
-            </w:pPr>
-            <w:r>
-              <w:t xml:space="preserve">sleep_duration</w:t>
-            </w:r>
-          </w:p>
-        </w:tc>
-        <w:tc>
-          <w:tcPr>
-            <w:tcBorders>
-              <w:top w:val="nil"/>
-              <w:left w:val="nil"/>
-              <w:bottom w:val="single" w:sz="12" w:space="0" w:color="000000"/>
-              <w:right w:val="nil"/>
-            </w:tcBorders>
-          </w:tcPr>
-          <w:tcPr/>
-          <w:p>
-            <w:pPr>
-              <w:pStyle w:val="Compact"/>
-            </w:pPr>
-            <w:r>
-              <w:t xml:space="preserve">+0.002</w:t>
-            </w:r>
-          </w:p>
-        </w:tc>
-        <w:tc>
-          <w:tcPr>
-            <w:tcBorders>
-              <w:top w:val="nil"/>
-              <w:left w:val="nil"/>
-              <w:bottom w:val="single" w:sz="12" w:space="0" w:color="000000"/>
-              <w:right w:val="nil"/>
-            </w:tcBorders>
-          </w:tcPr>
-          <w:tcPr/>
-          <w:p>
-            <w:pPr>
-              <w:pStyle w:val="Compact"/>
-            </w:pPr>
-            <w:r>
-              <w:t xml:space="preserve">[-0.041, +0.038]</w:t>
-            </w:r>
-          </w:p>
-        </w:tc>
-        <w:tc>
-          <w:tcPr>
-            <w:tcBorders>
-              <w:top w:val="nil"/>
-              <w:left w:val="nil"/>
-              <w:bottom w:val="single" w:sz="12" w:space="0" w:color="000000"/>
-              <w:right w:val="nil"/>
-            </w:tcBorders>
-          </w:tcPr>
-          <w:tcPr/>
-          <w:p>
-            <w:pPr>
-              <w:pStyle w:val="Compact"/>
-            </w:pPr>
-            <w:r>
-              <w:t xml:space="preserve">300</w:t>
-            </w:r>
-          </w:p>
-        </w:tc>
-        <w:tc>
-          <w:tcPr>
-            <w:tcBorders>
-              <w:top w:val="nil"/>
-              <w:left w:val="nil"/>
-              <w:bottom w:val="single" w:sz="12" w:space="0" w:color="000000"/>
-              <w:right w:val="nil"/>
-            </w:tcBorders>
-          </w:tcPr>
-          <w:tcPr/>
-          <w:p>
-            <w:pPr>
-              <w:pStyle w:val="Compact"/>
-            </w:pPr>
-            <w:r>
-              <w:t xml:space="preserve">2400</w:t>
-            </w:r>
-          </w:p>
-        </w:tc>
-      </w:tr>
-    </w:tbl>
-    <w:p>
-      <w:pPr>
-        <w:pStyle w:val="BodyText"/>
-      </w:pPr>
-      <w:r>
-        <w:t xml:space="preserve">Resting HR and HRV are highly reliable week-to-week. Sleep efficiency and duration are essentially noise from one week to the next on this generator. This is the kind of metric-level result that should appear in a clinical wearable paper instead of a single aggregate</w:t>
-      </w:r>
-      <w:r>
-        <w:t xml:space="preserve"> </w:t>
-      </w:r>
-      <w:r>
-        <w:t xml:space="preserve">“wearable reliability”</w:t>
-      </w:r>
-      <w:r>
-        <w:t xml:space="preserve"> </w:t>
-      </w:r>
-      <w:r>
-        <w:t xml:space="preserve">number.</w:t>
-      </w:r>
-    </w:p>
-    <w:bookmarkEnd w:id="53"/>
-    <w:bookmarkStart w:id="54" w:name="Xda95753af269ca0e3094d252b044c654d56e36b"/>
-    <w:p>
-      <w:pPr>
-        <w:pStyle w:val="Heading3"/>
-      </w:pPr>
-      <w:r>
-        <w:t xml:space="preserve">4.3 ICC(2,1) as within-participant noise-floor diagnostic</w:t>
-      </w:r>
-    </w:p>
-    <w:p>
-      <w:pPr>
-        <w:pStyle w:val="FirstParagraph"/>
-      </w:pPr>
-      <w:r>
-        <w:t xml:space="preserve">We also report an ICC(2,1) days-as-raters analysis as an internal noise-floor check (full numbers in supplement Table S1). The ICC and bootstrap week-pair r agree on metric ranking, with ICC uniformly more conservative because it treats within-week noise as rater disagreement. The bootstrap week-pair r is the recommended headline statistic for clinical claims; the ICC is included as a diagnostic.</w:t>
-      </w:r>
-    </w:p>
-    <w:bookmarkEnd w:id="54"/>
-    <w:bookmarkStart w:id="55" w:name="fairness-disparities-recovered"/>
-    <w:p>
-      <w:pPr>
-        <w:pStyle w:val="Heading3"/>
-      </w:pPr>
-      <w:r>
-        <w:t xml:space="preserve">4.4 Fairness disparities recovered</w:t>
-      </w:r>
-    </w:p>
-    <w:p>
-      <w:pPr>
-        <w:pStyle w:val="TableCaption"/>
-      </w:pPr>
-      <w:r>
-        <w:t xml:space="preserve">Table 12. Fairness disparities recovered on the synthetic cohort, signal_quality_score component.</w:t>
-      </w:r>
-    </w:p>
-    <w:tbl>
-      <w:tblPr>
-        <w:tblStyle w:val="Table"/>
-        <w:tblW w:type="pct" w:w="5000"/>
-        <w:tblLayout w:type="fixed"/>
-        <w:tblLook w:firstRow="1" w:lastRow="0" w:firstColumn="0" w:lastColumn="0" w:noHBand="0" w:noVBand="0" w:val="0020"/>
-        <w:tblCaption w:val="Table 12. Fairness disparities recovered on the synthetic cohort, signal_quality_score component."/>
-      </w:tblPr>
-      <w:tblGrid>
-        <w:gridCol w:w="1584"/>
-        <w:gridCol w:w="1584"/>
-        <w:gridCol w:w="1584"/>
-        <w:gridCol w:w="1584"/>
-        <w:gridCol w:w="1584"/>
-      </w:tblGrid>
-      <w:tr>
-        <w:trPr>
-          <w:tblHeader w:val="on"/>
-        </w:trPr>
-        <w:tc>
-          <w:tcPr>
-            <w:tcBorders>
-              <w:top w:val="single" w:sz="12" w:space="0" w:color="000000"/>
-              <w:left w:val="nil"/>
-              <w:bottom w:val="single" w:sz="8" w:space="0" w:color="000000"/>
-              <w:right w:val="nil"/>
-            </w:tcBorders>
-          </w:tcPr>
-          <w:tcPr/>
-          <w:p>
-            <w:pPr>
-              <w:pStyle w:val="Compact"/>
-            </w:pPr>
-            <w:r>
-              <w:t xml:space="preserve">Stratifier</w:t>
-            </w:r>
-          </w:p>
-        </w:tc>
-        <w:tc>
-          <w:tcPr>
-            <w:tcBorders>
-              <w:top w:val="single" w:sz="12" w:space="0" w:color="000000"/>
-              <w:left w:val="nil"/>
-              <w:bottom w:val="single" w:sz="8" w:space="0" w:color="000000"/>
-              <w:right w:val="nil"/>
-            </w:tcBorders>
-          </w:tcPr>
-          <w:tcPr/>
-          <w:p>
-            <w:pPr>
-              <w:pStyle w:val="Compact"/>
-            </w:pPr>
-            <w:r>
-              <w:t xml:space="preserve">Component</w:t>
-            </w:r>
-          </w:p>
-        </w:tc>
-        <w:tc>
-          <w:tcPr>
-            <w:tcBorders>
-              <w:top w:val="single" w:sz="12" w:space="0" w:color="000000"/>
-              <w:left w:val="nil"/>
-              <w:bottom w:val="single" w:sz="8" w:space="0" w:color="000000"/>
-              <w:right w:val="nil"/>
-            </w:tcBorders>
-          </w:tcPr>
-          <w:tcPr/>
-          <w:p>
-            <w:pPr>
-              <w:pStyle w:val="Compact"/>
-            </w:pPr>
-            <w:r>
-              <w:t xml:space="preserve">Q1 / lowest</w:t>
-            </w:r>
-          </w:p>
-        </w:tc>
-        <w:tc>
-          <w:tcPr>
-            <w:tcBorders>
-              <w:top w:val="single" w:sz="12" w:space="0" w:color="000000"/>
-              <w:left w:val="nil"/>
-              <w:bottom w:val="single" w:sz="8" w:space="0" w:color="000000"/>
-              <w:right w:val="nil"/>
-            </w:tcBorders>
-          </w:tcPr>
-          <w:tcPr/>
-          <w:p>
-            <w:pPr>
-              <w:pStyle w:val="Compact"/>
-            </w:pPr>
-            <w:r>
-              <w:t xml:space="preserve">Q4 / highest</w:t>
-            </w:r>
-          </w:p>
-        </w:tc>
-        <w:tc>
-          <w:tcPr>
-            <w:tcBorders>
-              <w:top w:val="single" w:sz="12" w:space="0" w:color="000000"/>
-              <w:left w:val="nil"/>
-              <w:bottom w:val="single" w:sz="8" w:space="0" w:color="000000"/>
-              <w:right w:val="nil"/>
-            </w:tcBorders>
-          </w:tcPr>
-          <w:tcPr/>
-          <w:p>
-            <w:pPr>
-              <w:pStyle w:val="Compact"/>
-            </w:pPr>
-            <w:r>
-              <w:t xml:space="preserve">Gap</w:t>
-            </w:r>
-          </w:p>
-        </w:tc>
-      </w:tr>
-      <w:tr>
-        <w:tc>
-          <w:tcPr>
-            <w:tcBorders>
-              <w:top w:val="nil"/>
-              <w:left w:val="nil"/>
-              <w:bottom w:val="nil"/>
-              <w:right w:val="nil"/>
-            </w:tcBorders>
-          </w:tcPr>
-          <w:tcPr/>
-          <w:p>
-            <w:pPr>
-              <w:pStyle w:val="Compact"/>
-            </w:pPr>
-            <w:r>
-              <w:t xml:space="preserve">device_type</w:t>
-            </w:r>
-          </w:p>
-        </w:tc>
-        <w:tc>
-          <w:tcPr>
-            <w:tcBorders>
-              <w:top w:val="nil"/>
-              <w:left w:val="nil"/>
-              <w:bottom w:val="nil"/>
-              <w:right w:val="nil"/>
-            </w:tcBorders>
-          </w:tcPr>
-          <w:tcPr/>
-          <w:p>
-            <w:pPr>
-              <w:pStyle w:val="Compact"/>
-            </w:pPr>
-            <w:r>
-              <w:t xml:space="preserve">signal_quality_score</w:t>
-            </w:r>
-          </w:p>
-        </w:tc>
-        <w:tc>
-          <w:tcPr>
-            <w:tcBorders>
-              <w:top w:val="nil"/>
-              <w:left w:val="nil"/>
-              <w:bottom w:val="nil"/>
-              <w:right w:val="nil"/>
-            </w:tcBorders>
-          </w:tcPr>
-          <w:tcPr/>
-          <w:p>
-            <w:pPr>
-              <w:pStyle w:val="Compact"/>
-            </w:pPr>
-            <w:r>
-              <w:t xml:space="preserve">device_A: 67.40</w:t>
-            </w:r>
-          </w:p>
-        </w:tc>
-        <w:tc>
-          <w:tcPr>
-            <w:tcBorders>
-              <w:top w:val="nil"/>
-              <w:left w:val="nil"/>
-              <w:bottom w:val="nil"/>
-              <w:right w:val="nil"/>
-            </w:tcBorders>
-          </w:tcPr>
-          <w:tcPr/>
-          <w:p>
-            <w:pPr>
-              <w:pStyle w:val="Compact"/>
-            </w:pPr>
-            <w:r>
-              <w:t xml:space="preserve">device_C: 54.38</w:t>
-            </w:r>
-          </w:p>
-        </w:tc>
-        <w:tc>
-          <w:tcPr>
-            <w:tcBorders>
-              <w:top w:val="nil"/>
-              <w:left w:val="nil"/>
-              <w:bottom w:val="nil"/>
-              <w:right w:val="nil"/>
-            </w:tcBorders>
-          </w:tcPr>
-          <w:tcPr/>
-          <w:p>
-            <w:pPr>
-              <w:pStyle w:val="Compact"/>
-            </w:pPr>
-            <w:r>
-              <w:rPr>
-                <w:b/>
-                <w:bCs/>
-              </w:rPr>
-              <w:t xml:space="preserve">-13.02</w:t>
-            </w:r>
-          </w:p>
-        </w:tc>
-      </w:tr>
-      <w:tr>
-        <w:tc>
-          <w:tcPr>
-            <w:tcBorders>
-              <w:top w:val="nil"/>
-              <w:left w:val="nil"/>
-              <w:bottom w:val="single" w:sz="12" w:space="0" w:color="000000"/>
-              <w:right w:val="nil"/>
-            </w:tcBorders>
-          </w:tcPr>
-          <w:tcPr/>
-          <w:p>
-            <w:pPr>
-              <w:pStyle w:val="Compact"/>
-            </w:pPr>
-            <w:r>
-              <w:t xml:space="preserve">skin_tone_q</w:t>
-            </w:r>
-          </w:p>
-        </w:tc>
-        <w:tc>
-          <w:tcPr>
-            <w:tcBorders>
-              <w:top w:val="nil"/>
-              <w:left w:val="nil"/>
-              <w:bottom w:val="single" w:sz="12" w:space="0" w:color="000000"/>
-              <w:right w:val="nil"/>
-            </w:tcBorders>
-          </w:tcPr>
-          <w:tcPr/>
-          <w:p>
-            <w:pPr>
-              <w:pStyle w:val="Compact"/>
-            </w:pPr>
-            <w:r>
-              <w:t xml:space="preserve">signal_quality_score</w:t>
-            </w:r>
-          </w:p>
-        </w:tc>
-        <w:tc>
-          <w:tcPr>
-            <w:tcBorders>
-              <w:top w:val="nil"/>
-              <w:left w:val="nil"/>
-              <w:bottom w:val="single" w:sz="12" w:space="0" w:color="000000"/>
-              <w:right w:val="nil"/>
-            </w:tcBorders>
-          </w:tcPr>
-          <w:tcPr/>
-          <w:p>
-            <w:pPr>
-              <w:pStyle w:val="Compact"/>
-            </w:pPr>
-            <w:r>
-              <w:t xml:space="preserve">Q1 (light): 67.93</w:t>
-            </w:r>
-          </w:p>
-        </w:tc>
-        <w:tc>
-          <w:tcPr>
-            <w:tcBorders>
-              <w:top w:val="nil"/>
-              <w:left w:val="nil"/>
-              <w:bottom w:val="single" w:sz="12" w:space="0" w:color="000000"/>
-              <w:right w:val="nil"/>
-            </w:tcBorders>
-          </w:tcPr>
-          <w:tcPr/>
-          <w:p>
-            <w:pPr>
-              <w:pStyle w:val="Compact"/>
-            </w:pPr>
-            <w:r>
-              <w:t xml:space="preserve">Q4 (dark): 58.40</w:t>
-            </w:r>
-          </w:p>
-        </w:tc>
-        <w:tc>
-          <w:tcPr>
-            <w:tcBorders>
-              <w:top w:val="nil"/>
-              <w:left w:val="nil"/>
-              <w:bottom w:val="single" w:sz="12" w:space="0" w:color="000000"/>
-              <w:right w:val="nil"/>
-            </w:tcBorders>
-          </w:tcPr>
-          <w:tcPr/>
-          <w:p>
-            <w:pPr>
-              <w:pStyle w:val="Compact"/>
-            </w:pPr>
-            <w:r>
-              <w:rPr>
-                <w:b/>
-                <w:bCs/>
-              </w:rPr>
-              <w:t xml:space="preserve">-9.53</w:t>
-            </w:r>
-          </w:p>
-        </w:tc>
-      </w:tr>
-    </w:tbl>
-    <w:p>
-      <w:pPr>
-        <w:pStyle w:val="BodyText"/>
-      </w:pPr>
-      <w:r>
-        <w:t xml:space="preserve">The injected effects were 0.85 vs 1.00 SQI multiplier for device C vs A (recovers as a 13.02-point gap) and 0.12 × proxy for skin tone (recovers as a 9.53-point gap). Both gaps have bootstrap 95% CIs (Section 2.7).</w:t>
-      </w:r>
-    </w:p>
-    <w:bookmarkEnd w:id="55"/>
-    <w:bookmarkStart w:id="56" w:name="causal-adjusted-confounding"/>
-    <w:p>
-      <w:pPr>
-        <w:pStyle w:val="Heading3"/>
-      </w:pPr>
-      <w:r>
-        <w:t xml:space="preserve">4.5 Causal-adjusted confounding</w:t>
-      </w:r>
-    </w:p>
-    <w:p>
-      <w:pPr>
-        <w:pStyle w:val="TableCaption"/>
-      </w:pPr>
-      <w:r>
-        <w:t xml:space="preserve">Table 13. Screening Pearson correlation vs AIPW adjusted estimate, synthetic cohort.</w:t>
-      </w:r>
-    </w:p>
-    <w:tbl>
-      <w:tblPr>
-        <w:tblStyle w:val="Table"/>
-        <w:tblW w:type="pct" w:w="5000"/>
-        <w:tblLayout w:type="fixed"/>
-        <w:tblLook w:firstRow="1" w:lastRow="0" w:firstColumn="0" w:lastColumn="0" w:noHBand="0" w:noVBand="0" w:val="0020"/>
-        <w:tblCaption w:val="Table 13. Screening Pearson correlation vs AIPW adjusted estimate, synthetic cohort."/>
-      </w:tblPr>
-      <w:tblGrid>
-        <w:gridCol w:w="1584"/>
-        <w:gridCol w:w="1584"/>
-        <w:gridCol w:w="1584"/>
-        <w:gridCol w:w="1584"/>
-        <w:gridCol w:w="1584"/>
-      </w:tblGrid>
-      <w:tr>
-        <w:trPr>
-          <w:tblHeader w:val="on"/>
-        </w:trPr>
-        <w:tc>
-          <w:tcPr>
-            <w:tcBorders>
-              <w:top w:val="single" w:sz="12" w:space="0" w:color="000000"/>
-              <w:left w:val="nil"/>
-              <w:bottom w:val="single" w:sz="8" w:space="0" w:color="000000"/>
-              <w:right w:val="nil"/>
-            </w:tcBorders>
-          </w:tcPr>
-          <w:tcPr/>
-          <w:p>
-            <w:pPr>
-              <w:pStyle w:val="Compact"/>
-            </w:pPr>
-            <w:r>
-              <w:t xml:space="preserve">Treatment</w:t>
-            </w:r>
-          </w:p>
-        </w:tc>
-        <w:tc>
-          <w:tcPr>
-            <w:tcBorders>
-              <w:top w:val="single" w:sz="12" w:space="0" w:color="000000"/>
-              <w:left w:val="nil"/>
-              <w:bottom w:val="single" w:sz="8" w:space="0" w:color="000000"/>
-              <w:right w:val="nil"/>
-            </w:tcBorders>
-          </w:tcPr>
-          <w:tcPr/>
-          <w:p>
-            <w:pPr>
-              <w:pStyle w:val="Compact"/>
-            </w:pPr>
-            <w:r>
-              <w:t xml:space="preserve">Outcome</w:t>
-            </w:r>
-          </w:p>
-        </w:tc>
-        <w:tc>
-          <w:tcPr>
-            <w:tcBorders>
-              <w:top w:val="single" w:sz="12" w:space="0" w:color="000000"/>
-              <w:left w:val="nil"/>
-              <w:bottom w:val="single" w:sz="8" w:space="0" w:color="000000"/>
-              <w:right w:val="nil"/>
-            </w:tcBorders>
-          </w:tcPr>
-          <w:tcPr/>
-          <w:p>
-            <w:pPr>
-              <w:pStyle w:val="Compact"/>
-            </w:pPr>
-            <w:r>
-              <w:t xml:space="preserve">Screening r</w:t>
-            </w:r>
-          </w:p>
-        </w:tc>
-        <w:tc>
-          <w:tcPr>
-            <w:tcBorders>
-              <w:top w:val="single" w:sz="12" w:space="0" w:color="000000"/>
-              <w:left w:val="nil"/>
-              <w:bottom w:val="single" w:sz="8" w:space="0" w:color="000000"/>
-              <w:right w:val="nil"/>
-            </w:tcBorders>
-          </w:tcPr>
-          <w:tcPr/>
-          <w:p>
-            <w:pPr>
-              <w:pStyle w:val="Compact"/>
-            </w:pPr>
-            <w:r>
-              <w:t xml:space="preserve">AIPW estimate</w:t>
-            </w:r>
-          </w:p>
-        </w:tc>
-        <w:tc>
-          <w:tcPr>
-            <w:tcBorders>
-              <w:top w:val="single" w:sz="12" w:space="0" w:color="000000"/>
-              <w:left w:val="nil"/>
-              <w:bottom w:val="single" w:sz="8" w:space="0" w:color="000000"/>
-              <w:right w:val="nil"/>
-            </w:tcBorders>
-          </w:tcPr>
-          <w:tcPr/>
-          <w:p>
-            <w:pPr>
-              <w:pStyle w:val="Compact"/>
-            </w:pPr>
-            <w:r>
-              <w:t xml:space="preserve">95% CI</w:t>
-            </w:r>
-          </w:p>
-        </w:tc>
-      </w:tr>
-      <w:tr>
-        <w:tc>
-          <w:tcPr>
-            <w:tcBorders>
-              <w:top w:val="nil"/>
-              <w:left w:val="nil"/>
-              <w:bottom w:val="nil"/>
-              <w:right w:val="nil"/>
-            </w:tcBorders>
-          </w:tcPr>
-          <w:tcPr/>
-          <w:p>
-            <w:pPr>
-              <w:pStyle w:val="Compact"/>
-            </w:pPr>
-            <w:r>
-              <w:t xml:space="preserve">heat_index</w:t>
-            </w:r>
-          </w:p>
-        </w:tc>
-        <w:tc>
-          <w:tcPr>
-            <w:tcBorders>
-              <w:top w:val="nil"/>
-              <w:left w:val="nil"/>
-              <w:bottom w:val="nil"/>
-              <w:right w:val="nil"/>
-            </w:tcBorders>
-          </w:tcPr>
-          <w:tcPr/>
-          <w:p>
-            <w:pPr>
-              <w:pStyle w:val="Compact"/>
-            </w:pPr>
-            <w:r>
-              <w:t xml:space="preserve">hrv_rmssd</w:t>
-            </w:r>
-          </w:p>
-        </w:tc>
-        <w:tc>
-          <w:tcPr>
-            <w:tcBorders>
-              <w:top w:val="nil"/>
-              <w:left w:val="nil"/>
-              <w:bottom w:val="nil"/>
-              <w:right w:val="nil"/>
-            </w:tcBorders>
-          </w:tcPr>
-          <w:tcPr/>
-          <w:p>
-            <w:pPr>
-              <w:pStyle w:val="Compact"/>
-            </w:pPr>
-            <w:r>
-              <w:t xml:space="preserve">-0.054</w:t>
-            </w:r>
-          </w:p>
-        </w:tc>
-        <w:tc>
-          <w:tcPr>
-            <w:tcBorders>
-              <w:top w:val="nil"/>
-              <w:left w:val="nil"/>
-              <w:bottom w:val="nil"/>
-              <w:right w:val="nil"/>
-            </w:tcBorders>
-          </w:tcPr>
-          <w:tcPr/>
-          <w:p>
-            <w:pPr>
-              <w:pStyle w:val="Compact"/>
-            </w:pPr>
-            <w:r>
-              <w:t xml:space="preserve">+0.249</w:t>
-            </w:r>
-          </w:p>
-        </w:tc>
-        <w:tc>
-          <w:tcPr>
-            <w:tcBorders>
-              <w:top w:val="nil"/>
-              <w:left w:val="nil"/>
-              <w:bottom w:val="nil"/>
-              <w:right w:val="nil"/>
-            </w:tcBorders>
-          </w:tcPr>
-          <w:tcPr/>
-          <w:p>
-            <w:pPr>
-              <w:pStyle w:val="Compact"/>
-            </w:pPr>
-            <w:r>
-              <w:t xml:space="preserve">[-0.604, +1.030]</w:t>
-            </w:r>
-          </w:p>
-        </w:tc>
-      </w:tr>
-      <w:tr>
-        <w:tc>
-          <w:tcPr>
-            <w:tcBorders>
-              <w:top w:val="nil"/>
-              <w:left w:val="nil"/>
-              <w:bottom w:val="nil"/>
-              <w:right w:val="nil"/>
-            </w:tcBorders>
-          </w:tcPr>
-          <w:tcPr/>
-          <w:p>
-            <w:pPr>
-              <w:pStyle w:val="Compact"/>
-            </w:pPr>
-            <w:r>
-              <w:t xml:space="preserve">heat_index</w:t>
-            </w:r>
-          </w:p>
-        </w:tc>
-        <w:tc>
-          <w:tcPr>
-            <w:tcBorders>
-              <w:top w:val="nil"/>
-              <w:left w:val="nil"/>
-              <w:bottom w:val="nil"/>
-              <w:right w:val="nil"/>
-            </w:tcBorders>
-          </w:tcPr>
-          <w:tcPr/>
-          <w:p>
-            <w:pPr>
-              <w:pStyle w:val="Compact"/>
-            </w:pPr>
-            <w:r>
-              <w:t xml:space="preserve">sleep_efficiency</w:t>
-            </w:r>
-          </w:p>
-        </w:tc>
-        <w:tc>
-          <w:tcPr>
-            <w:tcBorders>
-              <w:top w:val="nil"/>
-              <w:left w:val="nil"/>
-              <w:bottom w:val="nil"/>
-              <w:right w:val="nil"/>
-            </w:tcBorders>
-          </w:tcPr>
-          <w:tcPr/>
-          <w:p>
-            <w:pPr>
-              <w:pStyle w:val="Compact"/>
-            </w:pPr>
-            <w:r>
-              <w:t xml:space="preserve">-0.090</w:t>
-            </w:r>
-          </w:p>
-        </w:tc>
-        <w:tc>
-          <w:tcPr>
-            <w:tcBorders>
-              <w:top w:val="nil"/>
-              <w:left w:val="nil"/>
-              <w:bottom w:val="nil"/>
-              <w:right w:val="nil"/>
-            </w:tcBorders>
-          </w:tcPr>
-          <w:tcPr/>
-          <w:p>
-            <w:pPr>
-              <w:pStyle w:val="Compact"/>
-            </w:pPr>
-            <w:r>
-              <w:t xml:space="preserve">+0.005</w:t>
-            </w:r>
-          </w:p>
-        </w:tc>
-        <w:tc>
-          <w:tcPr>
-            <w:tcBorders>
-              <w:top w:val="nil"/>
-              <w:left w:val="nil"/>
-              <w:bottom w:val="nil"/>
-              <w:right w:val="nil"/>
-            </w:tcBorders>
-          </w:tcPr>
-          <w:tcPr/>
-          <w:p>
-            <w:pPr>
-              <w:pStyle w:val="Compact"/>
-            </w:pPr>
-            <w:r>
-              <w:t xml:space="preserve">[+0.000, +0.008]</w:t>
-            </w:r>
-          </w:p>
-        </w:tc>
-      </w:tr>
-      <w:tr>
-        <w:tc>
-          <w:tcPr>
-            <w:tcBorders>
-              <w:top w:val="nil"/>
-              <w:left w:val="nil"/>
-              <w:bottom w:val="nil"/>
-              <w:right w:val="nil"/>
-            </w:tcBorders>
-          </w:tcPr>
-          <w:tcPr/>
-          <w:p>
-            <w:pPr>
-              <w:pStyle w:val="Compact"/>
-            </w:pPr>
-            <w:r>
-              <w:t xml:space="preserve">aqi</w:t>
-            </w:r>
-          </w:p>
-        </w:tc>
-        <w:tc>
-          <w:tcPr>
-            <w:tcBorders>
-              <w:top w:val="nil"/>
-              <w:left w:val="nil"/>
-              <w:bottom w:val="nil"/>
-              <w:right w:val="nil"/>
-            </w:tcBorders>
-          </w:tcPr>
-          <w:tcPr/>
-          <w:p>
-            <w:pPr>
-              <w:pStyle w:val="Compact"/>
-            </w:pPr>
-            <w:r>
-              <w:t xml:space="preserve">sleep_efficiency</w:t>
-            </w:r>
-          </w:p>
-        </w:tc>
-        <w:tc>
-          <w:tcPr>
-            <w:tcBorders>
-              <w:top w:val="nil"/>
-              <w:left w:val="nil"/>
-              <w:bottom w:val="nil"/>
-              <w:right w:val="nil"/>
-            </w:tcBorders>
-          </w:tcPr>
-          <w:tcPr/>
-          <w:p>
-            <w:pPr>
-              <w:pStyle w:val="Compact"/>
-            </w:pPr>
-            <w:r>
-              <w:t xml:space="preserve">-0.020</w:t>
-            </w:r>
-          </w:p>
-        </w:tc>
-        <w:tc>
-          <w:tcPr>
-            <w:tcBorders>
-              <w:top w:val="nil"/>
-              <w:left w:val="nil"/>
-              <w:bottom w:val="nil"/>
-              <w:right w:val="nil"/>
-            </w:tcBorders>
-          </w:tcPr>
-          <w:tcPr/>
-          <w:p>
-            <w:pPr>
-              <w:pStyle w:val="Compact"/>
-            </w:pPr>
-            <w:r>
-              <w:t xml:space="preserve">-0.002</w:t>
-            </w:r>
-          </w:p>
-        </w:tc>
-        <w:tc>
-          <w:tcPr>
-            <w:tcBorders>
-              <w:top w:val="nil"/>
-              <w:left w:val="nil"/>
-              <w:bottom w:val="nil"/>
-              <w:right w:val="nil"/>
-            </w:tcBorders>
-          </w:tcPr>
-          <w:tcPr/>
-          <w:p>
-            <w:pPr>
-              <w:pStyle w:val="Compact"/>
-            </w:pPr>
-            <w:r>
-              <w:t xml:space="preserve">[-0.003, +0.000]</w:t>
-            </w:r>
-          </w:p>
-        </w:tc>
-      </w:tr>
-      <w:tr>
-        <w:tc>
-          <w:tcPr>
-            <w:tcBorders>
-              <w:top w:val="nil"/>
-              <w:left w:val="nil"/>
-              <w:bottom w:val="single" w:sz="12" w:space="0" w:color="000000"/>
-              <w:right w:val="nil"/>
-            </w:tcBorders>
-          </w:tcPr>
-          <w:tcPr/>
-          <w:p>
-            <w:pPr>
-              <w:pStyle w:val="Compact"/>
-            </w:pPr>
-            <w:r>
-              <w:t xml:space="preserve">active_minutes</w:t>
-            </w:r>
-          </w:p>
-        </w:tc>
-        <w:tc>
-          <w:tcPr>
-            <w:tcBorders>
-              <w:top w:val="nil"/>
-              <w:left w:val="nil"/>
-              <w:bottom w:val="single" w:sz="12" w:space="0" w:color="000000"/>
-              <w:right w:val="nil"/>
-            </w:tcBorders>
-          </w:tcPr>
-          <w:tcPr/>
-          <w:p>
-            <w:pPr>
-              <w:pStyle w:val="Compact"/>
-            </w:pPr>
-            <w:r>
-              <w:t xml:space="preserve">hrv_rmssd</w:t>
-            </w:r>
-          </w:p>
-        </w:tc>
-        <w:tc>
-          <w:tcPr>
-            <w:tcBorders>
-              <w:top w:val="nil"/>
-              <w:left w:val="nil"/>
-              <w:bottom w:val="single" w:sz="12" w:space="0" w:color="000000"/>
-              <w:right w:val="nil"/>
-            </w:tcBorders>
-          </w:tcPr>
-          <w:tcPr/>
-          <w:p>
-            <w:pPr>
-              <w:pStyle w:val="Compact"/>
-            </w:pPr>
-            <w:r>
-              <w:t xml:space="preserve">-0.019</w:t>
-            </w:r>
-          </w:p>
-        </w:tc>
-        <w:tc>
-          <w:tcPr>
-            <w:tcBorders>
-              <w:top w:val="nil"/>
-              <w:left w:val="nil"/>
-              <w:bottom w:val="single" w:sz="12" w:space="0" w:color="000000"/>
-              <w:right w:val="nil"/>
-            </w:tcBorders>
-          </w:tcPr>
-          <w:tcPr/>
-          <w:p>
-            <w:pPr>
-              <w:pStyle w:val="Compact"/>
-            </w:pPr>
-            <w:r>
-              <w:rPr>
-                <w:b/>
-                <w:bCs/>
-              </w:rPr>
-              <w:t xml:space="preserve">-0.497</w:t>
-            </w:r>
-          </w:p>
-        </w:tc>
-        <w:tc>
-          <w:tcPr>
-            <w:tcBorders>
-              <w:top w:val="nil"/>
-              <w:left w:val="nil"/>
-              <w:bottom w:val="single" w:sz="12" w:space="0" w:color="000000"/>
-              <w:right w:val="nil"/>
-            </w:tcBorders>
-          </w:tcPr>
-          <w:tcPr/>
-          <w:p>
-            <w:pPr>
-              <w:pStyle w:val="Compact"/>
-            </w:pPr>
-            <w:r>
-              <w:rPr>
-                <w:b/>
-                <w:bCs/>
-              </w:rPr>
-              <w:t xml:space="preserve">[-0.797, -0.137]</w:t>
-            </w:r>
-          </w:p>
-        </w:tc>
-      </w:tr>
-    </w:tbl>
-    <w:p>
-      <w:pPr>
-        <w:pStyle w:val="BodyText"/>
-      </w:pPr>
-      <w:r>
-        <w:t xml:space="preserve">The pattern wearable papers should worry about: screening correlations that mislead about causal direction or magnitude under adjustment. Active minutes → HRV illustrates this cleanly. The screening Pearson r is -0.019 (negligible), but AIPW adjustment under the wearable DAG reveals a significant negative effect (-0.497, CI excludes zero), with clean positivity (Kish effective sample size 98.5%) and an E-value of 2.52 indicating modest robustness to unmeasured confounding (supplement section S2). The audit reports screening and AIPW estimates side by side so that confounded screening results are visible to the reader.</w:t>
-      </w:r>
-    </w:p>
-    <w:p>
-      <w:pPr>
-        <w:pStyle w:val="BodyText"/>
-      </w:pPr>
-      <w:r>
-        <w:t xml:space="preserve">The heat_index → HRV and heat_index → sleep_efficiency rows in Table 13 illustrate the diagnostic in the opposite direction. The framework’s positivity check flags a violation for both heat_index treatments (Kish effective sample size 63%), meaning the propensity-score model produced effective sample sizes too small to support reliable adjusted estimation. The AIPW point estimates for the heat_index treatments are consequently reported with a positivity-violation warning attached to the analysis output and are not interpreted as substantive causal claims. The rows are included in Table 13 to demonstrate that the framework refuses to commit to a causal interpretation when the propensity-score assumption is empirically inadequate, rather than reporting a point estimate with the same authority as the active_minutes case. Positivity and E-value sensitivity output for both treatments is in supplement section S2.</w:t>
-      </w:r>
-    </w:p>
-    <w:bookmarkEnd w:id="56"/>
-    <w:bookmarkStart w:id="57" w:name="learned-trust-score-weights"/>
-    <w:p>
-      <w:pPr>
-        <w:pStyle w:val="Heading3"/>
-      </w:pPr>
-      <w:r>
-        <w:t xml:space="preserve">4.6 Learned trust-score weights</w:t>
-      </w:r>
-    </w:p>
-    <w:p>
-      <w:pPr>
-        <w:pStyle w:val="FirstParagraph"/>
-      </w:pPr>
-      <w:r>
-        <w:t xml:space="preserve">A 6-component weight-simplex search (Dirichlet sampling plus local grid refinement, 360 candidates) returned holdout Spearman ρ = +0.668 (n_holdout = 90) against a week-over-week HRV RMSSD reproducibility target, compared with +0.592 in training (n_train = 210). The learned weights emphasize signal_quality over confounding_risk but remain within the convex hull of plausible weightings; the default weights are within 0.08 Spearman of the optimum, supporting the policy of shipping the defaults and exposing the weights as user-configurable. Full training-vs-holdout breakdown in supplement section S6.</w:t>
-      </w:r>
-    </w:p>
-    <w:bookmarkEnd w:id="57"/>
-    <w:bookmarkStart w:id="61" w:name="cross-cohort-generalization"/>
-    <w:p>
-      <w:pPr>
-        <w:pStyle w:val="Heading3"/>
-      </w:pPr>
-      <w:r>
-        <w:t xml:space="preserve">4.7 Cross-cohort generalization</w:t>
-      </w:r>
-    </w:p>
-    <w:p>
-      <w:pPr>
-        <w:pStyle w:val="FirstParagraph"/>
-      </w:pPr>
-      <w:r>
-        <w:t xml:space="preserve">Across five synthetic regimes (default, strong environment, inverted skin-tone, severe device bias, clean world) and eight qualitative predictions, seven of eight predictions pass (Figure 7, panel C). The one failure is consistent with random variation: in the clean-world regime, small-sample random imbalance produces a non-zero empirical device-B offset despite zero injected bias. The audit responds to cohort parameters in the predicted direction, including the sign-flip on the skin-tone gap when the injected penalty is inverted (Figure 7, panel B). Full per-regime table in supplement Table S2.</w:t>
-      </w:r>
-    </w:p>
-    <w:p>
-      <w:pPr>
-        <w:pStyle w:val="CaptionedFigure"/>
-      </w:pPr>
-      <w:r>
-        <w:drawing>
-          <wp:inline>
-            <wp:extent cx="5334000" cy="1751128"/>
-            <wp:effectExtent b="0" l="0" r="0" t="0"/>
-            <wp:docPr descr="Figure 7. Cross-cohort parameter-sweep validation across five synthetic regimes (default, strong environment, inverted skin-tone, severe device bias, clean world). Seven of eight qualitative predictions pass. The sign-flip on the skin-tone gap under the inverted-penalty regime confirms that the audit responds to cohort parameters rather than to fixed generator values." title="" id="59" name="Picture"/>
-            <a:graphic>
-              <a:graphicData uri="http://schemas.openxmlformats.org/drawingml/2006/picture">
-                <pic:pic>
-                  <pic:nvPicPr>
-                    <pic:cNvPr descr="paper/figures/fig3_cross_cohort.png" id="60" name="Picture"/>
-                    <pic:cNvPicPr>
-                      <a:picLocks noChangeArrowheads="1" noChangeAspect="1"/>
-                    </pic:cNvPicPr>
-                  </pic:nvPicPr>
-                  <pic:blipFill>
-                    <a:blip r:embed="rId58"/>
-                    <a:stretch>
-                      <a:fillRect/>
-                    </a:stretch>
-                  </pic:blipFill>
-                  <pic:spPr bwMode="auto">
-                    <a:xfrm>
-                      <a:off x="0" y="0"/>
-                      <a:ext cx="5334000" cy="1751128"/>
-                    </a:xfrm>
-                    <a:prstGeom prst="rect">
-                      <a:avLst/>
-                    </a:prstGeom>
-                    <a:noFill/>
-                    <a:ln w="9525">
-                      <a:noFill/>
-                      <a:headEnd/>
-                      <a:tailEnd/>
-                    </a:ln>
-                  </pic:spPr>
-                </pic:pic>
-              </a:graphicData>
-            </a:graphic>
-          </wp:inline>
-        </w:drawing>
-      </w:r>
-    </w:p>
-    <w:p>
-      <w:pPr>
-        <w:pStyle w:val="ImageCaption"/>
-      </w:pPr>
-      <w:r>
-        <w:t xml:space="preserve">Figure 7. Cross-cohort parameter-sweep validation across five synthetic regimes (default, strong environment, inverted skin-tone, severe device bias, clean world). Seven of eight qualitative predictions pass. The sign-flip on the skin-tone gap under the inverted-penalty regime confirms that the audit responds to cohort parameters rather than to fixed generator values.</w:t>
-      </w:r>
-    </w:p>
-    <w:bookmarkEnd w:id="61"/>
-    <w:bookmarkEnd w:id="62"/>
-    <w:bookmarkStart w:id="66" w:name="discussion"/>
+        <w:t xml:space="preserve">The pipeline components that WESAD and PPG-DaLiA cannot exercise, the reliability primitives, the Digital Biomarker Trust Score, the AIPW-adjusted confounding analysis, and the stratified fairness audit, are validated on a 300-participant 60-day synthetic cohort with documented injected failure modes (cohort and generator described in Section 2.2). These analyses recover the injected effects (for example device-family and skin-tone signal-quality gaps, and an AIPW-adjusted active-minutes effect on HRV that a screening correlation misses) and characterise the components for follow-up studies on longitudinal datasets. They do not bear on the empirical findings in Section 3. The full results, tables, and figures are in supplement Section S10.</w:t>
+      </w:r>
+    </w:p>
+    <w:bookmarkEnd w:id="49"/>
+    <w:bookmarkStart w:id="53" w:name="discussion"/>
     <w:p>
       <w:pPr>
         <w:pStyle w:val="Heading2"/>
@@ -8646,7 +7017,7 @@
         <w:t xml:space="preserve">5. Discussion</w:t>
       </w:r>
     </w:p>
-    <w:bookmarkStart w:id="63" w:name="principal-findings"/>
+    <w:bookmarkStart w:id="50" w:name="principal-findings"/>
     <w:p>
       <w:pPr>
         <w:pStyle w:val="Heading3"/>
@@ -8726,8 +7097,8 @@
         <w:t xml:space="preserve">Mean |HR_PPG - HR_ECG| during stress ranges from 6.75 bpm (S15) to 26.02 bpm (S11), a four-fold spread across 15 subjects. The direction of the per-state quality change also varies (most subjects’ PPG SQI drops during stress; S15’s rises). Any conclusion from pooled WESAD wrist-PPG analysis is at risk of being driven by a small number of subjects. Restricting downstream models to Orphanidou-passing windows improves per-subject wrist-PPG-to-chest-ECG HR correlation by a median of +0.110 (13 of 15 subjects improved, paired Wilcoxon p = 1.5e-04), with the largest gains in subjects whose unfiltered correlation was modest (S10: 0.65 → 0.78, S9: 0.47 → 0.76).</w:t>
       </w:r>
     </w:p>
-    <w:bookmarkEnd w:id="63"/>
-    <w:bookmarkStart w:id="64" w:name="relation-to-prior-work"/>
+    <w:bookmarkEnd w:id="50"/>
+    <w:bookmarkStart w:id="51" w:name="relation-to-prior-work"/>
     <w:p>
       <w:pPr>
         <w:pStyle w:val="Heading3"/>
@@ -8782,8 +7153,8 @@
         <w:t xml:space="preserve">, which focuses on feature engineering and aggregation rather than auditing. Our framework can be combined with FLIRT rather than replacing it: FLIRT produces the features; our pipeline checks whether those features are reliable enough to model.</w:t>
       </w:r>
     </w:p>
-    <w:bookmarkEnd w:id="64"/>
-    <w:bookmarkStart w:id="65" w:name="limitations"/>
+    <w:bookmarkEnd w:id="51"/>
+    <w:bookmarkStart w:id="52" w:name="limitations"/>
     <w:p>
       <w:pPr>
         <w:pStyle w:val="Heading3"/>
@@ -8949,7 +7320,7 @@
         <w:t xml:space="preserve"> </w:t>
       </w:r>
       <w:r>
-        <w:t xml:space="preserve">(supplement S2.5). The synthetic cohort gives test-retest r = +0.977 for resting HR on week-mean pairs (Section 4.2). On real WESAD baseline segments, the split-half Pearson r between first-half and second-half of per-window HR is +0.078 (S2) and +0.112 (S3), with within-subject CV of 6.7-9.1%. These two statistics measure different things (week-aggregated reliability vs 5-second-window within-session correlation) and the synthetic numbers should not be read as predicting the real-data per-window numbers. The framework’s recommended HR reliability statistic for clinical claims is the bootstrap week-pair test-retest of a daily aggregate, which requires longitudinal data we cannot validate on WESAD.</w:t>
+        <w:t xml:space="preserve">(supplement S2.5). The synthetic cohort gives test-retest r = +0.977 for resting HR on week-mean pairs (supplement Section S10.2). On real WESAD baseline segments, the split-half Pearson r between first-half and second-half of per-window HR is +0.078 (S2) and +0.112 (S3), with within-subject CV of 6.7-9.1%. These two statistics measure different things (week-aggregated reliability vs 5-second-window within-session correlation) and the synthetic numbers should not be read as predicting the real-data per-window numbers. The framework’s recommended HR reliability statistic for clinical claims is the bootstrap week-pair test-retest of a daily aggregate, which requires longitudinal data we cannot validate on WESAD.</w:t>
       </w:r>
     </w:p>
     <w:p>
@@ -9015,7 +7386,7 @@
         <w:t xml:space="preserve"> </w:t>
       </w:r>
       <w:r>
-        <w:t xml:space="preserve">axis, which is not the canonical between-rater-on-same-subject form of ICC. We report it alongside the proper bootstrap week-pair test-retest (Section 4.3, Supplementary Table S1), not in place of it; both metrics rank biomarkers consistently on the synthetic cohort, with ICC uniformly more conservative because it treats within-week day-to-day variance as rater disagreement. Practitioners reporting ICC days-as-raters in the wearable-reliability literature can use either metric for ordinal comparisons.</w:t>
+        <w:t xml:space="preserve">axis, which is not the canonical between-rater-on-same-subject form of ICC. We report it alongside the proper bootstrap week-pair test-retest (supplement Section S10.3, Table S1), not in place of it; both metrics rank biomarkers consistently on the synthetic cohort, with ICC uniformly more conservative because it treats within-week day-to-day variance as rater disagreement. Practitioners reporting ICC days-as-raters in the wearable-reliability literature can use either metric for ordinal comparisons.</w:t>
       </w:r>
     </w:p>
     <w:p>
@@ -9072,9 +7443,9 @@
         <w:t xml:space="preserve">This is a methodology paper rather than a clinical validation study. The recommendations in Section 6 are aimed at the wearable-AI research community (multi-baseline SQI auditing as standard supplementary material in wearable-AI publications) and do not constitute clinical guidance. Translation of any cross-method-audit recommendation into patient-facing clinical practice would require prospective clinical validation with relevant device experience; the synthetic-cohort validation in Section 4 and the WESAD/PPG-DaLiA empirical study in Section 3 are methodological contributions rather than clinical findings.</w:t>
       </w:r>
     </w:p>
-    <w:bookmarkEnd w:id="65"/>
-    <w:bookmarkEnd w:id="66"/>
-    <w:bookmarkStart w:id="67" w:name="conclusions"/>
+    <w:bookmarkEnd w:id="52"/>
+    <w:bookmarkEnd w:id="53"/>
+    <w:bookmarkStart w:id="54" w:name="conclusions"/>
     <w:p>
       <w:pPr>
         <w:pStyle w:val="Heading2"/>
@@ -9114,8 +7485,8 @@
         <w:t xml:space="preserve">(MIT licensed) and runs end-to-end from a fixed seed in approximately three minutes on a modern laptop CPU.</w:t>
       </w:r>
     </w:p>
-    <w:bookmarkEnd w:id="67"/>
-    <w:bookmarkStart w:id="68" w:name="code-and-data-availability"/>
+    <w:bookmarkEnd w:id="54"/>
+    <w:bookmarkStart w:id="55" w:name="code-and-data-availability"/>
     <w:p>
       <w:pPr>
         <w:pStyle w:val="Heading2"/>
@@ -9150,8 +7521,8 @@
         <w:t xml:space="preserve">, also publicly available from the UCI Machine Learning Repository. Both are released without restrictions for research use.</w:t>
       </w:r>
     </w:p>
-    <w:bookmarkEnd w:id="68"/>
-    <w:bookmarkStart w:id="69" w:name="author-contributions"/>
+    <w:bookmarkEnd w:id="55"/>
+    <w:bookmarkStart w:id="56" w:name="author-contributions"/>
     <w:p>
       <w:pPr>
         <w:pStyle w:val="Heading2"/>
@@ -9168,8 +7539,8 @@
         <w:t xml:space="preserve">Ceyhun Olcan: Conceptualization, Data curation, Formal analysis, Investigation, Methodology, Software, Validation, Visualization, Writing - original draft, Writing - review and editing. Mehmet Ozberk Olcan: Writing - original draft, Writing - review and editing. Seckin Olcan: Writing - original draft, Writing - review and editing.</w:t>
       </w:r>
     </w:p>
-    <w:bookmarkEnd w:id="69"/>
-    <w:bookmarkStart w:id="70" w:name="funding"/>
+    <w:bookmarkEnd w:id="56"/>
+    <w:bookmarkStart w:id="57" w:name="funding"/>
     <w:p>
       <w:pPr>
         <w:pStyle w:val="Heading2"/>
@@ -9186,8 +7557,8 @@
         <w:t xml:space="preserve">No external funding supported this work.</w:t>
       </w:r>
     </w:p>
-    <w:bookmarkEnd w:id="70"/>
-    <w:bookmarkStart w:id="71" w:name="ethics-statement"/>
+    <w:bookmarkEnd w:id="57"/>
+    <w:bookmarkStart w:id="58" w:name="ethics-statement"/>
     <w:p>
       <w:pPr>
         <w:pStyle w:val="Heading2"/>
@@ -9225,8 +7596,8 @@
         <w:t xml:space="preserve">, released under terms permitting research use. No new human-subjects data were collected; institutional review board approval was therefore not required for this work.</w:t>
       </w:r>
     </w:p>
-    <w:bookmarkEnd w:id="71"/>
-    <w:bookmarkStart w:id="72" w:name="competing-interests"/>
+    <w:bookmarkEnd w:id="58"/>
+    <w:bookmarkStart w:id="59" w:name="competing-interests"/>
     <w:p>
       <w:pPr>
         <w:pStyle w:val="Heading2"/>
@@ -9243,8 +7614,8 @@
         <w:t xml:space="preserve">The authors declare no competing interests.</w:t>
       </w:r>
     </w:p>
-    <w:bookmarkEnd w:id="72"/>
-    <w:bookmarkStart w:id="128" w:name="references"/>
+    <w:bookmarkEnd w:id="59"/>
+    <w:bookmarkStart w:id="115" w:name="references"/>
     <w:p>
       <w:pPr>
         <w:pStyle w:val="Heading2"/>
@@ -9253,8 +7624,8 @@
         <w:t xml:space="preserve">References</w:t>
       </w:r>
     </w:p>
-    <w:bookmarkStart w:id="127" w:name="refs"/>
-    <w:bookmarkStart w:id="74" w:name="ref-allen2007"/>
+    <w:bookmarkStart w:id="114" w:name="refs"/>
+    <w:bookmarkStart w:id="61" w:name="ref-allen2007"/>
     <w:p>
       <w:pPr>
         <w:pStyle w:val="Bibliography"/>
@@ -9287,7 +7658,7 @@
       <w:r>
         <w:t xml:space="preserve"> </w:t>
       </w:r>
-      <w:hyperlink r:id="rId73">
+      <w:hyperlink r:id="rId60">
         <w:r>
           <w:rPr>
             <w:rStyle w:val="Hyperlink"/>
@@ -9299,8 +7670,8 @@
         <w:t xml:space="preserve">.</w:t>
       </w:r>
     </w:p>
-    <w:bookmarkEnd w:id="74"/>
-    <w:bookmarkStart w:id="76" w:name="ref-bent2020"/>
+    <w:bookmarkEnd w:id="61"/>
+    <w:bookmarkStart w:id="63" w:name="ref-bent2020"/>
     <w:p>
       <w:pPr>
         <w:pStyle w:val="Bibliography"/>
@@ -9333,7 +7704,7 @@
       <w:r>
         <w:t xml:space="preserve"> </w:t>
       </w:r>
-      <w:hyperlink r:id="rId75">
+      <w:hyperlink r:id="rId62">
         <w:r>
           <w:rPr>
             <w:rStyle w:val="Hyperlink"/>
@@ -9345,8 +7716,8 @@
         <w:t xml:space="preserve">.</w:t>
       </w:r>
     </w:p>
-    <w:bookmarkEnd w:id="76"/>
-    <w:bookmarkStart w:id="78" w:name="ref-bland1986"/>
+    <w:bookmarkEnd w:id="63"/>
+    <w:bookmarkStart w:id="65" w:name="ref-bland1986"/>
     <w:p>
       <w:pPr>
         <w:pStyle w:val="Bibliography"/>
@@ -9379,7 +7750,7 @@
       <w:r>
         <w:t xml:space="preserve"> </w:t>
       </w:r>
-      <w:hyperlink r:id="rId77">
+      <w:hyperlink r:id="rId64">
         <w:r>
           <w:rPr>
             <w:rStyle w:val="Hyperlink"/>
@@ -9391,8 +7762,8 @@
         <w:t xml:space="preserve">.</w:t>
       </w:r>
     </w:p>
-    <w:bookmarkEnd w:id="78"/>
-    <w:bookmarkStart w:id="80" w:name="ref-bossuyt2015stard"/>
+    <w:bookmarkEnd w:id="65"/>
+    <w:bookmarkStart w:id="67" w:name="ref-bossuyt2015stard"/>
     <w:p>
       <w:pPr>
         <w:pStyle w:val="Bibliography"/>
@@ -9437,7 +7808,7 @@
       <w:r>
         <w:t xml:space="preserve"> </w:t>
       </w:r>
-      <w:hyperlink r:id="rId79">
+      <w:hyperlink r:id="rId66">
         <w:r>
           <w:rPr>
             <w:rStyle w:val="Hyperlink"/>
@@ -9449,8 +7820,8 @@
         <w:t xml:space="preserve">.</w:t>
       </w:r>
     </w:p>
-    <w:bookmarkEnd w:id="80"/>
-    <w:bookmarkStart w:id="82" w:name="ref-cliff1993"/>
+    <w:bookmarkEnd w:id="67"/>
+    <w:bookmarkStart w:id="69" w:name="ref-cliff1993"/>
     <w:p>
       <w:pPr>
         <w:pStyle w:val="Bibliography"/>
@@ -9483,7 +7854,7 @@
       <w:r>
         <w:t xml:space="preserve"> </w:t>
       </w:r>
-      <w:hyperlink r:id="rId81">
+      <w:hyperlink r:id="rId68">
         <w:r>
           <w:rPr>
             <w:rStyle w:val="Hyperlink"/>
@@ -9495,8 +7866,8 @@
         <w:t xml:space="preserve">.</w:t>
       </w:r>
     </w:p>
-    <w:bookmarkEnd w:id="82"/>
-    <w:bookmarkStart w:id="84" w:name="ref-clifford2012"/>
+    <w:bookmarkEnd w:id="69"/>
+    <w:bookmarkStart w:id="71" w:name="ref-clifford2012"/>
     <w:p>
       <w:pPr>
         <w:pStyle w:val="Bibliography"/>
@@ -9529,7 +7900,7 @@
       <w:r>
         <w:t xml:space="preserve"> </w:t>
       </w:r>
-      <w:hyperlink r:id="rId83">
+      <w:hyperlink r:id="rId70">
         <w:r>
           <w:rPr>
             <w:rStyle w:val="Hyperlink"/>
@@ -9541,8 +7912,8 @@
         <w:t xml:space="preserve">.</w:t>
       </w:r>
     </w:p>
-    <w:bookmarkEnd w:id="84"/>
-    <w:bookmarkStart w:id="85" w:name="ref-cohen1988"/>
+    <w:bookmarkEnd w:id="71"/>
+    <w:bookmarkStart w:id="72" w:name="ref-cohen1988"/>
     <w:p>
       <w:pPr>
         <w:pStyle w:val="Bibliography"/>
@@ -9564,8 +7935,8 @@
         <w:t xml:space="preserve">. 2nd ed. Lawrence Erlbaum Associates.</w:t>
       </w:r>
     </w:p>
-    <w:bookmarkEnd w:id="85"/>
-    <w:bookmarkStart w:id="87" w:name="ref-collins2024tripodai"/>
+    <w:bookmarkEnd w:id="72"/>
+    <w:bookmarkStart w:id="74" w:name="ref-collins2024tripodai"/>
     <w:p>
       <w:pPr>
         <w:pStyle w:val="Bibliography"/>
@@ -9616,7 +7987,7 @@
       <w:r>
         <w:t xml:space="preserve"> </w:t>
       </w:r>
-      <w:hyperlink r:id="rId86">
+      <w:hyperlink r:id="rId73">
         <w:r>
           <w:rPr>
             <w:rStyle w:val="Hyperlink"/>
@@ -9628,8 +7999,8 @@
         <w:t xml:space="preserve">.</w:t>
       </w:r>
     </w:p>
-    <w:bookmarkEnd w:id="87"/>
-    <w:bookmarkStart w:id="88" w:name="ref-efron1993"/>
+    <w:bookmarkEnd w:id="74"/>
+    <w:bookmarkStart w:id="75" w:name="ref-efron1993"/>
     <w:p>
       <w:pPr>
         <w:pStyle w:val="Bibliography"/>
@@ -9651,8 +8022,8 @@
         <w:t xml:space="preserve">. Chapman &amp; Hall/CRC.</w:t>
       </w:r>
     </w:p>
-    <w:bookmarkEnd w:id="88"/>
-    <w:bookmarkStart w:id="90" w:name="ref-elgendi2016"/>
+    <w:bookmarkEnd w:id="75"/>
+    <w:bookmarkStart w:id="77" w:name="ref-elgendi2016"/>
     <w:p>
       <w:pPr>
         <w:pStyle w:val="Bibliography"/>
@@ -9685,7 +8056,7 @@
       <w:r>
         <w:t xml:space="preserve"> </w:t>
       </w:r>
-      <w:hyperlink r:id="rId89">
+      <w:hyperlink r:id="rId76">
         <w:r>
           <w:rPr>
             <w:rStyle w:val="Hyperlink"/>
@@ -9697,8 +8068,8 @@
         <w:t xml:space="preserve">.</w:t>
       </w:r>
     </w:p>
-    <w:bookmarkEnd w:id="90"/>
-    <w:bookmarkStart w:id="92" w:name="ref-foll2021"/>
+    <w:bookmarkEnd w:id="77"/>
+    <w:bookmarkStart w:id="79" w:name="ref-foll2021"/>
     <w:p>
       <w:pPr>
         <w:pStyle w:val="Bibliography"/>
@@ -9737,7 +8108,7 @@
       <w:r>
         <w:t xml:space="preserve"> </w:t>
       </w:r>
-      <w:hyperlink r:id="rId91">
+      <w:hyperlink r:id="rId78">
         <w:r>
           <w:rPr>
             <w:rStyle w:val="Hyperlink"/>
@@ -9749,8 +8120,8 @@
         <w:t xml:space="preserve">.</w:t>
       </w:r>
     </w:p>
-    <w:bookmarkEnd w:id="92"/>
-    <w:bookmarkStart w:id="94" w:name="ref-liu2020consortai"/>
+    <w:bookmarkEnd w:id="79"/>
+    <w:bookmarkStart w:id="81" w:name="ref-liu2020consortai"/>
     <w:p>
       <w:pPr>
         <w:pStyle w:val="Bibliography"/>
@@ -9795,7 +8166,7 @@
       <w:r>
         <w:t xml:space="preserve"> </w:t>
       </w:r>
-      <w:hyperlink r:id="rId93">
+      <w:hyperlink r:id="rId80">
         <w:r>
           <w:rPr>
             <w:rStyle w:val="Hyperlink"/>
@@ -9807,8 +8178,8 @@
         <w:t xml:space="preserve">.</w:t>
       </w:r>
     </w:p>
-    <w:bookmarkEnd w:id="94"/>
-    <w:bookmarkStart w:id="96" w:name="ref-malik1996"/>
+    <w:bookmarkEnd w:id="81"/>
+    <w:bookmarkStart w:id="83" w:name="ref-malik1996"/>
     <w:p>
       <w:pPr>
         <w:pStyle w:val="Bibliography"/>
@@ -9874,7 +8245,7 @@
       <w:r>
         <w:t xml:space="preserve"> </w:t>
       </w:r>
-      <w:hyperlink r:id="rId95">
+      <w:hyperlink r:id="rId82">
         <w:r>
           <w:rPr>
             <w:rStyle w:val="Hyperlink"/>
@@ -9886,8 +8257,8 @@
         <w:t xml:space="preserve">.</w:t>
       </w:r>
     </w:p>
-    <w:bookmarkEnd w:id="96"/>
-    <w:bookmarkStart w:id="98" w:name="ref-mclean2023sliding"/>
+    <w:bookmarkEnd w:id="83"/>
+    <w:bookmarkStart w:id="85" w:name="ref-mclean2023sliding"/>
     <w:p>
       <w:pPr>
         <w:pStyle w:val="Bibliography"/>
@@ -9920,7 +8291,7 @@
       <w:r>
         <w:t xml:space="preserve"> </w:t>
       </w:r>
-      <w:hyperlink r:id="rId97">
+      <w:hyperlink r:id="rId84">
         <w:r>
           <w:rPr>
             <w:rStyle w:val="Hyperlink"/>
@@ -9932,8 +8303,8 @@
         <w:t xml:space="preserve">.</w:t>
       </w:r>
     </w:p>
-    <w:bookmarkEnd w:id="98"/>
-    <w:bookmarkStart w:id="100" w:name="ref-charlton2021ppgproc"/>
+    <w:bookmarkEnd w:id="85"/>
+    <w:bookmarkStart w:id="87" w:name="ref-charlton2021ppgproc"/>
     <w:p>
       <w:pPr>
         <w:pStyle w:val="Bibliography"/>
@@ -9969,7 +8340,7 @@
       <w:r>
         <w:t xml:space="preserve"> </w:t>
       </w:r>
-      <w:hyperlink r:id="rId99">
+      <w:hyperlink r:id="rId86">
         <w:r>
           <w:rPr>
             <w:rStyle w:val="Hyperlink"/>
@@ -9981,8 +8352,8 @@
         <w:t xml:space="preserve">.</w:t>
       </w:r>
     </w:p>
-    <w:bookmarkEnd w:id="100"/>
-    <w:bookmarkStart w:id="102" w:name="ref-obermeyer2019"/>
+    <w:bookmarkEnd w:id="87"/>
+    <w:bookmarkStart w:id="89" w:name="ref-obermeyer2019"/>
     <w:p>
       <w:pPr>
         <w:pStyle w:val="Bibliography"/>
@@ -10015,7 +8386,7 @@
       <w:r>
         <w:t xml:space="preserve"> </w:t>
       </w:r>
-      <w:hyperlink r:id="rId101">
+      <w:hyperlink r:id="rId88">
         <w:r>
           <w:rPr>
             <w:rStyle w:val="Hyperlink"/>
@@ -10027,8 +8398,8 @@
         <w:t xml:space="preserve">.</w:t>
       </w:r>
     </w:p>
-    <w:bookmarkEnd w:id="102"/>
-    <w:bookmarkStart w:id="104" w:name="ref-orphanidou2015"/>
+    <w:bookmarkEnd w:id="89"/>
+    <w:bookmarkStart w:id="91" w:name="ref-orphanidou2015"/>
     <w:p>
       <w:pPr>
         <w:pStyle w:val="Bibliography"/>
@@ -10061,7 +8432,7 @@
       <w:r>
         <w:t xml:space="preserve"> </w:t>
       </w:r>
-      <w:hyperlink r:id="rId103">
+      <w:hyperlink r:id="rId90">
         <w:r>
           <w:rPr>
             <w:rStyle w:val="Hyperlink"/>
@@ -10073,8 +8444,8 @@
         <w:t xml:space="preserve">.</w:t>
       </w:r>
     </w:p>
-    <w:bookmarkEnd w:id="104"/>
-    <w:bookmarkStart w:id="106" w:name="ref-reiss2019"/>
+    <w:bookmarkEnd w:id="91"/>
+    <w:bookmarkStart w:id="93" w:name="ref-reiss2019"/>
     <w:p>
       <w:pPr>
         <w:pStyle w:val="Bibliography"/>
@@ -10113,7 +8484,7 @@
       <w:r>
         <w:t xml:space="preserve"> </w:t>
       </w:r>
-      <w:hyperlink r:id="rId105">
+      <w:hyperlink r:id="rId92">
         <w:r>
           <w:rPr>
             <w:rStyle w:val="Hyperlink"/>
@@ -10125,8 +8496,8 @@
         <w:t xml:space="preserve">.</w:t>
       </w:r>
     </w:p>
-    <w:bookmarkEnd w:id="106"/>
-    <w:bookmarkStart w:id="108" w:name="ref-robins1994"/>
+    <w:bookmarkEnd w:id="93"/>
+    <w:bookmarkStart w:id="95" w:name="ref-robins1994"/>
     <w:p>
       <w:pPr>
         <w:pStyle w:val="Bibliography"/>
@@ -10159,7 +8530,7 @@
       <w:r>
         <w:t xml:space="preserve"> </w:t>
       </w:r>
-      <w:hyperlink r:id="rId107">
+      <w:hyperlink r:id="rId94">
         <w:r>
           <w:rPr>
             <w:rStyle w:val="Hyperlink"/>
@@ -10171,8 +8542,8 @@
         <w:t xml:space="preserve">.</w:t>
       </w:r>
     </w:p>
-    <w:bookmarkEnd w:id="108"/>
-    <w:bookmarkStart w:id="110" w:name="ref-schafer2013"/>
+    <w:bookmarkEnd w:id="95"/>
+    <w:bookmarkStart w:id="97" w:name="ref-schafer2013"/>
     <w:p>
       <w:pPr>
         <w:pStyle w:val="Bibliography"/>
@@ -10205,7 +8576,7 @@
       <w:r>
         <w:t xml:space="preserve"> </w:t>
       </w:r>
-      <w:hyperlink r:id="rId109">
+      <w:hyperlink r:id="rId96">
         <w:r>
           <w:rPr>
             <w:rStyle w:val="Hyperlink"/>
@@ -10217,8 +8588,8 @@
         <w:t xml:space="preserve">.</w:t>
       </w:r>
     </w:p>
-    <w:bookmarkEnd w:id="110"/>
-    <w:bookmarkStart w:id="112" w:name="ref-schmidt2018"/>
+    <w:bookmarkEnd w:id="97"/>
+    <w:bookmarkStart w:id="99" w:name="ref-schmidt2018"/>
     <w:p>
       <w:pPr>
         <w:pStyle w:val="Bibliography"/>
@@ -10257,7 +8628,7 @@
       <w:r>
         <w:t xml:space="preserve"> </w:t>
       </w:r>
-      <w:hyperlink r:id="rId111">
+      <w:hyperlink r:id="rId98">
         <w:r>
           <w:rPr>
             <w:rStyle w:val="Hyperlink"/>
@@ -10269,8 +8640,8 @@
         <w:t xml:space="preserve">.</w:t>
       </w:r>
     </w:p>
-    <w:bookmarkEnd w:id="112"/>
-    <w:bookmarkStart w:id="114" w:name="ref-shcherbina2017"/>
+    <w:bookmarkEnd w:id="99"/>
+    <w:bookmarkStart w:id="101" w:name="ref-shcherbina2017"/>
     <w:p>
       <w:pPr>
         <w:pStyle w:val="Bibliography"/>
@@ -10303,7 +8674,7 @@
       <w:r>
         <w:t xml:space="preserve"> </w:t>
       </w:r>
-      <w:hyperlink r:id="rId113">
+      <w:hyperlink r:id="rId100">
         <w:r>
           <w:rPr>
             <w:rStyle w:val="Hyperlink"/>
@@ -10315,8 +8686,8 @@
         <w:t xml:space="preserve">.</w:t>
       </w:r>
     </w:p>
-    <w:bookmarkEnd w:id="114"/>
-    <w:bookmarkStart w:id="116" w:name="ref-shrout1979"/>
+    <w:bookmarkEnd w:id="101"/>
+    <w:bookmarkStart w:id="103" w:name="ref-shrout1979"/>
     <w:p>
       <w:pPr>
         <w:pStyle w:val="Bibliography"/>
@@ -10349,7 +8720,7 @@
       <w:r>
         <w:t xml:space="preserve"> </w:t>
       </w:r>
-      <w:hyperlink r:id="rId115">
+      <w:hyperlink r:id="rId102">
         <w:r>
           <w:rPr>
             <w:rStyle w:val="Hyperlink"/>
@@ -10361,8 +8732,8 @@
         <w:t xml:space="preserve">.</w:t>
       </w:r>
     </w:p>
-    <w:bookmarkEnd w:id="116"/>
-    <w:bookmarkStart w:id="118" w:name="ref-sjoding2020"/>
+    <w:bookmarkEnd w:id="103"/>
+    <w:bookmarkStart w:id="105" w:name="ref-sjoding2020"/>
     <w:p>
       <w:pPr>
         <w:pStyle w:val="Bibliography"/>
@@ -10395,7 +8766,7 @@
       <w:r>
         <w:t xml:space="preserve"> </w:t>
       </w:r>
-      <w:hyperlink r:id="rId117">
+      <w:hyperlink r:id="rId104">
         <w:r>
           <w:rPr>
             <w:rStyle w:val="Hyperlink"/>
@@ -10407,8 +8778,8 @@
         <w:t xml:space="preserve">.</w:t>
       </w:r>
     </w:p>
-    <w:bookmarkEnd w:id="118"/>
-    <w:bookmarkStart w:id="120" w:name="ref-sukor2011"/>
+    <w:bookmarkEnd w:id="105"/>
+    <w:bookmarkStart w:id="107" w:name="ref-sukor2011"/>
     <w:p>
       <w:pPr>
         <w:pStyle w:val="Bibliography"/>
@@ -10441,7 +8812,7 @@
       <w:r>
         <w:t xml:space="preserve"> </w:t>
       </w:r>
-      <w:hyperlink r:id="rId119">
+      <w:hyperlink r:id="rId106">
         <w:r>
           <w:rPr>
             <w:rStyle w:val="Hyperlink"/>
@@ -10453,8 +8824,8 @@
         <w:t xml:space="preserve">.</w:t>
       </w:r>
     </w:p>
-    <w:bookmarkEnd w:id="120"/>
-    <w:bookmarkStart w:id="122" w:name="ref-vasey2022decideai"/>
+    <w:bookmarkEnd w:id="107"/>
+    <w:bookmarkStart w:id="109" w:name="ref-vasey2022decideai"/>
     <w:p>
       <w:pPr>
         <w:pStyle w:val="Bibliography"/>
@@ -10499,7 +8870,7 @@
       <w:r>
         <w:t xml:space="preserve"> </w:t>
       </w:r>
-      <w:hyperlink r:id="rId121">
+      <w:hyperlink r:id="rId108">
         <w:r>
           <w:rPr>
             <w:rStyle w:val="Hyperlink"/>
@@ -10511,8 +8882,8 @@
         <w:t xml:space="preserve">.</w:t>
       </w:r>
     </w:p>
-    <w:bookmarkEnd w:id="122"/>
-    <w:bookmarkStart w:id="124" w:name="ref-vyas2020"/>
+    <w:bookmarkEnd w:id="109"/>
+    <w:bookmarkStart w:id="111" w:name="ref-vyas2020"/>
     <w:p>
       <w:pPr>
         <w:pStyle w:val="Bibliography"/>
@@ -10545,7 +8916,7 @@
       <w:r>
         <w:t xml:space="preserve"> </w:t>
       </w:r>
-      <w:hyperlink r:id="rId123">
+      <w:hyperlink r:id="rId110">
         <w:r>
           <w:rPr>
             <w:rStyle w:val="Hyperlink"/>
@@ -10557,8 +8928,8 @@
         <w:t xml:space="preserve">.</w:t>
       </w:r>
     </w:p>
-    <w:bookmarkEnd w:id="124"/>
-    <w:bookmarkStart w:id="126" w:name="ref-wilcoxon1945"/>
+    <w:bookmarkEnd w:id="111"/>
+    <w:bookmarkStart w:id="113" w:name="ref-wilcoxon1945"/>
     <w:p>
       <w:pPr>
         <w:pStyle w:val="Bibliography"/>
@@ -10591,7 +8962,7 @@
       <w:r>
         <w:t xml:space="preserve"> </w:t>
       </w:r>
-      <w:hyperlink r:id="rId125">
+      <w:hyperlink r:id="rId112">
         <w:r>
           <w:rPr>
             <w:rStyle w:val="Hyperlink"/>
@@ -10603,10 +8974,10 @@
         <w:t xml:space="preserve">.</w:t>
       </w:r>
     </w:p>
-    <w:bookmarkEnd w:id="126"/>
-    <w:bookmarkEnd w:id="127"/>
-    <w:bookmarkEnd w:id="128"/>
-    <w:bookmarkStart w:id="129" w:name="supplementary-materials"/>
+    <w:bookmarkEnd w:id="113"/>
+    <w:bookmarkEnd w:id="114"/>
+    <w:bookmarkEnd w:id="115"/>
+    <w:bookmarkStart w:id="116" w:name="supplementary-materials"/>
     <w:p>
       <w:pPr>
         <w:pStyle w:val="Heading2"/>
@@ -10750,8 +9121,8 @@
         <w:t xml:space="preserve">: full release history of the toolkit.</w:t>
       </w:r>
     </w:p>
-    <w:bookmarkEnd w:id="129"/>
-    <w:bookmarkEnd w:id="130"/>
+    <w:bookmarkEnd w:id="116"/>
+    <w:bookmarkEnd w:id="117"/>
     <w:sectPr>
       <w:footnotePr>
         <w:numRestart w:val="eachSect"/>

</xml_diff>

<commit_message>
Session 5: claims and writing pass. Correct the abstract Results to report the in-house threshold as the lone outlier with negative Gwet's AC1 rather than uncorrelated, consistent with Section 3.3; narrow an over-generalised in-house claim in the abstract Conclusions to the single tested threshold; rewrite the Section 5.2 headline to drop the degenerate kappa and the miscount of baselines
</commit_message>
<xml_diff>
--- a/paper/manuscript.docx
+++ b/paper/manuscript.docx
@@ -273,7 +273,7 @@
         <w:t xml:space="preserve"> </w:t>
       </w:r>
       <w:r>
-        <w:t xml:space="preserve">The three published methods agreed with each other (median Gwet’s AC1 = +0.32, mean raw agreement 63%; Cohen’s κ was negative on two of three pairs, a prevalence paradox from their shared 74 to 78% rejection rate) and converged on rejecting 44.6% of windows that the in-house threshold accepted, three methods testing three different physical properties of pulse waveforms, three concordant rejections. The in-house SQI was uncorrelated with any published baseline (κ = 0.000 against each). Single-threshold recalibration at n = 15 did not recover agreement (Δκ = 0.000; AUROC for in-house SQI predicting Orphanidou pass/fail = 0.484). Per-subject heterogeneity in wrist-PPG-to-chest-ECG HR disagreement spanned 6.75 to 26.02 bpm during the stress condition, a four-fold range across subjects. Restricting downstream models to Orphanidou-passing windows improved per-subject HR correlation by a median of +0.110 (13 of 15 subjects improved, paired Wilcoxon p = 1.5e-04), an improvement absent under matched random window retention and specific to the timing-based SQIs. The finding replicated on PPG-DaLiA</w:t>
+        <w:t xml:space="preserve">The three published methods agreed with each other (median Gwet’s AC1 = +0.32, mean raw agreement 63%; Cohen’s κ was negative on two of three pairs, a prevalence paradox from their shared 74 to 78% rejection rate) and converged on rejecting 44.6% of windows that the in-house threshold accepted, with each method testing a different physical property of the pulse waveform. The in-house threshold was the lone outlier, in negative chance-corrected agreement with every published method (Gwet’s AC1 -0.40 to -0.50); its Cohen’s κ of 0.000 against each is a degeneracy from its 100% pass rate, not evidence of independence. Single-threshold recalibration at n = 15 did not recover agreement (Δκ = 0.000; AUROC for in-house SQI predicting Orphanidou pass/fail = 0.484). Per-subject heterogeneity in wrist-PPG-to-chest-ECG HR disagreement spanned 6.75 to 26.02 bpm during the stress condition, a four-fold range across subjects. Restricting downstream models to Orphanidou-passing windows improved per-subject HR correlation by a median of +0.110 (13 of 15 subjects improved, paired Wilcoxon p = 1.5e-04), an improvement absent under matched random window retention and specific to the timing-based SQIs. The finding replicated on PPG-DaLiA</w:t>
       </w:r>
       <w:r>
         <w:t xml:space="preserve"> </w:t>
@@ -303,7 +303,7 @@
         <w:t xml:space="preserve"> </w:t>
       </w:r>
       <w:r>
-        <w:t xml:space="preserve">On a public wearable-PPG benchmark, three independently developed signal-quality methods reject a large fraction of windows that typical in-house pipelines accept, and single-threshold recalibration does not recover agreement at n = 15. Per-subject heterogeneity is the dominant feature of the data, not a single global signal-quality property. We recommend that wearable-AI publications report a multi-baseline SQI audit as standard supplementary material. All analyses are reproducible from a fixed seed in approximately three minutes on a laptop CPU.</w:t>
+        <w:t xml:space="preserve">On a public wearable-PPG benchmark, three independently developed signal-quality methods reject a large fraction of windows that a single fixed in-house threshold accepts, and single-threshold recalibration does not recover agreement at n = 15. Per-subject heterogeneity is the dominant feature of the data, not a single global signal-quality property. We recommend that wearable-AI publications report a multi-baseline SQI audit as standard supplementary material. All analyses are reproducible from a fixed seed in approximately three minutes on a laptop CPU.</w:t>
       </w:r>
     </w:p>
     <w:p>
@@ -7196,7 +7196,7 @@
         <w:t xml:space="preserve"> </w:t>
       </w:r>
       <w:r>
-        <w:t xml:space="preserve">The pilot estimates were updated against the full release; the headline finding (in-house SQI disagrees with published baselines on real wrist PPG, κ ≈ 0 against both) strengthened at n=15, but the pilot’s</w:t>
+        <w:t xml:space="preserve">The pilot estimates were updated against the full release; the headline finding (the three published methods consensus-reject a large fraction of windows accepted by the in-house threshold, which is the lone outlier) strengthened at n=15, but the pilot’s</w:t>
       </w:r>
       <w:r>
         <w:t xml:space="preserve"> </w:t>

</xml_diff>

<commit_message>
Session 5: claims and writing pass. Abstract now reports the in-house threshold as the lone outlier rather than uncorrelated and narrows an over-generalised in-house claim; Section 5.1 stops asserting an untested per-subject calibration fix and scopes the downstream-filtering benefit to timing-based SQIs; Section 5.2 reframed so the empirical audit is the contribution and the AIPW, reliability, and fairness components are supporting infrastructure validated in the supplement
</commit_message>
<xml_diff>
--- a/paper/manuscript.docx
+++ b/paper/manuscript.docx
@@ -7073,7 +7073,7 @@
         <w:t xml:space="preserve"> </w:t>
       </w:r>
       <w:r>
-        <w:t xml:space="preserve">A held-out split (3,292 calibration / 3,293 holdout windows) tuning the in-house threshold against Orphanidou returned Δκ ≈ 0 on holdout; AUROC for the in-house SQI predicting Orphanidou pass/fail was 0.484, statistically indistinguishable from chance. The implication is that a single global SQI threshold is the wrong unit of analysis on wrist PPG; per-subject or per-session calibration is required. The pilot finding of κ improving from 0.000 to +0.217 after recalibration to 0.99 (reported at n = 2) was an artifact of the two subjects whose wrist-PPG behaviour was unrepresentative of the cohort.</w:t>
+        <w:t xml:space="preserve">A held-out split (3,292 calibration / 3,293 holdout windows) tuning the in-house threshold against Orphanidou returned Δκ ≈ 0 on holdout; AUROC for the in-house SQI predicting Orphanidou pass/fail was 0.484, statistically indistinguishable from chance. The implication is that a single global SQI threshold is the wrong unit of analysis on wrist PPG; per-subject or per-session calibration is the alternative to test. The pilot finding of κ improving from 0.000 to +0.217 after recalibration to 0.99 (reported at n = 2) was an artifact of the two subjects whose wrist-PPG behaviour was unrepresentative of the cohort.</w:t>
       </w:r>
     </w:p>
     <w:p>
@@ -7088,7 +7088,7 @@
           <w:b/>
           <w:bCs/>
         </w:rPr>
-        <w:t xml:space="preserve">Per-subject heterogeneity dominates pooled summary statistics, and audit-based filtering improves downstream biomarker estimation.</w:t>
+        <w:t xml:space="preserve">Per-subject heterogeneity dominates pooled summary statistics, and filtering to a timing-based SQI improves downstream biomarker estimation.</w:t>
       </w:r>
       <w:r>
         <w:t xml:space="preserve"> </w:t>
@@ -7112,7 +7112,7 @@
         <w:pStyle w:val="FirstParagraph"/>
       </w:pPr>
       <w:r>
-        <w:t xml:space="preserve">Wearable signal-quality auditing and feature extraction have been addressed previously, for example by</w:t>
+        <w:t xml:space="preserve">Wearable signal-quality methods and feature-extraction toolkits have been addressed previously, for example by</w:t>
       </w:r>
       <w:r>
         <w:t xml:space="preserve"> </w:t>
@@ -7133,7 +7133,16 @@
         <w:t xml:space="preserve">Föll et al. (2021)</w:t>
       </w:r>
       <w:r>
-        <w:t xml:space="preserve">. Our contribution differs in three ways. First, we combine signal quality with formal reliability, causal-adjusted confounding analysis, and stratified fairness in a single pipeline; prior work tends to address these as separate tools. Second, we provide a doubly-robust AIPW estimator with bootstrap CIs under a user-supplied DAG, which to our knowledge has not been packaged in a wearable-quality framework. Third, we ship a parameter-sweep validation that demonstrates the audit responds to cohort properties rather than to fixed generator values, an unusual practice in synthetic-data methods papers.</w:t>
+        <w:t xml:space="preserve">, and prior work has argued that a single quality threshold cannot serve all measurement contexts</w:t>
+      </w:r>
+      <w:r>
+        <w:t xml:space="preserve"> </w:t>
+      </w:r>
+      <w:r>
+        <w:t xml:space="preserve">(McLean et al. 2023)</w:t>
+      </w:r>
+      <w:r>
+        <w:t xml:space="preserve">. What that literature has not done is quantify, on a public real-wearable-PPG benchmark, how far the published SQI methods agree with one another and what audit-based filtering does to downstream biomarker estimation. That empirical question is the contribution here: on WESAD and PPG-DaLiA the three published methods reach prevalence-insensitive agreement and consensus-reject a large window population that a single fixed in-house threshold accepts, and filtering to a timing-based published SQI improves per-subject HR correlation. The remaining pipeline components (reliability primitives, a doubly-robust AIPW confounding estimator under a user-supplied DAG, and a stratified fairness audit) are supporting infrastructure, validated on synthetic data in the supplement rather than claimed as empirical findings.</w:t>
       </w:r>
     </w:p>
     <w:p>

</xml_diff>

<commit_message>
Session 6: replace the conceptual Venn with a two-panel UpSet plot as Figure 1 showing the cross-method acceptance structure on WESAD and PPG-DaLiA; rewrite the Figure 1 caption; update the supplement description of Figure 1; align the WESAD consensus-reject count to the data-true 2,935. Supplementary Figure S4 image still renders 2,936 and is pending regeneration
</commit_message>
<xml_diff>
--- a/paper/manuscript.docx
+++ b/paper/manuscript.docx
@@ -472,14 +472,14 @@
       <w:r>
         <w:drawing>
           <wp:inline>
-            <wp:extent cx="5334000" cy="2459481"/>
+            <wp:extent cx="5334000" cy="5706139"/>
             <wp:effectExtent b="0" l="0" r="0" t="0"/>
-            <wp:docPr descr="Figure 1. Cross-method signal-quality agreement and consensus rejection on wearable photoplethysmography. Each colored disk represents the subset of windows accepted by one published method on each dataset (schematic; not proportional). The region outside all three disks represents the consensus rejection by all three independently developed methods (44.6% on WESAD; 43.1% on PPG-DaLiA). The three methods agree more than chance on pass/fail once prevalence is accounted for (median Gwet’s AC1 = +0.32) and converge on which to reject. Headline numbers in the figure are uncorrected and identical to those in Table 4 (WESAD) and Table 10 (PPG-DaLiA)." title="" id="14" name="Picture"/>
+            <wp:docPr descr="Figure 1. Cross-method acceptance structure of three independently developed published wrist-PPG signal-quality methods on (a) WESAD (n = 6,585 5-second windows) and (b) PPG-DaLiA (n = 18,781 windows), shown as UpSet plots. Each column is a combination of methods that accept a window; bar height is the number of windows in that combination, and the dot matrix below marks which methods make up each combination. On both datasets the largest single category is rejection by all three methods (consensus reject: 2,935 windows, 44.6%, on WESAD; 8,100 windows, 43.1%, on PPG-DaLiA), and the largest acceptance-agreement cell is Orphanidou with Sukor, the two timing-based methods. Windows accepted by all three methods are rare (0.5% and 0.7%), so the cross-method agreement is concentrated in the consensus-reject set rather than in co-acceptance." title="" id="14" name="Picture"/>
             <a:graphic>
               <a:graphicData uri="http://schemas.openxmlformats.org/drawingml/2006/picture">
                 <pic:pic>
                   <pic:nvPicPr>
-                    <pic:cNvPr descr="paper/figures/fig1_conceptual.png" id="15" name="Picture"/>
+                    <pic:cNvPr descr="paper/figures/fig1_upset.png" id="15" name="Picture"/>
                     <pic:cNvPicPr>
                       <a:picLocks noChangeArrowheads="1" noChangeAspect="1"/>
                     </pic:cNvPicPr>
@@ -493,7 +493,7 @@
                   <pic:spPr bwMode="auto">
                     <a:xfrm>
                       <a:off x="0" y="0"/>
-                      <a:ext cx="5334000" cy="2459481"/>
+                      <a:ext cx="5334000" cy="5706139"/>
                     </a:xfrm>
                     <a:prstGeom prst="rect">
                       <a:avLst/>
@@ -517,7 +517,7 @@
         <w:pStyle w:val="ImageCaption"/>
       </w:pPr>
       <w:r>
-        <w:t xml:space="preserve">Figure 1. Cross-method signal-quality agreement and consensus rejection on wearable photoplethysmography. Each colored disk represents the subset of windows accepted by one published method on each dataset (schematic; not proportional). The region outside all three disks represents the consensus rejection by all three independently developed methods (44.6% on WESAD; 43.1% on PPG-DaLiA). The three methods agree more than chance on pass/fail once prevalence is accounted for (median Gwet’s AC1 = +0.32) and converge on which to reject. Headline numbers in the figure are uncorrected and identical to those in Table 4 (WESAD) and Table 10 (PPG-DaLiA).</w:t>
+        <w:t xml:space="preserve">Figure 1. Cross-method acceptance structure of three independently developed published wrist-PPG signal-quality methods on (a) WESAD (n = 6,585 5-second windows) and (b) PPG-DaLiA (n = 18,781 windows), shown as UpSet plots. Each column is a combination of methods that accept a window; bar height is the number of windows in that combination, and the dot matrix below marks which methods make up each combination. On both datasets the largest single category is rejection by all three methods (consensus reject: 2,935 windows, 44.6%, on WESAD; 8,100 windows, 43.1%, on PPG-DaLiA), and the largest acceptance-agreement cell is Orphanidou with Sukor, the two timing-based methods. Windows accepted by all three methods are rare (0.5% and 0.7%), so the cross-method agreement is concentrated in the consensus-reject set rather than in co-acceptance.</w:t>
       </w:r>
     </w:p>
     <w:bookmarkEnd w:id="16"/>

</xml_diff>

<commit_message>
Pre-submission: add verified dataset URLs and DOIs (WESAD 10.24432/C57K5T, PPG-DaLiA 10.24432/C53890) to the data-availability statement and correct the license wording (PPG-DaLiA is CC BY 4.0, not unrestricted)
</commit_message>
<xml_diff>
--- a/paper/manuscript.docx
+++ b/paper/manuscript.docx
@@ -7509,7 +7509,7 @@
         <w:pStyle w:val="FirstParagraph"/>
       </w:pPr>
       <w:r>
-        <w:t xml:space="preserve">Code: https://github.com/ceyhunolcan/biomedical-signal-forensics-lab, released under the MIT license. PyPI: https://pypi.org/project/biomedical-signal-forensics-lab/. Concept DOI: 10.5281/zenodo.20349806. All synthetic data is generated by code from a fixed seed; no data is distributed separately. Two public datasets were used in the empirical study: WESAD</w:t>
+        <w:t xml:space="preserve">Code: https://github.com/ceyhunolcan/biomedical-signal-forensics-lab, released under the MIT license. PyPI: https://pypi.org/project/biomedical-signal-forensics-lab/. Concept DOI: 10.5281/zenodo.20349806. All synthetic data is generated by code from a fixed seed; no data is distributed separately. Two public datasets were used in the empirical study, both from the UCI Machine Learning Repository: WESAD</w:t>
       </w:r>
       <w:r>
         <w:t xml:space="preserve"> </w:t>
@@ -7518,7 +7518,10 @@
         <w:t xml:space="preserve">(Schmidt et al. 2018)</w:t>
       </w:r>
       <w:r>
-        <w:t xml:space="preserve">, publicly available from the UCI Machine Learning Repository, and PPG-DaLiA</w:t>
+        <w:t xml:space="preserve"> </w:t>
+      </w:r>
+      <w:r>
+        <w:t xml:space="preserve">(https://archive.ics.uci.edu/dataset/465/wesad+wearable+stress+and+affect+detection, DOI 10.24432/C57K5T) and PPG-DaLiA</w:t>
       </w:r>
       <w:r>
         <w:t xml:space="preserve"> </w:t>
@@ -7527,7 +7530,10 @@
         <w:t xml:space="preserve">(Reiss et al. 2019)</w:t>
       </w:r>
       <w:r>
-        <w:t xml:space="preserve">, also publicly available from the UCI Machine Learning Repository. Both are released without restrictions for research use.</w:t>
+        <w:t xml:space="preserve"> </w:t>
+      </w:r>
+      <w:r>
+        <w:t xml:space="preserve">(https://archive.ics.uci.edu/dataset/495/ppg+dalia, DOI 10.24432/C53890). PPG-DaLiA is released under a Creative Commons Attribution 4.0 (CC BY 4.0) license; both datasets are available for research use under the terms stated on their UCI pages.</w:t>
       </w:r>
     </w:p>
     <w:bookmarkEnd w:id="55"/>

</xml_diff>